<commit_message>
implemented DTO for create Category.
</commit_message>
<xml_diff>
--- a/Ecommerce/src/main/resources/material.docx
+++ b/Ecommerce/src/main/resources/material.docx
@@ -58,13 +58,7 @@
     <w:p/>
     <w:p>
       <w:r>
-        <w:t xml:space="preserve">Web works in </w:t>
-      </w:r>
-      <w:r>
-        <w:t>client</w:t>
-      </w:r>
-      <w:r>
-        <w:t>-server architecture. Where both are different APIs and communicate with each other using API Request/HTTP requests.</w:t>
+        <w:t>Web works in client-server architecture. Where both are different APIs and communicate with each other using API Request/HTTP requests.</w:t>
       </w:r>
     </w:p>
     <w:p/>
@@ -75,36 +69,18 @@
     </w:p>
     <w:p>
       <w:r>
-        <w:t xml:space="preserve">Server - server is a hardware device where it contains </w:t>
-      </w:r>
-      <w:r>
-        <w:t>logic and</w:t>
-      </w:r>
-      <w:r>
-        <w:t xml:space="preserve"> data. Provides resources to the client when request arrives.</w:t>
+        <w:t>Server - server is a hardware device where it contains logic and data. Provides resources to the client when request arrives.</w:t>
       </w:r>
     </w:p>
     <w:p/>
     <w:p>
       <w:r>
-        <w:t xml:space="preserve">Client </w:t>
-      </w:r>
-      <w:r>
-        <w:t>sends</w:t>
-      </w:r>
-      <w:r>
-        <w:t xml:space="preserve"> request to server</w:t>
-      </w:r>
-    </w:p>
-    <w:p>
-      <w:r>
-        <w:t xml:space="preserve">Server responds and </w:t>
-      </w:r>
-      <w:r>
-        <w:t>sends</w:t>
-      </w:r>
-      <w:r>
-        <w:t xml:space="preserve"> back </w:t>
+        <w:t>Client sends request to server</w:t>
+      </w:r>
+    </w:p>
+    <w:p>
+      <w:r>
+        <w:t xml:space="preserve">Server responds and sends back </w:t>
       </w:r>
       <w:proofErr w:type="gramStart"/>
       <w:r>
@@ -183,10 +159,7 @@
       </w:r>
       <w:proofErr w:type="gramEnd"/>
       <w:r>
-        <w:t xml:space="preserve"> it</w:t>
-      </w:r>
-      <w:r>
-        <w:t xml:space="preserve"> into server</w:t>
+        <w:t xml:space="preserve"> it into server</w:t>
       </w:r>
     </w:p>
     <w:p/>
@@ -307,14 +280,7 @@
           <w:b/>
           <w:bCs/>
         </w:rPr>
-        <w:t>Hypertext</w:t>
-      </w:r>
-      <w:r>
-        <w:rPr>
-          <w:b/>
-          <w:bCs/>
-        </w:rPr>
-        <w:t xml:space="preserve"> transfer protocol</w:t>
+        <w:t>Hypertext transfer protocol</w:t>
       </w:r>
       <w:r>
         <w:t>”</w:t>
@@ -323,13 +289,7 @@
     <w:p/>
     <w:p>
       <w:r>
-        <w:t xml:space="preserve">HTTP and HTTPS are protocols used by </w:t>
-      </w:r>
-      <w:r>
-        <w:t>clients</w:t>
-      </w:r>
-      <w:r>
-        <w:t xml:space="preserve"> and </w:t>
+        <w:t xml:space="preserve">HTTP and HTTPS are protocols used by clients and </w:t>
       </w:r>
       <w:proofErr w:type="gramStart"/>
       <w:r>
@@ -366,10 +326,7 @@
         </w:numPr>
       </w:pPr>
       <w:r>
-        <w:t xml:space="preserve">Client initializes a TCP </w:t>
-      </w:r>
-      <w:r>
-        <w:t>connection (</w:t>
+        <w:t>Client initializes a TCP connection (</w:t>
       </w:r>
       <w:proofErr w:type="gramStart"/>
       <w:r>
@@ -377,13 +334,7 @@
       </w:r>
       <w:proofErr w:type="gramEnd"/>
       <w:r>
-        <w:t xml:space="preserve"> </w:t>
-      </w:r>
-      <w:r>
-        <w:t>handshake</w:t>
-      </w:r>
-      <w:r>
-        <w:t xml:space="preserve"> SYN, SYN-ACK, ACK) on port 80.</w:t>
+        <w:t xml:space="preserve"> handshake SYN, SYN-ACK, ACK) on port 80.</w:t>
       </w:r>
     </w:p>
     <w:p>
@@ -564,6 +515,9 @@
     <w:p/>
     <w:p>
       <w:r>
+        <w:rPr>
+          <w:noProof/>
+        </w:rPr>
         <w:drawing>
           <wp:inline distT="0" distB="0" distL="0" distR="0" wp14:anchorId="48AAECB8" wp14:editId="61AF3FFD">
             <wp:extent cx="2842260" cy="3002280"/>
@@ -3921,9 +3875,123 @@
         <w:t>Using these validations can throw exceptions, they can be visible in console logs. But the response which will be sent to the client will be 500 internal errors.</w:t>
       </w:r>
     </w:p>
+    <w:p/>
     <w:p>
       <w:r>
         <w:lastRenderedPageBreak/>
+        <w:t xml:space="preserve">For example, </w:t>
+      </w:r>
+    </w:p>
+    <w:p>
+      <w:r>
+        <w:t xml:space="preserve">I have category class with </w:t>
+      </w:r>
+      <w:proofErr w:type="spellStart"/>
+      <w:r>
+        <w:t>categoryId</w:t>
+      </w:r>
+      <w:proofErr w:type="spellEnd"/>
+      <w:r>
+        <w:t xml:space="preserve"> and </w:t>
+      </w:r>
+      <w:proofErr w:type="spellStart"/>
+      <w:r>
+        <w:t>categoryName</w:t>
+      </w:r>
+      <w:proofErr w:type="spellEnd"/>
+      <w:r>
+        <w:t>, I am sending post request via postman API.</w:t>
+      </w:r>
+    </w:p>
+    <w:p>
+      <w:r>
+        <w:t xml:space="preserve">I have placed annotation over </w:t>
+      </w:r>
+      <w:proofErr w:type="spellStart"/>
+      <w:r>
+        <w:t>categoryName</w:t>
+      </w:r>
+      <w:proofErr w:type="spellEnd"/>
+      <w:r>
+        <w:t xml:space="preserve"> as @</w:t>
+      </w:r>
+      <w:proofErr w:type="gramStart"/>
+      <w:r>
+        <w:t>NotEmpty(</w:t>
+      </w:r>
+      <w:proofErr w:type="gramEnd"/>
+      <w:r>
+        <w:t>message = “</w:t>
+      </w:r>
+      <w:proofErr w:type="spellStart"/>
+      <w:r>
+        <w:t>CategoryName</w:t>
+      </w:r>
+      <w:proofErr w:type="spellEnd"/>
+      <w:r>
+        <w:t xml:space="preserve"> </w:t>
+      </w:r>
+      <w:proofErr w:type="spellStart"/>
+      <w:proofErr w:type="gramStart"/>
+      <w:r>
+        <w:t>cant</w:t>
+      </w:r>
+      <w:proofErr w:type="spellEnd"/>
+      <w:proofErr w:type="gramEnd"/>
+      <w:r>
+        <w:t xml:space="preserve"> be blank”)</w:t>
+      </w:r>
+    </w:p>
+    <w:p>
+      <w:r>
+        <w:t xml:space="preserve">In JSON request, I set value for </w:t>
+      </w:r>
+      <w:proofErr w:type="spellStart"/>
+      <w:r>
+        <w:t>categoryName</w:t>
+      </w:r>
+      <w:proofErr w:type="spellEnd"/>
+      <w:r>
+        <w:t xml:space="preserve"> as empty, when I send the request to API,</w:t>
+      </w:r>
+    </w:p>
+    <w:p>
+      <w:r>
+        <w:t xml:space="preserve">I get response as 500 internal </w:t>
+      </w:r>
+      <w:proofErr w:type="gramStart"/>
+      <w:r>
+        <w:t>error</w:t>
+      </w:r>
+      <w:proofErr w:type="gramEnd"/>
+      <w:r>
+        <w:t>.</w:t>
+      </w:r>
+    </w:p>
+    <w:p>
+      <w:r>
+        <w:t xml:space="preserve">In console logs, we </w:t>
+      </w:r>
+      <w:proofErr w:type="gramStart"/>
+      <w:r>
+        <w:t>can</w:t>
+      </w:r>
+      <w:proofErr w:type="gramEnd"/>
+      <w:r>
+        <w:t xml:space="preserve"> able to see exception of </w:t>
+      </w:r>
+      <w:proofErr w:type="spellStart"/>
+      <w:r>
+        <w:t>constraintsViolation</w:t>
+      </w:r>
+      <w:proofErr w:type="spellEnd"/>
+      <w:r>
+        <w:t xml:space="preserve"> Exception along with message and variable name.</w:t>
+      </w:r>
+    </w:p>
+    <w:p/>
+    <w:p>
+      <w:r>
         <w:t xml:space="preserve">In the process of making this more user friendly, we can </w:t>
       </w:r>
       <w:proofErr w:type="gramStart"/>
@@ -3937,9 +4005,11 @@
     </w:p>
     <w:p/>
     <w:p>
+      <w:proofErr w:type="gramStart"/>
       <w:r>
         <w:t>Using @</w:t>
       </w:r>
+      <w:proofErr w:type="gramEnd"/>
       <w:r>
         <w:t>Valid in controller at parameter level of the request</w:t>
       </w:r>
@@ -3947,10 +4017,25 @@
         <w:t xml:space="preserve"> in the method makes little difference and provides more details in the console logs. And specify better understandable response.</w:t>
       </w:r>
     </w:p>
-    <w:p/>
-    <w:p>
-      <w:r>
-        <w:t xml:space="preserve">After using @Valid annotation, the response will be 400 bad request, and in console logs, we can find exception of </w:t>
+    <w:p>
+      <w:r>
+        <w:t xml:space="preserve">After </w:t>
+      </w:r>
+      <w:proofErr w:type="gramStart"/>
+      <w:r>
+        <w:t>using @</w:t>
+      </w:r>
+      <w:proofErr w:type="gramEnd"/>
+      <w:r>
+        <w:t xml:space="preserve">Valid annotation, the response will be 400 bad </w:t>
+      </w:r>
+      <w:proofErr w:type="gramStart"/>
+      <w:r>
+        <w:t>request</w:t>
+      </w:r>
+      <w:proofErr w:type="gramEnd"/>
+      <w:r>
+        <w:t xml:space="preserve">, and in console logs, we can find exception of </w:t>
       </w:r>
       <w:r>
         <w:rPr>
@@ -3994,7 +4079,15 @@
       </w:r>
       <w:proofErr w:type="gramEnd"/>
       <w:r>
-        <w:t>ControllerAdvice and @ResponseBody, making it easier to manage exceptions globally and return JSON responses.</w:t>
+        <w:t xml:space="preserve">ControllerAdvice </w:t>
+      </w:r>
+      <w:proofErr w:type="gramStart"/>
+      <w:r>
+        <w:t>and @</w:t>
+      </w:r>
+      <w:proofErr w:type="gramEnd"/>
+      <w:r>
+        <w:t>ResponseBody, making it easier to manage exceptions globally and return JSON responses.</w:t>
       </w:r>
     </w:p>
     <w:p>
@@ -4055,10 +4148,122 @@
         <w:t xml:space="preserve"> We can return ResponseEntity along with exception message.</w:t>
       </w:r>
     </w:p>
-    <w:p/>
-    <w:p/>
-    <w:p/>
-    <w:p/>
+    <w:p>
+      <w:pPr>
+        <w:ind w:left="1080"/>
+      </w:pPr>
+      <w:r>
+        <w:t>Example:</w:t>
+      </w:r>
+    </w:p>
+    <w:p>
+      <w:pPr>
+        <w:ind w:left="1080"/>
+      </w:pPr>
+      <w:r>
+        <w:t>@</w:t>
+      </w:r>
+      <w:proofErr w:type="gramStart"/>
+      <w:r>
+        <w:t>ExceptionHandler(</w:t>
+      </w:r>
+      <w:proofErr w:type="gramEnd"/>
+      <w:r>
+        <w:t>APIException.class)</w:t>
+      </w:r>
+      <w:r>
+        <w:br/>
+        <w:t xml:space="preserve">public </w:t>
+      </w:r>
+      <w:proofErr w:type="spellStart"/>
+      <w:r>
+        <w:t>ResponseEntity</w:t>
+      </w:r>
+      <w:proofErr w:type="spellEnd"/>
+      <w:r>
+        <w:t xml:space="preserve">&lt;String&gt; </w:t>
+      </w:r>
+      <w:proofErr w:type="spellStart"/>
+      <w:proofErr w:type="gramStart"/>
+      <w:r>
+        <w:t>ApiException</w:t>
+      </w:r>
+      <w:proofErr w:type="spellEnd"/>
+      <w:r>
+        <w:t>(</w:t>
+      </w:r>
+      <w:proofErr w:type="spellStart"/>
+      <w:proofErr w:type="gramEnd"/>
+      <w:r>
+        <w:t>APIException</w:t>
+      </w:r>
+      <w:proofErr w:type="spellEnd"/>
+      <w:r>
+        <w:t xml:space="preserve"> exception)</w:t>
+      </w:r>
+      <w:r>
+        <w:br/>
+        <w:t>{</w:t>
+      </w:r>
+      <w:r>
+        <w:br/>
+        <w:t xml:space="preserve">    String message = </w:t>
+      </w:r>
+      <w:proofErr w:type="spellStart"/>
+      <w:proofErr w:type="gramStart"/>
+      <w:r>
+        <w:t>exception.getMessage</w:t>
+      </w:r>
+      <w:proofErr w:type="spellEnd"/>
+      <w:proofErr w:type="gramEnd"/>
+      <w:r>
+        <w:t>();</w:t>
+      </w:r>
+      <w:r>
+        <w:br/>
+        <w:t xml:space="preserve">    return new </w:t>
+      </w:r>
+      <w:proofErr w:type="spellStart"/>
+      <w:r>
+        <w:t>ResponseEntity</w:t>
+      </w:r>
+      <w:proofErr w:type="spellEnd"/>
+      <w:r>
+        <w:t>&lt;</w:t>
+      </w:r>
+      <w:proofErr w:type="gramStart"/>
+      <w:r>
+        <w:t>&gt;(</w:t>
+      </w:r>
+      <w:proofErr w:type="gramEnd"/>
+      <w:r>
+        <w:t xml:space="preserve">message, </w:t>
+      </w:r>
+      <w:proofErr w:type="spellStart"/>
+      <w:r>
+        <w:t>HttpStatus.</w:t>
+      </w:r>
+      <w:r>
+        <w:rPr>
+          <w:i/>
+          <w:iCs/>
+        </w:rPr>
+        <w:t>BAD_REQUEST</w:t>
+      </w:r>
+      <w:proofErr w:type="spellEnd"/>
+      <w:r>
+        <w:t>);</w:t>
+      </w:r>
+      <w:r>
+        <w:br/>
+        <w:t>}</w:t>
+      </w:r>
+    </w:p>
+    <w:p>
+      <w:pPr>
+        <w:ind w:left="1080"/>
+      </w:pPr>
+    </w:p>
     <w:p/>
     <w:sectPr>
       <w:pgSz w:w="12240" w:h="15840"/>

</xml_diff>

<commit_message>
implemented basic pagination for getCategories
</commit_message>
<xml_diff>
--- a/Ecommerce/src/main/resources/material.docx
+++ b/Ecommerce/src/main/resources/material.docx
@@ -1,6 +1,6 @@
 
 <file path=word/document.xml><?xml version="1.0" encoding="utf-8"?>
-<w:document xmlns:wpc="http://schemas.microsoft.com/office/word/2010/wordprocessingCanvas" xmlns:cx="http://schemas.microsoft.com/office/drawing/2014/chartex" xmlns:cx1="http://schemas.microsoft.com/office/drawing/2015/9/8/chartex" xmlns:cx2="http://schemas.microsoft.com/office/drawing/2015/10/21/chartex" xmlns:cx3="http://schemas.microsoft.com/office/drawing/2016/5/9/chartex" xmlns:cx4="http://schemas.microsoft.com/office/drawing/2016/5/10/chartex" xmlns:cx5="http://schemas.microsoft.com/office/drawing/2016/5/11/chartex" xmlns:cx6="http://schemas.microsoft.com/office/drawing/2016/5/12/chartex" xmlns:cx7="http://schemas.microsoft.com/office/drawing/2016/5/13/chartex" xmlns:cx8="http://schemas.microsoft.com/office/drawing/2016/5/14/chartex" xmlns:mc="http://schemas.openxmlformats.org/markup-compatibility/2006" xmlns:aink="http://schemas.microsoft.com/office/drawing/2016/ink" xmlns:am3d="http://schemas.microsoft.com/office/drawing/2017/model3d" xmlns:o="urn:schemas-microsoft-com:office:office" xmlns:oel="http://schemas.microsoft.com/office/2019/extlst" xmlns:r="http://schemas.openxmlformats.org/officeDocument/2006/relationships" xmlns:m="http://schemas.openxmlformats.org/officeDocument/2006/math" xmlns:v="urn:schemas-microsoft-com:vml" xmlns:wp14="http://schemas.microsoft.com/office/word/2010/wordprocessingDrawing" xmlns:wp="http://schemas.openxmlformats.org/drawingml/2006/wordprocessingDrawing" xmlns:w10="urn:schemas-microsoft-com:office:word" xmlns:w="http://schemas.openxmlformats.org/wordprocessingml/2006/main" xmlns:w14="http://schemas.microsoft.com/office/word/2010/wordml" xmlns:w15="http://schemas.microsoft.com/office/word/2012/wordml" xmlns:w16cei="http://schemas.microsoft.com/office/word/2026/wordml/cei" xmlns:w16cex="http://schemas.microsoft.com/office/word/2018/wordml/cex" xmlns:w16cid="http://schemas.microsoft.com/office/word/2016/wordml/cid" xmlns:w16="http://schemas.microsoft.com/office/word/2018/wordml" xmlns:w16du="http://schemas.microsoft.com/office/word/2023/wordml/word16du" xmlns:w16sdtdh="http://schemas.microsoft.com/office/word/2020/wordml/sdtdatahash" xmlns:w16sdtfl="http://schemas.microsoft.com/office/word/2024/wordml/sdtformatlock" xmlns:w16se="http://schemas.microsoft.com/office/word/2015/wordml/symex" xmlns:wpg="http://schemas.microsoft.com/office/word/2010/wordprocessingGroup" xmlns:wpi="http://schemas.microsoft.com/office/word/2010/wordprocessingInk" xmlns:wne="http://schemas.microsoft.com/office/word/2006/wordml" xmlns:wps="http://schemas.microsoft.com/office/word/2010/wordprocessingShape" mc:Ignorable="w14 w15 w16se w16cid w16 w16cex w16sdtdh w16sdtfl w16du wp14">
+<w:document xmlns:wpc="http://schemas.microsoft.com/office/word/2010/wordprocessingCanvas" xmlns:cx="http://schemas.microsoft.com/office/drawing/2014/chartex" xmlns:cx1="http://schemas.microsoft.com/office/drawing/2015/9/8/chartex" xmlns:cx2="http://schemas.microsoft.com/office/drawing/2015/10/21/chartex" xmlns:cx3="http://schemas.microsoft.com/office/drawing/2016/5/9/chartex" xmlns:cx4="http://schemas.microsoft.com/office/drawing/2016/5/10/chartex" xmlns:cx5="http://schemas.microsoft.com/office/drawing/2016/5/11/chartex" xmlns:cx6="http://schemas.microsoft.com/office/drawing/2016/5/12/chartex" xmlns:cx7="http://schemas.microsoft.com/office/drawing/2016/5/13/chartex" xmlns:cx8="http://schemas.microsoft.com/office/drawing/2016/5/14/chartex" xmlns:mc="http://schemas.openxmlformats.org/markup-compatibility/2006" xmlns:aink="http://schemas.microsoft.com/office/drawing/2016/ink" xmlns:am3d="http://schemas.microsoft.com/office/drawing/2017/model3d" xmlns:o="urn:schemas-microsoft-com:office:office" xmlns:oel="http://schemas.microsoft.com/office/2019/extlst" xmlns:r="http://schemas.openxmlformats.org/officeDocument/2006/relationships" xmlns:m="http://schemas.openxmlformats.org/officeDocument/2006/math" xmlns:v="urn:schemas-microsoft-com:vml" xmlns:wp14="http://schemas.microsoft.com/office/word/2010/wordprocessingDrawing" xmlns:wp="http://schemas.openxmlformats.org/drawingml/2006/wordprocessingDrawing" xmlns:w10="urn:schemas-microsoft-com:office:word" xmlns:w="http://schemas.openxmlformats.org/wordprocessingml/2006/main" xmlns:w14="http://schemas.microsoft.com/office/word/2010/wordml" xmlns:w15="http://schemas.microsoft.com/office/word/2012/wordml" xmlns:w16cex="http://schemas.microsoft.com/office/word/2018/wordml/cex" xmlns:w16cid="http://schemas.microsoft.com/office/word/2016/wordml/cid" xmlns:w16="http://schemas.microsoft.com/office/word/2018/wordml" xmlns:w16du="http://schemas.microsoft.com/office/word/2023/wordml/word16du" xmlns:w16sdtdh="http://schemas.microsoft.com/office/word/2020/wordml/sdtdatahash" xmlns:w16sdtfl="http://schemas.microsoft.com/office/word/2024/wordml/sdtformatlock" xmlns:w16se="http://schemas.microsoft.com/office/word/2015/wordml/symex" xmlns:wpg="http://schemas.microsoft.com/office/word/2010/wordprocessingGroup" xmlns:wpi="http://schemas.microsoft.com/office/word/2010/wordprocessingInk" xmlns:wne="http://schemas.microsoft.com/office/word/2006/wordml" xmlns:wps="http://schemas.microsoft.com/office/word/2010/wordprocessingShape" mc:Ignorable="w14 w15 w16se w16cid w16 w16cex w16sdtdh w16sdtfl w16du wp14">
   <w:body>
     <w:p>
       <w:r>
@@ -80,13 +80,8 @@
     </w:p>
     <w:p>
       <w:r>
-        <w:t xml:space="preserve">Server responds and sends back </w:t>
-      </w:r>
-      <w:proofErr w:type="gramStart"/>
-      <w:r>
-        <w:t>response</w:t>
-      </w:r>
-      <w:proofErr w:type="gramEnd"/>
+        <w:t>Server responds and sends back response</w:t>
+      </w:r>
     </w:p>
     <w:p/>
     <w:p>
@@ -151,15 +146,7 @@
     <w:p/>
     <w:p>
       <w:r>
-        <w:t xml:space="preserve">Authentication of the user also checks by API, when a request hits the Server, initially it authenticates the request. Then </w:t>
-      </w:r>
-      <w:proofErr w:type="gramStart"/>
-      <w:r>
-        <w:t>allows</w:t>
-      </w:r>
-      <w:proofErr w:type="gramEnd"/>
-      <w:r>
-        <w:t xml:space="preserve"> it into server</w:t>
+        <w:t>Authentication of the user also checks by API, when a request hits the Server, initially it authenticates the request. Then allows it into server</w:t>
       </w:r>
     </w:p>
     <w:p/>
@@ -223,23 +210,7 @@
         </w:numPr>
       </w:pPr>
       <w:r>
-        <w:t xml:space="preserve">REST is stateless. Means server did not hold any specific data </w:t>
-      </w:r>
-      <w:proofErr w:type="gramStart"/>
-      <w:r>
-        <w:t>of</w:t>
-      </w:r>
-      <w:proofErr w:type="gramEnd"/>
-      <w:r>
-        <w:t xml:space="preserve"> previous requests. </w:t>
-      </w:r>
-      <w:proofErr w:type="gramStart"/>
-      <w:r>
-        <w:t>So</w:t>
-      </w:r>
-      <w:proofErr w:type="gramEnd"/>
-      <w:r>
-        <w:t xml:space="preserve"> every request should contain all required data from the client to validate.</w:t>
+        <w:t>REST is stateless. Means server did not hold any specific data of previous requests. So every request should contain all required data from the client to validate.</w:t>
       </w:r>
     </w:p>
     <w:p>
@@ -289,15 +260,7 @@
     <w:p/>
     <w:p>
       <w:r>
-        <w:t xml:space="preserve">HTTP and HTTPS are protocols used by clients and </w:t>
-      </w:r>
-      <w:proofErr w:type="gramStart"/>
-      <w:r>
-        <w:t>server</w:t>
-      </w:r>
-      <w:proofErr w:type="gramEnd"/>
-      <w:r>
-        <w:t xml:space="preserve"> to communicate over a network. The difference is that HTTPS wraps HTTP inside a secure Transmission Layer Security (TLS/SSL).</w:t>
+        <w:t>HTTP and HTTPS are protocols used by clients and server to communicate over a network. The difference is that HTTPS wraps HTTP inside a secure Transmission Layer Security (TLS/SSL).</w:t>
       </w:r>
     </w:p>
     <w:p/>
@@ -326,15 +289,7 @@
         </w:numPr>
       </w:pPr>
       <w:r>
-        <w:t>Client initializes a TCP connection (</w:t>
-      </w:r>
-      <w:proofErr w:type="gramStart"/>
-      <w:r>
-        <w:t>3 way</w:t>
-      </w:r>
-      <w:proofErr w:type="gramEnd"/>
-      <w:r>
-        <w:t xml:space="preserve"> handshake SYN, SYN-ACK, ACK) on port 80.</w:t>
+        <w:t>Client initializes a TCP connection (3 way handshake SYN, SYN-ACK, ACK) on port 80.</w:t>
       </w:r>
     </w:p>
     <w:p>
@@ -462,21 +417,8 @@
     </w:p>
     <w:p/>
     <w:p>
-      <w:proofErr w:type="gramStart"/>
-      <w:r>
-        <w:t>Imagine,</w:t>
-      </w:r>
-      <w:proofErr w:type="gramEnd"/>
-      <w:r>
-        <w:t xml:space="preserve"> if our request contains username and password. Hackers can easily see them. </w:t>
-      </w:r>
-      <w:proofErr w:type="gramStart"/>
-      <w:r>
-        <w:t>So</w:t>
-      </w:r>
-      <w:proofErr w:type="gramEnd"/>
-      <w:r>
-        <w:t xml:space="preserve"> most of the companies use HTTPS</w:t>
+      <w:r>
+        <w:t>Imagine, if our request contains username and password. Hackers can easily see them. So most of the companies use HTTPS</w:t>
       </w:r>
     </w:p>
     <w:p>
@@ -493,23 +435,7 @@
     <w:p/>
     <w:p>
       <w:r>
-        <w:t xml:space="preserve">After establishing TCP on port 443, </w:t>
-      </w:r>
-      <w:proofErr w:type="gramStart"/>
-      <w:r>
-        <w:t>client</w:t>
-      </w:r>
-      <w:proofErr w:type="gramEnd"/>
-      <w:r>
-        <w:t xml:space="preserve"> and </w:t>
-      </w:r>
-      <w:proofErr w:type="gramStart"/>
-      <w:r>
-        <w:t>server</w:t>
-      </w:r>
-      <w:proofErr w:type="gramEnd"/>
-      <w:r>
-        <w:t xml:space="preserve"> perform TLS handshake.</w:t>
+        <w:t>After establishing TCP on port 443, client and server perform TLS handshake.</w:t>
       </w:r>
     </w:p>
     <w:p/>
@@ -595,15 +521,7 @@
       </w:r>
       <w:proofErr w:type="spellEnd"/>
       <w:r>
-        <w:t xml:space="preserve">: server picks a suitable TLS version, cipher suite/cryptographic algo and sends back </w:t>
-      </w:r>
-      <w:proofErr w:type="gramStart"/>
-      <w:r>
-        <w:t>clients</w:t>
-      </w:r>
-      <w:proofErr w:type="gramEnd"/>
-      <w:r>
-        <w:t xml:space="preserve"> own random number along with a digital certificate containing public key.</w:t>
+        <w:t>: server picks a suitable TLS version, cipher suite/cryptographic algo and sends back clients own random number along with a digital certificate containing public key.</w:t>
       </w:r>
     </w:p>
     <w:p/>
@@ -698,40 +616,19 @@
     </w:p>
     <w:p>
       <w:r>
-        <w:t xml:space="preserve">After establishing successful encryption. Data </w:t>
-      </w:r>
-      <w:proofErr w:type="gramStart"/>
-      <w:r>
-        <w:t>sends</w:t>
-      </w:r>
-      <w:proofErr w:type="gramEnd"/>
-      <w:r>
-        <w:t xml:space="preserve"> in a sequence of packets, which are not readable.</w:t>
+        <w:t>After establishing successful encryption. Data sends in a sequence of packets, which are not readable.</w:t>
       </w:r>
     </w:p>
     <w:p/>
     <w:p>
-      <w:proofErr w:type="gramStart"/>
-      <w:r>
-        <w:t>example :</w:t>
-      </w:r>
-      <w:proofErr w:type="gramEnd"/>
-      <w:r>
-        <w:t> </w:t>
+      <w:r>
+        <w:t>example : </w:t>
       </w:r>
     </w:p>
     <w:p/>
     <w:p>
       <w:r>
-        <w:t xml:space="preserve">What client initially </w:t>
-      </w:r>
-      <w:proofErr w:type="gramStart"/>
-      <w:r>
-        <w:t>send</w:t>
-      </w:r>
-      <w:proofErr w:type="gramEnd"/>
-      <w:r>
-        <w:t>:</w:t>
+        <w:t>What client initially send:</w:t>
       </w:r>
     </w:p>
     <w:p/>
@@ -753,15 +650,7 @@
     <w:p/>
     <w:p>
       <w:r>
-        <w:t xml:space="preserve">What </w:t>
-      </w:r>
-      <w:proofErr w:type="gramStart"/>
-      <w:r>
-        <w:t>actually data</w:t>
-      </w:r>
-      <w:proofErr w:type="gramEnd"/>
-      <w:r>
-        <w:t xml:space="preserve"> looks like in transit</w:t>
+        <w:t>What actually data looks like in transit</w:t>
       </w:r>
     </w:p>
     <w:p>
@@ -788,17 +677,8 @@
           <w:b/>
           <w:bCs/>
         </w:rPr>
-        <w:t xml:space="preserve">What HTTPS </w:t>
-      </w:r>
-      <w:proofErr w:type="gramStart"/>
-      <w:r>
-        <w:rPr>
-          <w:b/>
-          <w:bCs/>
-        </w:rPr>
-        <w:t>actually guarantees</w:t>
-      </w:r>
-      <w:proofErr w:type="gramEnd"/>
+        <w:t>What HTTPS actually guarantees</w:t>
+      </w:r>
     </w:p>
     <w:p>
       <w:pPr>
@@ -851,15 +731,7 @@
         <w:t>Authentication</w:t>
       </w:r>
       <w:r>
-        <w:t xml:space="preserve"> — you know you're </w:t>
-      </w:r>
-      <w:proofErr w:type="gramStart"/>
-      <w:r>
-        <w:t>actually talking</w:t>
-      </w:r>
-      <w:proofErr w:type="gramEnd"/>
-      <w:r>
-        <w:t xml:space="preserve"> to the domain you typed, not an impostor</w:t>
+        <w:t xml:space="preserve"> — you know you're actually talking to the domain you typed, not an impostor</w:t>
       </w:r>
     </w:p>
     <w:p>
@@ -907,15 +779,7 @@
     </w:p>
     <w:p>
       <w:r>
-        <w:t xml:space="preserve">Web framework is a collection of tools and modules that </w:t>
-      </w:r>
-      <w:proofErr w:type="gramStart"/>
-      <w:r>
-        <w:t>is</w:t>
-      </w:r>
-      <w:proofErr w:type="gramEnd"/>
-      <w:r>
-        <w:t xml:space="preserve"> needed to do standard tasks across every web application.</w:t>
+        <w:t>Web framework is a collection of tools and modules that is needed to do standard tasks across every web application.</w:t>
       </w:r>
     </w:p>
     <w:p>
@@ -1076,15 +940,7 @@
       </w:r>
       <w:proofErr w:type="spellEnd"/>
       <w:r>
-        <w:t xml:space="preserve">&lt;T&gt; is </w:t>
-      </w:r>
-      <w:proofErr w:type="gramStart"/>
-      <w:r>
-        <w:t>class :</w:t>
-      </w:r>
-      <w:proofErr w:type="gramEnd"/>
-      <w:r>
-        <w:t xml:space="preserve"> List&lt;Integer&gt; list = new </w:t>
+        <w:t xml:space="preserve">&lt;T&gt; is class : List&lt;Integer&gt; list = new </w:t>
       </w:r>
       <w:proofErr w:type="spellStart"/>
       <w:r>
@@ -1092,15 +948,7 @@
       </w:r>
       <w:proofErr w:type="spellEnd"/>
       <w:r>
-        <w:t>&lt;</w:t>
-      </w:r>
-      <w:proofErr w:type="gramStart"/>
-      <w:r>
-        <w:t>&gt;(</w:t>
-      </w:r>
-      <w:proofErr w:type="gramEnd"/>
-      <w:r>
-        <w:t>);</w:t>
+        <w:t>&lt;&gt;();</w:t>
       </w:r>
     </w:p>
     <w:p>
@@ -1111,23 +959,7 @@
         </w:numPr>
       </w:pPr>
       <w:r>
-        <w:t xml:space="preserve">Vector&lt;T&gt; is </w:t>
-      </w:r>
-      <w:proofErr w:type="gramStart"/>
-      <w:r>
-        <w:t>class :</w:t>
-      </w:r>
-      <w:proofErr w:type="gramEnd"/>
-      <w:r>
-        <w:t xml:space="preserve"> List&lt;String&gt; vector = new Vector&lt;</w:t>
-      </w:r>
-      <w:proofErr w:type="gramStart"/>
-      <w:r>
-        <w:t>&gt;(</w:t>
-      </w:r>
-      <w:proofErr w:type="gramEnd"/>
-      <w:r>
-        <w:t>);</w:t>
+        <w:t>Vector&lt;T&gt; is class : List&lt;String&gt; vector = new Vector&lt;&gt;();</w:t>
       </w:r>
     </w:p>
     <w:p>
@@ -1142,23 +974,7 @@
     </w:p>
     <w:p>
       <w:r>
-        <w:t xml:space="preserve">Inversion of control is a design </w:t>
-      </w:r>
-      <w:proofErr w:type="gramStart"/>
-      <w:r>
-        <w:t>principle  where</w:t>
-      </w:r>
-      <w:proofErr w:type="gramEnd"/>
-      <w:r>
-        <w:t xml:space="preserve"> the control of object creation and objects life cycle </w:t>
-      </w:r>
-      <w:proofErr w:type="gramStart"/>
-      <w:r>
-        <w:t>management  is</w:t>
-      </w:r>
-      <w:proofErr w:type="gramEnd"/>
-      <w:r>
-        <w:t xml:space="preserve"> transferred from the application code to an external container or framework.</w:t>
+        <w:t>Inversion of control is a design principle  where the control of object creation and objects life cycle management  is transferred from the application code to an external container or framework.</w:t>
       </w:r>
     </w:p>
     <w:p>
@@ -1185,15 +1001,7 @@
         </w:numPr>
       </w:pPr>
       <w:r>
-        <w:t xml:space="preserve">Dependency Injection is a designed pattern commonly used in </w:t>
-      </w:r>
-      <w:proofErr w:type="gramStart"/>
-      <w:r>
-        <w:t>object oriented</w:t>
-      </w:r>
-      <w:proofErr w:type="gramEnd"/>
-      <w:r>
-        <w:t xml:space="preserve"> programming with the dependency of a class being provided externally rather than being created within the class itself.</w:t>
+        <w:t>Dependency Injection is a designed pattern commonly used in object oriented programming with the dependency of a class being provided externally rather than being created within the class itself.</w:t>
       </w:r>
     </w:p>
     <w:p>
@@ -1216,15 +1024,7 @@
     <w:p/>
     <w:p>
       <w:r>
-        <w:t xml:space="preserve">Spring </w:t>
-      </w:r>
-      <w:proofErr w:type="gramStart"/>
-      <w:r>
-        <w:t>Container :</w:t>
-      </w:r>
-      <w:proofErr w:type="gramEnd"/>
-      <w:r>
-        <w:t xml:space="preserve"> Spring container is a core component and is responsible for managing the life cycle and configuration of objects called beans.</w:t>
+        <w:t>Spring Container : Spring container is a core component and is responsible for managing the life cycle and configuration of objects called beans.</w:t>
       </w:r>
     </w:p>
     <w:p>
@@ -1260,12 +1060,10 @@
     </w:p>
     <w:p>
       <w:proofErr w:type="spellStart"/>
-      <w:proofErr w:type="gramStart"/>
       <w:r>
         <w:t>BeanFactory</w:t>
       </w:r>
       <w:proofErr w:type="spellEnd"/>
-      <w:proofErr w:type="gramEnd"/>
       <w:r>
         <w:t>: </w:t>
       </w:r>
@@ -1342,15 +1140,7 @@
     </w:p>
     <w:p>
       <w:r>
-        <w:t xml:space="preserve">We as </w:t>
-      </w:r>
-      <w:proofErr w:type="gramStart"/>
-      <w:r>
-        <w:t>a developer</w:t>
-      </w:r>
-      <w:proofErr w:type="gramEnd"/>
-      <w:r>
-        <w:t>, create a configuration file. So that bean life cycle would know which objects need to be managed.</w:t>
+        <w:t>We as a developer, create a configuration file. So that bean life cycle would know which objects need to be managed.</w:t>
       </w:r>
     </w:p>
     <w:p>
@@ -1454,15 +1244,7 @@
         </w:numPr>
       </w:pPr>
       <w:r>
-        <w:t xml:space="preserve">creation, we </w:t>
-      </w:r>
-      <w:proofErr w:type="gramStart"/>
-      <w:r>
-        <w:t>have to</w:t>
-      </w:r>
-      <w:proofErr w:type="gramEnd"/>
-      <w:r>
-        <w:t xml:space="preserve"> create a config file which is XML. In that config file we define beans where the spring container needs to be managed.</w:t>
+        <w:t>creation, we have to create a config file which is XML. In that config file we define beans where the spring container needs to be managed.</w:t>
       </w:r>
     </w:p>
     <w:p/>
@@ -1532,21 +1314,8 @@
           <w:numId w:val="19"/>
         </w:numPr>
       </w:pPr>
-      <w:proofErr w:type="gramStart"/>
-      <w:r>
-        <w:t>Dependencies are</w:t>
-      </w:r>
-      <w:proofErr w:type="gramEnd"/>
-      <w:r>
-        <w:t xml:space="preserve"> provided </w:t>
-      </w:r>
-      <w:proofErr w:type="gramStart"/>
-      <w:r>
-        <w:t>to</w:t>
-      </w:r>
-      <w:proofErr w:type="gramEnd"/>
-      <w:r>
-        <w:t xml:space="preserve"> the dependent class through its constructor.</w:t>
+      <w:r>
+        <w:t>Dependencies are provided to the dependent class through its constructor.</w:t>
       </w:r>
     </w:p>
     <w:p>
@@ -1703,15 +1472,7 @@
       </w:r>
       <w:proofErr w:type="spellEnd"/>
       <w:r>
-        <w:t xml:space="preserve"> is a design pattern that automatically injects dependent objects into a bean. Reducing the need </w:t>
-      </w:r>
-      <w:proofErr w:type="gramStart"/>
-      <w:r>
-        <w:t>of</w:t>
-      </w:r>
-      <w:proofErr w:type="gramEnd"/>
-      <w:r>
-        <w:t xml:space="preserve"> explicit configuration in XML.</w:t>
+        <w:t xml:space="preserve"> is a design pattern that automatically injects dependent objects into a bean. Reducing the need of explicit configuration in XML.</w:t>
       </w:r>
     </w:p>
     <w:p>
@@ -1754,13 +1515,11 @@
         </w:numPr>
       </w:pPr>
       <w:proofErr w:type="spellStart"/>
-      <w:proofErr w:type="gramStart"/>
       <w:r>
         <w:lastRenderedPageBreak/>
         <w:t>byName</w:t>
       </w:r>
       <w:proofErr w:type="spellEnd"/>
-      <w:proofErr w:type="gramEnd"/>
     </w:p>
     <w:p>
       <w:pPr>
@@ -1815,15 +1574,7 @@
         </w:numPr>
       </w:pPr>
       <w:r>
-        <w:t xml:space="preserve">Use setter-based </w:t>
-      </w:r>
-      <w:proofErr w:type="gramStart"/>
-      <w:r>
-        <w:t>injection</w:t>
-      </w:r>
-      <w:proofErr w:type="gramEnd"/>
-      <w:r>
-        <w:t xml:space="preserve"> and must.</w:t>
+        <w:t>Use setter-based injection and must.</w:t>
       </w:r>
     </w:p>
     <w:p>
@@ -1901,15 +1652,7 @@
       </w:r>
       <w:proofErr w:type="spellEnd"/>
       <w:r>
-        <w:t xml:space="preserve"> constructor: spring injects </w:t>
-      </w:r>
-      <w:proofErr w:type="gramStart"/>
-      <w:r>
-        <w:t>the dependency</w:t>
-      </w:r>
-      <w:proofErr w:type="gramEnd"/>
-      <w:r>
-        <w:t xml:space="preserve"> based on the constructor.</w:t>
+        <w:t xml:space="preserve"> constructor: spring injects the dependency based on the constructor.</w:t>
       </w:r>
     </w:p>
     <w:p>
@@ -1919,45 +1662,8 @@
           <w:numId w:val="27"/>
         </w:numPr>
       </w:pPr>
-      <w:proofErr w:type="gramStart"/>
-      <w:r>
-        <w:t>Uses</w:t>
-      </w:r>
-      <w:proofErr w:type="gramEnd"/>
-      <w:r>
-        <w:t xml:space="preserve"> </w:t>
-      </w:r>
-      <w:proofErr w:type="gramStart"/>
-      <w:r>
-        <w:t>constructor based</w:t>
-      </w:r>
-      <w:proofErr w:type="gramEnd"/>
-      <w:r>
-        <w:t xml:space="preserve"> </w:t>
-      </w:r>
-      <w:proofErr w:type="gramStart"/>
-      <w:r>
-        <w:t>injection</w:t>
-      </w:r>
-      <w:proofErr w:type="gramEnd"/>
-      <w:r>
-        <w:t xml:space="preserve"> and </w:t>
-      </w:r>
-      <w:proofErr w:type="gramStart"/>
-      <w:r>
-        <w:t>constructor</w:t>
-      </w:r>
-      <w:proofErr w:type="gramEnd"/>
-      <w:r>
-        <w:t xml:space="preserve"> </w:t>
-      </w:r>
-      <w:proofErr w:type="gramStart"/>
-      <w:r>
-        <w:t>is</w:t>
-      </w:r>
-      <w:proofErr w:type="gramEnd"/>
-      <w:r>
-        <w:t xml:space="preserve"> must.</w:t>
+      <w:r>
+        <w:t>Uses constructor based injection and constructor is must.</w:t>
       </w:r>
     </w:p>
     <w:p>
@@ -2024,31 +1730,13 @@
       </w:r>
     </w:p>
     <w:p>
-      <w:proofErr w:type="gramStart"/>
-      <w:r>
-        <w:t>@Component</w:t>
-      </w:r>
-      <w:proofErr w:type="gramEnd"/>
-      <w:r>
-        <w:t xml:space="preserve"> - this annotation simply marks a java class as a bean. Spring scans the whole project at runtime and manages their life cycle.</w:t>
-      </w:r>
-    </w:p>
-    <w:p>
-      <w:proofErr w:type="gramStart"/>
-      <w:r>
-        <w:t>@Override</w:t>
-      </w:r>
-      <w:proofErr w:type="gramEnd"/>
-      <w:r>
-        <w:t xml:space="preserve"> - this annotation educates the compiler that the current method in sub class is from parent </w:t>
-      </w:r>
-      <w:proofErr w:type="gramStart"/>
-      <w:r>
-        <w:t>class</w:t>
-      </w:r>
-      <w:proofErr w:type="gramEnd"/>
-      <w:r>
-        <w:t xml:space="preserve"> and we are modifying the logic and using this implementation instead of parent implementation.</w:t>
+      <w:r>
+        <w:t>@Component - this annotation simply marks a java class as a bean. Spring scans the whole project at runtime and manages their life cycle.</w:t>
+      </w:r>
+    </w:p>
+    <w:p>
+      <w:r>
+        <w:t>@Override - this annotation educates the compiler that the current method in sub class is from parent class and we are modifying the logic and using this implementation instead of parent implementation.</w:t>
       </w:r>
     </w:p>
     <w:p/>
@@ -2127,14 +1815,9 @@
       </w:r>
       <w:proofErr w:type="spellStart"/>
       <w:r>
-        <w:t>com.</w:t>
-      </w:r>
-      <w:proofErr w:type="gramStart"/>
-      <w:r>
-        <w:t>example.MyClass</w:t>
+        <w:t>com.example.MyClass</w:t>
       </w:r>
       <w:proofErr w:type="spellEnd"/>
-      <w:proofErr w:type="gramEnd"/>
       <w:r>
         <w:t>” /&gt;</w:t>
       </w:r>
@@ -2248,13 +1931,8 @@
         </w:numPr>
       </w:pPr>
       <w:r>
-        <w:t xml:space="preserve">We can specify value from property files, Env files, system properties </w:t>
-      </w:r>
-      <w:proofErr w:type="gramStart"/>
-      <w:r>
-        <w:t>etc..</w:t>
-      </w:r>
-      <w:proofErr w:type="gramEnd"/>
+        <w:t>We can specify value from property files, Env files, system properties etc..</w:t>
+      </w:r>
     </w:p>
     <w:p>
       <w:pPr>
@@ -2269,15 +1947,7 @@
     </w:p>
     <w:p>
       <w:r>
-        <w:t>@</w:t>
-      </w:r>
-      <w:proofErr w:type="gramStart"/>
-      <w:r>
-        <w:t>Value(</w:t>
-      </w:r>
-      <w:proofErr w:type="gramEnd"/>
-      <w:r>
-        <w:t>101)</w:t>
+        <w:t>@Value(101)</w:t>
       </w:r>
     </w:p>
     <w:p>
@@ -2302,37 +1972,14 @@
     <w:p/>
     <w:p>
       <w:r>
-        <w:t xml:space="preserve">Configuration class: it is a class which has stereotype </w:t>
-      </w:r>
-      <w:proofErr w:type="gramStart"/>
-      <w:r>
-        <w:t>annotation @</w:t>
-      </w:r>
-      <w:proofErr w:type="gramEnd"/>
-      <w:r>
-        <w:t xml:space="preserve">Configuration at class level. Where this class has configurations which </w:t>
-      </w:r>
-      <w:proofErr w:type="gramStart"/>
-      <w:r>
-        <w:t>replaces</w:t>
-      </w:r>
-      <w:proofErr w:type="gramEnd"/>
-      <w:r>
-        <w:t xml:space="preserve"> the traditional XML configuration file to define, wire, and manage the beans. </w:t>
+        <w:t xml:space="preserve">Configuration class: it is a class which has stereotype annotation @Configuration at class level. Where this class has configurations which replaces the traditional XML configuration file to define, wire, and manage the beans. </w:t>
       </w:r>
       <w:r>
         <w:br/>
       </w:r>
       <w:r>
         <w:br/>
-      </w:r>
-      <w:proofErr w:type="gramStart"/>
-      <w:r>
-        <w:t>@Configuration</w:t>
-      </w:r>
-      <w:proofErr w:type="gramEnd"/>
-      <w:r>
-        <w:t>: annotation marks the class as a configuration class.</w:t>
+        <w:t>@Configuration: annotation marks the class as a configuration class.</w:t>
       </w:r>
     </w:p>
     <w:p>
@@ -2359,7 +2006,6 @@
     </w:p>
     <w:p/>
     <w:p>
-      <w:proofErr w:type="gramStart"/>
       <w:r>
         <w:rPr>
           <w:b/>
@@ -2368,19 +2014,7 @@
         <w:t>@Qualifie</w:t>
       </w:r>
       <w:r>
-        <w:t>r</w:t>
-      </w:r>
-      <w:proofErr w:type="gramEnd"/>
-      <w:r>
-        <w:t xml:space="preserve">: This annotation specifies which </w:t>
-      </w:r>
-      <w:proofErr w:type="gramStart"/>
-      <w:r>
-        <w:t>bean</w:t>
-      </w:r>
-      <w:proofErr w:type="gramEnd"/>
-      <w:r>
-        <w:t xml:space="preserve"> to inject when multiple beans exist in the configuration file.</w:t>
+        <w:t>r: This annotation specifies which bean to inject when multiple beans exist in the configuration file.</w:t>
       </w:r>
     </w:p>
     <w:p>
@@ -2390,15 +2024,7 @@
     </w:p>
     <w:p>
       <w:r>
-        <w:t xml:space="preserve">One interface, multiple implementation classes, </w:t>
-      </w:r>
-      <w:proofErr w:type="gramStart"/>
-      <w:r>
-        <w:t>need</w:t>
-      </w:r>
-      <w:proofErr w:type="gramEnd"/>
-      <w:r>
-        <w:t xml:space="preserve"> to specify in the controller while injecting.</w:t>
+        <w:t>One interface, multiple implementation classes, need to specify in the controller while injecting.</w:t>
       </w:r>
     </w:p>
     <w:p>
@@ -2445,630 +2071,517 @@
       </w:r>
       <w:proofErr w:type="spellEnd"/>
       <w:r>
-        <w:t>, we specify @</w:t>
-      </w:r>
-      <w:proofErr w:type="gramStart"/>
-      <w:r>
-        <w:t>Qualifer(</w:t>
-      </w:r>
-      <w:proofErr w:type="gramEnd"/>
-      <w:r>
-        <w:t>--name of service class–).</w:t>
+        <w:t>, we specify @Qualifer(--name of service class–).</w:t>
       </w:r>
     </w:p>
     <w:p/>
     <w:p>
-      <w:proofErr w:type="gramStart"/>
       <w:r>
         <w:rPr>
           <w:b/>
           <w:bCs/>
         </w:rPr>
-        <w:t>@Primary</w:t>
-      </w:r>
-      <w:proofErr w:type="gramEnd"/>
+        <w:t xml:space="preserve">@Primary: </w:t>
+      </w:r>
+      <w:r>
+        <w:t>Marks a bean as the default when multiple candidates exist. </w:t>
+      </w:r>
+    </w:p>
+    <w:p>
+      <w:r>
+        <w:t>We specify this annotation at the class level of service classes. So that class behaves as the primary class to inject.</w:t>
+      </w:r>
+    </w:p>
+    <w:p>
+      <w:r>
+        <w:br/>
+      </w:r>
+      <w:r>
+        <w:br/>
+      </w:r>
+      <w:r>
+        <w:br/>
+      </w:r>
+      <w:r>
+        <w:br/>
+      </w:r>
+      <w:r>
+        <w:br/>
+      </w:r>
+      <w:r>
+        <w:br/>
+      </w:r>
+      <w:r>
+        <w:br/>
+      </w:r>
+      <w:r>
+        <w:br/>
+      </w:r>
+      <w:r>
+        <w:br/>
+      </w:r>
+      <w:r>
+        <w:br/>
+      </w:r>
+      <w:r>
+        <w:br/>
+      </w:r>
+      <w:r>
+        <w:br/>
+      </w:r>
+      <w:r>
+        <w:br/>
+      </w:r>
+    </w:p>
+    <w:p>
+      <w:proofErr w:type="spellStart"/>
+      <w:r>
+        <w:t>SpringBoot</w:t>
+      </w:r>
+      <w:proofErr w:type="spellEnd"/>
+      <w:r>
+        <w:t>:</w:t>
+      </w:r>
+      <w:r>
+        <w:br/>
+      </w:r>
+      <w:r>
+        <w:br/>
+      </w:r>
+    </w:p>
+    <w:p>
+      <w:proofErr w:type="spellStart"/>
+      <w:r>
+        <w:t>Springboot</w:t>
+      </w:r>
+      <w:proofErr w:type="spellEnd"/>
+      <w:r>
+        <w:t xml:space="preserve"> is an open-source, JAVA based framework used to create stand-alone, production-grade spring-based applications on top of spring framework.</w:t>
+      </w:r>
+    </w:p>
+    <w:p>
+      <w:r>
+        <w:t xml:space="preserve">Spring vs </w:t>
+      </w:r>
+      <w:proofErr w:type="spellStart"/>
+      <w:r>
+        <w:t>springboot</w:t>
+      </w:r>
+      <w:proofErr w:type="spellEnd"/>
+    </w:p>
+    <w:p>
+      <w:r>
+        <w:t>In spring lots of steps involved in setting up, configuration, writing boilerplate code, deployment of the app.</w:t>
+      </w:r>
+    </w:p>
+    <w:p>
+      <w:pPr>
+        <w:numPr>
+          <w:ilvl w:val="0"/>
+          <w:numId w:val="33"/>
+        </w:numPr>
+      </w:pPr>
+      <w:r>
+        <w:t>Manual XML or annotation based configuration</w:t>
+      </w:r>
+    </w:p>
+    <w:p>
+      <w:pPr>
+        <w:numPr>
+          <w:ilvl w:val="0"/>
+          <w:numId w:val="33"/>
+        </w:numPr>
+      </w:pPr>
+      <w:r>
+        <w:t>Manually manage dependencies</w:t>
+      </w:r>
+    </w:p>
+    <w:p>
+      <w:pPr>
+        <w:numPr>
+          <w:ilvl w:val="0"/>
+          <w:numId w:val="33"/>
+        </w:numPr>
+      </w:pPr>
+      <w:r>
+        <w:t xml:space="preserve">Manually configure server (tomcat, jetty </w:t>
+      </w:r>
+      <w:proofErr w:type="spellStart"/>
+      <w:r>
+        <w:t>etc</w:t>
+      </w:r>
+      <w:proofErr w:type="spellEnd"/>
+      <w:r>
+        <w:t>…)</w:t>
+      </w:r>
+    </w:p>
+    <w:p>
+      <w:r>
+        <w:t>Spring boot is designed to reduce boilerplate code and setup complexity. It provides auto configuration, embedded local server and production-ready features.</w:t>
+      </w:r>
+    </w:p>
+    <w:p/>
+    <w:p>
+      <w:proofErr w:type="spellStart"/>
+      <w:r>
+        <w:lastRenderedPageBreak/>
+        <w:t>Springboot</w:t>
+      </w:r>
+      <w:proofErr w:type="spellEnd"/>
+      <w:r>
+        <w:t xml:space="preserve"> = Spring framework + prebuilt-configuration + embedded server.</w:t>
+      </w:r>
+    </w:p>
+    <w:p/>
+    <w:p>
+      <w:proofErr w:type="spellStart"/>
+      <w:r>
+        <w:t>Springboot</w:t>
+      </w:r>
+      <w:proofErr w:type="spellEnd"/>
+      <w:r>
+        <w:t xml:space="preserve"> components:</w:t>
+      </w:r>
+    </w:p>
+    <w:p>
+      <w:pPr>
+        <w:numPr>
+          <w:ilvl w:val="0"/>
+          <w:numId w:val="34"/>
+        </w:numPr>
+      </w:pPr>
+      <w:proofErr w:type="spellStart"/>
+      <w:r>
+        <w:t>Springboot</w:t>
+      </w:r>
+      <w:proofErr w:type="spellEnd"/>
+      <w:r>
+        <w:t xml:space="preserve"> starters:</w:t>
+      </w:r>
+    </w:p>
+    <w:p>
+      <w:proofErr w:type="spellStart"/>
+      <w:r>
+        <w:t>Springboot</w:t>
+      </w:r>
+      <w:proofErr w:type="spellEnd"/>
+      <w:r>
+        <w:t xml:space="preserve"> starters are collections of pre-built dependencies which will be helping in built web applications without manual configuration and version checking of each module.</w:t>
+      </w:r>
+    </w:p>
+    <w:p>
+      <w:r>
+        <w:t>These are in the form of maven/</w:t>
+      </w:r>
+      <w:proofErr w:type="spellStart"/>
+      <w:r>
+        <w:t>gradle</w:t>
+      </w:r>
+      <w:proofErr w:type="spellEnd"/>
+      <w:r>
+        <w:t xml:space="preserve"> dependencies.</w:t>
+      </w:r>
+    </w:p>
+    <w:p>
+      <w:r>
+        <w:t xml:space="preserve">Before starters, while building web applications, we manually add Spring MVC, tomcat server, </w:t>
+      </w:r>
+      <w:proofErr w:type="spellStart"/>
+      <w:r>
+        <w:t>jackson</w:t>
+      </w:r>
+      <w:proofErr w:type="spellEnd"/>
+      <w:r>
+        <w:t xml:space="preserve"> for JSON and other libraries and we take care of their versions too. If any version mismatches, we face errors.</w:t>
+      </w:r>
+    </w:p>
+    <w:p>
+      <w:r>
+        <w:t>Currently most used starter dependencies are</w:t>
+      </w:r>
+    </w:p>
+    <w:p>
+      <w:pPr>
+        <w:numPr>
+          <w:ilvl w:val="0"/>
+          <w:numId w:val="35"/>
+        </w:numPr>
+      </w:pPr>
+      <w:r>
+        <w:t>spring-boot-starter-web/spring-boot-starter-</w:t>
+      </w:r>
+      <w:proofErr w:type="spellStart"/>
+      <w:r>
+        <w:t>webmvc</w:t>
+      </w:r>
+      <w:proofErr w:type="spellEnd"/>
+    </w:p>
+    <w:p>
+      <w:r>
+        <w:t>This dependency includes Spring MVC, embedded tomcat server, Jackson for building RESTful web APIs</w:t>
+      </w:r>
+    </w:p>
+    <w:p>
+      <w:pPr>
+        <w:numPr>
+          <w:ilvl w:val="0"/>
+          <w:numId w:val="36"/>
+        </w:numPr>
+      </w:pPr>
+      <w:r>
+        <w:t>spring-boot-starter-data-</w:t>
+      </w:r>
+      <w:proofErr w:type="spellStart"/>
+      <w:r>
+        <w:t>jpa</w:t>
+      </w:r>
+      <w:proofErr w:type="spellEnd"/>
+      <w:r>
+        <w:t> </w:t>
+      </w:r>
+    </w:p>
+    <w:p>
+      <w:r>
+        <w:t>This dependency includes Spring Data JPA, Hibernate, ORM etc..</w:t>
+      </w:r>
+    </w:p>
+    <w:p>
+      <w:pPr>
+        <w:numPr>
+          <w:ilvl w:val="0"/>
+          <w:numId w:val="37"/>
+        </w:numPr>
+      </w:pPr>
+      <w:r>
+        <w:t>spring-boot-starter-security </w:t>
+      </w:r>
+    </w:p>
+    <w:p>
+      <w:r>
+        <w:t>This dependency includes security/Auth implementations.</w:t>
+      </w:r>
+    </w:p>
+    <w:p>
+      <w:pPr>
+        <w:numPr>
+          <w:ilvl w:val="0"/>
+          <w:numId w:val="38"/>
+        </w:numPr>
+      </w:pPr>
+      <w:r>
+        <w:t>spring-boot-starter-validation</w:t>
+      </w:r>
+    </w:p>
+    <w:p>
+      <w:r>
+        <w:t>This dependency includes the Bean validation implementation</w:t>
+      </w:r>
+    </w:p>
+    <w:p/>
+    <w:p>
+      <w:r>
+        <w:t xml:space="preserve">2) Auto configuration - </w:t>
+      </w:r>
+      <w:proofErr w:type="spellStart"/>
+      <w:r>
+        <w:t>Springboot</w:t>
+      </w:r>
+      <w:proofErr w:type="spellEnd"/>
+      <w:r>
+        <w:t xml:space="preserve"> automatically configures the project based on dependencies that we added in the pom.xml configuration file. No need to configure manually.</w:t>
+      </w:r>
+    </w:p>
+    <w:p>
+      <w:r>
+        <w:t xml:space="preserve">3) </w:t>
+      </w:r>
+      <w:proofErr w:type="spellStart"/>
+      <w:r>
+        <w:t>Springboot</w:t>
+      </w:r>
+      <w:proofErr w:type="spellEnd"/>
+      <w:r>
+        <w:t xml:space="preserve"> Actuator: This feature helps in monitoring our application metrics.</w:t>
+      </w:r>
+    </w:p>
+    <w:p>
+      <w:r>
+        <w:t xml:space="preserve">4) Embedded server: </w:t>
+      </w:r>
+      <w:proofErr w:type="spellStart"/>
+      <w:r>
+        <w:t>Springboot</w:t>
+      </w:r>
+      <w:proofErr w:type="spellEnd"/>
+      <w:r>
+        <w:t xml:space="preserve"> provides an embedded server which is tomcat server. This server comes with </w:t>
+      </w:r>
+      <w:proofErr w:type="spellStart"/>
+      <w:r>
+        <w:t>springboot</w:t>
+      </w:r>
+      <w:proofErr w:type="spellEnd"/>
+      <w:r>
+        <w:t xml:space="preserve"> starter web dependency.</w:t>
+      </w:r>
+    </w:p>
+    <w:p>
+      <w:r>
+        <w:lastRenderedPageBreak/>
+        <w:t xml:space="preserve">5) </w:t>
+      </w:r>
+      <w:proofErr w:type="spellStart"/>
+      <w:r>
+        <w:t>Springboot</w:t>
+      </w:r>
+      <w:proofErr w:type="spellEnd"/>
+      <w:r>
+        <w:t xml:space="preserve"> </w:t>
+      </w:r>
+      <w:proofErr w:type="spellStart"/>
+      <w:r>
+        <w:t>devTools</w:t>
+      </w:r>
+      <w:proofErr w:type="spellEnd"/>
+      <w:r>
+        <w:t>: This feature helps in enhancing productivity during application development. Auto application restarts/ auto re deployment.</w:t>
+      </w:r>
+    </w:p>
+    <w:p>
+      <w:r>
+        <w:t>Advantages:</w:t>
+      </w:r>
+    </w:p>
+    <w:p>
+      <w:pPr>
+        <w:numPr>
+          <w:ilvl w:val="0"/>
+          <w:numId w:val="39"/>
+        </w:numPr>
+      </w:pPr>
+      <w:r>
+        <w:t>Standalone and quick start</w:t>
+      </w:r>
+    </w:p>
+    <w:p>
+      <w:pPr>
+        <w:numPr>
+          <w:ilvl w:val="0"/>
+          <w:numId w:val="39"/>
+        </w:numPr>
+      </w:pPr>
+      <w:r>
+        <w:t>Starter code</w:t>
+      </w:r>
+    </w:p>
+    <w:p>
+      <w:pPr>
+        <w:numPr>
+          <w:ilvl w:val="0"/>
+          <w:numId w:val="39"/>
+        </w:numPr>
+      </w:pPr>
+      <w:r>
+        <w:t>Less configuration</w:t>
+      </w:r>
+    </w:p>
+    <w:p>
+      <w:pPr>
+        <w:numPr>
+          <w:ilvl w:val="0"/>
+          <w:numId w:val="39"/>
+        </w:numPr>
+      </w:pPr>
+      <w:r>
+        <w:t>Reduce cost and development time</w:t>
+      </w:r>
+    </w:p>
+    <w:p>
+      <w:proofErr w:type="spellStart"/>
+      <w:r>
+        <w:t>Springboot</w:t>
+      </w:r>
+      <w:proofErr w:type="spellEnd"/>
+      <w:r>
+        <w:t xml:space="preserve"> Architecture: SB has a layered architecture. Where layers communicate and share data.</w:t>
+      </w:r>
+    </w:p>
+    <w:p>
+      <w:r>
+        <w:t>Auto configuration, embedded server, starter dependencies wrapped around the outside to remove boilerplate.</w:t>
+      </w:r>
+    </w:p>
+    <w:p>
+      <w:pPr>
+        <w:numPr>
+          <w:ilvl w:val="0"/>
+          <w:numId w:val="40"/>
+        </w:numPr>
+      </w:pPr>
+      <w:r>
+        <w:t>Presentation layer (REST endpoints)</w:t>
+      </w:r>
+    </w:p>
+    <w:p>
+      <w:pPr>
+        <w:numPr>
+          <w:ilvl w:val="0"/>
+          <w:numId w:val="40"/>
+        </w:numPr>
+      </w:pPr>
+      <w:r>
+        <w:t>Service layer (Business logic)</w:t>
+      </w:r>
+    </w:p>
+    <w:p>
+      <w:pPr>
+        <w:numPr>
+          <w:ilvl w:val="0"/>
+          <w:numId w:val="40"/>
+        </w:numPr>
+      </w:pPr>
+      <w:r>
+        <w:t>Data layer (Data access)</w:t>
+      </w:r>
+    </w:p>
+    <w:p>
+      <w:r>
+        <w:t>Presentation layer: Presentation layer presents the data on the application features to the user this is the layer where in all the controller classes exist.</w:t>
+      </w:r>
+    </w:p>
+    <w:p>
+      <w:r>
+        <w:t>Service layer: Service layer is where business logic resides in the application. Tasks such as evaluations, decision making, processing of data is done in this layer.</w:t>
+      </w:r>
+    </w:p>
+    <w:p>
+      <w:r>
+        <w:t>Data Access layer: Data access layer is the layer where all the repository classes exist. Database related logic.</w:t>
+      </w:r>
+    </w:p>
+    <w:p>
+      <w:r>
+        <w:t>Client (Browser) -&gt; Controller -&gt; Service -&gt; Repository -&gt; Database</w:t>
+      </w:r>
+    </w:p>
+    <w:p>
+      <w:r>
+        <w:t>Pom.xml: Project Object model</w:t>
+      </w:r>
+    </w:p>
+    <w:p>
+      <w:r>
+        <w:t>The Project Object Model file serves as a configuration XML. It provides essential metadata and build instructions that Maven utilizes to manage the application development lifecycle.</w:t>
+      </w:r>
+    </w:p>
+    <w:p/>
+    <w:p>
       <w:r>
         <w:rPr>
           <w:b/>
           <w:bCs/>
         </w:rPr>
-        <w:t xml:space="preserve">: </w:t>
-      </w:r>
-      <w:r>
-        <w:t>Marks a bean as the default when multiple candidates exist. </w:t>
-      </w:r>
-    </w:p>
-    <w:p>
-      <w:r>
-        <w:t>We specify this annotation at the class level of service classes. So that class behaves as the primary class to inject.</w:t>
-      </w:r>
-    </w:p>
-    <w:p>
-      <w:r>
-        <w:br/>
-      </w:r>
-      <w:r>
-        <w:br/>
-      </w:r>
-      <w:r>
-        <w:br/>
-      </w:r>
-      <w:r>
-        <w:br/>
-      </w:r>
-      <w:r>
-        <w:br/>
-      </w:r>
-      <w:r>
-        <w:br/>
-      </w:r>
-      <w:r>
-        <w:br/>
-      </w:r>
-      <w:r>
-        <w:br/>
-      </w:r>
-      <w:r>
-        <w:br/>
-      </w:r>
-      <w:r>
-        <w:br/>
-      </w:r>
-      <w:r>
-        <w:br/>
-      </w:r>
-      <w:r>
-        <w:br/>
-      </w:r>
-      <w:r>
-        <w:br/>
-      </w:r>
-    </w:p>
-    <w:p>
-      <w:proofErr w:type="spellStart"/>
-      <w:r>
-        <w:t>SpringBoot</w:t>
-      </w:r>
-      <w:proofErr w:type="spellEnd"/>
-      <w:r>
-        <w:t>:</w:t>
-      </w:r>
-      <w:r>
-        <w:br/>
-      </w:r>
-      <w:r>
-        <w:br/>
-      </w:r>
-    </w:p>
-    <w:p>
-      <w:proofErr w:type="spellStart"/>
-      <w:r>
-        <w:t>Springboot</w:t>
-      </w:r>
-      <w:proofErr w:type="spellEnd"/>
-      <w:r>
-        <w:t xml:space="preserve"> is an open-source, JAVA based framework used to create stand-alone, production-grade spring-based applications on top of spring framework.</w:t>
-      </w:r>
-    </w:p>
-    <w:p>
-      <w:r>
-        <w:t xml:space="preserve">Spring vs </w:t>
-      </w:r>
-      <w:proofErr w:type="spellStart"/>
-      <w:r>
-        <w:t>springboot</w:t>
-      </w:r>
-      <w:proofErr w:type="spellEnd"/>
-    </w:p>
-    <w:p>
-      <w:r>
-        <w:t>In spring lots of steps involved in setting up, configuration, writing boilerplate code, deployment of the app.</w:t>
-      </w:r>
-    </w:p>
-    <w:p>
-      <w:pPr>
-        <w:numPr>
-          <w:ilvl w:val="0"/>
-          <w:numId w:val="33"/>
-        </w:numPr>
-      </w:pPr>
-      <w:r>
-        <w:t xml:space="preserve">Manual XML or </w:t>
-      </w:r>
-      <w:proofErr w:type="gramStart"/>
-      <w:r>
-        <w:t>annotation based</w:t>
-      </w:r>
-      <w:proofErr w:type="gramEnd"/>
-      <w:r>
-        <w:t xml:space="preserve"> configuration</w:t>
-      </w:r>
-    </w:p>
-    <w:p>
-      <w:pPr>
-        <w:numPr>
-          <w:ilvl w:val="0"/>
-          <w:numId w:val="33"/>
-        </w:numPr>
-      </w:pPr>
-      <w:r>
-        <w:t>Manually manage dependencies</w:t>
-      </w:r>
-    </w:p>
-    <w:p>
-      <w:pPr>
-        <w:numPr>
-          <w:ilvl w:val="0"/>
-          <w:numId w:val="33"/>
-        </w:numPr>
-      </w:pPr>
-      <w:r>
-        <w:t xml:space="preserve">Manually configure server (tomcat, jetty </w:t>
-      </w:r>
-      <w:proofErr w:type="spellStart"/>
-      <w:r>
-        <w:t>etc</w:t>
-      </w:r>
-      <w:proofErr w:type="spellEnd"/>
-      <w:r>
-        <w:t>…)</w:t>
-      </w:r>
-    </w:p>
-    <w:p>
-      <w:r>
-        <w:t xml:space="preserve">Spring boot is designed to reduce boilerplate code and setup complexity. It provides auto </w:t>
-      </w:r>
-      <w:proofErr w:type="gramStart"/>
-      <w:r>
-        <w:t>configuration</w:t>
-      </w:r>
-      <w:proofErr w:type="gramEnd"/>
-      <w:r>
-        <w:t xml:space="preserve">, embedded local </w:t>
-      </w:r>
-      <w:proofErr w:type="gramStart"/>
-      <w:r>
-        <w:t>server</w:t>
-      </w:r>
-      <w:proofErr w:type="gramEnd"/>
-      <w:r>
-        <w:t xml:space="preserve"> and production-ready features.</w:t>
-      </w:r>
-    </w:p>
-    <w:p/>
-    <w:p>
-      <w:proofErr w:type="spellStart"/>
-      <w:r>
-        <w:lastRenderedPageBreak/>
-        <w:t>Springboot</w:t>
-      </w:r>
-      <w:proofErr w:type="spellEnd"/>
-      <w:r>
-        <w:t xml:space="preserve"> = Spring framework + </w:t>
-      </w:r>
-      <w:proofErr w:type="gramStart"/>
-      <w:r>
-        <w:t>prebuilt-configuration</w:t>
-      </w:r>
-      <w:proofErr w:type="gramEnd"/>
-      <w:r>
-        <w:t xml:space="preserve"> + embedded server.</w:t>
-      </w:r>
-    </w:p>
-    <w:p/>
-    <w:p>
-      <w:proofErr w:type="spellStart"/>
-      <w:r>
-        <w:t>Springboot</w:t>
-      </w:r>
-      <w:proofErr w:type="spellEnd"/>
-      <w:r>
-        <w:t xml:space="preserve"> components:</w:t>
-      </w:r>
-    </w:p>
-    <w:p>
-      <w:pPr>
-        <w:numPr>
-          <w:ilvl w:val="0"/>
-          <w:numId w:val="34"/>
-        </w:numPr>
-      </w:pPr>
-      <w:proofErr w:type="spellStart"/>
-      <w:proofErr w:type="gramStart"/>
-      <w:r>
-        <w:t>Springboot</w:t>
-      </w:r>
-      <w:proofErr w:type="spellEnd"/>
-      <w:proofErr w:type="gramEnd"/>
-      <w:r>
-        <w:t xml:space="preserve"> starters:</w:t>
-      </w:r>
-    </w:p>
-    <w:p>
-      <w:proofErr w:type="spellStart"/>
-      <w:r>
-        <w:t>Springboot</w:t>
-      </w:r>
-      <w:proofErr w:type="spellEnd"/>
-      <w:r>
-        <w:t xml:space="preserve"> starters are collections of pre-built dependencies which will </w:t>
-      </w:r>
-      <w:proofErr w:type="gramStart"/>
-      <w:r>
-        <w:t>be helping</w:t>
-      </w:r>
-      <w:proofErr w:type="gramEnd"/>
-      <w:r>
-        <w:t xml:space="preserve"> in </w:t>
-      </w:r>
-      <w:proofErr w:type="gramStart"/>
-      <w:r>
-        <w:t>built</w:t>
-      </w:r>
-      <w:proofErr w:type="gramEnd"/>
-      <w:r>
-        <w:t xml:space="preserve"> web applications without manual configuration and version checking of each module.</w:t>
-      </w:r>
-    </w:p>
-    <w:p>
-      <w:r>
-        <w:t>These are in the form of maven/</w:t>
-      </w:r>
-      <w:proofErr w:type="spellStart"/>
-      <w:r>
-        <w:t>gradle</w:t>
-      </w:r>
-      <w:proofErr w:type="spellEnd"/>
-      <w:r>
-        <w:t xml:space="preserve"> dependencies.</w:t>
-      </w:r>
-    </w:p>
-    <w:p>
-      <w:r>
-        <w:t xml:space="preserve">Before starters, while building web applications, we manually add Spring MVC, tomcat server, </w:t>
-      </w:r>
-      <w:proofErr w:type="spellStart"/>
-      <w:r>
-        <w:t>jackson</w:t>
-      </w:r>
-      <w:proofErr w:type="spellEnd"/>
-      <w:r>
-        <w:t xml:space="preserve"> for JSON and other libraries and we take care of their versions too. If any version mismatches, we face errors.</w:t>
-      </w:r>
-    </w:p>
-    <w:p>
-      <w:r>
-        <w:t>Currently most used starter dependencies are</w:t>
-      </w:r>
-    </w:p>
-    <w:p>
-      <w:pPr>
-        <w:numPr>
-          <w:ilvl w:val="0"/>
-          <w:numId w:val="35"/>
-        </w:numPr>
-      </w:pPr>
-      <w:r>
-        <w:t>spring-boot-starter-web/spring-boot-starter-</w:t>
-      </w:r>
-      <w:proofErr w:type="spellStart"/>
-      <w:r>
-        <w:t>webmvc</w:t>
-      </w:r>
-      <w:proofErr w:type="spellEnd"/>
-    </w:p>
-    <w:p>
-      <w:r>
-        <w:t>This dependency includes Spring MVC, embedded tomcat server, Jackson for building RESTful web APIs</w:t>
-      </w:r>
-    </w:p>
-    <w:p>
-      <w:pPr>
-        <w:numPr>
-          <w:ilvl w:val="0"/>
-          <w:numId w:val="36"/>
-        </w:numPr>
-      </w:pPr>
-      <w:r>
-        <w:t>spring-boot-starter-data-</w:t>
-      </w:r>
-      <w:proofErr w:type="spellStart"/>
-      <w:r>
-        <w:t>jpa</w:t>
-      </w:r>
-      <w:proofErr w:type="spellEnd"/>
-      <w:r>
-        <w:t> </w:t>
-      </w:r>
-    </w:p>
-    <w:p>
-      <w:r>
-        <w:t xml:space="preserve">This dependency includes Spring Data JPA, Hibernate, ORM </w:t>
-      </w:r>
-      <w:proofErr w:type="gramStart"/>
-      <w:r>
-        <w:t>etc..</w:t>
-      </w:r>
-      <w:proofErr w:type="gramEnd"/>
-    </w:p>
-    <w:p>
-      <w:pPr>
-        <w:numPr>
-          <w:ilvl w:val="0"/>
-          <w:numId w:val="37"/>
-        </w:numPr>
-      </w:pPr>
-      <w:r>
-        <w:t>spring-boot-starter-security </w:t>
-      </w:r>
-    </w:p>
-    <w:p>
-      <w:r>
-        <w:t>This dependency includes security/Auth implementations.</w:t>
-      </w:r>
-    </w:p>
-    <w:p>
-      <w:pPr>
-        <w:numPr>
-          <w:ilvl w:val="0"/>
-          <w:numId w:val="38"/>
-        </w:numPr>
-      </w:pPr>
-      <w:r>
-        <w:t>spring-boot-starter-validation</w:t>
-      </w:r>
-    </w:p>
-    <w:p>
-      <w:r>
-        <w:t>This dependency includes the Bean validation implementation</w:t>
-      </w:r>
-    </w:p>
-    <w:p/>
-    <w:p>
-      <w:r>
-        <w:t xml:space="preserve">2) Auto configuration - </w:t>
-      </w:r>
-      <w:proofErr w:type="spellStart"/>
-      <w:r>
-        <w:t>Springboot</w:t>
-      </w:r>
-      <w:proofErr w:type="spellEnd"/>
-      <w:r>
-        <w:t xml:space="preserve"> automatically configures the project based on dependencies that we added in the pom.xml configuration file. No need to configure manually.</w:t>
-      </w:r>
-    </w:p>
-    <w:p>
-      <w:r>
-        <w:t xml:space="preserve">3) </w:t>
-      </w:r>
-      <w:proofErr w:type="spellStart"/>
-      <w:r>
-        <w:t>Springboot</w:t>
-      </w:r>
-      <w:proofErr w:type="spellEnd"/>
-      <w:r>
-        <w:t xml:space="preserve"> Actuator: This feature helps in monitoring our application metrics.</w:t>
-      </w:r>
-    </w:p>
-    <w:p>
-      <w:r>
-        <w:t xml:space="preserve">4) Embedded server: </w:t>
-      </w:r>
-      <w:proofErr w:type="spellStart"/>
-      <w:r>
-        <w:t>Springboot</w:t>
-      </w:r>
-      <w:proofErr w:type="spellEnd"/>
-      <w:r>
-        <w:t xml:space="preserve"> provides an embedded server which is tomcat server. This server comes with </w:t>
-      </w:r>
-      <w:proofErr w:type="spellStart"/>
-      <w:r>
-        <w:t>springboot</w:t>
-      </w:r>
-      <w:proofErr w:type="spellEnd"/>
-      <w:r>
-        <w:t xml:space="preserve"> starter web dependency.</w:t>
-      </w:r>
-    </w:p>
-    <w:p>
-      <w:r>
-        <w:lastRenderedPageBreak/>
-        <w:t xml:space="preserve">5) </w:t>
-      </w:r>
-      <w:proofErr w:type="spellStart"/>
-      <w:r>
-        <w:t>Springboot</w:t>
-      </w:r>
-      <w:proofErr w:type="spellEnd"/>
-      <w:r>
-        <w:t xml:space="preserve"> </w:t>
-      </w:r>
-      <w:proofErr w:type="spellStart"/>
-      <w:r>
-        <w:t>devTools</w:t>
-      </w:r>
-      <w:proofErr w:type="spellEnd"/>
-      <w:r>
-        <w:t>: This feature helps in enhancing productivity during application development. Auto application restarts/ auto re deployment.</w:t>
-      </w:r>
-    </w:p>
-    <w:p>
-      <w:r>
-        <w:t>Advantages:</w:t>
-      </w:r>
-    </w:p>
-    <w:p>
-      <w:pPr>
-        <w:numPr>
-          <w:ilvl w:val="0"/>
-          <w:numId w:val="39"/>
-        </w:numPr>
-      </w:pPr>
-      <w:r>
-        <w:t>Standalone and quick start</w:t>
-      </w:r>
-    </w:p>
-    <w:p>
-      <w:pPr>
-        <w:numPr>
-          <w:ilvl w:val="0"/>
-          <w:numId w:val="39"/>
-        </w:numPr>
-      </w:pPr>
-      <w:r>
-        <w:t>Starter code</w:t>
-      </w:r>
-    </w:p>
-    <w:p>
-      <w:pPr>
-        <w:numPr>
-          <w:ilvl w:val="0"/>
-          <w:numId w:val="39"/>
-        </w:numPr>
-      </w:pPr>
-      <w:r>
-        <w:t>Less configuration</w:t>
-      </w:r>
-    </w:p>
-    <w:p>
-      <w:pPr>
-        <w:numPr>
-          <w:ilvl w:val="0"/>
-          <w:numId w:val="39"/>
-        </w:numPr>
-      </w:pPr>
-      <w:r>
-        <w:t>Reduce cost and development time</w:t>
-      </w:r>
-    </w:p>
-    <w:p>
-      <w:proofErr w:type="spellStart"/>
-      <w:r>
-        <w:t>Springboot</w:t>
-      </w:r>
-      <w:proofErr w:type="spellEnd"/>
-      <w:r>
-        <w:t xml:space="preserve"> Architecture: SB has </w:t>
-      </w:r>
-      <w:proofErr w:type="gramStart"/>
-      <w:r>
-        <w:t>a layered</w:t>
-      </w:r>
-      <w:proofErr w:type="gramEnd"/>
-      <w:r>
-        <w:t xml:space="preserve"> architecture. Where layers communicate and share data.</w:t>
-      </w:r>
-    </w:p>
-    <w:p>
-      <w:r>
-        <w:t>Auto configuration, embedded server, starter dependencies wrapped around the outside to remove boilerplate.</w:t>
-      </w:r>
-    </w:p>
-    <w:p>
-      <w:pPr>
-        <w:numPr>
-          <w:ilvl w:val="0"/>
-          <w:numId w:val="40"/>
-        </w:numPr>
-      </w:pPr>
-      <w:r>
-        <w:t>Presentation layer (REST endpoints)</w:t>
-      </w:r>
-    </w:p>
-    <w:p>
-      <w:pPr>
-        <w:numPr>
-          <w:ilvl w:val="0"/>
-          <w:numId w:val="40"/>
-        </w:numPr>
-      </w:pPr>
-      <w:r>
-        <w:t>Service layer (Business logic)</w:t>
-      </w:r>
-    </w:p>
-    <w:p>
-      <w:pPr>
-        <w:numPr>
-          <w:ilvl w:val="0"/>
-          <w:numId w:val="40"/>
-        </w:numPr>
-      </w:pPr>
-      <w:r>
-        <w:t>Data layer (Data access)</w:t>
-      </w:r>
-    </w:p>
-    <w:p>
-      <w:r>
-        <w:t>Presentation layer: Presentation layer presents the data on the application features to the user this is the layer where in all the controller classes exist.</w:t>
-      </w:r>
-    </w:p>
-    <w:p>
-      <w:r>
-        <w:t>Service layer: Service layer is where business logic resides in the application. Tasks such as evaluations, decision making</w:t>
-      </w:r>
-      <w:proofErr w:type="gramStart"/>
-      <w:r>
-        <w:t>, processing</w:t>
-      </w:r>
-      <w:proofErr w:type="gramEnd"/>
-      <w:r>
-        <w:t xml:space="preserve"> of data </w:t>
-      </w:r>
-      <w:proofErr w:type="gramStart"/>
-      <w:r>
-        <w:t>is</w:t>
-      </w:r>
-      <w:proofErr w:type="gramEnd"/>
-      <w:r>
-        <w:t xml:space="preserve"> done in this layer.</w:t>
-      </w:r>
-    </w:p>
-    <w:p>
-      <w:r>
-        <w:t>Data Access layer: Data access layer is the layer where all the repository classes exist. Database related logic.</w:t>
-      </w:r>
-    </w:p>
-    <w:p>
-      <w:r>
-        <w:t>Client (Browser) -&gt; Controller -&gt; Service -&gt; Repository -&gt; Database</w:t>
-      </w:r>
-    </w:p>
-    <w:p>
-      <w:r>
-        <w:t>Pom.xml: Project Object model</w:t>
-      </w:r>
-    </w:p>
-    <w:p>
-      <w:r>
-        <w:t xml:space="preserve">The Project Object Model file serves as a configuration XML. It provides essential metadata and </w:t>
-      </w:r>
-      <w:proofErr w:type="gramStart"/>
-      <w:r>
-        <w:t>build</w:t>
-      </w:r>
-      <w:proofErr w:type="gramEnd"/>
-      <w:r>
-        <w:t xml:space="preserve"> instructions that Maven utilizes to manage the application development lifecycle.</w:t>
-      </w:r>
-    </w:p>
-    <w:p/>
-    <w:p>
-      <w:proofErr w:type="gramStart"/>
-      <w:r>
-        <w:rPr>
-          <w:b/>
-          <w:bCs/>
-        </w:rPr>
-        <w:t>@SpringBootApplication</w:t>
-      </w:r>
-      <w:proofErr w:type="gramEnd"/>
-      <w:r>
-        <w:rPr>
-          <w:b/>
-          <w:bCs/>
-        </w:rPr>
-        <w:t>:</w:t>
+        <w:t>@SpringBootApplication:</w:t>
       </w:r>
       <w:r>
         <w:t xml:space="preserve"> This annotation specifies this project as a </w:t>
@@ -3110,13 +2623,8 @@
       </w:r>
     </w:p>
     <w:p>
-      <w:proofErr w:type="gramStart"/>
-      <w:r>
-        <w:t>Dependencies are</w:t>
-      </w:r>
-      <w:proofErr w:type="gramEnd"/>
-      <w:r>
-        <w:t xml:space="preserve"> external libraries which are required to make our web application functional.</w:t>
+      <w:r>
+        <w:t>Dependencies are external libraries which are required to make our web application functional.</w:t>
       </w:r>
     </w:p>
     <w:p>
@@ -3145,32 +2653,17 @@
     <w:p/>
     <w:p>
       <w:proofErr w:type="spellStart"/>
-      <w:proofErr w:type="gramStart"/>
       <w:r>
         <w:t>Lets</w:t>
       </w:r>
       <w:proofErr w:type="spellEnd"/>
-      <w:proofErr w:type="gramEnd"/>
-      <w:r>
-        <w:t xml:space="preserve"> build our first RESTful API, </w:t>
-      </w:r>
-      <w:proofErr w:type="gramStart"/>
-      <w:r>
-        <w:t>for that</w:t>
-      </w:r>
-      <w:proofErr w:type="gramEnd"/>
-      <w:r>
-        <w:t xml:space="preserve"> we need a presentation layer which means, controller class is needed to manage REST endpoints.</w:t>
-      </w:r>
-    </w:p>
-    <w:p>
-      <w:proofErr w:type="gramStart"/>
-      <w:r>
-        <w:t>@Controller</w:t>
-      </w:r>
-      <w:proofErr w:type="gramEnd"/>
-      <w:r>
-        <w:t>: this annotation specifies the class as a controller class which manages the web requests and responses.</w:t>
+      <w:r>
+        <w:t xml:space="preserve"> build our first RESTful API, for that we need a presentation layer which means, controller class is needed to manage REST endpoints.</w:t>
+      </w:r>
+    </w:p>
+    <w:p>
+      <w:r>
+        <w:t>@Controller: this annotation specifies the class as a controller class which manages the web requests and responses.</w:t>
       </w:r>
     </w:p>
     <w:p>
@@ -3192,15 +2685,7 @@
       </w:r>
       <w:proofErr w:type="spellEnd"/>
       <w:r>
-        <w:t xml:space="preserve"> is the front controller in Spring MVC. A </w:t>
-      </w:r>
-      <w:proofErr w:type="gramStart"/>
-      <w:r>
-        <w:t>single entry</w:t>
-      </w:r>
-      <w:proofErr w:type="gramEnd"/>
-      <w:r>
-        <w:t xml:space="preserve"> point that receives every incoming HTTP request and routes it to the right handler (controller). Instead of each URL mapping to a separate servlet, all requests go through this one servlet, which then delegates the actual work.</w:t>
+        <w:t xml:space="preserve"> is the front controller in Spring MVC. A single entry point that receives every incoming HTTP request and routes it to the right handler (controller). Instead of each URL mapping to a separate servlet, all requests go through this one servlet, which then delegates the actual work.</w:t>
       </w:r>
     </w:p>
     <w:p/>
@@ -3230,15 +2715,7 @@
       </w:r>
       <w:proofErr w:type="spellEnd"/>
       <w:r>
-        <w:t xml:space="preserve"> — figures out which controller method should handle this URL (based </w:t>
-      </w:r>
-      <w:proofErr w:type="gramStart"/>
-      <w:r>
-        <w:t>on @RequestMapping, @</w:t>
-      </w:r>
-      <w:proofErr w:type="gramEnd"/>
-      <w:r>
-        <w:t>GetMapping, etc.)</w:t>
+        <w:t xml:space="preserve"> — figures out which controller method should handle this URL (based on @RequestMapping, @GetMapping, etc.)</w:t>
       </w:r>
     </w:p>
     <w:p>
@@ -3254,15 +2731,7 @@
       </w:r>
       <w:proofErr w:type="spellEnd"/>
       <w:r>
-        <w:t xml:space="preserve"> — </w:t>
-      </w:r>
-      <w:proofErr w:type="gramStart"/>
-      <w:r>
-        <w:t>actually invokes</w:t>
-      </w:r>
-      <w:proofErr w:type="gramEnd"/>
-      <w:r>
-        <w:t xml:space="preserve"> that controller method</w:t>
+        <w:t xml:space="preserve"> — actually invokes that controller method</w:t>
       </w:r>
     </w:p>
     <w:p>
@@ -3281,15 +2750,7 @@
       </w:r>
       <w:proofErr w:type="spellEnd"/>
       <w:r>
-        <w:t xml:space="preserve"> (or in REST APIs, the response body directly </w:t>
-      </w:r>
-      <w:proofErr w:type="gramStart"/>
-      <w:r>
-        <w:t>via @ResponseBody/@</w:t>
-      </w:r>
-      <w:proofErr w:type="gramEnd"/>
-      <w:r>
-        <w:t>RestController)</w:t>
+        <w:t xml:space="preserve"> (or in REST APIs, the response body directly via @ResponseBody/@RestController)</w:t>
       </w:r>
     </w:p>
     <w:p/>
@@ -3308,12 +2769,10 @@
         <w:t xml:space="preserve">The </w:t>
       </w:r>
       <w:proofErr w:type="spellStart"/>
-      <w:proofErr w:type="gramStart"/>
       <w:r>
         <w:t>application.properties</w:t>
       </w:r>
       <w:proofErr w:type="spellEnd"/>
-      <w:proofErr w:type="gramEnd"/>
       <w:r>
         <w:t xml:space="preserve"> is a file we use to customize the pre-configurations of component logics in </w:t>
       </w:r>
@@ -3328,42 +2787,19 @@
     </w:p>
     <w:p/>
     <w:p>
-      <w:proofErr w:type="gramStart"/>
-      <w:r>
-        <w:t>@PathVariable</w:t>
-      </w:r>
-      <w:proofErr w:type="gramEnd"/>
-      <w:r>
-        <w:t>: </w:t>
-      </w:r>
-    </w:p>
-    <w:p>
-      <w:proofErr w:type="gramStart"/>
+      <w:r>
+        <w:t>@PathVariable: </w:t>
+      </w:r>
+    </w:p>
+    <w:p>
       <w:r>
         <w:lastRenderedPageBreak/>
-        <w:t>@PathVariable</w:t>
-      </w:r>
-      <w:proofErr w:type="gramEnd"/>
-      <w:r>
-        <w:t xml:space="preserve"> annotation is used to extract dynamic values from the URL path and bind them to method parameters in the Rest controllers.</w:t>
-      </w:r>
-    </w:p>
-    <w:p>
-      <w:proofErr w:type="gramStart"/>
-      <w:r>
-        <w:t>@GetMapping</w:t>
-      </w:r>
-      <w:proofErr w:type="gramEnd"/>
-      <w:r>
-        <w:t>("/</w:t>
-      </w:r>
-      <w:proofErr w:type="gramStart"/>
-      <w:r>
-        <w:t>users/{id}"</w:t>
-      </w:r>
-      <w:proofErr w:type="gramEnd"/>
-      <w:r>
-        <w:t>)</w:t>
+        <w:t>@PathVariable annotation is used to extract dynamic values from the URL path and bind them to method parameters in the Rest controllers.</w:t>
+      </w:r>
+    </w:p>
+    <w:p>
+      <w:r>
+        <w:t>@GetMapping("/users/{id}")</w:t>
       </w:r>
     </w:p>
     <w:p>
@@ -3371,23 +2807,13 @@
         <w:t xml:space="preserve">public String </w:t>
       </w:r>
       <w:proofErr w:type="spellStart"/>
-      <w:proofErr w:type="gramStart"/>
       <w:r>
         <w:t>getUserById</w:t>
       </w:r>
       <w:proofErr w:type="spellEnd"/>
       <w:r>
-        <w:t>(</w:t>
-      </w:r>
-      <w:proofErr w:type="gramEnd"/>
-      <w:r>
-        <w:t xml:space="preserve">@PathVariable int </w:t>
-      </w:r>
-      <w:proofErr w:type="gramStart"/>
-      <w:r>
-        <w:t>id) {</w:t>
-      </w:r>
-      <w:proofErr w:type="gramEnd"/>
+        <w:t>(@PathVariable int id) {</w:t>
+      </w:r>
     </w:p>
     <w:p>
       <w:r>
@@ -3423,15 +2849,7 @@
         </w:numPr>
       </w:pPr>
       <w:r>
-        <w:t xml:space="preserve">We can explicitly </w:t>
-      </w:r>
-      <w:proofErr w:type="gramStart"/>
-      <w:r>
-        <w:t>mention in</w:t>
-      </w:r>
-      <w:proofErr w:type="gramEnd"/>
-      <w:r>
-        <w:t xml:space="preserve"> the variable name of annotation in the method parameter.</w:t>
+        <w:t>We can explicitly mention in the variable name of annotation in the method parameter.</w:t>
       </w:r>
     </w:p>
     <w:p>
@@ -3440,21 +2858,8 @@
       </w:r>
     </w:p>
     <w:p>
-      <w:proofErr w:type="gramStart"/>
-      <w:r>
-        <w:t>@GetMapping</w:t>
-      </w:r>
-      <w:proofErr w:type="gramEnd"/>
-      <w:r>
-        <w:t>("/</w:t>
-      </w:r>
-      <w:proofErr w:type="gramStart"/>
-      <w:r>
-        <w:t>books/{isbn}"</w:t>
-      </w:r>
-      <w:proofErr w:type="gramEnd"/>
-      <w:r>
-        <w:t>)</w:t>
+      <w:r>
+        <w:t>@GetMapping("/books/{isbn}")</w:t>
       </w:r>
     </w:p>
     <w:p>
@@ -3470,7 +2875,6 @@
         <w:t xml:space="preserve">(@PathVariable("isbn") String </w:t>
       </w:r>
       <w:proofErr w:type="spellStart"/>
-      <w:proofErr w:type="gramStart"/>
       <w:r>
         <w:t>bookCode</w:t>
       </w:r>
@@ -3478,7 +2882,6 @@
       <w:r>
         <w:t>) {</w:t>
       </w:r>
-      <w:proofErr w:type="gramEnd"/>
     </w:p>
     <w:p>
       <w:r>
@@ -3518,21 +2921,8 @@
       </w:r>
     </w:p>
     <w:p>
-      <w:proofErr w:type="gramStart"/>
-      <w:r>
-        <w:t>@GetMapping</w:t>
-      </w:r>
-      <w:proofErr w:type="gramEnd"/>
-      <w:r>
-        <w:t>("/</w:t>
-      </w:r>
-      <w:proofErr w:type="gramStart"/>
-      <w:r>
-        <w:t>orders/{userId}/order/{orderId}"</w:t>
-      </w:r>
-      <w:proofErr w:type="gramEnd"/>
-      <w:r>
-        <w:t>)</w:t>
+      <w:r>
+        <w:t>@GetMapping("/orders/{userId}/order/{orderId}")</w:t>
       </w:r>
     </w:p>
     <w:p>
@@ -3540,30 +2930,20 @@
         <w:t xml:space="preserve">public String </w:t>
       </w:r>
       <w:proofErr w:type="spellStart"/>
-      <w:proofErr w:type="gramStart"/>
       <w:r>
         <w:t>getOrder</w:t>
       </w:r>
       <w:proofErr w:type="spellEnd"/>
       <w:r>
-        <w:t>(</w:t>
-      </w:r>
-      <w:proofErr w:type="gramEnd"/>
-      <w:r>
-        <w:t xml:space="preserve">@PathVariable int </w:t>
+        <w:t xml:space="preserve">(@PathVariable int </w:t>
       </w:r>
       <w:proofErr w:type="spellStart"/>
-      <w:proofErr w:type="gramStart"/>
       <w:r>
         <w:t>userId</w:t>
       </w:r>
       <w:proofErr w:type="spellEnd"/>
       <w:r>
-        <w:t>, @</w:t>
-      </w:r>
-      <w:proofErr w:type="gramEnd"/>
-      <w:r>
-        <w:t xml:space="preserve">PathVariable int </w:t>
+        <w:t xml:space="preserve">, @PathVariable int </w:t>
       </w:r>
       <w:proofErr w:type="spellStart"/>
       <w:r>
@@ -3661,34 +3041,13 @@
       </w:r>
     </w:p>
     <w:p>
-      <w:proofErr w:type="gramStart"/>
-      <w:r>
-        <w:t>@Entity</w:t>
-      </w:r>
-      <w:proofErr w:type="gramEnd"/>
-      <w:r>
-        <w:t>: Marks the class as a JPA entity. JPA will manage this object for persistence.</w:t>
-      </w:r>
-    </w:p>
-    <w:p>
-      <w:r>
-        <w:t>@</w:t>
-      </w:r>
-      <w:proofErr w:type="gramStart"/>
-      <w:r>
-        <w:t>Table(</w:t>
-      </w:r>
-      <w:proofErr w:type="gramEnd"/>
-      <w:r>
-        <w:t xml:space="preserve">name = "employees"): Maps the entity to the </w:t>
-      </w:r>
-      <w:proofErr w:type="gramStart"/>
-      <w:r>
-        <w:t>employees</w:t>
-      </w:r>
-      <w:proofErr w:type="gramEnd"/>
-      <w:r>
-        <w:t xml:space="preserve"> table. Optional if table name is the same as class name.</w:t>
+      <w:r>
+        <w:t>@Entity: Marks the class as a JPA entity. JPA will manage this object for persistence.</w:t>
+      </w:r>
+    </w:p>
+    <w:p>
+      <w:r>
+        <w:t>@Table(name = "employees"): Maps the entity to the employees table. Optional if table name is the same as class name.</w:t>
       </w:r>
     </w:p>
     <w:p>
@@ -3711,15 +3070,7 @@
     </w:p>
     <w:p>
       <w:r>
-        <w:t>@</w:t>
-      </w:r>
-      <w:proofErr w:type="gramStart"/>
-      <w:r>
-        <w:t>Column(</w:t>
-      </w:r>
-      <w:proofErr w:type="gramEnd"/>
-      <w:r>
-        <w:t>name = "name"): Maps a field to a specific column in the database. Optional if field name matches column name.</w:t>
+        <w:t>@Column(name = "name"): Maps a field to a specific column in the database. Optional if field name matches column name.</w:t>
       </w:r>
     </w:p>
     <w:p>
@@ -3729,15 +3080,7 @@
     </w:p>
     <w:p>
       <w:r>
-        <w:t xml:space="preserve">Optional&lt;T&gt; is a container object used to represent the presence or absence of </w:t>
-      </w:r>
-      <w:proofErr w:type="gramStart"/>
-      <w:r>
-        <w:t>a value</w:t>
-      </w:r>
-      <w:proofErr w:type="gramEnd"/>
-      <w:r>
-        <w:t xml:space="preserve">. It prevents </w:t>
+        <w:t xml:space="preserve">Optional&lt;T&gt; is a container object used to represent the presence or absence of a value. It prevents </w:t>
       </w:r>
       <w:proofErr w:type="spellStart"/>
       <w:r>
@@ -3751,15 +3094,7 @@
     <w:p/>
     <w:p>
       <w:r>
-        <w:t xml:space="preserve">Getters and </w:t>
-      </w:r>
-      <w:proofErr w:type="gramStart"/>
-      <w:r>
-        <w:t>setters</w:t>
-      </w:r>
-      <w:proofErr w:type="gramEnd"/>
-      <w:r>
-        <w:t xml:space="preserve"> are really needed in the MODEL classes, when we are developing web applications. Without them, we cannot store and fetch values from DB.</w:t>
+        <w:t>Getters and setters are really needed in the MODEL classes, when we are developing web applications. Without them, we cannot store and fetch values from DB.</w:t>
       </w:r>
     </w:p>
     <w:p/>
@@ -3838,25 +3173,12 @@
     </w:p>
     <w:p>
       <w:r>
-        <w:t>@</w:t>
-      </w:r>
-      <w:proofErr w:type="gramStart"/>
-      <w:r>
-        <w:t>Size(</w:t>
-      </w:r>
-      <w:proofErr w:type="gramEnd"/>
-      <w:r>
-        <w:t>min = x, max = y)</w:t>
-      </w:r>
-    </w:p>
-    <w:p>
-      <w:proofErr w:type="gramStart"/>
-      <w:r>
-        <w:t>@Email</w:t>
-      </w:r>
-      <w:proofErr w:type="gramEnd"/>
-      <w:r>
-        <w:t>  </w:t>
+        <w:t>@Size(min = x, max = y)</w:t>
+      </w:r>
+    </w:p>
+    <w:p>
+      <w:r>
+        <w:t>@Email  </w:t>
       </w:r>
     </w:p>
     <w:p>
@@ -3913,15 +3235,7 @@
       </w:r>
       <w:proofErr w:type="spellEnd"/>
       <w:r>
-        <w:t xml:space="preserve"> as @</w:t>
-      </w:r>
-      <w:proofErr w:type="gramStart"/>
-      <w:r>
-        <w:t>NotEmpty(</w:t>
-      </w:r>
-      <w:proofErr w:type="gramEnd"/>
-      <w:r>
-        <w:t>message = “</w:t>
+        <w:t xml:space="preserve"> as @NotEmpty(message = “</w:t>
       </w:r>
       <w:proofErr w:type="spellStart"/>
       <w:r>
@@ -3932,12 +3246,10 @@
         <w:t xml:space="preserve"> </w:t>
       </w:r>
       <w:proofErr w:type="spellStart"/>
-      <w:proofErr w:type="gramStart"/>
       <w:r>
         <w:t>cant</w:t>
       </w:r>
       <w:proofErr w:type="spellEnd"/>
-      <w:proofErr w:type="gramEnd"/>
       <w:r>
         <w:t xml:space="preserve"> be blank”)</w:t>
       </w:r>
@@ -3957,28 +3269,12 @@
     </w:p>
     <w:p>
       <w:r>
-        <w:t xml:space="preserve">I get response as 500 internal </w:t>
-      </w:r>
-      <w:proofErr w:type="gramStart"/>
-      <w:r>
-        <w:t>error</w:t>
-      </w:r>
-      <w:proofErr w:type="gramEnd"/>
-      <w:r>
-        <w:t>.</w:t>
-      </w:r>
-    </w:p>
-    <w:p>
-      <w:r>
-        <w:t xml:space="preserve">In console logs, we </w:t>
-      </w:r>
-      <w:proofErr w:type="gramStart"/>
-      <w:r>
-        <w:t>can</w:t>
-      </w:r>
-      <w:proofErr w:type="gramEnd"/>
-      <w:r>
-        <w:t xml:space="preserve"> able to see exception of </w:t>
+        <w:t>I get response as 500 internal error.</w:t>
+      </w:r>
+    </w:p>
+    <w:p>
+      <w:r>
+        <w:t xml:space="preserve">In console logs, we can able to see exception of </w:t>
       </w:r>
       <w:proofErr w:type="spellStart"/>
       <w:r>
@@ -3992,24 +3288,14 @@
     <w:p/>
     <w:p>
       <w:r>
-        <w:t xml:space="preserve">In the process of making this more user friendly, we can </w:t>
-      </w:r>
-      <w:proofErr w:type="gramStart"/>
-      <w:r>
-        <w:t>use @</w:t>
-      </w:r>
-      <w:proofErr w:type="gramEnd"/>
-      <w:r>
-        <w:t>Valid annotation at controller class.</w:t>
+        <w:t>In the process of making this more user friendly, we can use @Valid annotation at controller class.</w:t>
       </w:r>
     </w:p>
     <w:p/>
     <w:p>
-      <w:proofErr w:type="gramStart"/>
       <w:r>
         <w:t>Using @</w:t>
       </w:r>
-      <w:proofErr w:type="gramEnd"/>
       <w:r>
         <w:t>Valid in controller at parameter level of the request</w:t>
       </w:r>
@@ -4019,23 +3305,7 @@
     </w:p>
     <w:p>
       <w:r>
-        <w:t xml:space="preserve">After </w:t>
-      </w:r>
-      <w:proofErr w:type="gramStart"/>
-      <w:r>
-        <w:t>using @</w:t>
-      </w:r>
-      <w:proofErr w:type="gramEnd"/>
-      <w:r>
-        <w:t xml:space="preserve">Valid annotation, the response will be 400 bad </w:t>
-      </w:r>
-      <w:proofErr w:type="gramStart"/>
-      <w:r>
-        <w:t>request</w:t>
-      </w:r>
-      <w:proofErr w:type="gramEnd"/>
-      <w:r>
-        <w:t xml:space="preserve">, and in console logs, we can find exception of </w:t>
+        <w:t xml:space="preserve">After using @Valid annotation, the response will be 400 bad request, and in console logs, we can find exception of </w:t>
       </w:r>
       <w:r>
         <w:rPr>
@@ -4071,41 +3341,12 @@
     </w:p>
     <w:p>
       <w:r>
-        <w:t xml:space="preserve">@RestControllerAdvice is a specialized version of @ControllerAdvice in Spring Boot, designed to handle exceptions in RESTful APIs. It combines the functionality </w:t>
-      </w:r>
-      <w:proofErr w:type="gramStart"/>
-      <w:r>
-        <w:t>of @</w:t>
-      </w:r>
-      <w:proofErr w:type="gramEnd"/>
-      <w:r>
-        <w:t xml:space="preserve">ControllerAdvice </w:t>
-      </w:r>
-      <w:proofErr w:type="gramStart"/>
-      <w:r>
-        <w:t>and @</w:t>
-      </w:r>
-      <w:proofErr w:type="gramEnd"/>
-      <w:r>
-        <w:t>ResponseBody, making it easier to manage exceptions globally and return JSON responses.</w:t>
-      </w:r>
-    </w:p>
-    <w:p>
-      <w:proofErr w:type="gramStart"/>
-      <w:r>
-        <w:t>Since @</w:t>
-      </w:r>
-      <w:proofErr w:type="gramEnd"/>
-      <w:r>
-        <w:t xml:space="preserve">RestControllerAdvice </w:t>
-      </w:r>
-      <w:proofErr w:type="gramStart"/>
-      <w:r>
-        <w:t>includes @</w:t>
-      </w:r>
-      <w:proofErr w:type="gramEnd"/>
-      <w:r>
-        <w:t>ResponseBody, any object returned from the exception handler methods is automatically serialized into JSON and sent back to the client.</w:t>
+        <w:t>@RestControllerAdvice is a specialized version of @ControllerAdvice in Spring Boot, designed to handle exceptions in RESTful APIs. It combines the functionality of @ControllerAdvice and @ResponseBody, making it easier to manage exceptions globally and return JSON responses.</w:t>
+      </w:r>
+    </w:p>
+    <w:p>
+      <w:r>
+        <w:t>Since @RestControllerAdvice includes @ResponseBody, any object returned from the exception handler methods is automatically serialized into JSON and sent back to the client.</w:t>
       </w:r>
     </w:p>
     <w:p/>
@@ -4130,7 +3371,19 @@
         </w:numPr>
       </w:pPr>
       <w:r>
-        <w:t>We create customException class and extend RuntimeException and implement logic.</w:t>
+        <w:t xml:space="preserve">We create customException class </w:t>
+      </w:r>
+      <w:r>
+        <w:t>with</w:t>
+      </w:r>
+      <w:r>
+        <w:t xml:space="preserve"> extend</w:t>
+      </w:r>
+      <w:r>
+        <w:t>ing</w:t>
+      </w:r>
+      <w:r>
+        <w:t xml:space="preserve"> RuntimeException and implement logic.</w:t>
       </w:r>
     </w:p>
     <w:p>
@@ -4161,15 +3414,7 @@
         <w:ind w:left="1080"/>
       </w:pPr>
       <w:r>
-        <w:t>@</w:t>
-      </w:r>
-      <w:proofErr w:type="gramStart"/>
-      <w:r>
-        <w:t>ExceptionHandler(</w:t>
-      </w:r>
-      <w:proofErr w:type="gramEnd"/>
-      <w:r>
-        <w:t>APIException.class)</w:t>
+        <w:t>@ExceptionHandler(APIException.class)</w:t>
       </w:r>
       <w:r>
         <w:br/>
@@ -4184,7 +3429,6 @@
         <w:t xml:space="preserve">&lt;String&gt; </w:t>
       </w:r>
       <w:proofErr w:type="spellStart"/>
-      <w:proofErr w:type="gramStart"/>
       <w:r>
         <w:t>ApiException</w:t>
       </w:r>
@@ -4193,7 +3437,6 @@
         <w:t>(</w:t>
       </w:r>
       <w:proofErr w:type="spellStart"/>
-      <w:proofErr w:type="gramEnd"/>
       <w:r>
         <w:t>APIException</w:t>
       </w:r>
@@ -4210,12 +3453,10 @@
         <w:t xml:space="preserve">    String message = </w:t>
       </w:r>
       <w:proofErr w:type="spellStart"/>
-      <w:proofErr w:type="gramStart"/>
       <w:r>
         <w:t>exception.getMessage</w:t>
       </w:r>
       <w:proofErr w:type="spellEnd"/>
-      <w:proofErr w:type="gramEnd"/>
       <w:r>
         <w:t>();</w:t>
       </w:r>
@@ -4229,15 +3470,7 @@
       </w:r>
       <w:proofErr w:type="spellEnd"/>
       <w:r>
-        <w:t>&lt;</w:t>
-      </w:r>
-      <w:proofErr w:type="gramStart"/>
-      <w:r>
-        <w:t>&gt;(</w:t>
-      </w:r>
-      <w:proofErr w:type="gramEnd"/>
-      <w:r>
-        <w:t xml:space="preserve">message, </w:t>
+        <w:t xml:space="preserve">&lt;&gt;(message, </w:t>
       </w:r>
       <w:proofErr w:type="spellStart"/>
       <w:r>
@@ -4263,6 +3496,86 @@
       <w:pPr>
         <w:ind w:left="1080"/>
       </w:pPr>
+    </w:p>
+    <w:p>
+      <w:r>
+        <w:t>Pagination:</w:t>
+      </w:r>
+      <w:r>
+        <w:br/>
+        <w:t>Pagination is a technique of dividing a large body of con tent or data into smaller, discrete and numbered pages.</w:t>
+      </w:r>
+    </w:p>
+    <w:p>
+      <w:r>
+        <w:t>Advantages:</w:t>
+      </w:r>
+    </w:p>
+    <w:p/>
+    <w:p>
+      <w:pPr>
+        <w:pStyle w:val="ListParagraph"/>
+        <w:numPr>
+          <w:ilvl w:val="1"/>
+          <w:numId w:val="36"/>
+        </w:numPr>
+      </w:pPr>
+      <w:r>
+        <w:t>Data splitting: break ups long list of items such as e-commerce products, blogs, search results into manageable chunks.</w:t>
+      </w:r>
+    </w:p>
+    <w:p>
+      <w:pPr>
+        <w:pStyle w:val="ListParagraph"/>
+        <w:numPr>
+          <w:ilvl w:val="1"/>
+          <w:numId w:val="36"/>
+        </w:numPr>
+      </w:pPr>
+      <w:r>
+        <w:t>Navigation: Allows user to navigate through content using ‘next’ and ‘previous’ and numerical page number.</w:t>
+      </w:r>
+    </w:p>
+    <w:p>
+      <w:pPr>
+        <w:pStyle w:val="ListParagraph"/>
+        <w:numPr>
+          <w:ilvl w:val="1"/>
+          <w:numId w:val="36"/>
+        </w:numPr>
+      </w:pPr>
+      <w:r>
+        <w:t>Performance: Improves website speed and server efficiency by loading only a small subset of records at a time rather than thousands of records at once.</w:t>
+      </w:r>
+    </w:p>
+    <w:p/>
+    <w:p/>
+    <w:p/>
+    <w:p/>
+    <w:p>
+      <w:r>
+        <w:lastRenderedPageBreak/>
+        <w:t xml:space="preserve">Pagination in </w:t>
+      </w:r>
+      <w:proofErr w:type="spellStart"/>
+      <w:r>
+        <w:t>Springboot</w:t>
+      </w:r>
+      <w:proofErr w:type="spellEnd"/>
+      <w:r>
+        <w:t>.</w:t>
+      </w:r>
+    </w:p>
+    <w:p>
+      <w:r>
+        <w:t>Pagination in Spring Boot is typically handled through Spring Data JPA's Pageable and Page</w:t>
+      </w:r>
+      <w:r>
+        <w:t xml:space="preserve">&lt;T&gt; </w:t>
+      </w:r>
+      <w:r>
+        <w:t>abstractions, which take care of the SQL LIMIT/OFFSET work for you.</w:t>
+      </w:r>
     </w:p>
     <w:p/>
     <w:sectPr>
@@ -4276,7 +3589,7 @@
 </file>
 
 <file path=word/numbering.xml><?xml version="1.0" encoding="utf-8"?>
-<w:numbering xmlns:wpc="http://schemas.microsoft.com/office/word/2010/wordprocessingCanvas" xmlns:cx="http://schemas.microsoft.com/office/drawing/2014/chartex" xmlns:cx1="http://schemas.microsoft.com/office/drawing/2015/9/8/chartex" xmlns:cx2="http://schemas.microsoft.com/office/drawing/2015/10/21/chartex" xmlns:cx3="http://schemas.microsoft.com/office/drawing/2016/5/9/chartex" xmlns:cx4="http://schemas.microsoft.com/office/drawing/2016/5/10/chartex" xmlns:cx5="http://schemas.microsoft.com/office/drawing/2016/5/11/chartex" xmlns:cx6="http://schemas.microsoft.com/office/drawing/2016/5/12/chartex" xmlns:cx7="http://schemas.microsoft.com/office/drawing/2016/5/13/chartex" xmlns:cx8="http://schemas.microsoft.com/office/drawing/2016/5/14/chartex" xmlns:mc="http://schemas.openxmlformats.org/markup-compatibility/2006" xmlns:aink="http://schemas.microsoft.com/office/drawing/2016/ink" xmlns:am3d="http://schemas.microsoft.com/office/drawing/2017/model3d" xmlns:o="urn:schemas-microsoft-com:office:office" xmlns:oel="http://schemas.microsoft.com/office/2019/extlst" xmlns:r="http://schemas.openxmlformats.org/officeDocument/2006/relationships" xmlns:m="http://schemas.openxmlformats.org/officeDocument/2006/math" xmlns:v="urn:schemas-microsoft-com:vml" xmlns:wp14="http://schemas.microsoft.com/office/word/2010/wordprocessingDrawing" xmlns:wp="http://schemas.openxmlformats.org/drawingml/2006/wordprocessingDrawing" xmlns:w10="urn:schemas-microsoft-com:office:word" xmlns:w="http://schemas.openxmlformats.org/wordprocessingml/2006/main" xmlns:w14="http://schemas.microsoft.com/office/word/2010/wordml" xmlns:w15="http://schemas.microsoft.com/office/word/2012/wordml" xmlns:w16cei="http://schemas.microsoft.com/office/word/2026/wordml/cei" xmlns:w16cex="http://schemas.microsoft.com/office/word/2018/wordml/cex" xmlns:w16cid="http://schemas.microsoft.com/office/word/2016/wordml/cid" xmlns:w16="http://schemas.microsoft.com/office/word/2018/wordml" xmlns:w16du="http://schemas.microsoft.com/office/word/2023/wordml/word16du" xmlns:w16sdtdh="http://schemas.microsoft.com/office/word/2020/wordml/sdtdatahash" xmlns:w16sdtfl="http://schemas.microsoft.com/office/word/2024/wordml/sdtformatlock" xmlns:w16se="http://schemas.microsoft.com/office/word/2015/wordml/symex" xmlns:wpg="http://schemas.microsoft.com/office/word/2010/wordprocessingGroup" xmlns:wpi="http://schemas.microsoft.com/office/word/2010/wordprocessingInk" xmlns:wne="http://schemas.microsoft.com/office/word/2006/wordml" xmlns:wps="http://schemas.microsoft.com/office/word/2010/wordprocessingShape" mc:Ignorable="w14 w15 w16se w16cid w16 w16cex w16sdtdh w16sdtfl w16du wp14">
+<w:numbering xmlns:wpc="http://schemas.microsoft.com/office/word/2010/wordprocessingCanvas" xmlns:cx="http://schemas.microsoft.com/office/drawing/2014/chartex" xmlns:cx1="http://schemas.microsoft.com/office/drawing/2015/9/8/chartex" xmlns:cx2="http://schemas.microsoft.com/office/drawing/2015/10/21/chartex" xmlns:cx3="http://schemas.microsoft.com/office/drawing/2016/5/9/chartex" xmlns:cx4="http://schemas.microsoft.com/office/drawing/2016/5/10/chartex" xmlns:cx5="http://schemas.microsoft.com/office/drawing/2016/5/11/chartex" xmlns:cx6="http://schemas.microsoft.com/office/drawing/2016/5/12/chartex" xmlns:cx7="http://schemas.microsoft.com/office/drawing/2016/5/13/chartex" xmlns:cx8="http://schemas.microsoft.com/office/drawing/2016/5/14/chartex" xmlns:mc="http://schemas.openxmlformats.org/markup-compatibility/2006" xmlns:aink="http://schemas.microsoft.com/office/drawing/2016/ink" xmlns:am3d="http://schemas.microsoft.com/office/drawing/2017/model3d" xmlns:o="urn:schemas-microsoft-com:office:office" xmlns:oel="http://schemas.microsoft.com/office/2019/extlst" xmlns:r="http://schemas.openxmlformats.org/officeDocument/2006/relationships" xmlns:m="http://schemas.openxmlformats.org/officeDocument/2006/math" xmlns:v="urn:schemas-microsoft-com:vml" xmlns:wp14="http://schemas.microsoft.com/office/word/2010/wordprocessingDrawing" xmlns:wp="http://schemas.openxmlformats.org/drawingml/2006/wordprocessingDrawing" xmlns:w10="urn:schemas-microsoft-com:office:word" xmlns:w="http://schemas.openxmlformats.org/wordprocessingml/2006/main" xmlns:w14="http://schemas.microsoft.com/office/word/2010/wordml" xmlns:w15="http://schemas.microsoft.com/office/word/2012/wordml" xmlns:w16cex="http://schemas.microsoft.com/office/word/2018/wordml/cex" xmlns:w16cid="http://schemas.microsoft.com/office/word/2016/wordml/cid" xmlns:w16="http://schemas.microsoft.com/office/word/2018/wordml" xmlns:w16du="http://schemas.microsoft.com/office/word/2023/wordml/word16du" xmlns:w16sdtdh="http://schemas.microsoft.com/office/word/2020/wordml/sdtdatahash" xmlns:w16sdtfl="http://schemas.microsoft.com/office/word/2024/wordml/sdtformatlock" xmlns:w16se="http://schemas.microsoft.com/office/word/2015/wordml/symex" xmlns:wpg="http://schemas.microsoft.com/office/word/2010/wordprocessingGroup" xmlns:wpi="http://schemas.microsoft.com/office/word/2010/wordprocessingInk" xmlns:wne="http://schemas.microsoft.com/office/word/2006/wordml" xmlns:wps="http://schemas.microsoft.com/office/word/2010/wordprocessingShape" mc:Ignorable="w14 w15 w16se w16cid w16 w16cex w16sdtdh w16sdtfl w16du wp14">
   <w:abstractNum w:abstractNumId="0" w15:restartNumberingAfterBreak="0">
     <w:nsid w:val="017F2065"/>
     <w:multiLevelType w:val="multilevel"/>
@@ -6220,6 +5533,95 @@
     </w:lvl>
   </w:abstractNum>
   <w:abstractNum w:abstractNumId="14" w15:restartNumberingAfterBreak="0">
+    <w:nsid w:val="25067F56"/>
+    <w:multiLevelType w:val="hybridMultilevel"/>
+    <w:tmpl w:val="B5D64DE0"/>
+    <w:lvl w:ilvl="0" w:tplc="193EE304">
+      <w:start w:val="1"/>
+      <w:numFmt w:val="decimal"/>
+      <w:lvlText w:val="%1-"/>
+      <w:lvlJc w:val="left"/>
+      <w:pPr>
+        <w:ind w:left="1440" w:hanging="360"/>
+      </w:pPr>
+      <w:rPr>
+        <w:rFonts w:hint="default"/>
+      </w:rPr>
+    </w:lvl>
+    <w:lvl w:ilvl="1" w:tplc="04090019" w:tentative="1">
+      <w:start w:val="1"/>
+      <w:numFmt w:val="lowerLetter"/>
+      <w:lvlText w:val="%2."/>
+      <w:lvlJc w:val="left"/>
+      <w:pPr>
+        <w:ind w:left="2160" w:hanging="360"/>
+      </w:pPr>
+    </w:lvl>
+    <w:lvl w:ilvl="2" w:tplc="0409001B" w:tentative="1">
+      <w:start w:val="1"/>
+      <w:numFmt w:val="lowerRoman"/>
+      <w:lvlText w:val="%3."/>
+      <w:lvlJc w:val="right"/>
+      <w:pPr>
+        <w:ind w:left="2880" w:hanging="180"/>
+      </w:pPr>
+    </w:lvl>
+    <w:lvl w:ilvl="3" w:tplc="0409000F" w:tentative="1">
+      <w:start w:val="1"/>
+      <w:numFmt w:val="decimal"/>
+      <w:lvlText w:val="%4."/>
+      <w:lvlJc w:val="left"/>
+      <w:pPr>
+        <w:ind w:left="3600" w:hanging="360"/>
+      </w:pPr>
+    </w:lvl>
+    <w:lvl w:ilvl="4" w:tplc="04090019" w:tentative="1">
+      <w:start w:val="1"/>
+      <w:numFmt w:val="lowerLetter"/>
+      <w:lvlText w:val="%5."/>
+      <w:lvlJc w:val="left"/>
+      <w:pPr>
+        <w:ind w:left="4320" w:hanging="360"/>
+      </w:pPr>
+    </w:lvl>
+    <w:lvl w:ilvl="5" w:tplc="0409001B" w:tentative="1">
+      <w:start w:val="1"/>
+      <w:numFmt w:val="lowerRoman"/>
+      <w:lvlText w:val="%6."/>
+      <w:lvlJc w:val="right"/>
+      <w:pPr>
+        <w:ind w:left="5040" w:hanging="180"/>
+      </w:pPr>
+    </w:lvl>
+    <w:lvl w:ilvl="6" w:tplc="0409000F" w:tentative="1">
+      <w:start w:val="1"/>
+      <w:numFmt w:val="decimal"/>
+      <w:lvlText w:val="%7."/>
+      <w:lvlJc w:val="left"/>
+      <w:pPr>
+        <w:ind w:left="5760" w:hanging="360"/>
+      </w:pPr>
+    </w:lvl>
+    <w:lvl w:ilvl="7" w:tplc="04090019" w:tentative="1">
+      <w:start w:val="1"/>
+      <w:numFmt w:val="lowerLetter"/>
+      <w:lvlText w:val="%8."/>
+      <w:lvlJc w:val="left"/>
+      <w:pPr>
+        <w:ind w:left="6480" w:hanging="360"/>
+      </w:pPr>
+    </w:lvl>
+    <w:lvl w:ilvl="8" w:tplc="0409001B" w:tentative="1">
+      <w:start w:val="1"/>
+      <w:numFmt w:val="lowerRoman"/>
+      <w:lvlText w:val="%9."/>
+      <w:lvlJc w:val="right"/>
+      <w:pPr>
+        <w:ind w:left="7200" w:hanging="180"/>
+      </w:pPr>
+    </w:lvl>
+  </w:abstractNum>
+  <w:abstractNum w:abstractNumId="15" w15:restartNumberingAfterBreak="0">
     <w:nsid w:val="258932B7"/>
     <w:multiLevelType w:val="multilevel"/>
     <w:tmpl w:val="8A7887A2"/>
@@ -6368,7 +5770,7 @@
       </w:rPr>
     </w:lvl>
   </w:abstractNum>
-  <w:abstractNum w:abstractNumId="15" w15:restartNumberingAfterBreak="0">
+  <w:abstractNum w:abstractNumId="16" w15:restartNumberingAfterBreak="0">
     <w:nsid w:val="295E33E6"/>
     <w:multiLevelType w:val="multilevel"/>
     <w:tmpl w:val="8F9E3000"/>
@@ -6517,7 +5919,7 @@
       </w:rPr>
     </w:lvl>
   </w:abstractNum>
-  <w:abstractNum w:abstractNumId="16" w15:restartNumberingAfterBreak="0">
+  <w:abstractNum w:abstractNumId="17" w15:restartNumberingAfterBreak="0">
     <w:nsid w:val="2B620CA2"/>
     <w:multiLevelType w:val="multilevel"/>
     <w:tmpl w:val="CF1AA116"/>
@@ -6666,7 +6068,7 @@
       </w:rPr>
     </w:lvl>
   </w:abstractNum>
-  <w:abstractNum w:abstractNumId="17" w15:restartNumberingAfterBreak="0">
+  <w:abstractNum w:abstractNumId="18" w15:restartNumberingAfterBreak="0">
     <w:nsid w:val="2C475D0D"/>
     <w:multiLevelType w:val="multilevel"/>
     <w:tmpl w:val="04E8B9B0"/>
@@ -6815,7 +6217,7 @@
       </w:rPr>
     </w:lvl>
   </w:abstractNum>
-  <w:abstractNum w:abstractNumId="18" w15:restartNumberingAfterBreak="0">
+  <w:abstractNum w:abstractNumId="19" w15:restartNumberingAfterBreak="0">
     <w:nsid w:val="2D5D7EB3"/>
     <w:multiLevelType w:val="multilevel"/>
     <w:tmpl w:val="F8464E06"/>
@@ -6928,7 +6330,7 @@
       </w:pPr>
     </w:lvl>
   </w:abstractNum>
-  <w:abstractNum w:abstractNumId="19" w15:restartNumberingAfterBreak="0">
+  <w:abstractNum w:abstractNumId="20" w15:restartNumberingAfterBreak="0">
     <w:nsid w:val="33CB2316"/>
     <w:multiLevelType w:val="multilevel"/>
     <w:tmpl w:val="6AC23518"/>
@@ -7077,7 +6479,7 @@
       </w:rPr>
     </w:lvl>
   </w:abstractNum>
-  <w:abstractNum w:abstractNumId="20" w15:restartNumberingAfterBreak="0">
+  <w:abstractNum w:abstractNumId="21" w15:restartNumberingAfterBreak="0">
     <w:nsid w:val="3C9E2897"/>
     <w:multiLevelType w:val="multilevel"/>
     <w:tmpl w:val="A740C8CE"/>
@@ -7226,7 +6628,7 @@
       </w:rPr>
     </w:lvl>
   </w:abstractNum>
-  <w:abstractNum w:abstractNumId="21" w15:restartNumberingAfterBreak="0">
+  <w:abstractNum w:abstractNumId="22" w15:restartNumberingAfterBreak="0">
     <w:nsid w:val="3F804D67"/>
     <w:multiLevelType w:val="multilevel"/>
     <w:tmpl w:val="706E918E"/>
@@ -7375,7 +6777,7 @@
       </w:rPr>
     </w:lvl>
   </w:abstractNum>
-  <w:abstractNum w:abstractNumId="22" w15:restartNumberingAfterBreak="0">
+  <w:abstractNum w:abstractNumId="23" w15:restartNumberingAfterBreak="0">
     <w:nsid w:val="3FAE43D4"/>
     <w:multiLevelType w:val="multilevel"/>
     <w:tmpl w:val="C074C1D8"/>
@@ -7524,7 +6926,7 @@
       </w:rPr>
     </w:lvl>
   </w:abstractNum>
-  <w:abstractNum w:abstractNumId="23" w15:restartNumberingAfterBreak="0">
+  <w:abstractNum w:abstractNumId="24" w15:restartNumberingAfterBreak="0">
     <w:nsid w:val="40251C9F"/>
     <w:multiLevelType w:val="multilevel"/>
     <w:tmpl w:val="901C151E"/>
@@ -7673,7 +7075,7 @@
       </w:rPr>
     </w:lvl>
   </w:abstractNum>
-  <w:abstractNum w:abstractNumId="24" w15:restartNumberingAfterBreak="0">
+  <w:abstractNum w:abstractNumId="25" w15:restartNumberingAfterBreak="0">
     <w:nsid w:val="44441E7D"/>
     <w:multiLevelType w:val="multilevel"/>
     <w:tmpl w:val="B9E88734"/>
@@ -7786,7 +7188,7 @@
       </w:pPr>
     </w:lvl>
   </w:abstractNum>
-  <w:abstractNum w:abstractNumId="25" w15:restartNumberingAfterBreak="0">
+  <w:abstractNum w:abstractNumId="26" w15:restartNumberingAfterBreak="0">
     <w:nsid w:val="45620F3C"/>
     <w:multiLevelType w:val="multilevel"/>
     <w:tmpl w:val="470E42CA"/>
@@ -7935,7 +7337,7 @@
       </w:rPr>
     </w:lvl>
   </w:abstractNum>
-  <w:abstractNum w:abstractNumId="26" w15:restartNumberingAfterBreak="0">
+  <w:abstractNum w:abstractNumId="27" w15:restartNumberingAfterBreak="0">
     <w:nsid w:val="4B623F45"/>
     <w:multiLevelType w:val="multilevel"/>
     <w:tmpl w:val="F40C0B64"/>
@@ -8048,7 +7450,7 @@
       </w:pPr>
     </w:lvl>
   </w:abstractNum>
-  <w:abstractNum w:abstractNumId="27" w15:restartNumberingAfterBreak="0">
+  <w:abstractNum w:abstractNumId="28" w15:restartNumberingAfterBreak="0">
     <w:nsid w:val="4C8D7A50"/>
     <w:multiLevelType w:val="multilevel"/>
     <w:tmpl w:val="3ED4C582"/>
@@ -8197,7 +7599,7 @@
       </w:rPr>
     </w:lvl>
   </w:abstractNum>
-  <w:abstractNum w:abstractNumId="28" w15:restartNumberingAfterBreak="0">
+  <w:abstractNum w:abstractNumId="29" w15:restartNumberingAfterBreak="0">
     <w:nsid w:val="4CA402C1"/>
     <w:multiLevelType w:val="multilevel"/>
     <w:tmpl w:val="A8BEFC02"/>
@@ -8346,7 +7748,7 @@
       </w:rPr>
     </w:lvl>
   </w:abstractNum>
-  <w:abstractNum w:abstractNumId="29" w15:restartNumberingAfterBreak="0">
+  <w:abstractNum w:abstractNumId="30" w15:restartNumberingAfterBreak="0">
     <w:nsid w:val="512A79B8"/>
     <w:multiLevelType w:val="multilevel"/>
     <w:tmpl w:val="D332D6CC"/>
@@ -8495,7 +7897,7 @@
       </w:rPr>
     </w:lvl>
   </w:abstractNum>
-  <w:abstractNum w:abstractNumId="30" w15:restartNumberingAfterBreak="0">
+  <w:abstractNum w:abstractNumId="31" w15:restartNumberingAfterBreak="0">
     <w:nsid w:val="5B965A77"/>
     <w:multiLevelType w:val="multilevel"/>
     <w:tmpl w:val="BD9C82EE"/>
@@ -8644,7 +8046,7 @@
       </w:rPr>
     </w:lvl>
   </w:abstractNum>
-  <w:abstractNum w:abstractNumId="31" w15:restartNumberingAfterBreak="0">
+  <w:abstractNum w:abstractNumId="32" w15:restartNumberingAfterBreak="0">
     <w:nsid w:val="5D247814"/>
     <w:multiLevelType w:val="multilevel"/>
     <w:tmpl w:val="D1DA57DC"/>
@@ -8793,7 +8195,7 @@
       </w:rPr>
     </w:lvl>
   </w:abstractNum>
-  <w:abstractNum w:abstractNumId="32" w15:restartNumberingAfterBreak="0">
+  <w:abstractNum w:abstractNumId="33" w15:restartNumberingAfterBreak="0">
     <w:nsid w:val="639064B2"/>
     <w:multiLevelType w:val="multilevel"/>
     <w:tmpl w:val="9D622B0A"/>
@@ -8906,7 +8308,7 @@
       </w:pPr>
     </w:lvl>
   </w:abstractNum>
-  <w:abstractNum w:abstractNumId="33" w15:restartNumberingAfterBreak="0">
+  <w:abstractNum w:abstractNumId="34" w15:restartNumberingAfterBreak="0">
     <w:nsid w:val="6745206A"/>
     <w:multiLevelType w:val="multilevel"/>
     <w:tmpl w:val="589838A2"/>
@@ -9019,7 +8421,7 @@
       </w:pPr>
     </w:lvl>
   </w:abstractNum>
-  <w:abstractNum w:abstractNumId="34" w15:restartNumberingAfterBreak="0">
+  <w:abstractNum w:abstractNumId="35" w15:restartNumberingAfterBreak="0">
     <w:nsid w:val="6B6C53DF"/>
     <w:multiLevelType w:val="multilevel"/>
     <w:tmpl w:val="B0DC7CD2"/>
@@ -9168,7 +8570,7 @@
       </w:rPr>
     </w:lvl>
   </w:abstractNum>
-  <w:abstractNum w:abstractNumId="35" w15:restartNumberingAfterBreak="0">
+  <w:abstractNum w:abstractNumId="36" w15:restartNumberingAfterBreak="0">
     <w:nsid w:val="6C7C0D7D"/>
     <w:multiLevelType w:val="multilevel"/>
     <w:tmpl w:val="5FEC7DDC"/>
@@ -9281,7 +8683,7 @@
       </w:pPr>
     </w:lvl>
   </w:abstractNum>
-  <w:abstractNum w:abstractNumId="36" w15:restartNumberingAfterBreak="0">
+  <w:abstractNum w:abstractNumId="37" w15:restartNumberingAfterBreak="0">
     <w:nsid w:val="6F1C5C3D"/>
     <w:multiLevelType w:val="multilevel"/>
     <w:tmpl w:val="C3D8C85C"/>
@@ -9430,7 +8832,7 @@
       </w:rPr>
     </w:lvl>
   </w:abstractNum>
-  <w:abstractNum w:abstractNumId="37" w15:restartNumberingAfterBreak="0">
+  <w:abstractNum w:abstractNumId="38" w15:restartNumberingAfterBreak="0">
     <w:nsid w:val="70EB4336"/>
     <w:multiLevelType w:val="multilevel"/>
     <w:tmpl w:val="5A98E152"/>
@@ -9543,7 +8945,7 @@
       </w:pPr>
     </w:lvl>
   </w:abstractNum>
-  <w:abstractNum w:abstractNumId="38" w15:restartNumberingAfterBreak="0">
+  <w:abstractNum w:abstractNumId="39" w15:restartNumberingAfterBreak="0">
     <w:nsid w:val="75034FCF"/>
     <w:multiLevelType w:val="multilevel"/>
     <w:tmpl w:val="078E21CE"/>
@@ -9692,7 +9094,7 @@
       </w:rPr>
     </w:lvl>
   </w:abstractNum>
-  <w:abstractNum w:abstractNumId="39" w15:restartNumberingAfterBreak="0">
+  <w:abstractNum w:abstractNumId="40" w15:restartNumberingAfterBreak="0">
     <w:nsid w:val="75994B14"/>
     <w:multiLevelType w:val="multilevel"/>
     <w:tmpl w:val="E4F6367E"/>
@@ -9841,7 +9243,7 @@
       </w:rPr>
     </w:lvl>
   </w:abstractNum>
-  <w:abstractNum w:abstractNumId="40" w15:restartNumberingAfterBreak="0">
+  <w:abstractNum w:abstractNumId="41" w15:restartNumberingAfterBreak="0">
     <w:nsid w:val="769046A9"/>
     <w:multiLevelType w:val="multilevel"/>
     <w:tmpl w:val="E4D8E34A"/>
@@ -9990,7 +9392,7 @@
       </w:rPr>
     </w:lvl>
   </w:abstractNum>
-  <w:abstractNum w:abstractNumId="41" w15:restartNumberingAfterBreak="0">
+  <w:abstractNum w:abstractNumId="42" w15:restartNumberingAfterBreak="0">
     <w:nsid w:val="794D618C"/>
     <w:multiLevelType w:val="multilevel"/>
     <w:tmpl w:val="0D6A193E"/>
@@ -10139,10 +9541,10 @@
       </w:rPr>
     </w:lvl>
   </w:abstractNum>
-  <w:abstractNum w:abstractNumId="42" w15:restartNumberingAfterBreak="0">
+  <w:abstractNum w:abstractNumId="43" w15:restartNumberingAfterBreak="0">
     <w:nsid w:val="7AC10A49"/>
     <w:multiLevelType w:val="multilevel"/>
-    <w:tmpl w:val="8B22FEBA"/>
+    <w:tmpl w:val="6B806EC0"/>
     <w:lvl w:ilvl="0">
       <w:start w:val="2"/>
       <w:numFmt w:val="decimal"/>
@@ -10155,17 +9557,17 @@
         <w:ind w:left="720" w:hanging="360"/>
       </w:pPr>
     </w:lvl>
-    <w:lvl w:ilvl="1" w:tentative="1">
+    <w:lvl w:ilvl="1">
       <w:start w:val="1"/>
       <w:numFmt w:val="decimal"/>
-      <w:lvlText w:val="%2."/>
-      <w:lvlJc w:val="left"/>
-      <w:pPr>
-        <w:tabs>
-          <w:tab w:val="num" w:pos="1440"/>
-        </w:tabs>
+      <w:lvlText w:val="%2)"/>
+      <w:lvlJc w:val="left"/>
+      <w:pPr>
         <w:ind w:left="1440" w:hanging="360"/>
       </w:pPr>
+      <w:rPr>
+        <w:rFonts w:hint="default"/>
+      </w:rPr>
     </w:lvl>
     <w:lvl w:ilvl="2" w:tentative="1">
       <w:start w:val="1"/>
@@ -10253,16 +9655,16 @@
     </w:lvl>
   </w:abstractNum>
   <w:num w:numId="1" w16cid:durableId="2039161732">
-    <w:abstractNumId w:val="36"/>
+    <w:abstractNumId w:val="37"/>
   </w:num>
   <w:num w:numId="2" w16cid:durableId="599878884">
-    <w:abstractNumId w:val="16"/>
+    <w:abstractNumId w:val="17"/>
   </w:num>
   <w:num w:numId="3" w16cid:durableId="1687515766">
-    <w:abstractNumId w:val="25"/>
+    <w:abstractNumId w:val="26"/>
   </w:num>
   <w:num w:numId="4" w16cid:durableId="1597786103">
-    <w:abstractNumId w:val="35"/>
+    <w:abstractNumId w:val="36"/>
   </w:num>
   <w:num w:numId="5" w16cid:durableId="2037730805">
     <w:abstractNumId w:val="11"/>
@@ -10291,16 +9693,16 @@
     <w:abstractNumId w:val="1"/>
   </w:num>
   <w:num w:numId="9" w16cid:durableId="2054183601">
-    <w:abstractNumId w:val="15"/>
+    <w:abstractNumId w:val="16"/>
   </w:num>
   <w:num w:numId="10" w16cid:durableId="1772167618">
-    <w:abstractNumId w:val="41"/>
+    <w:abstractNumId w:val="42"/>
   </w:num>
   <w:num w:numId="11" w16cid:durableId="97992273">
-    <w:abstractNumId w:val="22"/>
+    <w:abstractNumId w:val="23"/>
   </w:num>
   <w:num w:numId="12" w16cid:durableId="399138131">
-    <w:abstractNumId w:val="40"/>
+    <w:abstractNumId w:val="41"/>
   </w:num>
   <w:num w:numId="13" w16cid:durableId="1586260525">
     <w:abstractNumId w:val="0"/>
@@ -10312,25 +9714,25 @@
     <w:abstractNumId w:val="9"/>
   </w:num>
   <w:num w:numId="16" w16cid:durableId="825627380">
-    <w:abstractNumId w:val="26"/>
+    <w:abstractNumId w:val="27"/>
   </w:num>
   <w:num w:numId="17" w16cid:durableId="2075004164">
-    <w:abstractNumId w:val="31"/>
+    <w:abstractNumId w:val="32"/>
   </w:num>
   <w:num w:numId="18" w16cid:durableId="4594926">
-    <w:abstractNumId w:val="39"/>
+    <w:abstractNumId w:val="40"/>
   </w:num>
   <w:num w:numId="19" w16cid:durableId="1771468233">
     <w:abstractNumId w:val="4"/>
   </w:num>
   <w:num w:numId="20" w16cid:durableId="316500084">
-    <w:abstractNumId w:val="38"/>
+    <w:abstractNumId w:val="39"/>
   </w:num>
   <w:num w:numId="21" w16cid:durableId="46925458">
-    <w:abstractNumId w:val="34"/>
+    <w:abstractNumId w:val="35"/>
   </w:num>
   <w:num w:numId="22" w16cid:durableId="68312687">
-    <w:abstractNumId w:val="29"/>
+    <w:abstractNumId w:val="30"/>
   </w:num>
   <w:num w:numId="23" w16cid:durableId="1069303592">
     <w:abstractNumId w:val="8"/>
@@ -10339,40 +9741,40 @@
     <w:abstractNumId w:val="10"/>
   </w:num>
   <w:num w:numId="25" w16cid:durableId="1046952834">
-    <w:abstractNumId w:val="30"/>
+    <w:abstractNumId w:val="31"/>
   </w:num>
   <w:num w:numId="26" w16cid:durableId="1074931892">
     <w:abstractNumId w:val="13"/>
   </w:num>
   <w:num w:numId="27" w16cid:durableId="95760160">
-    <w:abstractNumId w:val="17"/>
+    <w:abstractNumId w:val="18"/>
   </w:num>
   <w:num w:numId="28" w16cid:durableId="2115401707">
     <w:abstractNumId w:val="5"/>
   </w:num>
   <w:num w:numId="29" w16cid:durableId="1036780762">
-    <w:abstractNumId w:val="21"/>
+    <w:abstractNumId w:val="22"/>
   </w:num>
   <w:num w:numId="30" w16cid:durableId="909072183">
-    <w:abstractNumId w:val="28"/>
+    <w:abstractNumId w:val="29"/>
   </w:num>
   <w:num w:numId="31" w16cid:durableId="290861997">
-    <w:abstractNumId w:val="19"/>
+    <w:abstractNumId w:val="20"/>
   </w:num>
   <w:num w:numId="32" w16cid:durableId="992679136">
-    <w:abstractNumId w:val="23"/>
+    <w:abstractNumId w:val="24"/>
   </w:num>
   <w:num w:numId="33" w16cid:durableId="1903565666">
     <w:abstractNumId w:val="3"/>
   </w:num>
   <w:num w:numId="34" w16cid:durableId="781609022">
-    <w:abstractNumId w:val="24"/>
+    <w:abstractNumId w:val="25"/>
   </w:num>
   <w:num w:numId="35" w16cid:durableId="2055502745">
-    <w:abstractNumId w:val="33"/>
+    <w:abstractNumId w:val="34"/>
   </w:num>
   <w:num w:numId="36" w16cid:durableId="1158157485">
-    <w:abstractNumId w:val="42"/>
+    <w:abstractNumId w:val="43"/>
     <w:lvlOverride w:ilvl="0">
       <w:lvl w:ilvl="0">
         <w:numFmt w:val="decimal"/>
@@ -10382,7 +9784,7 @@
     </w:lvlOverride>
   </w:num>
   <w:num w:numId="37" w16cid:durableId="1089040727">
-    <w:abstractNumId w:val="32"/>
+    <w:abstractNumId w:val="33"/>
     <w:lvlOverride w:ilvl="0">
       <w:lvl w:ilvl="0">
         <w:numFmt w:val="decimal"/>
@@ -10392,7 +9794,7 @@
     </w:lvlOverride>
   </w:num>
   <w:num w:numId="38" w16cid:durableId="1102337783">
-    <w:abstractNumId w:val="37"/>
+    <w:abstractNumId w:val="38"/>
     <w:lvlOverride w:ilvl="0">
       <w:lvl w:ilvl="0">
         <w:numFmt w:val="decimal"/>
@@ -10405,15 +9807,18 @@
     <w:abstractNumId w:val="12"/>
   </w:num>
   <w:num w:numId="40" w16cid:durableId="1517693151">
-    <w:abstractNumId w:val="27"/>
+    <w:abstractNumId w:val="28"/>
   </w:num>
   <w:num w:numId="41" w16cid:durableId="1516770646">
-    <w:abstractNumId w:val="18"/>
+    <w:abstractNumId w:val="19"/>
   </w:num>
   <w:num w:numId="42" w16cid:durableId="15204715">
-    <w:abstractNumId w:val="20"/>
+    <w:abstractNumId w:val="21"/>
   </w:num>
   <w:num w:numId="43" w16cid:durableId="1598364838">
+    <w:abstractNumId w:val="15"/>
+  </w:num>
+  <w:num w:numId="44" w16cid:durableId="491138507">
     <w:abstractNumId w:val="14"/>
   </w:num>
 </w:numbering>

</xml_diff>

<commit_message>
implemented CRUDs with Product
</commit_message>
<xml_diff>
--- a/Ecommerce/src/main/resources/material.docx
+++ b/Ecommerce/src/main/resources/material.docx
@@ -23,11 +23,9 @@
       <w:r>
         <w:t xml:space="preserve">The Internet is a global physical network of connected computers and </w:t>
       </w:r>
-      <w:proofErr w:type="spellStart"/>
-      <w:r>
-        <w:t>hardwares</w:t>
-      </w:r>
-      <w:proofErr w:type="spellEnd"/>
+      <w:r>
+        <w:t>hardware</w:t>
+      </w:r>
       <w:r>
         <w:t>. The Internet allows multiple devices to communicate with each other and share information.</w:t>
       </w:r>
@@ -80,8 +78,13 @@
     </w:p>
     <w:p>
       <w:r>
-        <w:t>Server responds and sends back response</w:t>
-      </w:r>
+        <w:t xml:space="preserve">Server responds and sends back </w:t>
+      </w:r>
+      <w:proofErr w:type="gramStart"/>
+      <w:r>
+        <w:t>response</w:t>
+      </w:r>
+      <w:proofErr w:type="gramEnd"/>
     </w:p>
     <w:p/>
     <w:p>
@@ -146,7 +149,15 @@
     <w:p/>
     <w:p>
       <w:r>
-        <w:t>Authentication of the user also checks by API, when a request hits the Server, initially it authenticates the request. Then allows it into server</w:t>
+        <w:t xml:space="preserve">Authentication of the user also checks by API, when a request hits the Server, initially it authenticates the request. Then </w:t>
+      </w:r>
+      <w:proofErr w:type="gramStart"/>
+      <w:r>
+        <w:t>allows</w:t>
+      </w:r>
+      <w:proofErr w:type="gramEnd"/>
+      <w:r>
+        <w:t xml:space="preserve"> it into server</w:t>
       </w:r>
     </w:p>
     <w:p/>
@@ -210,7 +221,23 @@
         </w:numPr>
       </w:pPr>
       <w:r>
-        <w:t>REST is stateless. Means server did not hold any specific data of previous requests. So every request should contain all required data from the client to validate.</w:t>
+        <w:t xml:space="preserve">REST is stateless. Means server did not hold any specific data </w:t>
+      </w:r>
+      <w:proofErr w:type="gramStart"/>
+      <w:r>
+        <w:t>of</w:t>
+      </w:r>
+      <w:proofErr w:type="gramEnd"/>
+      <w:r>
+        <w:t xml:space="preserve"> previous requests. </w:t>
+      </w:r>
+      <w:proofErr w:type="gramStart"/>
+      <w:r>
+        <w:t>So</w:t>
+      </w:r>
+      <w:proofErr w:type="gramEnd"/>
+      <w:r>
+        <w:t xml:space="preserve"> every request should contain all required data from the client to validate.</w:t>
       </w:r>
     </w:p>
     <w:p>
@@ -260,7 +287,15 @@
     <w:p/>
     <w:p>
       <w:r>
-        <w:t>HTTP and HTTPS are protocols used by clients and server to communicate over a network. The difference is that HTTPS wraps HTTP inside a secure Transmission Layer Security (TLS/SSL).</w:t>
+        <w:t xml:space="preserve">HTTP and HTTPS are protocols used by clients and </w:t>
+      </w:r>
+      <w:proofErr w:type="gramStart"/>
+      <w:r>
+        <w:t>server</w:t>
+      </w:r>
+      <w:proofErr w:type="gramEnd"/>
+      <w:r>
+        <w:t xml:space="preserve"> to communicate over a network. The difference is that HTTPS wraps HTTP inside a secure Transmission Layer Security (TLS/SSL).</w:t>
       </w:r>
     </w:p>
     <w:p/>
@@ -289,7 +324,15 @@
         </w:numPr>
       </w:pPr>
       <w:r>
-        <w:t>Client initializes a TCP connection (3 way handshake SYN, SYN-ACK, ACK) on port 80.</w:t>
+        <w:t>Client initializes a TCP connection (</w:t>
+      </w:r>
+      <w:proofErr w:type="gramStart"/>
+      <w:r>
+        <w:t>3 way</w:t>
+      </w:r>
+      <w:proofErr w:type="gramEnd"/>
+      <w:r>
+        <w:t xml:space="preserve"> handshake SYN, SYN-ACK, ACK) on port 80.</w:t>
       </w:r>
     </w:p>
     <w:p>
@@ -417,8 +460,21 @@
     </w:p>
     <w:p/>
     <w:p>
-      <w:r>
-        <w:t>Imagine, if our request contains username and password. Hackers can easily see them. So most of the companies use HTTPS</w:t>
+      <w:proofErr w:type="gramStart"/>
+      <w:r>
+        <w:t>Imagine,</w:t>
+      </w:r>
+      <w:proofErr w:type="gramEnd"/>
+      <w:r>
+        <w:t xml:space="preserve"> if our request contains username and password. Hackers can easily see them. </w:t>
+      </w:r>
+      <w:proofErr w:type="gramStart"/>
+      <w:r>
+        <w:t>So</w:t>
+      </w:r>
+      <w:proofErr w:type="gramEnd"/>
+      <w:r>
+        <w:t xml:space="preserve"> most of the companies use HTTPS</w:t>
       </w:r>
     </w:p>
     <w:p>
@@ -435,7 +491,23 @@
     <w:p/>
     <w:p>
       <w:r>
-        <w:t>After establishing TCP on port 443, client and server perform TLS handshake.</w:t>
+        <w:t xml:space="preserve">After establishing TCP on port 443, </w:t>
+      </w:r>
+      <w:proofErr w:type="gramStart"/>
+      <w:r>
+        <w:t>client</w:t>
+      </w:r>
+      <w:proofErr w:type="gramEnd"/>
+      <w:r>
+        <w:t xml:space="preserve"> and </w:t>
+      </w:r>
+      <w:proofErr w:type="gramStart"/>
+      <w:r>
+        <w:t>server</w:t>
+      </w:r>
+      <w:proofErr w:type="gramEnd"/>
+      <w:r>
+        <w:t xml:space="preserve"> perform TLS handshake.</w:t>
       </w:r>
     </w:p>
     <w:p/>
@@ -521,7 +593,15 @@
       </w:r>
       <w:proofErr w:type="spellEnd"/>
       <w:r>
-        <w:t>: server picks a suitable TLS version, cipher suite/cryptographic algo and sends back clients own random number along with a digital certificate containing public key.</w:t>
+        <w:t xml:space="preserve">: server picks a suitable TLS version, cipher suite/cryptographic algo and sends back </w:t>
+      </w:r>
+      <w:proofErr w:type="gramStart"/>
+      <w:r>
+        <w:t>clients</w:t>
+      </w:r>
+      <w:proofErr w:type="gramEnd"/>
+      <w:r>
+        <w:t xml:space="preserve"> own random number along with a digital certificate containing public key.</w:t>
       </w:r>
     </w:p>
     <w:p/>
@@ -616,19 +696,40 @@
     </w:p>
     <w:p>
       <w:r>
-        <w:t>After establishing successful encryption. Data sends in a sequence of packets, which are not readable.</w:t>
+        <w:t xml:space="preserve">After establishing successful encryption. Data </w:t>
+      </w:r>
+      <w:proofErr w:type="gramStart"/>
+      <w:r>
+        <w:t>sends</w:t>
+      </w:r>
+      <w:proofErr w:type="gramEnd"/>
+      <w:r>
+        <w:t xml:space="preserve"> in a sequence of packets, which are not readable.</w:t>
       </w:r>
     </w:p>
     <w:p/>
     <w:p>
-      <w:r>
-        <w:t>example : </w:t>
+      <w:proofErr w:type="gramStart"/>
+      <w:r>
+        <w:t>example :</w:t>
+      </w:r>
+      <w:proofErr w:type="gramEnd"/>
+      <w:r>
+        <w:t> </w:t>
       </w:r>
     </w:p>
     <w:p/>
     <w:p>
       <w:r>
-        <w:t>What client initially send:</w:t>
+        <w:t xml:space="preserve">What client initially </w:t>
+      </w:r>
+      <w:proofErr w:type="gramStart"/>
+      <w:r>
+        <w:t>send</w:t>
+      </w:r>
+      <w:proofErr w:type="gramEnd"/>
+      <w:r>
+        <w:t>:</w:t>
       </w:r>
     </w:p>
     <w:p/>
@@ -650,7 +751,15 @@
     <w:p/>
     <w:p>
       <w:r>
-        <w:t>What actually data looks like in transit</w:t>
+        <w:t xml:space="preserve">What </w:t>
+      </w:r>
+      <w:proofErr w:type="gramStart"/>
+      <w:r>
+        <w:t>actually data</w:t>
+      </w:r>
+      <w:proofErr w:type="gramEnd"/>
+      <w:r>
+        <w:t xml:space="preserve"> looks like in transit</w:t>
       </w:r>
     </w:p>
     <w:p>
@@ -677,8 +786,17 @@
           <w:b/>
           <w:bCs/>
         </w:rPr>
-        <w:t>What HTTPS actually guarantees</w:t>
-      </w:r>
+        <w:t xml:space="preserve">What HTTPS </w:t>
+      </w:r>
+      <w:proofErr w:type="gramStart"/>
+      <w:r>
+        <w:rPr>
+          <w:b/>
+          <w:bCs/>
+        </w:rPr>
+        <w:t>actually guarantees</w:t>
+      </w:r>
+      <w:proofErr w:type="gramEnd"/>
     </w:p>
     <w:p>
       <w:pPr>
@@ -731,7 +849,15 @@
         <w:t>Authentication</w:t>
       </w:r>
       <w:r>
-        <w:t xml:space="preserve"> — you know you're actually talking to the domain you typed, not an impostor</w:t>
+        <w:t xml:space="preserve"> — you know you're </w:t>
+      </w:r>
+      <w:proofErr w:type="gramStart"/>
+      <w:r>
+        <w:t>actually talking</w:t>
+      </w:r>
+      <w:proofErr w:type="gramEnd"/>
+      <w:r>
+        <w:t xml:space="preserve"> to the domain you typed, not an impostor</w:t>
       </w:r>
     </w:p>
     <w:p>
@@ -779,7 +905,15 @@
     </w:p>
     <w:p>
       <w:r>
-        <w:t>Web framework is a collection of tools and modules that is needed to do standard tasks across every web application.</w:t>
+        <w:t xml:space="preserve">Web framework is a collection of tools and modules that </w:t>
+      </w:r>
+      <w:proofErr w:type="gramStart"/>
+      <w:r>
+        <w:t>is</w:t>
+      </w:r>
+      <w:proofErr w:type="gramEnd"/>
+      <w:r>
+        <w:t xml:space="preserve"> needed to do standard tasks across every web application.</w:t>
       </w:r>
     </w:p>
     <w:p>
@@ -842,8 +976,13 @@
       </w:r>
     </w:p>
     <w:p>
-      <w:r>
-        <w:t>Loose coupling: loose coupling is a design principle that aims to reduce dependency between components in the system.</w:t>
+      <w:proofErr w:type="gramStart"/>
+      <w:r>
+        <w:t>Loose</w:t>
+      </w:r>
+      <w:proofErr w:type="gramEnd"/>
+      <w:r>
+        <w:t xml:space="preserve"> coupling: loose coupling is a design principle that aims to reduce dependency between components in the system.</w:t>
       </w:r>
     </w:p>
     <w:p>
@@ -940,7 +1079,15 @@
       </w:r>
       <w:proofErr w:type="spellEnd"/>
       <w:r>
-        <w:t xml:space="preserve">&lt;T&gt; is class : List&lt;Integer&gt; list = new </w:t>
+        <w:t xml:space="preserve">&lt;T&gt; is </w:t>
+      </w:r>
+      <w:proofErr w:type="gramStart"/>
+      <w:r>
+        <w:t>class :</w:t>
+      </w:r>
+      <w:proofErr w:type="gramEnd"/>
+      <w:r>
+        <w:t xml:space="preserve"> List&lt;Integer&gt; list = new </w:t>
       </w:r>
       <w:proofErr w:type="spellStart"/>
       <w:r>
@@ -948,7 +1095,15 @@
       </w:r>
       <w:proofErr w:type="spellEnd"/>
       <w:r>
-        <w:t>&lt;&gt;();</w:t>
+        <w:t>&lt;</w:t>
+      </w:r>
+      <w:proofErr w:type="gramStart"/>
+      <w:r>
+        <w:t>&gt;(</w:t>
+      </w:r>
+      <w:proofErr w:type="gramEnd"/>
+      <w:r>
+        <w:t>);</w:t>
       </w:r>
     </w:p>
     <w:p>
@@ -959,7 +1114,23 @@
         </w:numPr>
       </w:pPr>
       <w:r>
-        <w:t>Vector&lt;T&gt; is class : List&lt;String&gt; vector = new Vector&lt;&gt;();</w:t>
+        <w:t xml:space="preserve">Vector&lt;T&gt; is </w:t>
+      </w:r>
+      <w:proofErr w:type="gramStart"/>
+      <w:r>
+        <w:t>class :</w:t>
+      </w:r>
+      <w:proofErr w:type="gramEnd"/>
+      <w:r>
+        <w:t xml:space="preserve"> List&lt;String&gt; vector = new Vector&lt;</w:t>
+      </w:r>
+      <w:proofErr w:type="gramStart"/>
+      <w:r>
+        <w:t>&gt;(</w:t>
+      </w:r>
+      <w:proofErr w:type="gramEnd"/>
+      <w:r>
+        <w:t>);</w:t>
       </w:r>
     </w:p>
     <w:p>
@@ -974,7 +1145,23 @@
     </w:p>
     <w:p>
       <w:r>
-        <w:t>Inversion of control is a design principle  where the control of object creation and objects life cycle management  is transferred from the application code to an external container or framework.</w:t>
+        <w:t xml:space="preserve">Inversion of control is a design </w:t>
+      </w:r>
+      <w:proofErr w:type="gramStart"/>
+      <w:r>
+        <w:t>principle  where</w:t>
+      </w:r>
+      <w:proofErr w:type="gramEnd"/>
+      <w:r>
+        <w:t xml:space="preserve"> the control of object creation and objects life cycle </w:t>
+      </w:r>
+      <w:proofErr w:type="gramStart"/>
+      <w:r>
+        <w:t>management  is</w:t>
+      </w:r>
+      <w:proofErr w:type="gramEnd"/>
+      <w:r>
+        <w:t xml:space="preserve"> transferred from the application code to an external container or framework.</w:t>
       </w:r>
     </w:p>
     <w:p>
@@ -1001,7 +1188,15 @@
         </w:numPr>
       </w:pPr>
       <w:r>
-        <w:t>Dependency Injection is a designed pattern commonly used in object oriented programming with the dependency of a class being provided externally rather than being created within the class itself.</w:t>
+        <w:t xml:space="preserve">Dependency Injection is a designed pattern commonly used in </w:t>
+      </w:r>
+      <w:proofErr w:type="gramStart"/>
+      <w:r>
+        <w:t>object oriented</w:t>
+      </w:r>
+      <w:proofErr w:type="gramEnd"/>
+      <w:r>
+        <w:t xml:space="preserve"> programming with the dependency of a class being provided externally rather than being created within the class itself.</w:t>
       </w:r>
     </w:p>
     <w:p>
@@ -1024,7 +1219,15 @@
     <w:p/>
     <w:p>
       <w:r>
-        <w:t>Spring Container : Spring container is a core component and is responsible for managing the life cycle and configuration of objects called beans.</w:t>
+        <w:t xml:space="preserve">Spring </w:t>
+      </w:r>
+      <w:proofErr w:type="gramStart"/>
+      <w:r>
+        <w:t>Container :</w:t>
+      </w:r>
+      <w:proofErr w:type="gramEnd"/>
+      <w:r>
+        <w:t xml:space="preserve"> Spring container is a core component and is responsible for managing the life cycle and configuration of objects called beans.</w:t>
       </w:r>
     </w:p>
     <w:p>
@@ -1060,10 +1263,12 @@
     </w:p>
     <w:p>
       <w:proofErr w:type="spellStart"/>
+      <w:proofErr w:type="gramStart"/>
       <w:r>
         <w:t>BeanFactory</w:t>
       </w:r>
       <w:proofErr w:type="spellEnd"/>
+      <w:proofErr w:type="gramEnd"/>
       <w:r>
         <w:t>: </w:t>
       </w:r>
@@ -1140,7 +1345,15 @@
     </w:p>
     <w:p>
       <w:r>
-        <w:t>We as a developer, create a configuration file. So that bean life cycle would know which objects need to be managed.</w:t>
+        <w:t xml:space="preserve">We as </w:t>
+      </w:r>
+      <w:proofErr w:type="gramStart"/>
+      <w:r>
+        <w:t>a developer</w:t>
+      </w:r>
+      <w:proofErr w:type="gramEnd"/>
+      <w:r>
+        <w:t>, create a configuration file. So that bean life cycle would know which objects need to be managed.</w:t>
       </w:r>
     </w:p>
     <w:p>
@@ -1244,7 +1457,15 @@
         </w:numPr>
       </w:pPr>
       <w:r>
-        <w:t>creation, we have to create a config file which is XML. In that config file we define beans where the spring container needs to be managed.</w:t>
+        <w:t xml:space="preserve">creation, we </w:t>
+      </w:r>
+      <w:proofErr w:type="gramStart"/>
+      <w:r>
+        <w:t>have to</w:t>
+      </w:r>
+      <w:proofErr w:type="gramEnd"/>
+      <w:r>
+        <w:t xml:space="preserve"> create a config file which is XML. In that config file we define beans where the spring container needs to be managed.</w:t>
       </w:r>
     </w:p>
     <w:p/>
@@ -1314,8 +1535,21 @@
           <w:numId w:val="19"/>
         </w:numPr>
       </w:pPr>
-      <w:r>
-        <w:t>Dependencies are provided to the dependent class through its constructor.</w:t>
+      <w:proofErr w:type="gramStart"/>
+      <w:r>
+        <w:t>Dependencies are</w:t>
+      </w:r>
+      <w:proofErr w:type="gramEnd"/>
+      <w:r>
+        <w:t xml:space="preserve"> provided </w:t>
+      </w:r>
+      <w:proofErr w:type="gramStart"/>
+      <w:r>
+        <w:t>to</w:t>
+      </w:r>
+      <w:proofErr w:type="gramEnd"/>
+      <w:r>
+        <w:t xml:space="preserve"> the dependent class through its constructor.</w:t>
       </w:r>
     </w:p>
     <w:p>
@@ -1472,7 +1706,15 @@
       </w:r>
       <w:proofErr w:type="spellEnd"/>
       <w:r>
-        <w:t xml:space="preserve"> is a design pattern that automatically injects dependent objects into a bean. Reducing the need of explicit configuration in XML.</w:t>
+        <w:t xml:space="preserve"> is a design pattern that automatically injects dependent objects into a bean. Reducing the need </w:t>
+      </w:r>
+      <w:proofErr w:type="gramStart"/>
+      <w:r>
+        <w:t>of</w:t>
+      </w:r>
+      <w:proofErr w:type="gramEnd"/>
+      <w:r>
+        <w:t xml:space="preserve"> explicit configuration in XML.</w:t>
       </w:r>
     </w:p>
     <w:p>
@@ -1515,11 +1757,13 @@
         </w:numPr>
       </w:pPr>
       <w:proofErr w:type="spellStart"/>
+      <w:proofErr w:type="gramStart"/>
       <w:r>
         <w:lastRenderedPageBreak/>
         <w:t>byName</w:t>
       </w:r>
       <w:proofErr w:type="spellEnd"/>
+      <w:proofErr w:type="gramEnd"/>
     </w:p>
     <w:p>
       <w:pPr>
@@ -1574,7 +1818,15 @@
         </w:numPr>
       </w:pPr>
       <w:r>
-        <w:t>Use setter-based injection and must.</w:t>
+        <w:t xml:space="preserve">Use setter-based </w:t>
+      </w:r>
+      <w:proofErr w:type="gramStart"/>
+      <w:r>
+        <w:t>injection</w:t>
+      </w:r>
+      <w:proofErr w:type="gramEnd"/>
+      <w:r>
+        <w:t xml:space="preserve"> and must.</w:t>
       </w:r>
     </w:p>
     <w:p>
@@ -1652,7 +1904,15 @@
       </w:r>
       <w:proofErr w:type="spellEnd"/>
       <w:r>
-        <w:t xml:space="preserve"> constructor: spring injects the dependency based on the constructor.</w:t>
+        <w:t xml:space="preserve"> constructor: spring injects </w:t>
+      </w:r>
+      <w:proofErr w:type="gramStart"/>
+      <w:r>
+        <w:t>the dependency</w:t>
+      </w:r>
+      <w:proofErr w:type="gramEnd"/>
+      <w:r>
+        <w:t xml:space="preserve"> based on the constructor.</w:t>
       </w:r>
     </w:p>
     <w:p>
@@ -1662,8 +1922,45 @@
           <w:numId w:val="27"/>
         </w:numPr>
       </w:pPr>
-      <w:r>
-        <w:t>Uses constructor based injection and constructor is must.</w:t>
+      <w:proofErr w:type="gramStart"/>
+      <w:r>
+        <w:t>Uses</w:t>
+      </w:r>
+      <w:proofErr w:type="gramEnd"/>
+      <w:r>
+        <w:t xml:space="preserve"> </w:t>
+      </w:r>
+      <w:proofErr w:type="gramStart"/>
+      <w:r>
+        <w:t>constructor based</w:t>
+      </w:r>
+      <w:proofErr w:type="gramEnd"/>
+      <w:r>
+        <w:t xml:space="preserve"> </w:t>
+      </w:r>
+      <w:proofErr w:type="gramStart"/>
+      <w:r>
+        <w:t>injection</w:t>
+      </w:r>
+      <w:proofErr w:type="gramEnd"/>
+      <w:r>
+        <w:t xml:space="preserve"> and </w:t>
+      </w:r>
+      <w:proofErr w:type="gramStart"/>
+      <w:r>
+        <w:t>constructor</w:t>
+      </w:r>
+      <w:proofErr w:type="gramEnd"/>
+      <w:r>
+        <w:t xml:space="preserve"> </w:t>
+      </w:r>
+      <w:proofErr w:type="gramStart"/>
+      <w:r>
+        <w:t>is</w:t>
+      </w:r>
+      <w:proofErr w:type="gramEnd"/>
+      <w:r>
+        <w:t xml:space="preserve"> must.</w:t>
       </w:r>
     </w:p>
     <w:p>
@@ -1730,13 +2027,31 @@
       </w:r>
     </w:p>
     <w:p>
-      <w:r>
-        <w:t>@Component - this annotation simply marks a java class as a bean. Spring scans the whole project at runtime and manages their life cycle.</w:t>
-      </w:r>
-    </w:p>
-    <w:p>
-      <w:r>
-        <w:t>@Override - this annotation educates the compiler that the current method in sub class is from parent class and we are modifying the logic and using this implementation instead of parent implementation.</w:t>
+      <w:proofErr w:type="gramStart"/>
+      <w:r>
+        <w:t>@Component</w:t>
+      </w:r>
+      <w:proofErr w:type="gramEnd"/>
+      <w:r>
+        <w:t xml:space="preserve"> - this annotation simply marks a java class as a bean. Spring scans the whole project at runtime and manages their life cycle.</w:t>
+      </w:r>
+    </w:p>
+    <w:p>
+      <w:proofErr w:type="gramStart"/>
+      <w:r>
+        <w:t>@Override</w:t>
+      </w:r>
+      <w:proofErr w:type="gramEnd"/>
+      <w:r>
+        <w:t xml:space="preserve"> - this annotation educates the compiler that the current method in sub class is from parent </w:t>
+      </w:r>
+      <w:proofErr w:type="gramStart"/>
+      <w:r>
+        <w:t>class</w:t>
+      </w:r>
+      <w:proofErr w:type="gramEnd"/>
+      <w:r>
+        <w:t xml:space="preserve"> and we are modifying the logic and using this implementation instead of parent implementation.</w:t>
       </w:r>
     </w:p>
     <w:p/>
@@ -1815,9 +2130,14 @@
       </w:r>
       <w:proofErr w:type="spellStart"/>
       <w:r>
-        <w:t>com.example.MyClass</w:t>
-      </w:r>
-      <w:proofErr w:type="spellEnd"/>
+        <w:t>com.</w:t>
+      </w:r>
+      <w:proofErr w:type="gramStart"/>
+      <w:r>
+        <w:t>example.MyClass</w:t>
+      </w:r>
+      <w:proofErr w:type="spellEnd"/>
+      <w:proofErr w:type="gramEnd"/>
       <w:r>
         <w:t>” /&gt;</w:t>
       </w:r>
@@ -1931,8 +2251,13 @@
         </w:numPr>
       </w:pPr>
       <w:r>
-        <w:t>We can specify value from property files, Env files, system properties etc..</w:t>
-      </w:r>
+        <w:t xml:space="preserve">We can specify value from property files, Env files, system properties </w:t>
+      </w:r>
+      <w:proofErr w:type="gramStart"/>
+      <w:r>
+        <w:t>etc..</w:t>
+      </w:r>
+      <w:proofErr w:type="gramEnd"/>
     </w:p>
     <w:p>
       <w:pPr>
@@ -1947,7 +2272,15 @@
     </w:p>
     <w:p>
       <w:r>
-        <w:t>@Value(101)</w:t>
+        <w:t>@</w:t>
+      </w:r>
+      <w:proofErr w:type="gramStart"/>
+      <w:r>
+        <w:t>Value(</w:t>
+      </w:r>
+      <w:proofErr w:type="gramEnd"/>
+      <w:r>
+        <w:t>101)</w:t>
       </w:r>
     </w:p>
     <w:p>
@@ -1972,14 +2305,37 @@
     <w:p/>
     <w:p>
       <w:r>
-        <w:t xml:space="preserve">Configuration class: it is a class which has stereotype annotation @Configuration at class level. Where this class has configurations which replaces the traditional XML configuration file to define, wire, and manage the beans. </w:t>
+        <w:t xml:space="preserve">Configuration class: it is a class which has stereotype </w:t>
+      </w:r>
+      <w:proofErr w:type="gramStart"/>
+      <w:r>
+        <w:t>annotation @</w:t>
+      </w:r>
+      <w:proofErr w:type="gramEnd"/>
+      <w:r>
+        <w:t xml:space="preserve">Configuration at class level. Where this class has configurations which </w:t>
+      </w:r>
+      <w:proofErr w:type="gramStart"/>
+      <w:r>
+        <w:t>replaces</w:t>
+      </w:r>
+      <w:proofErr w:type="gramEnd"/>
+      <w:r>
+        <w:t xml:space="preserve"> the traditional XML configuration file to define, wire, and manage the beans. </w:t>
       </w:r>
       <w:r>
         <w:br/>
       </w:r>
       <w:r>
         <w:br/>
-        <w:t>@Configuration: annotation marks the class as a configuration class.</w:t>
+      </w:r>
+      <w:proofErr w:type="gramStart"/>
+      <w:r>
+        <w:t>@Configuration</w:t>
+      </w:r>
+      <w:proofErr w:type="gramEnd"/>
+      <w:r>
+        <w:t>: annotation marks the class as a configuration class.</w:t>
       </w:r>
     </w:p>
     <w:p>
@@ -2006,6 +2362,7 @@
     </w:p>
     <w:p/>
     <w:p>
+      <w:proofErr w:type="gramStart"/>
       <w:r>
         <w:rPr>
           <w:b/>
@@ -2014,7 +2371,19 @@
         <w:t>@Qualifie</w:t>
       </w:r>
       <w:r>
-        <w:t>r: This annotation specifies which bean to inject when multiple beans exist in the configuration file.</w:t>
+        <w:t>r</w:t>
+      </w:r>
+      <w:proofErr w:type="gramEnd"/>
+      <w:r>
+        <w:t xml:space="preserve">: This annotation specifies which </w:t>
+      </w:r>
+      <w:proofErr w:type="gramStart"/>
+      <w:r>
+        <w:t>bean</w:t>
+      </w:r>
+      <w:proofErr w:type="gramEnd"/>
+      <w:r>
+        <w:t xml:space="preserve"> to inject when multiple beans exist in the configuration file.</w:t>
       </w:r>
     </w:p>
     <w:p>
@@ -2024,7 +2393,15 @@
     </w:p>
     <w:p>
       <w:r>
-        <w:t>One interface, multiple implementation classes, need to specify in the controller while injecting.</w:t>
+        <w:t xml:space="preserve">One interface, multiple implementation classes, </w:t>
+      </w:r>
+      <w:proofErr w:type="gramStart"/>
+      <w:r>
+        <w:t>need</w:t>
+      </w:r>
+      <w:proofErr w:type="gramEnd"/>
+      <w:r>
+        <w:t xml:space="preserve"> to specify in the controller while injecting.</w:t>
       </w:r>
     </w:p>
     <w:p>
@@ -2071,17 +2448,34 @@
       </w:r>
       <w:proofErr w:type="spellEnd"/>
       <w:r>
-        <w:t>, we specify @Qualifer(--name of service class–).</w:t>
+        <w:t>, we specify @</w:t>
+      </w:r>
+      <w:proofErr w:type="gramStart"/>
+      <w:r>
+        <w:t>Qualifer(</w:t>
+      </w:r>
+      <w:proofErr w:type="gramEnd"/>
+      <w:r>
+        <w:t>--name of service class–).</w:t>
       </w:r>
     </w:p>
     <w:p/>
     <w:p>
+      <w:proofErr w:type="gramStart"/>
       <w:r>
         <w:rPr>
           <w:b/>
           <w:bCs/>
         </w:rPr>
-        <w:t xml:space="preserve">@Primary: </w:t>
+        <w:t>@Primary</w:t>
+      </w:r>
+      <w:proofErr w:type="gramEnd"/>
+      <w:r>
+        <w:rPr>
+          <w:b/>
+          <w:bCs/>
+        </w:rPr>
+        <w:t xml:space="preserve">: </w:t>
       </w:r>
       <w:r>
         <w:t>Marks a bean as the default when multiple candidates exist. </w:t>
@@ -2182,7 +2576,15 @@
         </w:numPr>
       </w:pPr>
       <w:r>
-        <w:t>Manual XML or annotation based configuration</w:t>
+        <w:t xml:space="preserve">Manual XML or </w:t>
+      </w:r>
+      <w:proofErr w:type="gramStart"/>
+      <w:r>
+        <w:t>annotation based</w:t>
+      </w:r>
+      <w:proofErr w:type="gramEnd"/>
+      <w:r>
+        <w:t xml:space="preserve"> configuration</w:t>
       </w:r>
     </w:p>
     <w:p>
@@ -2217,7 +2619,23 @@
     </w:p>
     <w:p>
       <w:r>
-        <w:t>Spring boot is designed to reduce boilerplate code and setup complexity. It provides auto configuration, embedded local server and production-ready features.</w:t>
+        <w:t xml:space="preserve">Spring boot is designed to reduce boilerplate code and setup complexity. It provides auto </w:t>
+      </w:r>
+      <w:proofErr w:type="gramStart"/>
+      <w:r>
+        <w:t>configuration</w:t>
+      </w:r>
+      <w:proofErr w:type="gramEnd"/>
+      <w:r>
+        <w:t xml:space="preserve">, embedded local </w:t>
+      </w:r>
+      <w:proofErr w:type="gramStart"/>
+      <w:r>
+        <w:t>server</w:t>
+      </w:r>
+      <w:proofErr w:type="gramEnd"/>
+      <w:r>
+        <w:t xml:space="preserve"> and production-ready features.</w:t>
       </w:r>
     </w:p>
     <w:p/>
@@ -2229,7 +2647,15 @@
       </w:r>
       <w:proofErr w:type="spellEnd"/>
       <w:r>
-        <w:t xml:space="preserve"> = Spring framework + prebuilt-configuration + embedded server.</w:t>
+        <w:t xml:space="preserve"> = Spring framework + </w:t>
+      </w:r>
+      <w:proofErr w:type="gramStart"/>
+      <w:r>
+        <w:t>prebuilt-configuration</w:t>
+      </w:r>
+      <w:proofErr w:type="gramEnd"/>
+      <w:r>
+        <w:t xml:space="preserve"> + embedded server.</w:t>
       </w:r>
     </w:p>
     <w:p/>
@@ -2251,10 +2677,12 @@
         </w:numPr>
       </w:pPr>
       <w:proofErr w:type="spellStart"/>
+      <w:proofErr w:type="gramStart"/>
       <w:r>
         <w:t>Springboot</w:t>
       </w:r>
       <w:proofErr w:type="spellEnd"/>
+      <w:proofErr w:type="gramEnd"/>
       <w:r>
         <w:t xml:space="preserve"> starters:</w:t>
       </w:r>
@@ -2266,7 +2694,23 @@
       </w:r>
       <w:proofErr w:type="spellEnd"/>
       <w:r>
-        <w:t xml:space="preserve"> starters are collections of pre-built dependencies which will be helping in built web applications without manual configuration and version checking of each module.</w:t>
+        <w:t xml:space="preserve"> starters are collections of pre-built dependencies which will </w:t>
+      </w:r>
+      <w:proofErr w:type="gramStart"/>
+      <w:r>
+        <w:t>be helping</w:t>
+      </w:r>
+      <w:proofErr w:type="gramEnd"/>
+      <w:r>
+        <w:t xml:space="preserve"> in </w:t>
+      </w:r>
+      <w:proofErr w:type="gramStart"/>
+      <w:r>
+        <w:t>built</w:t>
+      </w:r>
+      <w:proofErr w:type="gramEnd"/>
+      <w:r>
+        <w:t xml:space="preserve"> web applications without manual configuration and version checking of each module.</w:t>
       </w:r>
     </w:p>
     <w:p>
@@ -2342,8 +2786,13 @@
     </w:p>
     <w:p>
       <w:r>
-        <w:t>This dependency includes Spring Data JPA, Hibernate, ORM etc..</w:t>
-      </w:r>
+        <w:t xml:space="preserve">This dependency includes Spring Data JPA, Hibernate, ORM </w:t>
+      </w:r>
+      <w:proofErr w:type="gramStart"/>
+      <w:r>
+        <w:t>etc..</w:t>
+      </w:r>
+      <w:proofErr w:type="gramEnd"/>
     </w:p>
     <w:p>
       <w:pPr>
@@ -2503,7 +2952,15 @@
       </w:r>
       <w:proofErr w:type="spellEnd"/>
       <w:r>
-        <w:t xml:space="preserve"> Architecture: SB has a layered architecture. Where layers communicate and share data.</w:t>
+        <w:t xml:space="preserve"> Architecture: SB has </w:t>
+      </w:r>
+      <w:proofErr w:type="gramStart"/>
+      <w:r>
+        <w:t>a layered</w:t>
+      </w:r>
+      <w:proofErr w:type="gramEnd"/>
+      <w:r>
+        <w:t xml:space="preserve"> architecture. Where layers communicate and share data.</w:t>
       </w:r>
     </w:p>
     <w:p>
@@ -2551,7 +3008,23 @@
     </w:p>
     <w:p>
       <w:r>
-        <w:t>Service layer: Service layer is where business logic resides in the application. Tasks such as evaluations, decision making, processing of data is done in this layer.</w:t>
+        <w:t>Service layer: Service layer is where business logic resides in the application. Tasks such as evaluations, decision making</w:t>
+      </w:r>
+      <w:proofErr w:type="gramStart"/>
+      <w:r>
+        <w:t>, processing</w:t>
+      </w:r>
+      <w:proofErr w:type="gramEnd"/>
+      <w:r>
+        <w:t xml:space="preserve"> of data </w:t>
+      </w:r>
+      <w:proofErr w:type="gramStart"/>
+      <w:r>
+        <w:t>is</w:t>
+      </w:r>
+      <w:proofErr w:type="gramEnd"/>
+      <w:r>
+        <w:t xml:space="preserve"> done in this layer.</w:t>
       </w:r>
     </w:p>
     <w:p>
@@ -2571,17 +3044,34 @@
     </w:p>
     <w:p>
       <w:r>
-        <w:t>The Project Object Model file serves as a configuration XML. It provides essential metadata and build instructions that Maven utilizes to manage the application development lifecycle.</w:t>
+        <w:t xml:space="preserve">The Project Object Model file serves as a configuration XML. It provides essential metadata and </w:t>
+      </w:r>
+      <w:proofErr w:type="gramStart"/>
+      <w:r>
+        <w:t>build</w:t>
+      </w:r>
+      <w:proofErr w:type="gramEnd"/>
+      <w:r>
+        <w:t xml:space="preserve"> instructions that Maven utilizes to manage the application development lifecycle.</w:t>
       </w:r>
     </w:p>
     <w:p/>
     <w:p>
+      <w:proofErr w:type="gramStart"/>
       <w:r>
         <w:rPr>
           <w:b/>
           <w:bCs/>
         </w:rPr>
-        <w:t>@SpringBootApplication:</w:t>
+        <w:t>@SpringBootApplication</w:t>
+      </w:r>
+      <w:proofErr w:type="gramEnd"/>
+      <w:r>
+        <w:rPr>
+          <w:b/>
+          <w:bCs/>
+        </w:rPr>
+        <w:t>:</w:t>
       </w:r>
       <w:r>
         <w:t xml:space="preserve"> This annotation specifies this project as a </w:t>
@@ -2623,8 +3113,13 @@
       </w:r>
     </w:p>
     <w:p>
-      <w:r>
-        <w:t>Dependencies are external libraries which are required to make our web application functional.</w:t>
+      <w:proofErr w:type="gramStart"/>
+      <w:r>
+        <w:t>Dependencies are</w:t>
+      </w:r>
+      <w:proofErr w:type="gramEnd"/>
+      <w:r>
+        <w:t xml:space="preserve"> external libraries which are required to make our web application functional.</w:t>
       </w:r>
     </w:p>
     <w:p>
@@ -2653,17 +3148,32 @@
     <w:p/>
     <w:p>
       <w:proofErr w:type="spellStart"/>
+      <w:proofErr w:type="gramStart"/>
       <w:r>
         <w:t>Lets</w:t>
       </w:r>
       <w:proofErr w:type="spellEnd"/>
-      <w:r>
-        <w:t xml:space="preserve"> build our first RESTful API, for that we need a presentation layer which means, controller class is needed to manage REST endpoints.</w:t>
-      </w:r>
-    </w:p>
-    <w:p>
-      <w:r>
-        <w:t>@Controller: this annotation specifies the class as a controller class which manages the web requests and responses.</w:t>
+      <w:proofErr w:type="gramEnd"/>
+      <w:r>
+        <w:t xml:space="preserve"> build our first RESTful API, </w:t>
+      </w:r>
+      <w:proofErr w:type="gramStart"/>
+      <w:r>
+        <w:t>for that</w:t>
+      </w:r>
+      <w:proofErr w:type="gramEnd"/>
+      <w:r>
+        <w:t xml:space="preserve"> we need a presentation layer which means, controller class is needed to manage REST endpoints.</w:t>
+      </w:r>
+    </w:p>
+    <w:p>
+      <w:proofErr w:type="gramStart"/>
+      <w:r>
+        <w:t>@Controller</w:t>
+      </w:r>
+      <w:proofErr w:type="gramEnd"/>
+      <w:r>
+        <w:t>: this annotation specifies the class as a controller class which manages the web requests and responses.</w:t>
       </w:r>
     </w:p>
     <w:p>
@@ -2685,7 +3195,15 @@
       </w:r>
       <w:proofErr w:type="spellEnd"/>
       <w:r>
-        <w:t xml:space="preserve"> is the front controller in Spring MVC. A single entry point that receives every incoming HTTP request and routes it to the right handler (controller). Instead of each URL mapping to a separate servlet, all requests go through this one servlet, which then delegates the actual work.</w:t>
+        <w:t xml:space="preserve"> is the front controller in Spring MVC. A </w:t>
+      </w:r>
+      <w:proofErr w:type="gramStart"/>
+      <w:r>
+        <w:t>single entry</w:t>
+      </w:r>
+      <w:proofErr w:type="gramEnd"/>
+      <w:r>
+        <w:t xml:space="preserve"> point that receives every incoming HTTP request and routes it to the right handler (controller). Instead of each URL mapping to a separate servlet, all requests go through this one servlet, which then delegates the actual work.</w:t>
       </w:r>
     </w:p>
     <w:p/>
@@ -2715,7 +3233,15 @@
       </w:r>
       <w:proofErr w:type="spellEnd"/>
       <w:r>
-        <w:t xml:space="preserve"> — figures out which controller method should handle this URL (based on @RequestMapping, @GetMapping, etc.)</w:t>
+        <w:t xml:space="preserve"> — figures out which controller method should handle this URL (based </w:t>
+      </w:r>
+      <w:proofErr w:type="gramStart"/>
+      <w:r>
+        <w:t>on @RequestMapping, @</w:t>
+      </w:r>
+      <w:proofErr w:type="gramEnd"/>
+      <w:r>
+        <w:t>GetMapping, etc.)</w:t>
       </w:r>
     </w:p>
     <w:p>
@@ -2731,7 +3257,15 @@
       </w:r>
       <w:proofErr w:type="spellEnd"/>
       <w:r>
-        <w:t xml:space="preserve"> — actually invokes that controller method</w:t>
+        <w:t xml:space="preserve"> — </w:t>
+      </w:r>
+      <w:proofErr w:type="gramStart"/>
+      <w:r>
+        <w:t>actually invokes</w:t>
+      </w:r>
+      <w:proofErr w:type="gramEnd"/>
+      <w:r>
+        <w:t xml:space="preserve"> that controller method</w:t>
       </w:r>
     </w:p>
     <w:p>
@@ -2750,7 +3284,15 @@
       </w:r>
       <w:proofErr w:type="spellEnd"/>
       <w:r>
-        <w:t xml:space="preserve"> (or in REST APIs, the response body directly via @ResponseBody/@RestController)</w:t>
+        <w:t xml:space="preserve"> (or in REST APIs, the response body directly </w:t>
+      </w:r>
+      <w:proofErr w:type="gramStart"/>
+      <w:r>
+        <w:t>via @ResponseBody/@</w:t>
+      </w:r>
+      <w:proofErr w:type="gramEnd"/>
+      <w:r>
+        <w:t>RestController)</w:t>
       </w:r>
     </w:p>
     <w:p/>
@@ -2769,10 +3311,12 @@
         <w:t xml:space="preserve">The </w:t>
       </w:r>
       <w:proofErr w:type="spellStart"/>
+      <w:proofErr w:type="gramStart"/>
       <w:r>
         <w:t>application.properties</w:t>
       </w:r>
       <w:proofErr w:type="spellEnd"/>
+      <w:proofErr w:type="gramEnd"/>
       <w:r>
         <w:t xml:space="preserve"> is a file we use to customize the pre-configurations of component logics in </w:t>
       </w:r>
@@ -2787,19 +3331,42 @@
     </w:p>
     <w:p/>
     <w:p>
-      <w:r>
-        <w:t>@PathVariable: </w:t>
-      </w:r>
-    </w:p>
-    <w:p>
+      <w:proofErr w:type="gramStart"/>
+      <w:r>
+        <w:t>@PathVariable</w:t>
+      </w:r>
+      <w:proofErr w:type="gramEnd"/>
+      <w:r>
+        <w:t>: </w:t>
+      </w:r>
+    </w:p>
+    <w:p>
+      <w:proofErr w:type="gramStart"/>
       <w:r>
         <w:lastRenderedPageBreak/>
-        <w:t>@PathVariable annotation is used to extract dynamic values from the URL path and bind them to method parameters in the Rest controllers.</w:t>
-      </w:r>
-    </w:p>
-    <w:p>
-      <w:r>
-        <w:t>@GetMapping("/users/{id}")</w:t>
+        <w:t>@PathVariable</w:t>
+      </w:r>
+      <w:proofErr w:type="gramEnd"/>
+      <w:r>
+        <w:t xml:space="preserve"> annotation is used to extract dynamic values from the URL path and bind them to method parameters in the Rest controllers.</w:t>
+      </w:r>
+    </w:p>
+    <w:p>
+      <w:proofErr w:type="gramStart"/>
+      <w:r>
+        <w:t>@GetMapping</w:t>
+      </w:r>
+      <w:proofErr w:type="gramEnd"/>
+      <w:r>
+        <w:t>("/</w:t>
+      </w:r>
+      <w:proofErr w:type="gramStart"/>
+      <w:r>
+        <w:t>users/{id}"</w:t>
+      </w:r>
+      <w:proofErr w:type="gramEnd"/>
+      <w:r>
+        <w:t>)</w:t>
       </w:r>
     </w:p>
     <w:p>
@@ -2807,13 +3374,23 @@
         <w:t xml:space="preserve">public String </w:t>
       </w:r>
       <w:proofErr w:type="spellStart"/>
+      <w:proofErr w:type="gramStart"/>
       <w:r>
         <w:t>getUserById</w:t>
       </w:r>
       <w:proofErr w:type="spellEnd"/>
       <w:r>
-        <w:t>(@PathVariable int id) {</w:t>
-      </w:r>
+        <w:t>(</w:t>
+      </w:r>
+      <w:proofErr w:type="gramEnd"/>
+      <w:r>
+        <w:t xml:space="preserve">@PathVariable int </w:t>
+      </w:r>
+      <w:proofErr w:type="gramStart"/>
+      <w:r>
+        <w:t>id) {</w:t>
+      </w:r>
+      <w:proofErr w:type="gramEnd"/>
     </w:p>
     <w:p>
       <w:r>
@@ -2849,7 +3426,15 @@
         </w:numPr>
       </w:pPr>
       <w:r>
-        <w:t>We can explicitly mention in the variable name of annotation in the method parameter.</w:t>
+        <w:t xml:space="preserve">We can explicitly </w:t>
+      </w:r>
+      <w:proofErr w:type="gramStart"/>
+      <w:r>
+        <w:t>mention in</w:t>
+      </w:r>
+      <w:proofErr w:type="gramEnd"/>
+      <w:r>
+        <w:t xml:space="preserve"> the variable name of annotation in the method parameter.</w:t>
       </w:r>
     </w:p>
     <w:p>
@@ -2858,8 +3443,21 @@
       </w:r>
     </w:p>
     <w:p>
-      <w:r>
-        <w:t>@GetMapping("/books/{isbn}")</w:t>
+      <w:proofErr w:type="gramStart"/>
+      <w:r>
+        <w:t>@GetMapping</w:t>
+      </w:r>
+      <w:proofErr w:type="gramEnd"/>
+      <w:r>
+        <w:t>("/</w:t>
+      </w:r>
+      <w:proofErr w:type="gramStart"/>
+      <w:r>
+        <w:t>books/{isbn}"</w:t>
+      </w:r>
+      <w:proofErr w:type="gramEnd"/>
+      <w:r>
+        <w:t>)</w:t>
       </w:r>
     </w:p>
     <w:p>
@@ -2875,6 +3473,7 @@
         <w:t xml:space="preserve">(@PathVariable("isbn") String </w:t>
       </w:r>
       <w:proofErr w:type="spellStart"/>
+      <w:proofErr w:type="gramStart"/>
       <w:r>
         <w:t>bookCode</w:t>
       </w:r>
@@ -2882,6 +3481,7 @@
       <w:r>
         <w:t>) {</w:t>
       </w:r>
+      <w:proofErr w:type="gramEnd"/>
     </w:p>
     <w:p>
       <w:r>
@@ -2921,8 +3521,21 @@
       </w:r>
     </w:p>
     <w:p>
-      <w:r>
-        <w:t>@GetMapping("/orders/{userId}/order/{orderId}")</w:t>
+      <w:proofErr w:type="gramStart"/>
+      <w:r>
+        <w:t>@GetMapping</w:t>
+      </w:r>
+      <w:proofErr w:type="gramEnd"/>
+      <w:r>
+        <w:t>("/</w:t>
+      </w:r>
+      <w:proofErr w:type="gramStart"/>
+      <w:r>
+        <w:t>orders/{userId}/order/{orderId}"</w:t>
+      </w:r>
+      <w:proofErr w:type="gramEnd"/>
+      <w:r>
+        <w:t>)</w:t>
       </w:r>
     </w:p>
     <w:p>
@@ -2930,20 +3543,30 @@
         <w:t xml:space="preserve">public String </w:t>
       </w:r>
       <w:proofErr w:type="spellStart"/>
+      <w:proofErr w:type="gramStart"/>
       <w:r>
         <w:t>getOrder</w:t>
       </w:r>
       <w:proofErr w:type="spellEnd"/>
       <w:r>
-        <w:t xml:space="preserve">(@PathVariable int </w:t>
-      </w:r>
-      <w:proofErr w:type="spellStart"/>
+        <w:t>(</w:t>
+      </w:r>
+      <w:proofErr w:type="gramEnd"/>
+      <w:r>
+        <w:t xml:space="preserve">@PathVariable int </w:t>
+      </w:r>
+      <w:proofErr w:type="spellStart"/>
+      <w:proofErr w:type="gramStart"/>
       <w:r>
         <w:t>userId</w:t>
       </w:r>
       <w:proofErr w:type="spellEnd"/>
       <w:r>
-        <w:t xml:space="preserve">, @PathVariable int </w:t>
+        <w:t>, @</w:t>
+      </w:r>
+      <w:proofErr w:type="gramEnd"/>
+      <w:r>
+        <w:t xml:space="preserve">PathVariable int </w:t>
       </w:r>
       <w:proofErr w:type="spellStart"/>
       <w:r>
@@ -2982,20 +3605,40 @@
     </w:p>
     <w:p/>
     <w:p>
-      <w:r>
-        <w:t>ResponseEntity:</w:t>
+      <w:proofErr w:type="spellStart"/>
+      <w:r>
+        <w:t>ResponseEntity</w:t>
+      </w:r>
+      <w:proofErr w:type="spellEnd"/>
+      <w:r>
+        <w:t>:</w:t>
       </w:r>
       <w:r>
         <w:br/>
       </w:r>
       <w:r>
         <w:br/>
-        <w:t>ResponseEntity is a wrapper class in Spring that represents the entire HTTP response. This includes status code, headers and body.</w:t>
-      </w:r>
-    </w:p>
-    <w:p>
-      <w:r>
-        <w:t>When the method returns the ResponseEntity, Spring uses information provided in the method to construct the final HTTP response sent to the client.</w:t>
+      </w:r>
+      <w:proofErr w:type="spellStart"/>
+      <w:r>
+        <w:t>ResponseEntity</w:t>
+      </w:r>
+      <w:proofErr w:type="spellEnd"/>
+      <w:r>
+        <w:t xml:space="preserve"> is a wrapper class in Spring that represents the entire HTTP response. This includes status code, headers and body.</w:t>
+      </w:r>
+    </w:p>
+    <w:p>
+      <w:r>
+        <w:t xml:space="preserve">When the method returns the </w:t>
+      </w:r>
+      <w:proofErr w:type="spellStart"/>
+      <w:r>
+        <w:t>ResponseEntity</w:t>
+      </w:r>
+      <w:proofErr w:type="spellEnd"/>
+      <w:r>
+        <w:t>, Spring uses information provided in the method to construct the final HTTP response sent to the client.</w:t>
       </w:r>
     </w:p>
     <w:p/>
@@ -3041,13 +3684,34 @@
       </w:r>
     </w:p>
     <w:p>
-      <w:r>
-        <w:t>@Entity: Marks the class as a JPA entity. JPA will manage this object for persistence.</w:t>
-      </w:r>
-    </w:p>
-    <w:p>
-      <w:r>
-        <w:t>@Table(name = "employees"): Maps the entity to the employees table. Optional if table name is the same as class name.</w:t>
+      <w:proofErr w:type="gramStart"/>
+      <w:r>
+        <w:t>@Entity</w:t>
+      </w:r>
+      <w:proofErr w:type="gramEnd"/>
+      <w:r>
+        <w:t>: Marks the class as a JPA entity. JPA will manage this object for persistence.</w:t>
+      </w:r>
+    </w:p>
+    <w:p>
+      <w:r>
+        <w:t>@</w:t>
+      </w:r>
+      <w:proofErr w:type="gramStart"/>
+      <w:r>
+        <w:t>Table(</w:t>
+      </w:r>
+      <w:proofErr w:type="gramEnd"/>
+      <w:r>
+        <w:t xml:space="preserve">name = "employees"): Maps the entity to the </w:t>
+      </w:r>
+      <w:proofErr w:type="gramStart"/>
+      <w:r>
+        <w:t>employees</w:t>
+      </w:r>
+      <w:proofErr w:type="gramEnd"/>
+      <w:r>
+        <w:t xml:space="preserve"> table. Optional if table name is the same as class name.</w:t>
       </w:r>
     </w:p>
     <w:p>
@@ -3057,7 +3721,15 @@
     </w:p>
     <w:p>
       <w:r>
-        <w:t xml:space="preserve">@GeneratedValue(strategy = </w:t>
+        <w:t>@</w:t>
+      </w:r>
+      <w:proofErr w:type="gramStart"/>
+      <w:r>
+        <w:t>GeneratedValue(</w:t>
+      </w:r>
+      <w:proofErr w:type="gramEnd"/>
+      <w:r>
+        <w:t xml:space="preserve">strategy = </w:t>
       </w:r>
       <w:proofErr w:type="spellStart"/>
       <w:r>
@@ -3070,7 +3742,15 @@
     </w:p>
     <w:p>
       <w:r>
-        <w:t>@Column(name = "name"): Maps a field to a specific column in the database. Optional if field name matches column name.</w:t>
+        <w:t>@</w:t>
+      </w:r>
+      <w:proofErr w:type="gramStart"/>
+      <w:r>
+        <w:t>Column(</w:t>
+      </w:r>
+      <w:proofErr w:type="gramEnd"/>
+      <w:r>
+        <w:t>name = "name"): Maps a field to a specific column in the database. Optional if field name matches column name.</w:t>
       </w:r>
     </w:p>
     <w:p>
@@ -3080,7 +3760,15 @@
     </w:p>
     <w:p>
       <w:r>
-        <w:t xml:space="preserve">Optional&lt;T&gt; is a container object used to represent the presence or absence of a value. It prevents </w:t>
+        <w:t xml:space="preserve">Optional&lt;T&gt; is a container object used to represent the presence or absence of </w:t>
+      </w:r>
+      <w:proofErr w:type="gramStart"/>
+      <w:r>
+        <w:t>a value</w:t>
+      </w:r>
+      <w:proofErr w:type="gramEnd"/>
+      <w:r>
+        <w:t xml:space="preserve">. It prevents </w:t>
       </w:r>
       <w:proofErr w:type="spellStart"/>
       <w:r>
@@ -3094,7 +3782,15 @@
     <w:p/>
     <w:p>
       <w:r>
-        <w:t>Getters and setters are really needed in the MODEL classes, when we are developing web applications. Without them, we cannot store and fetch values from DB.</w:t>
+        <w:t xml:space="preserve">Getters and </w:t>
+      </w:r>
+      <w:proofErr w:type="gramStart"/>
+      <w:r>
+        <w:t>setters</w:t>
+      </w:r>
+      <w:proofErr w:type="gramEnd"/>
+      <w:r>
+        <w:t xml:space="preserve"> are really needed in the MODEL classes, when we are developing web applications. Without them, we cannot store and fetch values from DB.</w:t>
       </w:r>
     </w:p>
     <w:p/>
@@ -3173,12 +3869,25 @@
     </w:p>
     <w:p>
       <w:r>
-        <w:t>@Size(min = x, max = y)</w:t>
-      </w:r>
-    </w:p>
-    <w:p>
-      <w:r>
-        <w:t>@Email  </w:t>
+        <w:t>@</w:t>
+      </w:r>
+      <w:proofErr w:type="gramStart"/>
+      <w:r>
+        <w:t>Size(</w:t>
+      </w:r>
+      <w:proofErr w:type="gramEnd"/>
+      <w:r>
+        <w:t>min = x, max = y)</w:t>
+      </w:r>
+    </w:p>
+    <w:p>
+      <w:proofErr w:type="gramStart"/>
+      <w:r>
+        <w:t>@Email</w:t>
+      </w:r>
+      <w:proofErr w:type="gramEnd"/>
+      <w:r>
+        <w:t>  </w:t>
       </w:r>
     </w:p>
     <w:p>
@@ -3235,7 +3944,15 @@
       </w:r>
       <w:proofErr w:type="spellEnd"/>
       <w:r>
-        <w:t xml:space="preserve"> as @NotEmpty(message = “</w:t>
+        <w:t xml:space="preserve"> as @</w:t>
+      </w:r>
+      <w:proofErr w:type="gramStart"/>
+      <w:r>
+        <w:t>NotEmpty(</w:t>
+      </w:r>
+      <w:proofErr w:type="gramEnd"/>
+      <w:r>
+        <w:t>message = “</w:t>
       </w:r>
       <w:proofErr w:type="spellStart"/>
       <w:r>
@@ -3246,10 +3963,12 @@
         <w:t xml:space="preserve"> </w:t>
       </w:r>
       <w:proofErr w:type="spellStart"/>
+      <w:proofErr w:type="gramStart"/>
       <w:r>
         <w:t>cant</w:t>
       </w:r>
       <w:proofErr w:type="spellEnd"/>
+      <w:proofErr w:type="gramEnd"/>
       <w:r>
         <w:t xml:space="preserve"> be blank”)</w:t>
       </w:r>
@@ -3269,12 +3988,28 @@
     </w:p>
     <w:p>
       <w:r>
-        <w:t>I get response as 500 internal error.</w:t>
-      </w:r>
-    </w:p>
-    <w:p>
-      <w:r>
-        <w:t xml:space="preserve">In console logs, we can able to see exception of </w:t>
+        <w:t xml:space="preserve">I get response as 500 internal </w:t>
+      </w:r>
+      <w:proofErr w:type="gramStart"/>
+      <w:r>
+        <w:t>error</w:t>
+      </w:r>
+      <w:proofErr w:type="gramEnd"/>
+      <w:r>
+        <w:t>.</w:t>
+      </w:r>
+    </w:p>
+    <w:p>
+      <w:r>
+        <w:t xml:space="preserve">In console logs, we </w:t>
+      </w:r>
+      <w:proofErr w:type="gramStart"/>
+      <w:r>
+        <w:t>can</w:t>
+      </w:r>
+      <w:proofErr w:type="gramEnd"/>
+      <w:r>
+        <w:t xml:space="preserve"> able to see exception of </w:t>
       </w:r>
       <w:proofErr w:type="spellStart"/>
       <w:r>
@@ -3288,14 +4023,24 @@
     <w:p/>
     <w:p>
       <w:r>
-        <w:t>In the process of making this more user friendly, we can use @Valid annotation at controller class.</w:t>
+        <w:t xml:space="preserve">In the process of making this more user friendly, we can </w:t>
+      </w:r>
+      <w:proofErr w:type="gramStart"/>
+      <w:r>
+        <w:t>use @</w:t>
+      </w:r>
+      <w:proofErr w:type="gramEnd"/>
+      <w:r>
+        <w:t>Valid annotation at controller class.</w:t>
       </w:r>
     </w:p>
     <w:p/>
     <w:p>
+      <w:proofErr w:type="gramStart"/>
       <w:r>
         <w:t>Using @</w:t>
       </w:r>
+      <w:proofErr w:type="gramEnd"/>
       <w:r>
         <w:t>Valid in controller at parameter level of the request</w:t>
       </w:r>
@@ -3305,8 +4050,25 @@
     </w:p>
     <w:p>
       <w:r>
-        <w:t xml:space="preserve">After using @Valid annotation, the response will be 400 bad request, and in console logs, we can find exception of </w:t>
-      </w:r>
+        <w:t xml:space="preserve">After </w:t>
+      </w:r>
+      <w:proofErr w:type="gramStart"/>
+      <w:r>
+        <w:t>using @</w:t>
+      </w:r>
+      <w:proofErr w:type="gramEnd"/>
+      <w:r>
+        <w:t xml:space="preserve">Valid annotation, the response will be 400 bad </w:t>
+      </w:r>
+      <w:proofErr w:type="gramStart"/>
+      <w:r>
+        <w:t>request</w:t>
+      </w:r>
+      <w:proofErr w:type="gramEnd"/>
+      <w:r>
+        <w:t xml:space="preserve">, and in console logs, we can find exception of </w:t>
+      </w:r>
+      <w:proofErr w:type="spellStart"/>
       <w:r>
         <w:rPr>
           <w:b/>
@@ -3314,6 +4076,7 @@
         </w:rPr>
         <w:t>MethodArugumentNotValidException</w:t>
       </w:r>
+      <w:proofErr w:type="spellEnd"/>
       <w:r>
         <w:t xml:space="preserve"> and its shows which fields did not pass the validation and specifies the message of validation we mentioned in the POJO class.</w:t>
       </w:r>
@@ -3323,6 +4086,7 @@
       <w:r>
         <w:t xml:space="preserve">To achieve more user-friendly response, we use </w:t>
       </w:r>
+      <w:proofErr w:type="spellStart"/>
       <w:r>
         <w:rPr>
           <w:b/>
@@ -3330,23 +4094,71 @@
         </w:rPr>
         <w:t>globalExceptionHandler</w:t>
       </w:r>
+      <w:proofErr w:type="spellEnd"/>
       <w:r>
         <w:t xml:space="preserve"> class, to manage default exception implementation.</w:t>
       </w:r>
     </w:p>
     <w:p>
-      <w:r>
-        <w:t>@RestControllerAdvice:</w:t>
-      </w:r>
-    </w:p>
-    <w:p>
-      <w:r>
-        <w:t>@RestControllerAdvice is a specialized version of @ControllerAdvice in Spring Boot, designed to handle exceptions in RESTful APIs. It combines the functionality of @ControllerAdvice and @ResponseBody, making it easier to manage exceptions globally and return JSON responses.</w:t>
-      </w:r>
-    </w:p>
-    <w:p>
-      <w:r>
-        <w:t>Since @RestControllerAdvice includes @ResponseBody, any object returned from the exception handler methods is automatically serialized into JSON and sent back to the client.</w:t>
+      <w:proofErr w:type="gramStart"/>
+      <w:r>
+        <w:t>@RestControllerAdvice</w:t>
+      </w:r>
+      <w:proofErr w:type="gramEnd"/>
+      <w:r>
+        <w:t>:</w:t>
+      </w:r>
+    </w:p>
+    <w:p>
+      <w:proofErr w:type="gramStart"/>
+      <w:r>
+        <w:t>@RestControllerAdvice</w:t>
+      </w:r>
+      <w:proofErr w:type="gramEnd"/>
+      <w:r>
+        <w:t xml:space="preserve"> is a specialized version </w:t>
+      </w:r>
+      <w:proofErr w:type="gramStart"/>
+      <w:r>
+        <w:t>of @</w:t>
+      </w:r>
+      <w:proofErr w:type="gramEnd"/>
+      <w:r>
+        <w:t xml:space="preserve">ControllerAdvice in Spring Boot, designed to handle exceptions in RESTful APIs. It combines the functionality </w:t>
+      </w:r>
+      <w:proofErr w:type="gramStart"/>
+      <w:r>
+        <w:t>of @</w:t>
+      </w:r>
+      <w:proofErr w:type="gramEnd"/>
+      <w:r>
+        <w:t xml:space="preserve">ControllerAdvice </w:t>
+      </w:r>
+      <w:proofErr w:type="gramStart"/>
+      <w:r>
+        <w:t>and @</w:t>
+      </w:r>
+      <w:proofErr w:type="gramEnd"/>
+      <w:r>
+        <w:t>ResponseBody, making it easier to manage exceptions globally and return JSON responses.</w:t>
+      </w:r>
+    </w:p>
+    <w:p>
+      <w:proofErr w:type="gramStart"/>
+      <w:r>
+        <w:t>Since @</w:t>
+      </w:r>
+      <w:proofErr w:type="gramEnd"/>
+      <w:r>
+        <w:t xml:space="preserve">RestControllerAdvice </w:t>
+      </w:r>
+      <w:proofErr w:type="gramStart"/>
+      <w:r>
+        <w:t>includes @</w:t>
+      </w:r>
+      <w:proofErr w:type="gramEnd"/>
+      <w:r>
+        <w:t>ResponseBody, any object returned from the exception handler methods is automatically serialized into JSON and sent back to the client.</w:t>
       </w:r>
     </w:p>
     <w:p/>
@@ -3371,7 +4183,15 @@
         </w:numPr>
       </w:pPr>
       <w:r>
-        <w:t xml:space="preserve">We create customException class </w:t>
+        <w:t xml:space="preserve">We create </w:t>
+      </w:r>
+      <w:proofErr w:type="spellStart"/>
+      <w:r>
+        <w:t>customException</w:t>
+      </w:r>
+      <w:proofErr w:type="spellEnd"/>
+      <w:r>
+        <w:t xml:space="preserve"> class </w:t>
       </w:r>
       <w:r>
         <w:t>with</w:t>
@@ -3383,7 +4203,15 @@
         <w:t>ing</w:t>
       </w:r>
       <w:r>
-        <w:t xml:space="preserve"> RuntimeException and implement logic.</w:t>
+        <w:t xml:space="preserve"> </w:t>
+      </w:r>
+      <w:proofErr w:type="spellStart"/>
+      <w:r>
+        <w:t>RuntimeException</w:t>
+      </w:r>
+      <w:proofErr w:type="spellEnd"/>
+      <w:r>
+        <w:t xml:space="preserve"> and implement logic.</w:t>
       </w:r>
     </w:p>
     <w:p>
@@ -3395,10 +4223,26 @@
         </w:numPr>
       </w:pPr>
       <w:r>
-        <w:t>We manage this custom exception class in the globalExceptionHandler class.</w:t>
-      </w:r>
-      <w:r>
-        <w:t xml:space="preserve"> We can return ResponseEntity along with exception message.</w:t>
+        <w:t xml:space="preserve">We manage this custom exception class in the </w:t>
+      </w:r>
+      <w:proofErr w:type="spellStart"/>
+      <w:r>
+        <w:t>globalExceptionHandler</w:t>
+      </w:r>
+      <w:proofErr w:type="spellEnd"/>
+      <w:r>
+        <w:t xml:space="preserve"> class.</w:t>
+      </w:r>
+      <w:r>
+        <w:t xml:space="preserve"> We can return </w:t>
+      </w:r>
+      <w:proofErr w:type="spellStart"/>
+      <w:r>
+        <w:t>ResponseEntity</w:t>
+      </w:r>
+      <w:proofErr w:type="spellEnd"/>
+      <w:r>
+        <w:t xml:space="preserve"> along with exception message.</w:t>
       </w:r>
     </w:p>
     <w:p>
@@ -3414,7 +4258,15 @@
         <w:ind w:left="1080"/>
       </w:pPr>
       <w:r>
-        <w:t>@ExceptionHandler(APIException.class)</w:t>
+        <w:t>@</w:t>
+      </w:r>
+      <w:proofErr w:type="gramStart"/>
+      <w:r>
+        <w:t>ExceptionHandler(</w:t>
+      </w:r>
+      <w:proofErr w:type="gramEnd"/>
+      <w:r>
+        <w:t>APIException.class)</w:t>
       </w:r>
       <w:r>
         <w:br/>
@@ -3429,6 +4281,7 @@
         <w:t xml:space="preserve">&lt;String&gt; </w:t>
       </w:r>
       <w:proofErr w:type="spellStart"/>
+      <w:proofErr w:type="gramStart"/>
       <w:r>
         <w:t>ApiException</w:t>
       </w:r>
@@ -3437,6 +4290,7 @@
         <w:t>(</w:t>
       </w:r>
       <w:proofErr w:type="spellStart"/>
+      <w:proofErr w:type="gramEnd"/>
       <w:r>
         <w:t>APIException</w:t>
       </w:r>
@@ -3453,10 +4307,12 @@
         <w:t xml:space="preserve">    String message = </w:t>
       </w:r>
       <w:proofErr w:type="spellStart"/>
+      <w:proofErr w:type="gramStart"/>
       <w:r>
         <w:t>exception.getMessage</w:t>
       </w:r>
       <w:proofErr w:type="spellEnd"/>
+      <w:proofErr w:type="gramEnd"/>
       <w:r>
         <w:t>();</w:t>
       </w:r>
@@ -3470,7 +4326,15 @@
       </w:r>
       <w:proofErr w:type="spellEnd"/>
       <w:r>
-        <w:t xml:space="preserve">&lt;&gt;(message, </w:t>
+        <w:t>&lt;</w:t>
+      </w:r>
+      <w:proofErr w:type="gramStart"/>
+      <w:r>
+        <w:t>&gt;(</w:t>
+      </w:r>
+      <w:proofErr w:type="gramEnd"/>
+      <w:r>
+        <w:t xml:space="preserve">message, </w:t>
       </w:r>
       <w:proofErr w:type="spellStart"/>
       <w:r>
@@ -3503,7 +4367,15 @@
       </w:r>
       <w:r>
         <w:br/>
-        <w:t>Pagination is a technique of dividing a large body of con tent or data into smaller, discrete and numbered pages.</w:t>
+        <w:t xml:space="preserve">Pagination is a technique of dividing a large body of </w:t>
+      </w:r>
+      <w:proofErr w:type="gramStart"/>
+      <w:r>
+        <w:t>con tent</w:t>
+      </w:r>
+      <w:proofErr w:type="gramEnd"/>
+      <w:r>
+        <w:t xml:space="preserve"> or data into smaller, discrete and numbered pages.</w:t>
       </w:r>
     </w:p>
     <w:p>
@@ -3557,11 +4429,9 @@
         <w:lastRenderedPageBreak/>
         <w:t xml:space="preserve">Pagination in </w:t>
       </w:r>
-      <w:proofErr w:type="spellStart"/>
-      <w:r>
-        <w:t>Springboot</w:t>
-      </w:r>
-      <w:proofErr w:type="spellEnd"/>
+      <w:r>
+        <w:t>Spring boot</w:t>
+      </w:r>
       <w:r>
         <w:t>.</w:t>
       </w:r>
@@ -3577,6 +4447,1119 @@
         <w:t>abstractions, which take care of the SQL LIMIT/OFFSET work for you.</w:t>
       </w:r>
     </w:p>
+    <w:p/>
+    <w:p>
+      <w:r>
+        <w:t xml:space="preserve">To implement pagination, our repositories must extend </w:t>
+      </w:r>
+      <w:proofErr w:type="spellStart"/>
+      <w:r>
+        <w:t>JpaRepository</w:t>
+      </w:r>
+      <w:proofErr w:type="spellEnd"/>
+      <w:r>
+        <w:t xml:space="preserve"> or </w:t>
+      </w:r>
+      <w:proofErr w:type="spellStart"/>
+      <w:r>
+        <w:t>PagingAndSortingRepository</w:t>
+      </w:r>
+      <w:proofErr w:type="spellEnd"/>
+      <w:r>
+        <w:t>.</w:t>
+      </w:r>
+    </w:p>
+    <w:p/>
+    <w:p>
+      <w:r>
+        <w:t>Pageable:</w:t>
+      </w:r>
+    </w:p>
+    <w:p>
+      <w:r>
+        <w:t xml:space="preserve">Pageable is the interface that describes what page of data you want. It's just a request object — it doesn't hold any actual data. It carries three things: the page number, the page size, and optionally a Sort. Spring Data's concrete implementation you'll </w:t>
+      </w:r>
+      <w:proofErr w:type="gramStart"/>
+      <w:r>
+        <w:t>actually construct</w:t>
+      </w:r>
+      <w:proofErr w:type="gramEnd"/>
+      <w:r>
+        <w:t xml:space="preserve"> is </w:t>
+      </w:r>
+      <w:proofErr w:type="spellStart"/>
+      <w:r>
+        <w:t>PageRequest</w:t>
+      </w:r>
+      <w:proofErr w:type="spellEnd"/>
+      <w:r>
+        <w:t>.</w:t>
+      </w:r>
+    </w:p>
+    <w:p/>
+    <w:p>
+      <w:r>
+        <w:t xml:space="preserve">Pageable </w:t>
+      </w:r>
+      <w:proofErr w:type="spellStart"/>
+      <w:r>
+        <w:t>pageable</w:t>
+      </w:r>
+      <w:proofErr w:type="spellEnd"/>
+      <w:r>
+        <w:t xml:space="preserve"> = </w:t>
+      </w:r>
+      <w:proofErr w:type="spellStart"/>
+      <w:r>
+        <w:t>PageRequest.of</w:t>
+      </w:r>
+      <w:proofErr w:type="spellEnd"/>
+      <w:r>
+        <w:t>(0, 20); // page 0, 20 items per page</w:t>
+      </w:r>
+    </w:p>
+    <w:p>
+      <w:r>
+        <w:t xml:space="preserve">Pageable </w:t>
+      </w:r>
+      <w:proofErr w:type="spellStart"/>
+      <w:r>
+        <w:t>pageable</w:t>
+      </w:r>
+      <w:proofErr w:type="spellEnd"/>
+      <w:r>
+        <w:t xml:space="preserve"> = </w:t>
+      </w:r>
+      <w:proofErr w:type="spellStart"/>
+      <w:r>
+        <w:t>PageRequest.of</w:t>
+      </w:r>
+      <w:proofErr w:type="spellEnd"/>
+      <w:r>
+        <w:t>(0, 20, Sort.by("</w:t>
+      </w:r>
+      <w:proofErr w:type="spellStart"/>
+      <w:r>
+        <w:t>lastName</w:t>
+      </w:r>
+      <w:proofErr w:type="spellEnd"/>
+      <w:r>
+        <w:t>"</w:t>
+      </w:r>
+      <w:proofErr w:type="gramStart"/>
+      <w:r>
+        <w:t>).ascending</w:t>
+      </w:r>
+      <w:proofErr w:type="gramEnd"/>
+      <w:r>
+        <w:t>());</w:t>
+      </w:r>
+    </w:p>
+    <w:p>
+      <w:r>
+        <w:t xml:space="preserve">Pageable </w:t>
+      </w:r>
+      <w:proofErr w:type="spellStart"/>
+      <w:r>
+        <w:t>pageable</w:t>
+      </w:r>
+      <w:proofErr w:type="spellEnd"/>
+      <w:r>
+        <w:t xml:space="preserve"> = </w:t>
+      </w:r>
+      <w:proofErr w:type="spellStart"/>
+      <w:r>
+        <w:t>PageRequest.of</w:t>
+      </w:r>
+      <w:proofErr w:type="spellEnd"/>
+      <w:r>
+        <w:t>(0, 20, Sort.by("</w:t>
+      </w:r>
+      <w:proofErr w:type="spellStart"/>
+      <w:r>
+        <w:t>lastName</w:t>
+      </w:r>
+      <w:proofErr w:type="spellEnd"/>
+      <w:r>
+        <w:t>"</w:t>
+      </w:r>
+      <w:proofErr w:type="gramStart"/>
+      <w:r>
+        <w:t>).ascending</w:t>
+      </w:r>
+      <w:proofErr w:type="gramEnd"/>
+      <w:r>
+        <w:t>().</w:t>
+      </w:r>
+      <w:proofErr w:type="gramStart"/>
+      <w:r>
+        <w:t>and(</w:t>
+      </w:r>
+      <w:proofErr w:type="gramEnd"/>
+      <w:r>
+        <w:t>Sort.by("</w:t>
+      </w:r>
+      <w:proofErr w:type="spellStart"/>
+      <w:r>
+        <w:t>firstName</w:t>
+      </w:r>
+      <w:proofErr w:type="spellEnd"/>
+      <w:r>
+        <w:t>")));</w:t>
+      </w:r>
+    </w:p>
+    <w:p/>
+    <w:p>
+      <w:r>
+        <w:t>Page&lt;T&gt;:</w:t>
+      </w:r>
+    </w:p>
+    <w:p>
+      <w:r>
+        <w:t xml:space="preserve">Page&lt;T&gt; is what you get back when you pass a Pageable into a query. It extends Slice&lt;T&gt;, and on top of the slice behavior it adds a full count of all matching rows, obtained via a second, separate query. That's the important trade-off to </w:t>
+      </w:r>
+      <w:proofErr w:type="gramStart"/>
+      <w:r>
+        <w:t>know:</w:t>
+      </w:r>
+      <w:proofErr w:type="gramEnd"/>
+      <w:r>
+        <w:t xml:space="preserve"> under the hood, a Page&lt;T&gt; result triggers two SQL statements, one for the actual page of rows (with LIMIT/OFFSET) and one SELECT </w:t>
+      </w:r>
+      <w:proofErr w:type="gramStart"/>
+      <w:r>
+        <w:t>COUNT(</w:t>
+      </w:r>
+      <w:proofErr w:type="gramEnd"/>
+      <w:r>
+        <w:t xml:space="preserve">*) to compute </w:t>
+      </w:r>
+      <w:proofErr w:type="spellStart"/>
+      <w:proofErr w:type="gramStart"/>
+      <w:r>
+        <w:t>getTotalElements</w:t>
+      </w:r>
+      <w:proofErr w:type="spellEnd"/>
+      <w:r>
+        <w:t>(</w:t>
+      </w:r>
+      <w:proofErr w:type="gramEnd"/>
+      <w:r>
+        <w:t>).</w:t>
+      </w:r>
+    </w:p>
+    <w:p/>
+    <w:p>
+      <w:r>
+        <w:t xml:space="preserve">Page&lt;Employee&gt; page = </w:t>
+      </w:r>
+      <w:proofErr w:type="spellStart"/>
+      <w:r>
+        <w:t>employeeRepository.findAll</w:t>
+      </w:r>
+      <w:proofErr w:type="spellEnd"/>
+      <w:r>
+        <w:t>(pageable);</w:t>
+      </w:r>
+    </w:p>
+    <w:p>
+      <w:proofErr w:type="spellStart"/>
+      <w:proofErr w:type="gramStart"/>
+      <w:r>
+        <w:t>page.getContent</w:t>
+      </w:r>
+      <w:proofErr w:type="spellEnd"/>
+      <w:proofErr w:type="gramEnd"/>
+      <w:r>
+        <w:t>(</w:t>
+      </w:r>
+      <w:proofErr w:type="gramStart"/>
+      <w:r>
+        <w:t xml:space="preserve">);   </w:t>
+      </w:r>
+      <w:proofErr w:type="gramEnd"/>
+      <w:r>
+        <w:t xml:space="preserve">     // List&lt;Employee&gt; — the actual rows</w:t>
+      </w:r>
+    </w:p>
+    <w:p>
+      <w:proofErr w:type="spellStart"/>
+      <w:proofErr w:type="gramStart"/>
+      <w:r>
+        <w:t>page.getTotalElements</w:t>
+      </w:r>
+      <w:proofErr w:type="spellEnd"/>
+      <w:proofErr w:type="gramEnd"/>
+      <w:r>
+        <w:t>(</w:t>
+      </w:r>
+      <w:proofErr w:type="gramStart"/>
+      <w:r>
+        <w:t>);  /</w:t>
+      </w:r>
+      <w:proofErr w:type="gramEnd"/>
+      <w:r>
+        <w:t>/ total matching rows across all pages</w:t>
+      </w:r>
+    </w:p>
+    <w:p>
+      <w:proofErr w:type="spellStart"/>
+      <w:proofErr w:type="gramStart"/>
+      <w:r>
+        <w:t>page.getTotalPages</w:t>
+      </w:r>
+      <w:proofErr w:type="spellEnd"/>
+      <w:proofErr w:type="gramEnd"/>
+      <w:r>
+        <w:t>(</w:t>
+      </w:r>
+      <w:proofErr w:type="gramStart"/>
+      <w:r>
+        <w:t xml:space="preserve">);   </w:t>
+      </w:r>
+      <w:proofErr w:type="gramEnd"/>
+      <w:r>
+        <w:t xml:space="preserve">  // </w:t>
+      </w:r>
+      <w:proofErr w:type="gramStart"/>
+      <w:r>
+        <w:t>ceil(</w:t>
+      </w:r>
+      <w:proofErr w:type="spellStart"/>
+      <w:proofErr w:type="gramEnd"/>
+      <w:r>
+        <w:t>totalElements</w:t>
+      </w:r>
+      <w:proofErr w:type="spellEnd"/>
+      <w:r>
+        <w:t xml:space="preserve"> / </w:t>
+      </w:r>
+      <w:proofErr w:type="spellStart"/>
+      <w:r>
+        <w:t>pageSize</w:t>
+      </w:r>
+      <w:proofErr w:type="spellEnd"/>
+      <w:r>
+        <w:t>)</w:t>
+      </w:r>
+    </w:p>
+    <w:p>
+      <w:proofErr w:type="spellStart"/>
+      <w:proofErr w:type="gramStart"/>
+      <w:r>
+        <w:lastRenderedPageBreak/>
+        <w:t>page.getNumber</w:t>
+      </w:r>
+      <w:proofErr w:type="spellEnd"/>
+      <w:proofErr w:type="gramEnd"/>
+      <w:r>
+        <w:t>(</w:t>
+      </w:r>
+      <w:proofErr w:type="gramStart"/>
+      <w:r>
+        <w:t xml:space="preserve">);   </w:t>
+      </w:r>
+      <w:proofErr w:type="gramEnd"/>
+      <w:r>
+        <w:t xml:space="preserve">      // current page number (0-indexed)</w:t>
+      </w:r>
+    </w:p>
+    <w:p>
+      <w:proofErr w:type="spellStart"/>
+      <w:proofErr w:type="gramStart"/>
+      <w:r>
+        <w:t>page.getSize</w:t>
+      </w:r>
+      <w:proofErr w:type="spellEnd"/>
+      <w:proofErr w:type="gramEnd"/>
+      <w:r>
+        <w:t>(</w:t>
+      </w:r>
+      <w:proofErr w:type="gramStart"/>
+      <w:r>
+        <w:t xml:space="preserve">);   </w:t>
+      </w:r>
+      <w:proofErr w:type="gramEnd"/>
+      <w:r>
+        <w:t xml:space="preserve">        // page size</w:t>
+      </w:r>
+    </w:p>
+    <w:p>
+      <w:proofErr w:type="spellStart"/>
+      <w:proofErr w:type="gramStart"/>
+      <w:r>
+        <w:t>page.hasNext</w:t>
+      </w:r>
+      <w:proofErr w:type="spellEnd"/>
+      <w:proofErr w:type="gramEnd"/>
+      <w:r>
+        <w:t>();</w:t>
+      </w:r>
+    </w:p>
+    <w:p>
+      <w:proofErr w:type="spellStart"/>
+      <w:proofErr w:type="gramStart"/>
+      <w:r>
+        <w:t>page.hasPrevious</w:t>
+      </w:r>
+      <w:proofErr w:type="spellEnd"/>
+      <w:proofErr w:type="gramEnd"/>
+      <w:r>
+        <w:t>();</w:t>
+      </w:r>
+    </w:p>
+    <w:p>
+      <w:proofErr w:type="spellStart"/>
+      <w:proofErr w:type="gramStart"/>
+      <w:r>
+        <w:t>page.isFirst</w:t>
+      </w:r>
+      <w:proofErr w:type="spellEnd"/>
+      <w:proofErr w:type="gramEnd"/>
+      <w:r>
+        <w:t>();</w:t>
+      </w:r>
+    </w:p>
+    <w:p>
+      <w:proofErr w:type="spellStart"/>
+      <w:proofErr w:type="gramStart"/>
+      <w:r>
+        <w:t>page.isLast</w:t>
+      </w:r>
+      <w:proofErr w:type="spellEnd"/>
+      <w:proofErr w:type="gramEnd"/>
+      <w:r>
+        <w:t>();</w:t>
+      </w:r>
+    </w:p>
+    <w:p/>
+    <w:p>
+      <w:r>
+        <w:t>JPA entity Relationships:</w:t>
+      </w:r>
+    </w:p>
+    <w:p/>
+    <w:p>
+      <w:r>
+        <w:t>Every enterprise level project has multiple entities, some of them also have relationships.</w:t>
+      </w:r>
+    </w:p>
+    <w:p>
+      <w:r>
+        <w:t>Multiple entities have multiple relationships too.</w:t>
+      </w:r>
+    </w:p>
+    <w:p/>
+    <w:p>
+      <w:r>
+        <w:t>JPA and relationships:</w:t>
+      </w:r>
+    </w:p>
+    <w:p>
+      <w:pPr>
+        <w:pStyle w:val="ListParagraph"/>
+        <w:numPr>
+          <w:ilvl w:val="1"/>
+          <w:numId w:val="35"/>
+        </w:numPr>
+      </w:pPr>
+      <w:r>
+        <w:t>An entity represents a table in database.</w:t>
+      </w:r>
+    </w:p>
+    <w:p>
+      <w:pPr>
+        <w:pStyle w:val="ListParagraph"/>
+        <w:numPr>
+          <w:ilvl w:val="1"/>
+          <w:numId w:val="35"/>
+        </w:numPr>
+      </w:pPr>
+      <w:r>
+        <w:t xml:space="preserve">Each instance of entity is a row in a table. </w:t>
+      </w:r>
+    </w:p>
+    <w:p>
+      <w:pPr>
+        <w:pStyle w:val="ListParagraph"/>
+        <w:numPr>
+          <w:ilvl w:val="1"/>
+          <w:numId w:val="35"/>
+        </w:numPr>
+      </w:pPr>
+      <w:r>
+        <w:t xml:space="preserve">Relationships in JPA defines how entities have </w:t>
+      </w:r>
+      <w:proofErr w:type="gramStart"/>
+      <w:r>
+        <w:t>related</w:t>
+      </w:r>
+      <w:proofErr w:type="gramEnd"/>
+      <w:r>
+        <w:t xml:space="preserve"> each other.</w:t>
+      </w:r>
+    </w:p>
+    <w:p>
+      <w:pPr>
+        <w:pStyle w:val="ListParagraph"/>
+        <w:numPr>
+          <w:ilvl w:val="1"/>
+          <w:numId w:val="35"/>
+        </w:numPr>
+      </w:pPr>
+      <w:r>
+        <w:t>JPA allows us to map these relationships using annotations in java code.</w:t>
+      </w:r>
+    </w:p>
+    <w:p>
+      <w:r>
+        <w:t>Relationships:</w:t>
+      </w:r>
+      <w:r>
+        <w:br/>
+      </w:r>
+    </w:p>
+    <w:p>
+      <w:r>
+        <w:t>One – One</w:t>
+      </w:r>
+    </w:p>
+    <w:p>
+      <w:r>
+        <w:t>One – Many</w:t>
+      </w:r>
+    </w:p>
+    <w:p>
+      <w:r>
+        <w:t>Many – One</w:t>
+      </w:r>
+    </w:p>
+    <w:p>
+      <w:r>
+        <w:t>Many – Many</w:t>
+      </w:r>
+    </w:p>
+    <w:p/>
+    <w:p>
+      <w:r>
+        <w:t>Directions of relationships:</w:t>
+      </w:r>
+      <w:r>
+        <w:br/>
+      </w:r>
+    </w:p>
+    <w:p>
+      <w:r>
+        <w:t xml:space="preserve">Uni-directional: </w:t>
+      </w:r>
+      <w:r>
+        <w:t>Only one entity knows about the relationship and holds a reference to the other.</w:t>
+      </w:r>
+    </w:p>
+    <w:p>
+      <w:r>
+        <w:lastRenderedPageBreak/>
+        <w:t xml:space="preserve">Bi-directional: </w:t>
+      </w:r>
+    </w:p>
+    <w:p>
+      <w:r>
+        <w:t xml:space="preserve">Both entities know about </w:t>
+      </w:r>
+      <w:r>
+        <w:t xml:space="preserve">the </w:t>
+      </w:r>
+      <w:r>
+        <w:t>relation</w:t>
+      </w:r>
+      <w:r>
+        <w:t xml:space="preserve"> between them</w:t>
+      </w:r>
+      <w:r>
+        <w:t xml:space="preserve"> </w:t>
+      </w:r>
+      <w:r>
+        <w:t xml:space="preserve">and reference. One side is designated as the </w:t>
+      </w:r>
+      <w:r>
+        <w:rPr>
+          <w:b/>
+          <w:bCs/>
+        </w:rPr>
+        <w:t>owning side</w:t>
+      </w:r>
+      <w:r>
+        <w:t xml:space="preserve"> (holds the foreign key via @JoinColumn), and the other is the </w:t>
+      </w:r>
+      <w:r>
+        <w:rPr>
+          <w:b/>
+          <w:bCs/>
+        </w:rPr>
+        <w:t>inverse/referencing side</w:t>
+      </w:r>
+      <w:r>
+        <w:t xml:space="preserve"> (uses </w:t>
+      </w:r>
+      <w:proofErr w:type="spellStart"/>
+      <w:r>
+        <w:t>mappedBy</w:t>
+      </w:r>
+      <w:proofErr w:type="spellEnd"/>
+      <w:r>
+        <w:t>).</w:t>
+      </w:r>
+    </w:p>
+    <w:p/>
+    <w:p>
+      <w:proofErr w:type="gramStart"/>
+      <w:r>
+        <w:t>@JoinColumn</w:t>
+      </w:r>
+      <w:proofErr w:type="gramEnd"/>
+      <w:r>
+        <w:t>: this annotation used to explicitly manage the foreign Key in owned side.</w:t>
+      </w:r>
+    </w:p>
+    <w:p/>
+    <w:p>
+      <w:proofErr w:type="spellStart"/>
+      <w:r>
+        <w:t>MappedBy</w:t>
+      </w:r>
+      <w:proofErr w:type="spellEnd"/>
+      <w:r>
+        <w:t xml:space="preserve">: we use this attribute </w:t>
+      </w:r>
+      <w:r>
+        <w:t xml:space="preserve">in the relationship annotation </w:t>
+      </w:r>
+      <w:r>
+        <w:t>to specify bi</w:t>
+      </w:r>
+      <w:r>
+        <w:t>-</w:t>
+      </w:r>
+      <w:r>
+        <w:t xml:space="preserve">directional </w:t>
+      </w:r>
+      <w:proofErr w:type="gramStart"/>
+      <w:r>
+        <w:t>relationship</w:t>
+      </w:r>
+      <w:r>
+        <w:t>,</w:t>
+      </w:r>
+      <w:proofErr w:type="gramEnd"/>
+      <w:r>
+        <w:t xml:space="preserve"> we include this attribute in referencing side.</w:t>
+      </w:r>
+    </w:p>
+    <w:p/>
+    <w:p>
+      <w:r>
+        <w:t xml:space="preserve">Circular reference: this is an issue occurs when we establish </w:t>
+      </w:r>
+      <w:proofErr w:type="gramStart"/>
+      <w:r>
+        <w:t>bi directional</w:t>
+      </w:r>
+      <w:proofErr w:type="gramEnd"/>
+      <w:r>
+        <w:t xml:space="preserve"> mapping, response would look like user -&gt; </w:t>
+      </w:r>
+      <w:proofErr w:type="spellStart"/>
+      <w:r>
+        <w:t>userProfile</w:t>
+      </w:r>
+      <w:proofErr w:type="spellEnd"/>
+      <w:r>
+        <w:t xml:space="preserve"> -&gt; user -&gt; </w:t>
+      </w:r>
+      <w:proofErr w:type="spellStart"/>
+      <w:r>
+        <w:t>userProfile</w:t>
+      </w:r>
+      <w:proofErr w:type="spellEnd"/>
+      <w:r>
+        <w:t>……. Like an infinite JSON file.</w:t>
+      </w:r>
+    </w:p>
+    <w:p/>
+    <w:p>
+      <w:r>
+        <w:t xml:space="preserve">Issue: </w:t>
+      </w:r>
+      <w:r>
+        <w:t>Could not write JSON: Infinite recursion (</w:t>
+      </w:r>
+      <w:proofErr w:type="spellStart"/>
+      <w:r>
+        <w:t>StackOverflowError</w:t>
+      </w:r>
+      <w:proofErr w:type="spellEnd"/>
+      <w:r>
+        <w:t>)]</w:t>
+      </w:r>
+    </w:p>
+    <w:p>
+      <w:r>
+        <w:t xml:space="preserve">To stop this, we have to </w:t>
+      </w:r>
+      <w:proofErr w:type="gramStart"/>
+      <w:r>
+        <w:t>use @</w:t>
+      </w:r>
+      <w:proofErr w:type="gramEnd"/>
+      <w:r>
+        <w:t xml:space="preserve">JsonIgnore annotation, we </w:t>
+      </w:r>
+      <w:r>
+        <w:t>must</w:t>
+      </w:r>
+      <w:r>
+        <w:t xml:space="preserve"> place this at relation owning side class at the variable which has relation with reference class.</w:t>
+      </w:r>
+    </w:p>
+    <w:p>
+      <w:r>
+        <w:t xml:space="preserve">Note: if we </w:t>
+      </w:r>
+      <w:r>
+        <w:t>are using</w:t>
+      </w:r>
+      <w:r>
+        <w:t xml:space="preserve"> Lombok, we have explicitly </w:t>
+      </w:r>
+      <w:proofErr w:type="gramStart"/>
+      <w:r>
+        <w:t>specify</w:t>
+      </w:r>
+      <w:proofErr w:type="gramEnd"/>
+      <w:r>
+        <w:t xml:space="preserve"> </w:t>
+      </w:r>
+      <w:r>
+        <w:t xml:space="preserve">the </w:t>
+      </w:r>
+      <w:proofErr w:type="spellStart"/>
+      <w:proofErr w:type="gramStart"/>
+      <w:r>
+        <w:t>hashCode</w:t>
+      </w:r>
+      <w:proofErr w:type="spellEnd"/>
+      <w:r>
+        <w:t>(</w:t>
+      </w:r>
+      <w:proofErr w:type="gramEnd"/>
+      <w:r>
+        <w:t>)</w:t>
+      </w:r>
+      <w:r>
+        <w:t xml:space="preserve">, </w:t>
+      </w:r>
+      <w:proofErr w:type="spellStart"/>
+      <w:proofErr w:type="gramStart"/>
+      <w:r>
+        <w:t>toString</w:t>
+      </w:r>
+      <w:proofErr w:type="spellEnd"/>
+      <w:r>
+        <w:t>(</w:t>
+      </w:r>
+      <w:proofErr w:type="gramEnd"/>
+      <w:r>
+        <w:t>)</w:t>
+      </w:r>
+      <w:r>
+        <w:t xml:space="preserve">, </w:t>
+      </w:r>
+      <w:proofErr w:type="gramStart"/>
+      <w:r>
+        <w:t>Equals</w:t>
+      </w:r>
+      <w:r>
+        <w:t>(</w:t>
+      </w:r>
+      <w:proofErr w:type="gramEnd"/>
+      <w:r>
+        <w:t>)</w:t>
+      </w:r>
+      <w:r>
+        <w:t xml:space="preserve"> </w:t>
+      </w:r>
+      <w:r>
+        <w:t>methods with only instance variables and exclude relationship related variables.</w:t>
+      </w:r>
+    </w:p>
+    <w:p>
+      <w:r>
+        <w:t xml:space="preserve">When we </w:t>
+      </w:r>
+      <w:proofErr w:type="gramStart"/>
+      <w:r>
+        <w:t>use @</w:t>
+      </w:r>
+      <w:proofErr w:type="gramEnd"/>
+      <w:r>
+        <w:t xml:space="preserve">Data of Lombok, </w:t>
+      </w:r>
+      <w:proofErr w:type="gramStart"/>
+      <w:r>
+        <w:t>It</w:t>
+      </w:r>
+      <w:proofErr w:type="gramEnd"/>
+      <w:r>
+        <w:t xml:space="preserve"> generates </w:t>
+      </w:r>
+      <w:proofErr w:type="spellStart"/>
+      <w:proofErr w:type="gramStart"/>
+      <w:r>
+        <w:t>toString</w:t>
+      </w:r>
+      <w:proofErr w:type="spellEnd"/>
+      <w:r>
+        <w:t>(</w:t>
+      </w:r>
+      <w:proofErr w:type="gramEnd"/>
+      <w:r>
+        <w:t xml:space="preserve">), </w:t>
+      </w:r>
+      <w:proofErr w:type="gramStart"/>
+      <w:r>
+        <w:t>equals(</w:t>
+      </w:r>
+      <w:proofErr w:type="gramEnd"/>
+      <w:r>
+        <w:t xml:space="preserve">), and </w:t>
+      </w:r>
+      <w:proofErr w:type="spellStart"/>
+      <w:proofErr w:type="gramStart"/>
+      <w:r>
+        <w:t>hashCode</w:t>
+      </w:r>
+      <w:proofErr w:type="spellEnd"/>
+      <w:r>
+        <w:t>(</w:t>
+      </w:r>
+      <w:proofErr w:type="gramEnd"/>
+      <w:r>
+        <w:t>) using all fields by default</w:t>
+      </w:r>
+      <w:r>
+        <w:t xml:space="preserve">. </w:t>
+      </w:r>
+      <w:r>
+        <w:t xml:space="preserve">including relationship fields. So even if JSON ignores </w:t>
+      </w:r>
+      <w:proofErr w:type="spellStart"/>
+      <w:r>
+        <w:t>socialUsers</w:t>
+      </w:r>
+      <w:proofErr w:type="spellEnd"/>
+      <w:r>
+        <w:t>, Lombok could still recurse through</w:t>
+      </w:r>
+    </w:p>
+    <w:p/>
+    <w:p/>
+    <w:p/>
+    <w:p/>
+    <w:p/>
+    <w:p/>
+    <w:p>
+      <w:r>
+        <w:lastRenderedPageBreak/>
+        <w:t>While adding data, in referenced class, we include owned class data also. But data is not being added.</w:t>
+      </w:r>
+      <w:r>
+        <w:t xml:space="preserve"> Because we </w:t>
+      </w:r>
+      <w:proofErr w:type="gramStart"/>
+      <w:r>
+        <w:t>missed to use</w:t>
+      </w:r>
+      <w:proofErr w:type="gramEnd"/>
+      <w:r>
+        <w:t xml:space="preserve"> cascading.</w:t>
+      </w:r>
+    </w:p>
+    <w:p>
+      <w:pPr>
+        <w:rPr>
+          <w:b/>
+          <w:bCs/>
+        </w:rPr>
+      </w:pPr>
+      <w:r>
+        <w:rPr>
+          <w:b/>
+          <w:bCs/>
+        </w:rPr>
+        <w:t>Cascading:</w:t>
+      </w:r>
+    </w:p>
+    <w:p>
+      <w:r>
+        <w:t xml:space="preserve">Cascading lets you propagate an operation (save, delete, update, etc.) performed on a </w:t>
+      </w:r>
+      <w:r>
+        <w:rPr>
+          <w:b/>
+          <w:bCs/>
+        </w:rPr>
+        <w:t>parent entity</w:t>
+      </w:r>
+      <w:r>
+        <w:t xml:space="preserve"> automatically to its </w:t>
+      </w:r>
+      <w:r>
+        <w:rPr>
+          <w:b/>
+          <w:bCs/>
+        </w:rPr>
+        <w:t>related/child entities</w:t>
+      </w:r>
+      <w:r>
+        <w:t>, without you having to manually persist or remove each one.</w:t>
+      </w:r>
+    </w:p>
+    <w:p>
+      <w:r>
+        <w:t> When we perform some action on the target entity, the same action will be applied to the associated entity.</w:t>
+      </w:r>
+    </w:p>
+    <w:p>
+      <w:r>
+        <w:t>Types of cascading:</w:t>
+      </w:r>
+    </w:p>
+    <w:p>
+      <w:pPr>
+        <w:pStyle w:val="ListParagraph"/>
+        <w:numPr>
+          <w:ilvl w:val="0"/>
+          <w:numId w:val="45"/>
+        </w:numPr>
+      </w:pPr>
+      <w:r>
+        <w:t>ALL</w:t>
+      </w:r>
+    </w:p>
+    <w:p>
+      <w:pPr>
+        <w:pStyle w:val="ListParagraph"/>
+        <w:numPr>
+          <w:ilvl w:val="0"/>
+          <w:numId w:val="45"/>
+        </w:numPr>
+      </w:pPr>
+      <w:r>
+        <w:t>PERSIST</w:t>
+      </w:r>
+    </w:p>
+    <w:p>
+      <w:pPr>
+        <w:pStyle w:val="ListParagraph"/>
+        <w:numPr>
+          <w:ilvl w:val="0"/>
+          <w:numId w:val="45"/>
+        </w:numPr>
+      </w:pPr>
+      <w:r>
+        <w:t>MERGE</w:t>
+      </w:r>
+    </w:p>
+    <w:p>
+      <w:pPr>
+        <w:pStyle w:val="ListParagraph"/>
+        <w:numPr>
+          <w:ilvl w:val="0"/>
+          <w:numId w:val="45"/>
+        </w:numPr>
+      </w:pPr>
+      <w:r>
+        <w:t>REMOVE</w:t>
+      </w:r>
+    </w:p>
+    <w:p>
+      <w:pPr>
+        <w:pStyle w:val="ListParagraph"/>
+        <w:numPr>
+          <w:ilvl w:val="0"/>
+          <w:numId w:val="45"/>
+        </w:numPr>
+      </w:pPr>
+      <w:r>
+        <w:t>REFRESH</w:t>
+      </w:r>
+    </w:p>
+    <w:p>
+      <w:pPr>
+        <w:pStyle w:val="ListParagraph"/>
+        <w:numPr>
+          <w:ilvl w:val="0"/>
+          <w:numId w:val="45"/>
+        </w:numPr>
+      </w:pPr>
+      <w:r>
+        <w:t>DETACH</w:t>
+      </w:r>
+    </w:p>
+    <w:p>
+      <w:r>
+        <w:t xml:space="preserve">We </w:t>
+      </w:r>
+      <w:r>
+        <w:t>must</w:t>
+      </w:r>
+      <w:r>
+        <w:t xml:space="preserve"> specify cascading attribute </w:t>
+      </w:r>
+      <w:proofErr w:type="gramStart"/>
+      <w:r>
+        <w:t>like @OneToMany(</w:t>
+      </w:r>
+      <w:proofErr w:type="gramEnd"/>
+      <w:r>
+        <w:t xml:space="preserve">cascade = </w:t>
+      </w:r>
+      <w:proofErr w:type="spellStart"/>
+      <w:r>
+        <w:t>Cascade.ALL</w:t>
+      </w:r>
+      <w:proofErr w:type="spellEnd"/>
+      <w:r>
+        <w:t>).</w:t>
+      </w:r>
+    </w:p>
+    <w:p>
+      <w:r>
+        <w:t xml:space="preserve">It can </w:t>
+      </w:r>
+      <w:r>
+        <w:t xml:space="preserve">mostly be used in @OneToOne and @OneToMany relations. We can use in other relationships also but must handle with care and better to use persist </w:t>
+      </w:r>
+      <w:r>
+        <w:t xml:space="preserve">and </w:t>
+      </w:r>
+      <w:r>
+        <w:t>Merge, to don’t delete the shared records.</w:t>
+      </w:r>
+    </w:p>
+    <w:p>
+      <w:r>
+        <w:t>If we only use persist, new data will be saved but cannot align with existing data. In this situation we require.</w:t>
+      </w:r>
+    </w:p>
+    <w:p>
+      <w:r>
+        <w:t>Example, we have child with id 4, when creating parent id with 4 which associates with existing child id 4, it cannot establish relation with child and pass null values to DB.</w:t>
+      </w:r>
+    </w:p>
+    <w:p>
+      <w:r>
+        <w:t>After adding cascading, still we can face that issue.</w:t>
+      </w:r>
+    </w:p>
+    <w:p>
+      <w:r>
+        <w:t xml:space="preserve">To fix this, we </w:t>
+      </w:r>
+      <w:r>
+        <w:t>must</w:t>
+      </w:r>
+      <w:r>
+        <w:t xml:space="preserve"> explicitly create </w:t>
+      </w:r>
+      <w:r>
+        <w:t xml:space="preserve">setters for relationship fields in both referenced class and owning side class, because Lombok provides default implementation of setters. </w:t>
+      </w:r>
+    </w:p>
+    <w:p/>
+    <w:p/>
+    <w:p/>
+    <w:p/>
+    <w:p>
+      <w:proofErr w:type="spellStart"/>
+      <w:r>
+        <w:lastRenderedPageBreak/>
+        <w:t>FetchTypes</w:t>
+      </w:r>
+      <w:proofErr w:type="spellEnd"/>
+      <w:r>
+        <w:t>:</w:t>
+      </w:r>
+    </w:p>
+    <w:p>
+      <w:proofErr w:type="spellStart"/>
+      <w:r>
+        <w:t>FetchType</w:t>
+      </w:r>
+      <w:proofErr w:type="spellEnd"/>
+      <w:r>
+        <w:t xml:space="preserve"> controls when related entities are loaded from the database relative to their parent entity. It's set on relationship </w:t>
+      </w:r>
+      <w:proofErr w:type="gramStart"/>
+      <w:r>
+        <w:t>annotations (@OneToMany, @ManyToOne, @OneToOne, @</w:t>
+      </w:r>
+      <w:proofErr w:type="gramEnd"/>
+      <w:r>
+        <w:t>ManyToMany) via the fetch attribute.</w:t>
+      </w:r>
+    </w:p>
+    <w:p/>
+    <w:p>
+      <w:proofErr w:type="spellStart"/>
+      <w:r>
+        <w:t>FetchType.Eager</w:t>
+      </w:r>
+      <w:proofErr w:type="spellEnd"/>
+    </w:p>
+    <w:p>
+      <w:r>
+        <w:t xml:space="preserve">The related entity is loaded </w:t>
+      </w:r>
+      <w:r>
+        <w:rPr>
+          <w:b/>
+          <w:bCs/>
+        </w:rPr>
+        <w:t>immediately</w:t>
+      </w:r>
+      <w:r>
+        <w:t>, at the same time as the parent — even if you never access it.</w:t>
+      </w:r>
+    </w:p>
+    <w:p>
+      <w:proofErr w:type="spellStart"/>
+      <w:r>
+        <w:t>FetchType.Lazy</w:t>
+      </w:r>
+      <w:proofErr w:type="spellEnd"/>
+    </w:p>
+    <w:p>
+      <w:r>
+        <w:t xml:space="preserve">The related entity is loaded </w:t>
+      </w:r>
+      <w:r>
+        <w:rPr>
+          <w:b/>
+          <w:bCs/>
+        </w:rPr>
+        <w:t>only when you actually access it</w:t>
+      </w:r>
+      <w:r>
+        <w:t xml:space="preserve"> (a proxy is used until then).</w:t>
+      </w:r>
+    </w:p>
+    <w:p/>
+    <w:p/>
+    <w:p/>
+    <w:p/>
+    <w:p/>
+    <w:p/>
     <w:p/>
     <w:sectPr>
       <w:pgSz w:w="12240" w:h="15840"/>
@@ -6331,6 +8314,119 @@
     </w:lvl>
   </w:abstractNum>
   <w:abstractNum w:abstractNumId="20" w15:restartNumberingAfterBreak="0">
+    <w:nsid w:val="2E8B44A7"/>
+    <w:multiLevelType w:val="hybridMultilevel"/>
+    <w:tmpl w:val="003C4F1A"/>
+    <w:lvl w:ilvl="0" w:tplc="04090001">
+      <w:start w:val="1"/>
+      <w:numFmt w:val="bullet"/>
+      <w:lvlText w:val=""/>
+      <w:lvlJc w:val="left"/>
+      <w:pPr>
+        <w:ind w:left="720" w:hanging="360"/>
+      </w:pPr>
+      <w:rPr>
+        <w:rFonts w:ascii="Symbol" w:hAnsi="Symbol" w:hint="default"/>
+      </w:rPr>
+    </w:lvl>
+    <w:lvl w:ilvl="1" w:tplc="04090003" w:tentative="1">
+      <w:start w:val="1"/>
+      <w:numFmt w:val="bullet"/>
+      <w:lvlText w:val="o"/>
+      <w:lvlJc w:val="left"/>
+      <w:pPr>
+        <w:ind w:left="1440" w:hanging="360"/>
+      </w:pPr>
+      <w:rPr>
+        <w:rFonts w:ascii="Courier New" w:hAnsi="Courier New" w:cs="Courier New" w:hint="default"/>
+      </w:rPr>
+    </w:lvl>
+    <w:lvl w:ilvl="2" w:tplc="04090005" w:tentative="1">
+      <w:start w:val="1"/>
+      <w:numFmt w:val="bullet"/>
+      <w:lvlText w:val=""/>
+      <w:lvlJc w:val="left"/>
+      <w:pPr>
+        <w:ind w:left="2160" w:hanging="360"/>
+      </w:pPr>
+      <w:rPr>
+        <w:rFonts w:ascii="Wingdings" w:hAnsi="Wingdings" w:hint="default"/>
+      </w:rPr>
+    </w:lvl>
+    <w:lvl w:ilvl="3" w:tplc="04090001" w:tentative="1">
+      <w:start w:val="1"/>
+      <w:numFmt w:val="bullet"/>
+      <w:lvlText w:val=""/>
+      <w:lvlJc w:val="left"/>
+      <w:pPr>
+        <w:ind w:left="2880" w:hanging="360"/>
+      </w:pPr>
+      <w:rPr>
+        <w:rFonts w:ascii="Symbol" w:hAnsi="Symbol" w:hint="default"/>
+      </w:rPr>
+    </w:lvl>
+    <w:lvl w:ilvl="4" w:tplc="04090003" w:tentative="1">
+      <w:start w:val="1"/>
+      <w:numFmt w:val="bullet"/>
+      <w:lvlText w:val="o"/>
+      <w:lvlJc w:val="left"/>
+      <w:pPr>
+        <w:ind w:left="3600" w:hanging="360"/>
+      </w:pPr>
+      <w:rPr>
+        <w:rFonts w:ascii="Courier New" w:hAnsi="Courier New" w:cs="Courier New" w:hint="default"/>
+      </w:rPr>
+    </w:lvl>
+    <w:lvl w:ilvl="5" w:tplc="04090005" w:tentative="1">
+      <w:start w:val="1"/>
+      <w:numFmt w:val="bullet"/>
+      <w:lvlText w:val=""/>
+      <w:lvlJc w:val="left"/>
+      <w:pPr>
+        <w:ind w:left="4320" w:hanging="360"/>
+      </w:pPr>
+      <w:rPr>
+        <w:rFonts w:ascii="Wingdings" w:hAnsi="Wingdings" w:hint="default"/>
+      </w:rPr>
+    </w:lvl>
+    <w:lvl w:ilvl="6" w:tplc="04090001" w:tentative="1">
+      <w:start w:val="1"/>
+      <w:numFmt w:val="bullet"/>
+      <w:lvlText w:val=""/>
+      <w:lvlJc w:val="left"/>
+      <w:pPr>
+        <w:ind w:left="5040" w:hanging="360"/>
+      </w:pPr>
+      <w:rPr>
+        <w:rFonts w:ascii="Symbol" w:hAnsi="Symbol" w:hint="default"/>
+      </w:rPr>
+    </w:lvl>
+    <w:lvl w:ilvl="7" w:tplc="04090003" w:tentative="1">
+      <w:start w:val="1"/>
+      <w:numFmt w:val="bullet"/>
+      <w:lvlText w:val="o"/>
+      <w:lvlJc w:val="left"/>
+      <w:pPr>
+        <w:ind w:left="5760" w:hanging="360"/>
+      </w:pPr>
+      <w:rPr>
+        <w:rFonts w:ascii="Courier New" w:hAnsi="Courier New" w:cs="Courier New" w:hint="default"/>
+      </w:rPr>
+    </w:lvl>
+    <w:lvl w:ilvl="8" w:tplc="04090005" w:tentative="1">
+      <w:start w:val="1"/>
+      <w:numFmt w:val="bullet"/>
+      <w:lvlText w:val=""/>
+      <w:lvlJc w:val="left"/>
+      <w:pPr>
+        <w:ind w:left="6480" w:hanging="360"/>
+      </w:pPr>
+      <w:rPr>
+        <w:rFonts w:ascii="Wingdings" w:hAnsi="Wingdings" w:hint="default"/>
+      </w:rPr>
+    </w:lvl>
+  </w:abstractNum>
+  <w:abstractNum w:abstractNumId="21" w15:restartNumberingAfterBreak="0">
     <w:nsid w:val="33CB2316"/>
     <w:multiLevelType w:val="multilevel"/>
     <w:tmpl w:val="6AC23518"/>
@@ -6479,7 +8575,7 @@
       </w:rPr>
     </w:lvl>
   </w:abstractNum>
-  <w:abstractNum w:abstractNumId="21" w15:restartNumberingAfterBreak="0">
+  <w:abstractNum w:abstractNumId="22" w15:restartNumberingAfterBreak="0">
     <w:nsid w:val="3C9E2897"/>
     <w:multiLevelType w:val="multilevel"/>
     <w:tmpl w:val="A740C8CE"/>
@@ -6628,7 +8724,7 @@
       </w:rPr>
     </w:lvl>
   </w:abstractNum>
-  <w:abstractNum w:abstractNumId="22" w15:restartNumberingAfterBreak="0">
+  <w:abstractNum w:abstractNumId="23" w15:restartNumberingAfterBreak="0">
     <w:nsid w:val="3F804D67"/>
     <w:multiLevelType w:val="multilevel"/>
     <w:tmpl w:val="706E918E"/>
@@ -6777,7 +8873,7 @@
       </w:rPr>
     </w:lvl>
   </w:abstractNum>
-  <w:abstractNum w:abstractNumId="23" w15:restartNumberingAfterBreak="0">
+  <w:abstractNum w:abstractNumId="24" w15:restartNumberingAfterBreak="0">
     <w:nsid w:val="3FAE43D4"/>
     <w:multiLevelType w:val="multilevel"/>
     <w:tmpl w:val="C074C1D8"/>
@@ -6926,7 +9022,7 @@
       </w:rPr>
     </w:lvl>
   </w:abstractNum>
-  <w:abstractNum w:abstractNumId="24" w15:restartNumberingAfterBreak="0">
+  <w:abstractNum w:abstractNumId="25" w15:restartNumberingAfterBreak="0">
     <w:nsid w:val="40251C9F"/>
     <w:multiLevelType w:val="multilevel"/>
     <w:tmpl w:val="901C151E"/>
@@ -7075,7 +9171,7 @@
       </w:rPr>
     </w:lvl>
   </w:abstractNum>
-  <w:abstractNum w:abstractNumId="25" w15:restartNumberingAfterBreak="0">
+  <w:abstractNum w:abstractNumId="26" w15:restartNumberingAfterBreak="0">
     <w:nsid w:val="44441E7D"/>
     <w:multiLevelType w:val="multilevel"/>
     <w:tmpl w:val="B9E88734"/>
@@ -7188,7 +9284,7 @@
       </w:pPr>
     </w:lvl>
   </w:abstractNum>
-  <w:abstractNum w:abstractNumId="26" w15:restartNumberingAfterBreak="0">
+  <w:abstractNum w:abstractNumId="27" w15:restartNumberingAfterBreak="0">
     <w:nsid w:val="45620F3C"/>
     <w:multiLevelType w:val="multilevel"/>
     <w:tmpl w:val="470E42CA"/>
@@ -7337,7 +9433,7 @@
       </w:rPr>
     </w:lvl>
   </w:abstractNum>
-  <w:abstractNum w:abstractNumId="27" w15:restartNumberingAfterBreak="0">
+  <w:abstractNum w:abstractNumId="28" w15:restartNumberingAfterBreak="0">
     <w:nsid w:val="4B623F45"/>
     <w:multiLevelType w:val="multilevel"/>
     <w:tmpl w:val="F40C0B64"/>
@@ -7450,7 +9546,7 @@
       </w:pPr>
     </w:lvl>
   </w:abstractNum>
-  <w:abstractNum w:abstractNumId="28" w15:restartNumberingAfterBreak="0">
+  <w:abstractNum w:abstractNumId="29" w15:restartNumberingAfterBreak="0">
     <w:nsid w:val="4C8D7A50"/>
     <w:multiLevelType w:val="multilevel"/>
     <w:tmpl w:val="3ED4C582"/>
@@ -7599,7 +9695,7 @@
       </w:rPr>
     </w:lvl>
   </w:abstractNum>
-  <w:abstractNum w:abstractNumId="29" w15:restartNumberingAfterBreak="0">
+  <w:abstractNum w:abstractNumId="30" w15:restartNumberingAfterBreak="0">
     <w:nsid w:val="4CA402C1"/>
     <w:multiLevelType w:val="multilevel"/>
     <w:tmpl w:val="A8BEFC02"/>
@@ -7748,7 +9844,7 @@
       </w:rPr>
     </w:lvl>
   </w:abstractNum>
-  <w:abstractNum w:abstractNumId="30" w15:restartNumberingAfterBreak="0">
+  <w:abstractNum w:abstractNumId="31" w15:restartNumberingAfterBreak="0">
     <w:nsid w:val="512A79B8"/>
     <w:multiLevelType w:val="multilevel"/>
     <w:tmpl w:val="D332D6CC"/>
@@ -7897,7 +9993,7 @@
       </w:rPr>
     </w:lvl>
   </w:abstractNum>
-  <w:abstractNum w:abstractNumId="31" w15:restartNumberingAfterBreak="0">
+  <w:abstractNum w:abstractNumId="32" w15:restartNumberingAfterBreak="0">
     <w:nsid w:val="5B965A77"/>
     <w:multiLevelType w:val="multilevel"/>
     <w:tmpl w:val="BD9C82EE"/>
@@ -8046,7 +10142,7 @@
       </w:rPr>
     </w:lvl>
   </w:abstractNum>
-  <w:abstractNum w:abstractNumId="32" w15:restartNumberingAfterBreak="0">
+  <w:abstractNum w:abstractNumId="33" w15:restartNumberingAfterBreak="0">
     <w:nsid w:val="5D247814"/>
     <w:multiLevelType w:val="multilevel"/>
     <w:tmpl w:val="D1DA57DC"/>
@@ -8195,7 +10291,7 @@
       </w:rPr>
     </w:lvl>
   </w:abstractNum>
-  <w:abstractNum w:abstractNumId="33" w15:restartNumberingAfterBreak="0">
+  <w:abstractNum w:abstractNumId="34" w15:restartNumberingAfterBreak="0">
     <w:nsid w:val="639064B2"/>
     <w:multiLevelType w:val="multilevel"/>
     <w:tmpl w:val="9D622B0A"/>
@@ -8308,10 +10404,10 @@
       </w:pPr>
     </w:lvl>
   </w:abstractNum>
-  <w:abstractNum w:abstractNumId="34" w15:restartNumberingAfterBreak="0">
+  <w:abstractNum w:abstractNumId="35" w15:restartNumberingAfterBreak="0">
     <w:nsid w:val="6745206A"/>
     <w:multiLevelType w:val="multilevel"/>
-    <w:tmpl w:val="589838A2"/>
+    <w:tmpl w:val="8C342222"/>
     <w:lvl w:ilvl="0">
       <w:start w:val="1"/>
       <w:numFmt w:val="decimal"/>
@@ -8324,17 +10420,16 @@
         <w:ind w:left="720" w:hanging="360"/>
       </w:pPr>
     </w:lvl>
-    <w:lvl w:ilvl="1" w:tentative="1">
-      <w:start w:val="1"/>
-      <w:numFmt w:val="decimal"/>
-      <w:lvlText w:val="%2."/>
-      <w:lvlJc w:val="left"/>
-      <w:pPr>
-        <w:tabs>
-          <w:tab w:val="num" w:pos="1440"/>
-        </w:tabs>
+    <w:lvl w:ilvl="1">
+      <w:numFmt w:val="bullet"/>
+      <w:lvlText w:val="-"/>
+      <w:lvlJc w:val="left"/>
+      <w:pPr>
         <w:ind w:left="1440" w:hanging="360"/>
       </w:pPr>
+      <w:rPr>
+        <w:rFonts w:ascii="Aptos" w:eastAsiaTheme="minorHAnsi" w:hAnsi="Aptos" w:cstheme="minorBidi" w:hint="default"/>
+      </w:rPr>
     </w:lvl>
     <w:lvl w:ilvl="2" w:tentative="1">
       <w:start w:val="1"/>
@@ -8421,7 +10516,7 @@
       </w:pPr>
     </w:lvl>
   </w:abstractNum>
-  <w:abstractNum w:abstractNumId="35" w15:restartNumberingAfterBreak="0">
+  <w:abstractNum w:abstractNumId="36" w15:restartNumberingAfterBreak="0">
     <w:nsid w:val="6B6C53DF"/>
     <w:multiLevelType w:val="multilevel"/>
     <w:tmpl w:val="B0DC7CD2"/>
@@ -8570,7 +10665,7 @@
       </w:rPr>
     </w:lvl>
   </w:abstractNum>
-  <w:abstractNum w:abstractNumId="36" w15:restartNumberingAfterBreak="0">
+  <w:abstractNum w:abstractNumId="37" w15:restartNumberingAfterBreak="0">
     <w:nsid w:val="6C7C0D7D"/>
     <w:multiLevelType w:val="multilevel"/>
     <w:tmpl w:val="5FEC7DDC"/>
@@ -8683,7 +10778,7 @@
       </w:pPr>
     </w:lvl>
   </w:abstractNum>
-  <w:abstractNum w:abstractNumId="37" w15:restartNumberingAfterBreak="0">
+  <w:abstractNum w:abstractNumId="38" w15:restartNumberingAfterBreak="0">
     <w:nsid w:val="6F1C5C3D"/>
     <w:multiLevelType w:val="multilevel"/>
     <w:tmpl w:val="C3D8C85C"/>
@@ -8832,7 +10927,7 @@
       </w:rPr>
     </w:lvl>
   </w:abstractNum>
-  <w:abstractNum w:abstractNumId="38" w15:restartNumberingAfterBreak="0">
+  <w:abstractNum w:abstractNumId="39" w15:restartNumberingAfterBreak="0">
     <w:nsid w:val="70EB4336"/>
     <w:multiLevelType w:val="multilevel"/>
     <w:tmpl w:val="5A98E152"/>
@@ -8945,7 +11040,7 @@
       </w:pPr>
     </w:lvl>
   </w:abstractNum>
-  <w:abstractNum w:abstractNumId="39" w15:restartNumberingAfterBreak="0">
+  <w:abstractNum w:abstractNumId="40" w15:restartNumberingAfterBreak="0">
     <w:nsid w:val="75034FCF"/>
     <w:multiLevelType w:val="multilevel"/>
     <w:tmpl w:val="078E21CE"/>
@@ -9094,7 +11189,7 @@
       </w:rPr>
     </w:lvl>
   </w:abstractNum>
-  <w:abstractNum w:abstractNumId="40" w15:restartNumberingAfterBreak="0">
+  <w:abstractNum w:abstractNumId="41" w15:restartNumberingAfterBreak="0">
     <w:nsid w:val="75994B14"/>
     <w:multiLevelType w:val="multilevel"/>
     <w:tmpl w:val="E4F6367E"/>
@@ -9243,7 +11338,7 @@
       </w:rPr>
     </w:lvl>
   </w:abstractNum>
-  <w:abstractNum w:abstractNumId="41" w15:restartNumberingAfterBreak="0">
+  <w:abstractNum w:abstractNumId="42" w15:restartNumberingAfterBreak="0">
     <w:nsid w:val="769046A9"/>
     <w:multiLevelType w:val="multilevel"/>
     <w:tmpl w:val="E4D8E34A"/>
@@ -9392,7 +11487,7 @@
       </w:rPr>
     </w:lvl>
   </w:abstractNum>
-  <w:abstractNum w:abstractNumId="42" w15:restartNumberingAfterBreak="0">
+  <w:abstractNum w:abstractNumId="43" w15:restartNumberingAfterBreak="0">
     <w:nsid w:val="794D618C"/>
     <w:multiLevelType w:val="multilevel"/>
     <w:tmpl w:val="0D6A193E"/>
@@ -9541,7 +11636,7 @@
       </w:rPr>
     </w:lvl>
   </w:abstractNum>
-  <w:abstractNum w:abstractNumId="43" w15:restartNumberingAfterBreak="0">
+  <w:abstractNum w:abstractNumId="44" w15:restartNumberingAfterBreak="0">
     <w:nsid w:val="7AC10A49"/>
     <w:multiLevelType w:val="multilevel"/>
     <w:tmpl w:val="6B806EC0"/>
@@ -9655,16 +11750,16 @@
     </w:lvl>
   </w:abstractNum>
   <w:num w:numId="1" w16cid:durableId="2039161732">
-    <w:abstractNumId w:val="37"/>
+    <w:abstractNumId w:val="38"/>
   </w:num>
   <w:num w:numId="2" w16cid:durableId="599878884">
     <w:abstractNumId w:val="17"/>
   </w:num>
   <w:num w:numId="3" w16cid:durableId="1687515766">
-    <w:abstractNumId w:val="26"/>
+    <w:abstractNumId w:val="27"/>
   </w:num>
   <w:num w:numId="4" w16cid:durableId="1597786103">
-    <w:abstractNumId w:val="36"/>
+    <w:abstractNumId w:val="37"/>
   </w:num>
   <w:num w:numId="5" w16cid:durableId="2037730805">
     <w:abstractNumId w:val="11"/>
@@ -9696,13 +11791,13 @@
     <w:abstractNumId w:val="16"/>
   </w:num>
   <w:num w:numId="10" w16cid:durableId="1772167618">
-    <w:abstractNumId w:val="42"/>
+    <w:abstractNumId w:val="43"/>
   </w:num>
   <w:num w:numId="11" w16cid:durableId="97992273">
-    <w:abstractNumId w:val="23"/>
+    <w:abstractNumId w:val="24"/>
   </w:num>
   <w:num w:numId="12" w16cid:durableId="399138131">
-    <w:abstractNumId w:val="41"/>
+    <w:abstractNumId w:val="42"/>
   </w:num>
   <w:num w:numId="13" w16cid:durableId="1586260525">
     <w:abstractNumId w:val="0"/>
@@ -9714,25 +11809,25 @@
     <w:abstractNumId w:val="9"/>
   </w:num>
   <w:num w:numId="16" w16cid:durableId="825627380">
-    <w:abstractNumId w:val="27"/>
+    <w:abstractNumId w:val="28"/>
   </w:num>
   <w:num w:numId="17" w16cid:durableId="2075004164">
-    <w:abstractNumId w:val="32"/>
+    <w:abstractNumId w:val="33"/>
   </w:num>
   <w:num w:numId="18" w16cid:durableId="4594926">
-    <w:abstractNumId w:val="40"/>
+    <w:abstractNumId w:val="41"/>
   </w:num>
   <w:num w:numId="19" w16cid:durableId="1771468233">
     <w:abstractNumId w:val="4"/>
   </w:num>
   <w:num w:numId="20" w16cid:durableId="316500084">
-    <w:abstractNumId w:val="39"/>
+    <w:abstractNumId w:val="40"/>
   </w:num>
   <w:num w:numId="21" w16cid:durableId="46925458">
-    <w:abstractNumId w:val="35"/>
+    <w:abstractNumId w:val="36"/>
   </w:num>
   <w:num w:numId="22" w16cid:durableId="68312687">
-    <w:abstractNumId w:val="30"/>
+    <w:abstractNumId w:val="31"/>
   </w:num>
   <w:num w:numId="23" w16cid:durableId="1069303592">
     <w:abstractNumId w:val="8"/>
@@ -9741,7 +11836,7 @@
     <w:abstractNumId w:val="10"/>
   </w:num>
   <w:num w:numId="25" w16cid:durableId="1046952834">
-    <w:abstractNumId w:val="31"/>
+    <w:abstractNumId w:val="32"/>
   </w:num>
   <w:num w:numId="26" w16cid:durableId="1074931892">
     <w:abstractNumId w:val="13"/>
@@ -9753,28 +11848,28 @@
     <w:abstractNumId w:val="5"/>
   </w:num>
   <w:num w:numId="29" w16cid:durableId="1036780762">
-    <w:abstractNumId w:val="22"/>
+    <w:abstractNumId w:val="23"/>
   </w:num>
   <w:num w:numId="30" w16cid:durableId="909072183">
-    <w:abstractNumId w:val="29"/>
+    <w:abstractNumId w:val="30"/>
   </w:num>
   <w:num w:numId="31" w16cid:durableId="290861997">
-    <w:abstractNumId w:val="20"/>
+    <w:abstractNumId w:val="21"/>
   </w:num>
   <w:num w:numId="32" w16cid:durableId="992679136">
-    <w:abstractNumId w:val="24"/>
+    <w:abstractNumId w:val="25"/>
   </w:num>
   <w:num w:numId="33" w16cid:durableId="1903565666">
     <w:abstractNumId w:val="3"/>
   </w:num>
   <w:num w:numId="34" w16cid:durableId="781609022">
-    <w:abstractNumId w:val="25"/>
+    <w:abstractNumId w:val="26"/>
   </w:num>
   <w:num w:numId="35" w16cid:durableId="2055502745">
-    <w:abstractNumId w:val="34"/>
+    <w:abstractNumId w:val="35"/>
   </w:num>
   <w:num w:numId="36" w16cid:durableId="1158157485">
-    <w:abstractNumId w:val="43"/>
+    <w:abstractNumId w:val="44"/>
     <w:lvlOverride w:ilvl="0">
       <w:lvl w:ilvl="0">
         <w:numFmt w:val="decimal"/>
@@ -9784,7 +11879,7 @@
     </w:lvlOverride>
   </w:num>
   <w:num w:numId="37" w16cid:durableId="1089040727">
-    <w:abstractNumId w:val="33"/>
+    <w:abstractNumId w:val="34"/>
     <w:lvlOverride w:ilvl="0">
       <w:lvl w:ilvl="0">
         <w:numFmt w:val="decimal"/>
@@ -9794,7 +11889,7 @@
     </w:lvlOverride>
   </w:num>
   <w:num w:numId="38" w16cid:durableId="1102337783">
-    <w:abstractNumId w:val="38"/>
+    <w:abstractNumId w:val="39"/>
     <w:lvlOverride w:ilvl="0">
       <w:lvl w:ilvl="0">
         <w:numFmt w:val="decimal"/>
@@ -9807,19 +11902,22 @@
     <w:abstractNumId w:val="12"/>
   </w:num>
   <w:num w:numId="40" w16cid:durableId="1517693151">
-    <w:abstractNumId w:val="28"/>
+    <w:abstractNumId w:val="29"/>
   </w:num>
   <w:num w:numId="41" w16cid:durableId="1516770646">
     <w:abstractNumId w:val="19"/>
   </w:num>
   <w:num w:numId="42" w16cid:durableId="15204715">
-    <w:abstractNumId w:val="21"/>
+    <w:abstractNumId w:val="22"/>
   </w:num>
   <w:num w:numId="43" w16cid:durableId="1598364838">
     <w:abstractNumId w:val="15"/>
   </w:num>
   <w:num w:numId="44" w16cid:durableId="491138507">
     <w:abstractNumId w:val="14"/>
+  </w:num>
+  <w:num w:numId="45" w16cid:durableId="318193185">
+    <w:abstractNumId w:val="20"/>
   </w:num>
 </w:numbering>
 </file>

</xml_diff>

<commit_message>
Implemented users,roles,address and their relationships
</commit_message>
<xml_diff>
--- a/Ecommerce/src/main/resources/material.docx
+++ b/Ecommerce/src/main/resources/material.docx
@@ -78,13 +78,8 @@
     </w:p>
     <w:p>
       <w:r>
-        <w:t xml:space="preserve">Server responds and sends back </w:t>
-      </w:r>
-      <w:proofErr w:type="gramStart"/>
-      <w:r>
-        <w:t>response</w:t>
-      </w:r>
-      <w:proofErr w:type="gramEnd"/>
+        <w:t>Server responds and sends back response</w:t>
+      </w:r>
     </w:p>
     <w:p/>
     <w:p>
@@ -100,15 +95,7 @@
     <w:p/>
     <w:p>
       <w:r>
-        <w:t xml:space="preserve">Example: </w:t>
-      </w:r>
-      <w:proofErr w:type="spellStart"/>
-      <w:r>
-        <w:t>System.out.print</w:t>
-      </w:r>
-      <w:proofErr w:type="spellEnd"/>
-      <w:r>
-        <w:t>(): // local API</w:t>
+        <w:t>Example: System.out.print(): // local API</w:t>
       </w:r>
     </w:p>
     <w:p>
@@ -149,15 +136,7 @@
     <w:p/>
     <w:p>
       <w:r>
-        <w:t xml:space="preserve">Authentication of the user also checks by API, when a request hits the Server, initially it authenticates the request. Then </w:t>
-      </w:r>
-      <w:proofErr w:type="gramStart"/>
-      <w:r>
-        <w:t>allows</w:t>
-      </w:r>
-      <w:proofErr w:type="gramEnd"/>
-      <w:r>
-        <w:t xml:space="preserve"> it into server</w:t>
+        <w:t>Authentication of the user also checks by API, when a request hits the Server, initially it authenticates the request. Then allows it into server</w:t>
       </w:r>
     </w:p>
     <w:p/>
@@ -221,23 +200,7 @@
         </w:numPr>
       </w:pPr>
       <w:r>
-        <w:t xml:space="preserve">REST is stateless. Means server did not hold any specific data </w:t>
-      </w:r>
-      <w:proofErr w:type="gramStart"/>
-      <w:r>
-        <w:t>of</w:t>
-      </w:r>
-      <w:proofErr w:type="gramEnd"/>
-      <w:r>
-        <w:t xml:space="preserve"> previous requests. </w:t>
-      </w:r>
-      <w:proofErr w:type="gramStart"/>
-      <w:r>
-        <w:t>So</w:t>
-      </w:r>
-      <w:proofErr w:type="gramEnd"/>
-      <w:r>
-        <w:t xml:space="preserve"> every request should contain all required data from the client to validate.</w:t>
+        <w:t>REST is stateless. Means server did not hold any specific data of previous requests. So every request should contain all required data from the client to validate.</w:t>
       </w:r>
     </w:p>
     <w:p>
@@ -287,15 +250,7 @@
     <w:p/>
     <w:p>
       <w:r>
-        <w:t xml:space="preserve">HTTP and HTTPS are protocols used by clients and </w:t>
-      </w:r>
-      <w:proofErr w:type="gramStart"/>
-      <w:r>
-        <w:t>server</w:t>
-      </w:r>
-      <w:proofErr w:type="gramEnd"/>
-      <w:r>
-        <w:t xml:space="preserve"> to communicate over a network. The difference is that HTTPS wraps HTTP inside a secure Transmission Layer Security (TLS/SSL).</w:t>
+        <w:t>HTTP and HTTPS are protocols used by clients and server to communicate over a network. The difference is that HTTPS wraps HTTP inside a secure Transmission Layer Security (TLS/SSL).</w:t>
       </w:r>
     </w:p>
     <w:p/>
@@ -324,15 +279,7 @@
         </w:numPr>
       </w:pPr>
       <w:r>
-        <w:t>Client initializes a TCP connection (</w:t>
-      </w:r>
-      <w:proofErr w:type="gramStart"/>
-      <w:r>
-        <w:t>3 way</w:t>
-      </w:r>
-      <w:proofErr w:type="gramEnd"/>
-      <w:r>
-        <w:t xml:space="preserve"> handshake SYN, SYN-ACK, ACK) on port 80.</w:t>
+        <w:t>Client initializes a TCP connection (3 way handshake SYN, SYN-ACK, ACK) on port 80.</w:t>
       </w:r>
     </w:p>
     <w:p>
@@ -353,15 +300,7 @@
     </w:p>
     <w:p>
       <w:r>
-        <w:t>GET /</w:t>
-      </w:r>
-      <w:proofErr w:type="spellStart"/>
-      <w:r>
-        <w:t>products?id</w:t>
-      </w:r>
-      <w:proofErr w:type="spellEnd"/>
-      <w:r>
-        <w:t>=10 HTTP/1.1</w:t>
+        <w:t>GET /products?id=10 HTTP/1.1</w:t>
       </w:r>
     </w:p>
     <w:p>
@@ -408,13 +347,8 @@
     </w:p>
     <w:p>
       <w:r>
-        <w:t>Content-Type: application/</w:t>
-      </w:r>
-      <w:proofErr w:type="spellStart"/>
-      <w:r>
-        <w:t>json</w:t>
-      </w:r>
-      <w:proofErr w:type="spellEnd"/>
+        <w:t>Content-Type: application/json</w:t>
+      </w:r>
     </w:p>
     <w:p>
       <w:r>
@@ -460,21 +394,8 @@
     </w:p>
     <w:p/>
     <w:p>
-      <w:proofErr w:type="gramStart"/>
-      <w:r>
-        <w:t>Imagine,</w:t>
-      </w:r>
-      <w:proofErr w:type="gramEnd"/>
-      <w:r>
-        <w:t xml:space="preserve"> if our request contains username and password. Hackers can easily see them. </w:t>
-      </w:r>
-      <w:proofErr w:type="gramStart"/>
-      <w:r>
-        <w:t>So</w:t>
-      </w:r>
-      <w:proofErr w:type="gramEnd"/>
-      <w:r>
-        <w:t xml:space="preserve"> most of the companies use HTTPS</w:t>
+      <w:r>
+        <w:t>Imagine, if our request contains username and password. Hackers can easily see them. So most of the companies use HTTPS</w:t>
       </w:r>
     </w:p>
     <w:p>
@@ -491,23 +412,7 @@
     <w:p/>
     <w:p>
       <w:r>
-        <w:t xml:space="preserve">After establishing TCP on port 443, </w:t>
-      </w:r>
-      <w:proofErr w:type="gramStart"/>
-      <w:r>
-        <w:t>client</w:t>
-      </w:r>
-      <w:proofErr w:type="gramEnd"/>
-      <w:r>
-        <w:t xml:space="preserve"> and </w:t>
-      </w:r>
-      <w:proofErr w:type="gramStart"/>
-      <w:r>
-        <w:t>server</w:t>
-      </w:r>
-      <w:proofErr w:type="gramEnd"/>
-      <w:r>
-        <w:t xml:space="preserve"> perform TLS handshake.</w:t>
+        <w:t>After establishing TCP on port 443, client and server perform TLS handshake.</w:t>
       </w:r>
     </w:p>
     <w:p/>
@@ -568,7 +473,6 @@
     </w:p>
     <w:p/>
     <w:p>
-      <w:proofErr w:type="spellStart"/>
       <w:r>
         <w:rPr>
           <w:b/>
@@ -576,14 +480,12 @@
         </w:rPr>
         <w:t>ClientHello</w:t>
       </w:r>
-      <w:proofErr w:type="spellEnd"/>
       <w:r>
         <w:t>: Client sends the information such as supported TLS versions, cryptographic algorithms/cipher suites and random numbers</w:t>
       </w:r>
     </w:p>
     <w:p/>
     <w:p>
-      <w:proofErr w:type="spellStart"/>
       <w:r>
         <w:rPr>
           <w:b/>
@@ -591,17 +493,8 @@
         </w:rPr>
         <w:t>ServerHello</w:t>
       </w:r>
-      <w:proofErr w:type="spellEnd"/>
-      <w:r>
-        <w:t xml:space="preserve">: server picks a suitable TLS version, cipher suite/cryptographic algo and sends back </w:t>
-      </w:r>
-      <w:proofErr w:type="gramStart"/>
-      <w:r>
-        <w:t>clients</w:t>
-      </w:r>
-      <w:proofErr w:type="gramEnd"/>
-      <w:r>
-        <w:t xml:space="preserve"> own random number along with a digital certificate containing public key.</w:t>
+      <w:r>
+        <w:t>: server picks a suitable TLS version, cipher suite/cryptographic algo and sends back clients own random number along with a digital certificate containing public key.</w:t>
       </w:r>
     </w:p>
     <w:p/>
@@ -696,40 +589,19 @@
     </w:p>
     <w:p>
       <w:r>
-        <w:t xml:space="preserve">After establishing successful encryption. Data </w:t>
-      </w:r>
-      <w:proofErr w:type="gramStart"/>
-      <w:r>
-        <w:t>sends</w:t>
-      </w:r>
-      <w:proofErr w:type="gramEnd"/>
-      <w:r>
-        <w:t xml:space="preserve"> in a sequence of packets, which are not readable.</w:t>
+        <w:t>After establishing successful encryption. Data sends in a sequence of packets, which are not readable.</w:t>
       </w:r>
     </w:p>
     <w:p/>
     <w:p>
-      <w:proofErr w:type="gramStart"/>
-      <w:r>
-        <w:t>example :</w:t>
-      </w:r>
-      <w:proofErr w:type="gramEnd"/>
-      <w:r>
-        <w:t> </w:t>
+      <w:r>
+        <w:t>example : </w:t>
       </w:r>
     </w:p>
     <w:p/>
     <w:p>
       <w:r>
-        <w:t xml:space="preserve">What client initially </w:t>
-      </w:r>
-      <w:proofErr w:type="gramStart"/>
-      <w:r>
-        <w:t>send</w:t>
-      </w:r>
-      <w:proofErr w:type="gramEnd"/>
-      <w:r>
-        <w:t>:</w:t>
+        <w:t>What client initially send:</w:t>
       </w:r>
     </w:p>
     <w:p/>
@@ -751,15 +623,7 @@
     <w:p/>
     <w:p>
       <w:r>
-        <w:t xml:space="preserve">What </w:t>
-      </w:r>
-      <w:proofErr w:type="gramStart"/>
-      <w:r>
-        <w:t>actually data</w:t>
-      </w:r>
-      <w:proofErr w:type="gramEnd"/>
-      <w:r>
-        <w:t xml:space="preserve"> looks like in transit</w:t>
+        <w:t>What actually data looks like in transit</w:t>
       </w:r>
     </w:p>
     <w:p>
@@ -786,17 +650,8 @@
           <w:b/>
           <w:bCs/>
         </w:rPr>
-        <w:t xml:space="preserve">What HTTPS </w:t>
-      </w:r>
-      <w:proofErr w:type="gramStart"/>
-      <w:r>
-        <w:rPr>
-          <w:b/>
-          <w:bCs/>
-        </w:rPr>
-        <w:t>actually guarantees</w:t>
-      </w:r>
-      <w:proofErr w:type="gramEnd"/>
+        <w:t>What HTTPS actually guarantees</w:t>
+      </w:r>
     </w:p>
     <w:p>
       <w:pPr>
@@ -849,15 +704,7 @@
         <w:t>Authentication</w:t>
       </w:r>
       <w:r>
-        <w:t xml:space="preserve"> — you know you're </w:t>
-      </w:r>
-      <w:proofErr w:type="gramStart"/>
-      <w:r>
-        <w:t>actually talking</w:t>
-      </w:r>
-      <w:proofErr w:type="gramEnd"/>
-      <w:r>
-        <w:t xml:space="preserve"> to the domain you typed, not an impostor</w:t>
+        <w:t xml:space="preserve"> — you know you're actually talking to the domain you typed, not an impostor</w:t>
       </w:r>
     </w:p>
     <w:p>
@@ -905,15 +752,7 @@
     </w:p>
     <w:p>
       <w:r>
-        <w:t xml:space="preserve">Web framework is a collection of tools and modules that </w:t>
-      </w:r>
-      <w:proofErr w:type="gramStart"/>
-      <w:r>
-        <w:t>is</w:t>
-      </w:r>
-      <w:proofErr w:type="gramEnd"/>
-      <w:r>
-        <w:t xml:space="preserve"> needed to do standard tasks across every web application.</w:t>
+        <w:t>Web framework is a collection of tools and modules that is needed to do standard tasks across every web application.</w:t>
       </w:r>
     </w:p>
     <w:p>
@@ -976,13 +815,8 @@
       </w:r>
     </w:p>
     <w:p>
-      <w:proofErr w:type="gramStart"/>
-      <w:r>
-        <w:t>Loose</w:t>
-      </w:r>
-      <w:proofErr w:type="gramEnd"/>
-      <w:r>
-        <w:t xml:space="preserve"> coupling: loose coupling is a design principle that aims to reduce dependency between components in the system.</w:t>
+      <w:r>
+        <w:t>Loose coupling: loose coupling is a design principle that aims to reduce dependency between components in the system.</w:t>
       </w:r>
     </w:p>
     <w:p>
@@ -1073,37 +907,8 @@
           <w:numId w:val="11"/>
         </w:numPr>
       </w:pPr>
-      <w:proofErr w:type="spellStart"/>
-      <w:r>
-        <w:t>ArrayList</w:t>
-      </w:r>
-      <w:proofErr w:type="spellEnd"/>
-      <w:r>
-        <w:t xml:space="preserve">&lt;T&gt; is </w:t>
-      </w:r>
-      <w:proofErr w:type="gramStart"/>
-      <w:r>
-        <w:t>class :</w:t>
-      </w:r>
-      <w:proofErr w:type="gramEnd"/>
-      <w:r>
-        <w:t xml:space="preserve"> List&lt;Integer&gt; list = new </w:t>
-      </w:r>
-      <w:proofErr w:type="spellStart"/>
-      <w:r>
-        <w:t>ArrayList</w:t>
-      </w:r>
-      <w:proofErr w:type="spellEnd"/>
-      <w:r>
-        <w:t>&lt;</w:t>
-      </w:r>
-      <w:proofErr w:type="gramStart"/>
-      <w:r>
-        <w:t>&gt;(</w:t>
-      </w:r>
-      <w:proofErr w:type="gramEnd"/>
-      <w:r>
-        <w:t>);</w:t>
+      <w:r>
+        <w:t>ArrayList&lt;T&gt; is class : List&lt;Integer&gt; list = new ArrayList&lt;&gt;();</w:t>
       </w:r>
     </w:p>
     <w:p>
@@ -1114,23 +919,7 @@
         </w:numPr>
       </w:pPr>
       <w:r>
-        <w:t xml:space="preserve">Vector&lt;T&gt; is </w:t>
-      </w:r>
-      <w:proofErr w:type="gramStart"/>
-      <w:r>
-        <w:t>class :</w:t>
-      </w:r>
-      <w:proofErr w:type="gramEnd"/>
-      <w:r>
-        <w:t xml:space="preserve"> List&lt;String&gt; vector = new Vector&lt;</w:t>
-      </w:r>
-      <w:proofErr w:type="gramStart"/>
-      <w:r>
-        <w:t>&gt;(</w:t>
-      </w:r>
-      <w:proofErr w:type="gramEnd"/>
-      <w:r>
-        <w:t>);</w:t>
+        <w:t>Vector&lt;T&gt; is class : List&lt;String&gt; vector = new Vector&lt;&gt;();</w:t>
       </w:r>
     </w:p>
     <w:p>
@@ -1145,23 +934,7 @@
     </w:p>
     <w:p>
       <w:r>
-        <w:t xml:space="preserve">Inversion of control is a design </w:t>
-      </w:r>
-      <w:proofErr w:type="gramStart"/>
-      <w:r>
-        <w:t>principle  where</w:t>
-      </w:r>
-      <w:proofErr w:type="gramEnd"/>
-      <w:r>
-        <w:t xml:space="preserve"> the control of object creation and objects life cycle </w:t>
-      </w:r>
-      <w:proofErr w:type="gramStart"/>
-      <w:r>
-        <w:t>management  is</w:t>
-      </w:r>
-      <w:proofErr w:type="gramEnd"/>
-      <w:r>
-        <w:t xml:space="preserve"> transferred from the application code to an external container or framework.</w:t>
+        <w:t>Inversion of control is a design principle  where the control of object creation and objects life cycle management  is transferred from the application code to an external container or framework.</w:t>
       </w:r>
     </w:p>
     <w:p>
@@ -1188,15 +961,7 @@
         </w:numPr>
       </w:pPr>
       <w:r>
-        <w:t xml:space="preserve">Dependency Injection is a designed pattern commonly used in </w:t>
-      </w:r>
-      <w:proofErr w:type="gramStart"/>
-      <w:r>
-        <w:t>object oriented</w:t>
-      </w:r>
-      <w:proofErr w:type="gramEnd"/>
-      <w:r>
-        <w:t xml:space="preserve"> programming with the dependency of a class being provided externally rather than being created within the class itself.</w:t>
+        <w:t>Dependency Injection is a designed pattern commonly used in object oriented programming with the dependency of a class being provided externally rather than being created within the class itself.</w:t>
       </w:r>
     </w:p>
     <w:p>
@@ -1219,15 +984,7 @@
     <w:p/>
     <w:p>
       <w:r>
-        <w:t xml:space="preserve">Spring </w:t>
-      </w:r>
-      <w:proofErr w:type="gramStart"/>
-      <w:r>
-        <w:t>Container :</w:t>
-      </w:r>
-      <w:proofErr w:type="gramEnd"/>
-      <w:r>
-        <w:t xml:space="preserve"> Spring container is a core component and is responsible for managing the life cycle and configuration of objects called beans.</w:t>
+        <w:t>Spring Container : Spring container is a core component and is responsible for managing the life cycle and configuration of objects called beans.</w:t>
       </w:r>
     </w:p>
     <w:p>
@@ -1242,11 +999,9 @@
           <w:numId w:val="14"/>
         </w:numPr>
       </w:pPr>
-      <w:proofErr w:type="spellStart"/>
       <w:r>
         <w:t>BeanFactory</w:t>
       </w:r>
-      <w:proofErr w:type="spellEnd"/>
     </w:p>
     <w:p>
       <w:pPr>
@@ -1255,22 +1010,13 @@
           <w:numId w:val="14"/>
         </w:numPr>
       </w:pPr>
-      <w:proofErr w:type="spellStart"/>
       <w:r>
         <w:t>ApplicationContext</w:t>
       </w:r>
-      <w:proofErr w:type="spellEnd"/>
-    </w:p>
-    <w:p>
-      <w:proofErr w:type="spellStart"/>
-      <w:proofErr w:type="gramStart"/>
-      <w:r>
-        <w:t>BeanFactory</w:t>
-      </w:r>
-      <w:proofErr w:type="spellEnd"/>
-      <w:proofErr w:type="gramEnd"/>
-      <w:r>
-        <w:t>: </w:t>
+    </w:p>
+    <w:p>
+      <w:r>
+        <w:t>BeanFactory: </w:t>
       </w:r>
     </w:p>
     <w:p>
@@ -1279,62 +1025,23 @@
       </w:r>
     </w:p>
     <w:p>
-      <w:proofErr w:type="spellStart"/>
-      <w:r>
-        <w:t>BeanFactory</w:t>
-      </w:r>
-      <w:proofErr w:type="spellEnd"/>
-      <w:r>
-        <w:t xml:space="preserve"> context = new </w:t>
-      </w:r>
-      <w:proofErr w:type="spellStart"/>
-      <w:r>
-        <w:t>ClassPathXmlApplicationContext</w:t>
-      </w:r>
-      <w:proofErr w:type="spellEnd"/>
-      <w:r>
-        <w:t>("applicationBeanContext.xml");</w:t>
-      </w:r>
-    </w:p>
-    <w:p>
-      <w:proofErr w:type="spellStart"/>
-      <w:r>
-        <w:t>ApplicationContext</w:t>
-      </w:r>
-      <w:proofErr w:type="spellEnd"/>
-      <w:r>
-        <w:t>: </w:t>
-      </w:r>
-    </w:p>
-    <w:p>
-      <w:r>
-        <w:t xml:space="preserve">A more advanced container built on top of </w:t>
-      </w:r>
-      <w:proofErr w:type="spellStart"/>
-      <w:r>
-        <w:t>BeanFactory</w:t>
-      </w:r>
-      <w:proofErr w:type="spellEnd"/>
-      <w:r>
-        <w:t>, offering additional features such as event propagation, declarative mechanisms to create a bean, and various means to look up. It is generally recommended for most applications. </w:t>
-      </w:r>
-    </w:p>
-    <w:p>
-      <w:proofErr w:type="spellStart"/>
-      <w:r>
-        <w:t>ApplicationContext</w:t>
-      </w:r>
-      <w:proofErr w:type="spellEnd"/>
-      <w:r>
-        <w:t xml:space="preserve"> context = new </w:t>
-      </w:r>
-      <w:proofErr w:type="spellStart"/>
-      <w:r>
-        <w:t>ClassPathXmlApplicationContext</w:t>
-      </w:r>
-      <w:proofErr w:type="spellEnd"/>
-      <w:r>
-        <w:t>("applicationBeanContext.xml");</w:t>
+      <w:r>
+        <w:t>BeanFactory context = new ClassPathXmlApplicationContext("applicationBeanContext.xml");</w:t>
+      </w:r>
+    </w:p>
+    <w:p>
+      <w:r>
+        <w:t>ApplicationContext: </w:t>
+      </w:r>
+    </w:p>
+    <w:p>
+      <w:r>
+        <w:t>A more advanced container built on top of BeanFactory, offering additional features such as event propagation, declarative mechanisms to create a bean, and various means to look up. It is generally recommended for most applications. </w:t>
+      </w:r>
+    </w:p>
+    <w:p>
+      <w:r>
+        <w:t>ApplicationContext context = new ClassPathXmlApplicationContext("applicationBeanContext.xml");</w:t>
       </w:r>
     </w:p>
     <w:p/>
@@ -1345,15 +1052,7 @@
     </w:p>
     <w:p>
       <w:r>
-        <w:t xml:space="preserve">We as </w:t>
-      </w:r>
-      <w:proofErr w:type="gramStart"/>
-      <w:r>
-        <w:t>a developer</w:t>
-      </w:r>
-      <w:proofErr w:type="gramEnd"/>
-      <w:r>
-        <w:t>, create a configuration file. So that bean life cycle would know which objects need to be managed.</w:t>
+        <w:t>We as a developer, create a configuration file. So that bean life cycle would know which objects need to be managed.</w:t>
       </w:r>
     </w:p>
     <w:p>
@@ -1457,15 +1156,7 @@
         </w:numPr>
       </w:pPr>
       <w:r>
-        <w:t xml:space="preserve">creation, we </w:t>
-      </w:r>
-      <w:proofErr w:type="gramStart"/>
-      <w:r>
-        <w:t>have to</w:t>
-      </w:r>
-      <w:proofErr w:type="gramEnd"/>
-      <w:r>
-        <w:t xml:space="preserve"> create a config file which is XML. In that config file we define beans where the spring container needs to be managed.</w:t>
+        <w:t>creation, we have to create a config file which is XML. In that config file we define beans where the spring container needs to be managed.</w:t>
       </w:r>
     </w:p>
     <w:p/>
@@ -1535,21 +1226,8 @@
           <w:numId w:val="19"/>
         </w:numPr>
       </w:pPr>
-      <w:proofErr w:type="gramStart"/>
-      <w:r>
-        <w:t>Dependencies are</w:t>
-      </w:r>
-      <w:proofErr w:type="gramEnd"/>
-      <w:r>
-        <w:t xml:space="preserve"> provided </w:t>
-      </w:r>
-      <w:proofErr w:type="gramStart"/>
-      <w:r>
-        <w:t>to</w:t>
-      </w:r>
-      <w:proofErr w:type="gramEnd"/>
-      <w:r>
-        <w:t xml:space="preserve"> the dependent class through its constructor.</w:t>
+      <w:r>
+        <w:t>Dependencies are provided to the dependent class through its constructor.</w:t>
       </w:r>
     </w:p>
     <w:p>
@@ -1609,15 +1287,7 @@
         </w:numPr>
       </w:pPr>
       <w:r>
-        <w:t>We create a sub tag of &lt;constructor-</w:t>
-      </w:r>
-      <w:proofErr w:type="spellStart"/>
-      <w:r>
-        <w:t>arg</w:t>
-      </w:r>
-      <w:proofErr w:type="spellEnd"/>
-      <w:r>
-        <w:t>&gt; in dependent class bean where we mention the id of dependency class in that tag.</w:t>
+        <w:t>We create a sub tag of &lt;constructor-arg&gt; in dependent class bean where we mention the id of dependency class in that tag.</w:t>
       </w:r>
     </w:p>
     <w:p>
@@ -1692,29 +1362,8 @@
       </w:r>
     </w:p>
     <w:p>
-      <w:proofErr w:type="spellStart"/>
-      <w:r>
-        <w:t>Autowiring</w:t>
-      </w:r>
-      <w:proofErr w:type="spellEnd"/>
-      <w:r>
-        <w:t xml:space="preserve">: </w:t>
-      </w:r>
-      <w:proofErr w:type="spellStart"/>
-      <w:r>
-        <w:t>Autowiring</w:t>
-      </w:r>
-      <w:proofErr w:type="spellEnd"/>
-      <w:r>
-        <w:t xml:space="preserve"> is a design pattern that automatically injects dependent objects into a bean. Reducing the need </w:t>
-      </w:r>
-      <w:proofErr w:type="gramStart"/>
-      <w:r>
-        <w:t>of</w:t>
-      </w:r>
-      <w:proofErr w:type="gramEnd"/>
-      <w:r>
-        <w:t xml:space="preserve"> explicit configuration in XML.</w:t>
+      <w:r>
+        <w:t>Autowiring: Autowiring is a design pattern that automatically injects dependent objects into a bean. Reducing the need of explicit configuration in XML.</w:t>
       </w:r>
     </w:p>
     <w:p>
@@ -1741,13 +1390,8 @@
     </w:p>
     <w:p>
       <w:r>
-        <w:t xml:space="preserve">Type of </w:t>
-      </w:r>
-      <w:proofErr w:type="spellStart"/>
-      <w:r>
-        <w:t>autowiring</w:t>
-      </w:r>
-      <w:proofErr w:type="spellEnd"/>
+        <w:t>Type of autowiring</w:t>
+      </w:r>
     </w:p>
     <w:p>
       <w:pPr>
@@ -1756,14 +1400,10 @@
           <w:numId w:val="24"/>
         </w:numPr>
       </w:pPr>
-      <w:proofErr w:type="spellStart"/>
-      <w:proofErr w:type="gramStart"/>
       <w:r>
         <w:lastRenderedPageBreak/>
         <w:t>byName</w:t>
       </w:r>
-      <w:proofErr w:type="spellEnd"/>
-      <w:proofErr w:type="gramEnd"/>
     </w:p>
     <w:p>
       <w:pPr>
@@ -1772,11 +1412,9 @@
           <w:numId w:val="24"/>
         </w:numPr>
       </w:pPr>
-      <w:proofErr w:type="spellStart"/>
       <w:r>
         <w:t>byTpe</w:t>
       </w:r>
-      <w:proofErr w:type="spellEnd"/>
     </w:p>
     <w:p>
       <w:pPr>
@@ -1785,29 +1423,14 @@
           <w:numId w:val="24"/>
         </w:numPr>
       </w:pPr>
-      <w:proofErr w:type="spellStart"/>
       <w:r>
         <w:t>byConstructor</w:t>
       </w:r>
-      <w:proofErr w:type="spellEnd"/>
     </w:p>
     <w:p/>
     <w:p>
-      <w:proofErr w:type="spellStart"/>
-      <w:r>
-        <w:t>Autowiring</w:t>
-      </w:r>
-      <w:proofErr w:type="spellEnd"/>
-      <w:r>
-        <w:t xml:space="preserve"> </w:t>
-      </w:r>
-      <w:proofErr w:type="spellStart"/>
-      <w:r>
-        <w:t>byName</w:t>
-      </w:r>
-      <w:proofErr w:type="spellEnd"/>
-      <w:r>
-        <w:t>: Spring injects the dependency by matching the bean ID with property name of dependency object in dependent class.</w:t>
+      <w:r>
+        <w:t>Autowiring byName: Spring injects the dependency by matching the bean ID with property name of dependency object in dependent class.</w:t>
       </w:r>
     </w:p>
     <w:p>
@@ -1818,15 +1441,7 @@
         </w:numPr>
       </w:pPr>
       <w:r>
-        <w:t xml:space="preserve">Use setter-based </w:t>
-      </w:r>
-      <w:proofErr w:type="gramStart"/>
-      <w:r>
-        <w:t>injection</w:t>
-      </w:r>
-      <w:proofErr w:type="gramEnd"/>
-      <w:r>
-        <w:t xml:space="preserve"> and must.</w:t>
+        <w:t>Use setter-based injection and must.</w:t>
       </w:r>
     </w:p>
     <w:p>
@@ -1842,37 +1457,8 @@
     </w:p>
     <w:p/>
     <w:p>
-      <w:proofErr w:type="spellStart"/>
-      <w:r>
-        <w:t>Autowiring</w:t>
-      </w:r>
-      <w:proofErr w:type="spellEnd"/>
-      <w:r>
-        <w:t xml:space="preserve"> </w:t>
-      </w:r>
-      <w:proofErr w:type="spellStart"/>
-      <w:r>
-        <w:t>byType</w:t>
-      </w:r>
-      <w:proofErr w:type="spellEnd"/>
-      <w:r>
-        <w:t xml:space="preserve">: Spring injects the dependency based on the </w:t>
-      </w:r>
-      <w:proofErr w:type="spellStart"/>
-      <w:r>
-        <w:t>ClassName</w:t>
-      </w:r>
-      <w:proofErr w:type="spellEnd"/>
-      <w:r>
-        <w:t>/</w:t>
-      </w:r>
-      <w:proofErr w:type="spellStart"/>
-      <w:r>
-        <w:t>ClassType</w:t>
-      </w:r>
-      <w:proofErr w:type="spellEnd"/>
-      <w:r>
-        <w:t>.</w:t>
+      <w:r>
+        <w:t>Autowiring byType: Spring injects the dependency based on the ClassName/ClassType.</w:t>
       </w:r>
     </w:p>
     <w:p>
@@ -1898,21 +1484,8 @@
       </w:r>
     </w:p>
     <w:p>
-      <w:proofErr w:type="spellStart"/>
-      <w:r>
-        <w:t>Autowiring</w:t>
-      </w:r>
-      <w:proofErr w:type="spellEnd"/>
-      <w:r>
-        <w:t xml:space="preserve"> constructor: spring injects </w:t>
-      </w:r>
-      <w:proofErr w:type="gramStart"/>
-      <w:r>
-        <w:t>the dependency</w:t>
-      </w:r>
-      <w:proofErr w:type="gramEnd"/>
-      <w:r>
-        <w:t xml:space="preserve"> based on the constructor.</w:t>
+      <w:r>
+        <w:t>Autowiring constructor: spring injects the dependency based on the constructor.</w:t>
       </w:r>
     </w:p>
     <w:p>
@@ -1922,45 +1495,8 @@
           <w:numId w:val="27"/>
         </w:numPr>
       </w:pPr>
-      <w:proofErr w:type="gramStart"/>
-      <w:r>
-        <w:t>Uses</w:t>
-      </w:r>
-      <w:proofErr w:type="gramEnd"/>
-      <w:r>
-        <w:t xml:space="preserve"> </w:t>
-      </w:r>
-      <w:proofErr w:type="gramStart"/>
-      <w:r>
-        <w:t>constructor based</w:t>
-      </w:r>
-      <w:proofErr w:type="gramEnd"/>
-      <w:r>
-        <w:t xml:space="preserve"> </w:t>
-      </w:r>
-      <w:proofErr w:type="gramStart"/>
-      <w:r>
-        <w:t>injection</w:t>
-      </w:r>
-      <w:proofErr w:type="gramEnd"/>
-      <w:r>
-        <w:t xml:space="preserve"> and </w:t>
-      </w:r>
-      <w:proofErr w:type="gramStart"/>
-      <w:r>
-        <w:t>constructor</w:t>
-      </w:r>
-      <w:proofErr w:type="gramEnd"/>
-      <w:r>
-        <w:t xml:space="preserve"> </w:t>
-      </w:r>
-      <w:proofErr w:type="gramStart"/>
-      <w:r>
-        <w:t>is</w:t>
-      </w:r>
-      <w:proofErr w:type="gramEnd"/>
-      <w:r>
-        <w:t xml:space="preserve"> must.</w:t>
+      <w:r>
+        <w:t>Uses constructor based injection and constructor is must.</w:t>
       </w:r>
     </w:p>
     <w:p>
@@ -1994,15 +1530,7 @@
         </w:numPr>
       </w:pPr>
       <w:r>
-        <w:t xml:space="preserve">Adds pre-defined implementations at </w:t>
-      </w:r>
-      <w:proofErr w:type="spellStart"/>
-      <w:r>
-        <w:t>runTime</w:t>
-      </w:r>
-      <w:proofErr w:type="spellEnd"/>
-      <w:r>
-        <w:t>.</w:t>
+        <w:t>Adds pre-defined implementations at runTime.</w:t>
       </w:r>
     </w:p>
     <w:p>
@@ -2013,13 +1541,8 @@
         </w:numPr>
       </w:pPr>
       <w:r>
-        <w:t xml:space="preserve">We use annotations to simplify configuration and runtime </w:t>
-      </w:r>
-      <w:proofErr w:type="spellStart"/>
-      <w:r>
-        <w:t>behaviour</w:t>
-      </w:r>
-      <w:proofErr w:type="spellEnd"/>
+        <w:t>We use annotations to simplify configuration and runtime behaviour</w:t>
+      </w:r>
     </w:p>
     <w:p>
       <w:r>
@@ -2027,31 +1550,13 @@
       </w:r>
     </w:p>
     <w:p>
-      <w:proofErr w:type="gramStart"/>
-      <w:r>
-        <w:t>@Component</w:t>
-      </w:r>
-      <w:proofErr w:type="gramEnd"/>
-      <w:r>
-        <w:t xml:space="preserve"> - this annotation simply marks a java class as a bean. Spring scans the whole project at runtime and manages their life cycle.</w:t>
-      </w:r>
-    </w:p>
-    <w:p>
-      <w:proofErr w:type="gramStart"/>
-      <w:r>
-        <w:t>@Override</w:t>
-      </w:r>
-      <w:proofErr w:type="gramEnd"/>
-      <w:r>
-        <w:t xml:space="preserve"> - this annotation educates the compiler that the current method in sub class is from parent </w:t>
-      </w:r>
-      <w:proofErr w:type="gramStart"/>
-      <w:r>
-        <w:t>class</w:t>
-      </w:r>
-      <w:proofErr w:type="gramEnd"/>
-      <w:r>
-        <w:t xml:space="preserve"> and we are modifying the logic and using this implementation instead of parent implementation.</w:t>
+      <w:r>
+        <w:t>@Component - this annotation simply marks a java class as a bean. Spring scans the whole project at runtime and manages their life cycle.</w:t>
+      </w:r>
+    </w:p>
+    <w:p>
+      <w:r>
+        <w:t>@Override - this annotation educates the compiler that the current method in sub class is from parent class and we are modifying the logic and using this implementation instead of parent implementation.</w:t>
       </w:r>
     </w:p>
     <w:p/>
@@ -2084,15 +1589,7 @@
         </w:numPr>
       </w:pPr>
       <w:r>
-        <w:t xml:space="preserve">Components are managed automatically by spring </w:t>
-      </w:r>
-      <w:proofErr w:type="spellStart"/>
-      <w:r>
-        <w:t>componentScanning</w:t>
-      </w:r>
-      <w:proofErr w:type="spellEnd"/>
-      <w:r>
-        <w:t>. But management of beans requires XML configuration.</w:t>
+        <w:t>Components are managed automatically by spring componentScanning. But management of beans requires XML configuration.</w:t>
       </w:r>
     </w:p>
     <w:p>
@@ -2118,28 +1615,7 @@
     </w:p>
     <w:p>
       <w:r>
-        <w:t>&lt;bean id = “</w:t>
-      </w:r>
-      <w:proofErr w:type="spellStart"/>
-      <w:r>
-        <w:t>myClass</w:t>
-      </w:r>
-      <w:proofErr w:type="spellEnd"/>
-      <w:r>
-        <w:t>” class = “</w:t>
-      </w:r>
-      <w:proofErr w:type="spellStart"/>
-      <w:r>
-        <w:t>com.</w:t>
-      </w:r>
-      <w:proofErr w:type="gramStart"/>
-      <w:r>
-        <w:t>example.MyClass</w:t>
-      </w:r>
-      <w:proofErr w:type="spellEnd"/>
-      <w:proofErr w:type="gramEnd"/>
-      <w:r>
-        <w:t>” /&gt;</w:t>
+        <w:t>&lt;bean id = “myClass” class = “com.example.MyClass” /&gt;</w:t>
       </w:r>
     </w:p>
     <w:p>
@@ -2159,15 +1635,7 @@
       </w:r>
       <w:r>
         <w:br/>
-        <w:t xml:space="preserve">Public class </w:t>
-      </w:r>
-      <w:proofErr w:type="spellStart"/>
-      <w:r>
-        <w:t>MyClass</w:t>
-      </w:r>
-      <w:proofErr w:type="spellEnd"/>
-      <w:r>
-        <w:t xml:space="preserve"> {</w:t>
+        <w:t>Public class MyClass {</w:t>
       </w:r>
     </w:p>
     <w:p>
@@ -2206,15 +1674,7 @@
         </w:numPr>
       </w:pPr>
       <w:r>
-        <w:t xml:space="preserve">We can use XML and annotations to specify </w:t>
-      </w:r>
-      <w:proofErr w:type="spellStart"/>
-      <w:r>
-        <w:t>componentScanning</w:t>
-      </w:r>
-      <w:proofErr w:type="spellEnd"/>
-      <w:r>
-        <w:t>.</w:t>
+        <w:t>We can use XML and annotations to specify componentScanning.</w:t>
       </w:r>
     </w:p>
     <w:p>
@@ -2225,15 +1685,7 @@
     <w:p>
       <w:r>
         <w:tab/>
-        <w:t>&lt;context: component-scan base-package=”</w:t>
-      </w:r>
-      <w:proofErr w:type="spellStart"/>
-      <w:r>
-        <w:t>com.example</w:t>
-      </w:r>
-      <w:proofErr w:type="spellEnd"/>
-      <w:r>
-        <w:t>” /&gt;</w:t>
+        <w:t>&lt;context: component-scan base-package=”com.example” /&gt;</w:t>
       </w:r>
     </w:p>
     <w:p/>
@@ -2251,13 +1703,8 @@
         </w:numPr>
       </w:pPr>
       <w:r>
-        <w:t xml:space="preserve">We can specify value from property files, Env files, system properties </w:t>
-      </w:r>
-      <w:proofErr w:type="gramStart"/>
-      <w:r>
-        <w:t>etc..</w:t>
-      </w:r>
-      <w:proofErr w:type="gramEnd"/>
+        <w:t>We can specify value from property files, Env files, system properties etc..</w:t>
+      </w:r>
     </w:p>
     <w:p>
       <w:pPr>
@@ -2272,28 +1719,12 @@
     </w:p>
     <w:p>
       <w:r>
-        <w:t>@</w:t>
-      </w:r>
-      <w:proofErr w:type="gramStart"/>
-      <w:r>
-        <w:t>Value(</w:t>
-      </w:r>
-      <w:proofErr w:type="gramEnd"/>
-      <w:r>
-        <w:t>101)</w:t>
-      </w:r>
-    </w:p>
-    <w:p>
-      <w:r>
-        <w:t xml:space="preserve">Private int </w:t>
-      </w:r>
-      <w:proofErr w:type="spellStart"/>
-      <w:r>
-        <w:t>empId</w:t>
-      </w:r>
-      <w:proofErr w:type="spellEnd"/>
-      <w:r>
-        <w:t>;</w:t>
+        <w:t>@Value(101)</w:t>
+      </w:r>
+    </w:p>
+    <w:p>
+      <w:r>
+        <w:t>Private int empId;</w:t>
       </w:r>
     </w:p>
     <w:p/>
@@ -2305,37 +1736,14 @@
     <w:p/>
     <w:p>
       <w:r>
-        <w:t xml:space="preserve">Configuration class: it is a class which has stereotype </w:t>
-      </w:r>
-      <w:proofErr w:type="gramStart"/>
-      <w:r>
-        <w:t>annotation @</w:t>
-      </w:r>
-      <w:proofErr w:type="gramEnd"/>
-      <w:r>
-        <w:t xml:space="preserve">Configuration at class level. Where this class has configurations which </w:t>
-      </w:r>
-      <w:proofErr w:type="gramStart"/>
-      <w:r>
-        <w:t>replaces</w:t>
-      </w:r>
-      <w:proofErr w:type="gramEnd"/>
-      <w:r>
-        <w:t xml:space="preserve"> the traditional XML configuration file to define, wire, and manage the beans. </w:t>
+        <w:t xml:space="preserve">Configuration class: it is a class which has stereotype annotation @Configuration at class level. Where this class has configurations which replaces the traditional XML configuration file to define, wire, and manage the beans. </w:t>
       </w:r>
       <w:r>
         <w:br/>
       </w:r>
       <w:r>
         <w:br/>
-      </w:r>
-      <w:proofErr w:type="gramStart"/>
-      <w:r>
-        <w:t>@Configuration</w:t>
-      </w:r>
-      <w:proofErr w:type="gramEnd"/>
-      <w:r>
-        <w:t>: annotation marks the class as a configuration class.</w:t>
+        <w:t>@Configuration: annotation marks the class as a configuration class.</w:t>
       </w:r>
     </w:p>
     <w:p>
@@ -2362,7 +1770,6 @@
     </w:p>
     <w:p/>
     <w:p>
-      <w:proofErr w:type="gramStart"/>
       <w:r>
         <w:rPr>
           <w:b/>
@@ -2371,19 +1778,7 @@
         <w:t>@Qualifie</w:t>
       </w:r>
       <w:r>
-        <w:t>r</w:t>
-      </w:r>
-      <w:proofErr w:type="gramEnd"/>
-      <w:r>
-        <w:t xml:space="preserve">: This annotation specifies which </w:t>
-      </w:r>
-      <w:proofErr w:type="gramStart"/>
-      <w:r>
-        <w:t>bean</w:t>
-      </w:r>
-      <w:proofErr w:type="gramEnd"/>
-      <w:r>
-        <w:t xml:space="preserve"> to inject when multiple beans exist in the configuration file.</w:t>
+        <w:t>r: This annotation specifies which bean to inject when multiple beans exist in the configuration file.</w:t>
       </w:r>
     </w:p>
     <w:p>
@@ -2393,717 +1788,410 @@
     </w:p>
     <w:p>
       <w:r>
-        <w:t xml:space="preserve">One interface, multiple implementation classes, </w:t>
-      </w:r>
-      <w:proofErr w:type="gramStart"/>
-      <w:r>
-        <w:t>need</w:t>
-      </w:r>
-      <w:proofErr w:type="gramEnd"/>
-      <w:r>
-        <w:t xml:space="preserve"> to specify in the controller while injecting.</w:t>
-      </w:r>
-    </w:p>
-    <w:p>
-      <w:r>
-        <w:t xml:space="preserve">Interface </w:t>
-      </w:r>
-      <w:proofErr w:type="spellStart"/>
-      <w:r>
-        <w:t>PaymentService</w:t>
-      </w:r>
-      <w:proofErr w:type="spellEnd"/>
-      <w:r>
-        <w:t xml:space="preserve">. Class </w:t>
-      </w:r>
-      <w:proofErr w:type="spellStart"/>
-      <w:r>
-        <w:t>CreditCard</w:t>
-      </w:r>
-      <w:proofErr w:type="spellEnd"/>
-      <w:r>
-        <w:t xml:space="preserve"> implements </w:t>
-      </w:r>
-      <w:proofErr w:type="spellStart"/>
-      <w:r>
-        <w:t>paymentService</w:t>
-      </w:r>
-      <w:proofErr w:type="spellEnd"/>
-      <w:r>
-        <w:t xml:space="preserve"> and Class UPI implements </w:t>
-      </w:r>
-      <w:proofErr w:type="spellStart"/>
-      <w:r>
-        <w:t>PaymentService</w:t>
-      </w:r>
-      <w:proofErr w:type="spellEnd"/>
-    </w:p>
-    <w:p>
-      <w:r>
-        <w:t xml:space="preserve">Both services have different controllers, so while injecting </w:t>
-      </w:r>
-      <w:proofErr w:type="spellStart"/>
-      <w:r>
-        <w:t>PaymentService</w:t>
-      </w:r>
-      <w:proofErr w:type="spellEnd"/>
-      <w:r>
-        <w:t>, we specify @</w:t>
-      </w:r>
-      <w:proofErr w:type="gramStart"/>
-      <w:r>
-        <w:t>Qualifer(</w:t>
-      </w:r>
-      <w:proofErr w:type="gramEnd"/>
-      <w:r>
-        <w:t>--name of service class–).</w:t>
+        <w:t>One interface, multiple implementation classes, need to specify in the controller while injecting.</w:t>
+      </w:r>
+    </w:p>
+    <w:p>
+      <w:r>
+        <w:t>Interface PaymentService. Class CreditCard implements paymentService and Class UPI implements PaymentService</w:t>
+      </w:r>
+    </w:p>
+    <w:p>
+      <w:r>
+        <w:t>Both services have different controllers, so while injecting PaymentService, we specify @Qualifer(--name of service class–).</w:t>
       </w:r>
     </w:p>
     <w:p/>
     <w:p>
-      <w:proofErr w:type="gramStart"/>
       <w:r>
         <w:rPr>
           <w:b/>
           <w:bCs/>
         </w:rPr>
-        <w:t>@Primary</w:t>
-      </w:r>
-      <w:proofErr w:type="gramEnd"/>
+        <w:t xml:space="preserve">@Primary: </w:t>
+      </w:r>
+      <w:r>
+        <w:t>Marks a bean as the default when multiple candidates exist. </w:t>
+      </w:r>
+    </w:p>
+    <w:p>
+      <w:r>
+        <w:t>We specify this annotation at the class level of service classes. So that class behaves as the primary class to inject.</w:t>
+      </w:r>
+    </w:p>
+    <w:p>
+      <w:r>
+        <w:br/>
+      </w:r>
+      <w:r>
+        <w:br/>
+      </w:r>
+      <w:r>
+        <w:br/>
+      </w:r>
+      <w:r>
+        <w:br/>
+      </w:r>
+      <w:r>
+        <w:br/>
+      </w:r>
+      <w:r>
+        <w:br/>
+      </w:r>
+      <w:r>
+        <w:br/>
+      </w:r>
+      <w:r>
+        <w:br/>
+      </w:r>
+      <w:r>
+        <w:br/>
+      </w:r>
+      <w:r>
+        <w:br/>
+      </w:r>
+      <w:r>
+        <w:br/>
+      </w:r>
+      <w:r>
+        <w:br/>
+      </w:r>
+      <w:r>
+        <w:br/>
+      </w:r>
+    </w:p>
+    <w:p>
+      <w:r>
+        <w:t>SpringBoot:</w:t>
+      </w:r>
+      <w:r>
+        <w:br/>
+      </w:r>
+      <w:r>
+        <w:br/>
+      </w:r>
+    </w:p>
+    <w:p>
+      <w:r>
+        <w:t>Springboot is an open-source, JAVA based framework used to create stand-alone, production-grade spring-based applications on top of spring framework.</w:t>
+      </w:r>
+    </w:p>
+    <w:p>
+      <w:r>
+        <w:t>Spring vs springboot</w:t>
+      </w:r>
+    </w:p>
+    <w:p>
+      <w:r>
+        <w:t>In spring lots of steps involved in setting up, configuration, writing boilerplate code, deployment of the app.</w:t>
+      </w:r>
+    </w:p>
+    <w:p>
+      <w:pPr>
+        <w:numPr>
+          <w:ilvl w:val="0"/>
+          <w:numId w:val="33"/>
+        </w:numPr>
+      </w:pPr>
+      <w:r>
+        <w:t>Manual XML or annotation based configuration</w:t>
+      </w:r>
+    </w:p>
+    <w:p>
+      <w:pPr>
+        <w:numPr>
+          <w:ilvl w:val="0"/>
+          <w:numId w:val="33"/>
+        </w:numPr>
+      </w:pPr>
+      <w:r>
+        <w:t>Manually manage dependencies</w:t>
+      </w:r>
+    </w:p>
+    <w:p>
+      <w:pPr>
+        <w:numPr>
+          <w:ilvl w:val="0"/>
+          <w:numId w:val="33"/>
+        </w:numPr>
+      </w:pPr>
+      <w:r>
+        <w:t>Manually configure server (tomcat, jetty etc…)</w:t>
+      </w:r>
+    </w:p>
+    <w:p>
+      <w:r>
+        <w:t>Spring boot is designed to reduce boilerplate code and setup complexity. It provides auto configuration, embedded local server and production-ready features.</w:t>
+      </w:r>
+    </w:p>
+    <w:p/>
+    <w:p>
+      <w:r>
+        <w:lastRenderedPageBreak/>
+        <w:t>Springboot = Spring framework + prebuilt-configuration + embedded server.</w:t>
+      </w:r>
+    </w:p>
+    <w:p/>
+    <w:p>
+      <w:r>
+        <w:t>Springboot components:</w:t>
+      </w:r>
+    </w:p>
+    <w:p>
+      <w:pPr>
+        <w:numPr>
+          <w:ilvl w:val="0"/>
+          <w:numId w:val="34"/>
+        </w:numPr>
+      </w:pPr>
+      <w:r>
+        <w:t>Springboot starters:</w:t>
+      </w:r>
+    </w:p>
+    <w:p>
+      <w:r>
+        <w:t>Springboot starters are collections of pre-built dependencies which will be helping in built web applications without manual configuration and version checking of each module.</w:t>
+      </w:r>
+    </w:p>
+    <w:p>
+      <w:r>
+        <w:t>These are in the form of maven/gradle dependencies.</w:t>
+      </w:r>
+    </w:p>
+    <w:p>
+      <w:r>
+        <w:t>Before starters, while building web applications, we manually add Spring MVC, tomcat server, jackson for JSON and other libraries and we take care of their versions too. If any version mismatches, we face errors.</w:t>
+      </w:r>
+    </w:p>
+    <w:p>
+      <w:r>
+        <w:t>Currently most used starter dependencies are</w:t>
+      </w:r>
+    </w:p>
+    <w:p>
+      <w:pPr>
+        <w:numPr>
+          <w:ilvl w:val="0"/>
+          <w:numId w:val="35"/>
+        </w:numPr>
+      </w:pPr>
+      <w:r>
+        <w:t>spring-boot-starter-web/spring-boot-starter-webmvc</w:t>
+      </w:r>
+    </w:p>
+    <w:p>
+      <w:r>
+        <w:t>This dependency includes Spring MVC, embedded tomcat server, Jackson for building RESTful web APIs</w:t>
+      </w:r>
+    </w:p>
+    <w:p>
+      <w:pPr>
+        <w:numPr>
+          <w:ilvl w:val="0"/>
+          <w:numId w:val="36"/>
+        </w:numPr>
+      </w:pPr>
+      <w:r>
+        <w:t>spring-boot-starter-data-jpa </w:t>
+      </w:r>
+    </w:p>
+    <w:p>
+      <w:r>
+        <w:t>This dependency includes Spring Data JPA, Hibernate, ORM etc..</w:t>
+      </w:r>
+    </w:p>
+    <w:p>
+      <w:pPr>
+        <w:numPr>
+          <w:ilvl w:val="0"/>
+          <w:numId w:val="37"/>
+        </w:numPr>
+      </w:pPr>
+      <w:r>
+        <w:t>spring-boot-starter-security </w:t>
+      </w:r>
+    </w:p>
+    <w:p>
+      <w:r>
+        <w:t>This dependency includes security/Auth implementations.</w:t>
+      </w:r>
+    </w:p>
+    <w:p>
+      <w:pPr>
+        <w:numPr>
+          <w:ilvl w:val="0"/>
+          <w:numId w:val="38"/>
+        </w:numPr>
+      </w:pPr>
+      <w:r>
+        <w:t>spring-boot-starter-validation</w:t>
+      </w:r>
+    </w:p>
+    <w:p>
+      <w:r>
+        <w:t>This dependency includes the Bean validation implementation</w:t>
+      </w:r>
+    </w:p>
+    <w:p/>
+    <w:p>
+      <w:r>
+        <w:t>2) Auto configuration - Springboot automatically configures the project based on dependencies that we added in the pom.xml configuration file. No need to configure manually.</w:t>
+      </w:r>
+    </w:p>
+    <w:p>
+      <w:r>
+        <w:t>3) Springboot Actuator: This feature helps in monitoring our application metrics.</w:t>
+      </w:r>
+    </w:p>
+    <w:p>
+      <w:r>
+        <w:t>4) Embedded server: Springboot provides an embedded server which is tomcat server. This server comes with springboot starter web dependency.</w:t>
+      </w:r>
+    </w:p>
+    <w:p>
+      <w:r>
+        <w:lastRenderedPageBreak/>
+        <w:t>5) Springboot devTools: This feature helps in enhancing productivity during application development. Auto application restarts/ auto re deployment.</w:t>
+      </w:r>
+    </w:p>
+    <w:p>
+      <w:r>
+        <w:t>Advantages:</w:t>
+      </w:r>
+    </w:p>
+    <w:p>
+      <w:pPr>
+        <w:numPr>
+          <w:ilvl w:val="0"/>
+          <w:numId w:val="39"/>
+        </w:numPr>
+      </w:pPr>
+      <w:r>
+        <w:t>Standalone and quick start</w:t>
+      </w:r>
+    </w:p>
+    <w:p>
+      <w:pPr>
+        <w:numPr>
+          <w:ilvl w:val="0"/>
+          <w:numId w:val="39"/>
+        </w:numPr>
+      </w:pPr>
+      <w:r>
+        <w:t>Starter code</w:t>
+      </w:r>
+    </w:p>
+    <w:p>
+      <w:pPr>
+        <w:numPr>
+          <w:ilvl w:val="0"/>
+          <w:numId w:val="39"/>
+        </w:numPr>
+      </w:pPr>
+      <w:r>
+        <w:t>Less configuration</w:t>
+      </w:r>
+    </w:p>
+    <w:p>
+      <w:pPr>
+        <w:numPr>
+          <w:ilvl w:val="0"/>
+          <w:numId w:val="39"/>
+        </w:numPr>
+      </w:pPr>
+      <w:r>
+        <w:t>Reduce cost and development time</w:t>
+      </w:r>
+    </w:p>
+    <w:p>
+      <w:r>
+        <w:t>Springboot Architecture: SB has a layered architecture. Where layers communicate and share data.</w:t>
+      </w:r>
+    </w:p>
+    <w:p>
+      <w:r>
+        <w:t>Auto configuration, embedded server, starter dependencies wrapped around the outside to remove boilerplate.</w:t>
+      </w:r>
+    </w:p>
+    <w:p>
+      <w:pPr>
+        <w:numPr>
+          <w:ilvl w:val="0"/>
+          <w:numId w:val="40"/>
+        </w:numPr>
+      </w:pPr>
+      <w:r>
+        <w:t>Presentation layer (REST endpoints)</w:t>
+      </w:r>
+    </w:p>
+    <w:p>
+      <w:pPr>
+        <w:numPr>
+          <w:ilvl w:val="0"/>
+          <w:numId w:val="40"/>
+        </w:numPr>
+      </w:pPr>
+      <w:r>
+        <w:t>Service layer (Business logic)</w:t>
+      </w:r>
+    </w:p>
+    <w:p>
+      <w:pPr>
+        <w:numPr>
+          <w:ilvl w:val="0"/>
+          <w:numId w:val="40"/>
+        </w:numPr>
+      </w:pPr>
+      <w:r>
+        <w:t>Data layer (Data access)</w:t>
+      </w:r>
+    </w:p>
+    <w:p>
+      <w:r>
+        <w:t>Presentation layer: Presentation layer presents the data on the application features to the user this is the layer where in all the controller classes exist.</w:t>
+      </w:r>
+    </w:p>
+    <w:p>
+      <w:r>
+        <w:t>Service layer: Service layer is where business logic resides in the application. Tasks such as evaluations, decision making, processing of data is done in this layer.</w:t>
+      </w:r>
+    </w:p>
+    <w:p>
+      <w:r>
+        <w:t>Data Access layer: Data access layer is the layer where all the repository classes exist. Database related logic.</w:t>
+      </w:r>
+    </w:p>
+    <w:p>
+      <w:r>
+        <w:t>Client (Browser) -&gt; Controller -&gt; Service -&gt; Repository -&gt; Database</w:t>
+      </w:r>
+    </w:p>
+    <w:p>
+      <w:r>
+        <w:t>Pom.xml: Project Object model</w:t>
+      </w:r>
+    </w:p>
+    <w:p>
+      <w:r>
+        <w:t>The Project Object Model file serves as a configuration XML. It provides essential metadata and build instructions that Maven utilizes to manage the application development lifecycle.</w:t>
+      </w:r>
+    </w:p>
+    <w:p/>
+    <w:p>
       <w:r>
         <w:rPr>
           <w:b/>
           <w:bCs/>
         </w:rPr>
-        <w:t xml:space="preserve">: </w:t>
-      </w:r>
-      <w:r>
-        <w:t>Marks a bean as the default when multiple candidates exist. </w:t>
-      </w:r>
-    </w:p>
-    <w:p>
-      <w:r>
-        <w:t>We specify this annotation at the class level of service classes. So that class behaves as the primary class to inject.</w:t>
-      </w:r>
-    </w:p>
-    <w:p>
-      <w:r>
-        <w:br/>
-      </w:r>
-      <w:r>
-        <w:br/>
-      </w:r>
-      <w:r>
-        <w:br/>
-      </w:r>
-      <w:r>
-        <w:br/>
-      </w:r>
-      <w:r>
-        <w:br/>
-      </w:r>
-      <w:r>
-        <w:br/>
-      </w:r>
-      <w:r>
-        <w:br/>
-      </w:r>
-      <w:r>
-        <w:br/>
-      </w:r>
-      <w:r>
-        <w:br/>
-      </w:r>
-      <w:r>
-        <w:br/>
-      </w:r>
-      <w:r>
-        <w:br/>
-      </w:r>
-      <w:r>
-        <w:br/>
-      </w:r>
-      <w:r>
-        <w:br/>
-      </w:r>
-    </w:p>
-    <w:p>
-      <w:proofErr w:type="spellStart"/>
-      <w:r>
-        <w:t>SpringBoot</w:t>
-      </w:r>
-      <w:proofErr w:type="spellEnd"/>
-      <w:r>
-        <w:t>:</w:t>
-      </w:r>
-      <w:r>
-        <w:br/>
-      </w:r>
-      <w:r>
-        <w:br/>
-      </w:r>
-    </w:p>
-    <w:p>
-      <w:proofErr w:type="spellStart"/>
-      <w:r>
-        <w:t>Springboot</w:t>
-      </w:r>
-      <w:proofErr w:type="spellEnd"/>
-      <w:r>
-        <w:t xml:space="preserve"> is an open-source, JAVA based framework used to create stand-alone, production-grade spring-based applications on top of spring framework.</w:t>
-      </w:r>
-    </w:p>
-    <w:p>
-      <w:r>
-        <w:t xml:space="preserve">Spring vs </w:t>
-      </w:r>
-      <w:proofErr w:type="spellStart"/>
-      <w:r>
-        <w:t>springboot</w:t>
-      </w:r>
-      <w:proofErr w:type="spellEnd"/>
-    </w:p>
-    <w:p>
-      <w:r>
-        <w:t>In spring lots of steps involved in setting up, configuration, writing boilerplate code, deployment of the app.</w:t>
-      </w:r>
-    </w:p>
-    <w:p>
-      <w:pPr>
-        <w:numPr>
-          <w:ilvl w:val="0"/>
-          <w:numId w:val="33"/>
-        </w:numPr>
-      </w:pPr>
-      <w:r>
-        <w:t xml:space="preserve">Manual XML or </w:t>
-      </w:r>
-      <w:proofErr w:type="gramStart"/>
-      <w:r>
-        <w:t>annotation based</w:t>
-      </w:r>
-      <w:proofErr w:type="gramEnd"/>
-      <w:r>
-        <w:t xml:space="preserve"> configuration</w:t>
-      </w:r>
-    </w:p>
-    <w:p>
-      <w:pPr>
-        <w:numPr>
-          <w:ilvl w:val="0"/>
-          <w:numId w:val="33"/>
-        </w:numPr>
-      </w:pPr>
-      <w:r>
-        <w:t>Manually manage dependencies</w:t>
-      </w:r>
-    </w:p>
-    <w:p>
-      <w:pPr>
-        <w:numPr>
-          <w:ilvl w:val="0"/>
-          <w:numId w:val="33"/>
-        </w:numPr>
-      </w:pPr>
-      <w:r>
-        <w:t xml:space="preserve">Manually configure server (tomcat, jetty </w:t>
-      </w:r>
-      <w:proofErr w:type="spellStart"/>
-      <w:r>
-        <w:t>etc</w:t>
-      </w:r>
-      <w:proofErr w:type="spellEnd"/>
-      <w:r>
-        <w:t>…)</w:t>
-      </w:r>
-    </w:p>
-    <w:p>
-      <w:r>
-        <w:t xml:space="preserve">Spring boot is designed to reduce boilerplate code and setup complexity. It provides auto </w:t>
-      </w:r>
-      <w:proofErr w:type="gramStart"/>
-      <w:r>
-        <w:t>configuration</w:t>
-      </w:r>
-      <w:proofErr w:type="gramEnd"/>
-      <w:r>
-        <w:t xml:space="preserve">, embedded local </w:t>
-      </w:r>
-      <w:proofErr w:type="gramStart"/>
-      <w:r>
-        <w:t>server</w:t>
-      </w:r>
-      <w:proofErr w:type="gramEnd"/>
-      <w:r>
-        <w:t xml:space="preserve"> and production-ready features.</w:t>
-      </w:r>
-    </w:p>
-    <w:p/>
-    <w:p>
-      <w:proofErr w:type="spellStart"/>
-      <w:r>
-        <w:lastRenderedPageBreak/>
-        <w:t>Springboot</w:t>
-      </w:r>
-      <w:proofErr w:type="spellEnd"/>
-      <w:r>
-        <w:t xml:space="preserve"> = Spring framework + </w:t>
-      </w:r>
-      <w:proofErr w:type="gramStart"/>
-      <w:r>
-        <w:t>prebuilt-configuration</w:t>
-      </w:r>
-      <w:proofErr w:type="gramEnd"/>
-      <w:r>
-        <w:t xml:space="preserve"> + embedded server.</w:t>
-      </w:r>
-    </w:p>
-    <w:p/>
-    <w:p>
-      <w:proofErr w:type="spellStart"/>
-      <w:r>
-        <w:t>Springboot</w:t>
-      </w:r>
-      <w:proofErr w:type="spellEnd"/>
-      <w:r>
-        <w:t xml:space="preserve"> components:</w:t>
-      </w:r>
-    </w:p>
-    <w:p>
-      <w:pPr>
-        <w:numPr>
-          <w:ilvl w:val="0"/>
-          <w:numId w:val="34"/>
-        </w:numPr>
-      </w:pPr>
-      <w:proofErr w:type="spellStart"/>
-      <w:proofErr w:type="gramStart"/>
-      <w:r>
-        <w:t>Springboot</w:t>
-      </w:r>
-      <w:proofErr w:type="spellEnd"/>
-      <w:proofErr w:type="gramEnd"/>
-      <w:r>
-        <w:t xml:space="preserve"> starters:</w:t>
-      </w:r>
-    </w:p>
-    <w:p>
-      <w:proofErr w:type="spellStart"/>
-      <w:r>
-        <w:t>Springboot</w:t>
-      </w:r>
-      <w:proofErr w:type="spellEnd"/>
-      <w:r>
-        <w:t xml:space="preserve"> starters are collections of pre-built dependencies which will </w:t>
-      </w:r>
-      <w:proofErr w:type="gramStart"/>
-      <w:r>
-        <w:t>be helping</w:t>
-      </w:r>
-      <w:proofErr w:type="gramEnd"/>
-      <w:r>
-        <w:t xml:space="preserve"> in </w:t>
-      </w:r>
-      <w:proofErr w:type="gramStart"/>
-      <w:r>
-        <w:t>built</w:t>
-      </w:r>
-      <w:proofErr w:type="gramEnd"/>
-      <w:r>
-        <w:t xml:space="preserve"> web applications without manual configuration and version checking of each module.</w:t>
-      </w:r>
-    </w:p>
-    <w:p>
-      <w:r>
-        <w:t>These are in the form of maven/</w:t>
-      </w:r>
-      <w:proofErr w:type="spellStart"/>
-      <w:r>
-        <w:t>gradle</w:t>
-      </w:r>
-      <w:proofErr w:type="spellEnd"/>
-      <w:r>
-        <w:t xml:space="preserve"> dependencies.</w:t>
-      </w:r>
-    </w:p>
-    <w:p>
-      <w:r>
-        <w:t xml:space="preserve">Before starters, while building web applications, we manually add Spring MVC, tomcat server, </w:t>
-      </w:r>
-      <w:proofErr w:type="spellStart"/>
-      <w:r>
-        <w:t>jackson</w:t>
-      </w:r>
-      <w:proofErr w:type="spellEnd"/>
-      <w:r>
-        <w:t xml:space="preserve"> for JSON and other libraries and we take care of their versions too. If any version mismatches, we face errors.</w:t>
-      </w:r>
-    </w:p>
-    <w:p>
-      <w:r>
-        <w:t>Currently most used starter dependencies are</w:t>
-      </w:r>
-    </w:p>
-    <w:p>
-      <w:pPr>
-        <w:numPr>
-          <w:ilvl w:val="0"/>
-          <w:numId w:val="35"/>
-        </w:numPr>
-      </w:pPr>
-      <w:r>
-        <w:t>spring-boot-starter-web/spring-boot-starter-</w:t>
-      </w:r>
-      <w:proofErr w:type="spellStart"/>
-      <w:r>
-        <w:t>webmvc</w:t>
-      </w:r>
-      <w:proofErr w:type="spellEnd"/>
-    </w:p>
-    <w:p>
-      <w:r>
-        <w:t>This dependency includes Spring MVC, embedded tomcat server, Jackson for building RESTful web APIs</w:t>
-      </w:r>
-    </w:p>
-    <w:p>
-      <w:pPr>
-        <w:numPr>
-          <w:ilvl w:val="0"/>
-          <w:numId w:val="36"/>
-        </w:numPr>
-      </w:pPr>
-      <w:r>
-        <w:t>spring-boot-starter-data-</w:t>
-      </w:r>
-      <w:proofErr w:type="spellStart"/>
-      <w:r>
-        <w:t>jpa</w:t>
-      </w:r>
-      <w:proofErr w:type="spellEnd"/>
-      <w:r>
-        <w:t> </w:t>
-      </w:r>
-    </w:p>
-    <w:p>
-      <w:r>
-        <w:t xml:space="preserve">This dependency includes Spring Data JPA, Hibernate, ORM </w:t>
-      </w:r>
-      <w:proofErr w:type="gramStart"/>
-      <w:r>
-        <w:t>etc..</w:t>
-      </w:r>
-      <w:proofErr w:type="gramEnd"/>
-    </w:p>
-    <w:p>
-      <w:pPr>
-        <w:numPr>
-          <w:ilvl w:val="0"/>
-          <w:numId w:val="37"/>
-        </w:numPr>
-      </w:pPr>
-      <w:r>
-        <w:t>spring-boot-starter-security </w:t>
-      </w:r>
-    </w:p>
-    <w:p>
-      <w:r>
-        <w:t>This dependency includes security/Auth implementations.</w:t>
-      </w:r>
-    </w:p>
-    <w:p>
-      <w:pPr>
-        <w:numPr>
-          <w:ilvl w:val="0"/>
-          <w:numId w:val="38"/>
-        </w:numPr>
-      </w:pPr>
-      <w:r>
-        <w:t>spring-boot-starter-validation</w:t>
-      </w:r>
-    </w:p>
-    <w:p>
-      <w:r>
-        <w:t>This dependency includes the Bean validation implementation</w:t>
-      </w:r>
-    </w:p>
-    <w:p/>
-    <w:p>
-      <w:r>
-        <w:t xml:space="preserve">2) Auto configuration - </w:t>
-      </w:r>
-      <w:proofErr w:type="spellStart"/>
-      <w:r>
-        <w:t>Springboot</w:t>
-      </w:r>
-      <w:proofErr w:type="spellEnd"/>
-      <w:r>
-        <w:t xml:space="preserve"> automatically configures the project based on dependencies that we added in the pom.xml configuration file. No need to configure manually.</w:t>
-      </w:r>
-    </w:p>
-    <w:p>
-      <w:r>
-        <w:t xml:space="preserve">3) </w:t>
-      </w:r>
-      <w:proofErr w:type="spellStart"/>
-      <w:r>
-        <w:t>Springboot</w:t>
-      </w:r>
-      <w:proofErr w:type="spellEnd"/>
-      <w:r>
-        <w:t xml:space="preserve"> Actuator: This feature helps in monitoring our application metrics.</w:t>
-      </w:r>
-    </w:p>
-    <w:p>
-      <w:r>
-        <w:t xml:space="preserve">4) Embedded server: </w:t>
-      </w:r>
-      <w:proofErr w:type="spellStart"/>
-      <w:r>
-        <w:t>Springboot</w:t>
-      </w:r>
-      <w:proofErr w:type="spellEnd"/>
-      <w:r>
-        <w:t xml:space="preserve"> provides an embedded server which is tomcat server. This server comes with </w:t>
-      </w:r>
-      <w:proofErr w:type="spellStart"/>
-      <w:r>
-        <w:t>springboot</w:t>
-      </w:r>
-      <w:proofErr w:type="spellEnd"/>
-      <w:r>
-        <w:t xml:space="preserve"> starter web dependency.</w:t>
-      </w:r>
-    </w:p>
-    <w:p>
-      <w:r>
-        <w:lastRenderedPageBreak/>
-        <w:t xml:space="preserve">5) </w:t>
-      </w:r>
-      <w:proofErr w:type="spellStart"/>
-      <w:r>
-        <w:t>Springboot</w:t>
-      </w:r>
-      <w:proofErr w:type="spellEnd"/>
-      <w:r>
-        <w:t xml:space="preserve"> </w:t>
-      </w:r>
-      <w:proofErr w:type="spellStart"/>
-      <w:r>
-        <w:t>devTools</w:t>
-      </w:r>
-      <w:proofErr w:type="spellEnd"/>
-      <w:r>
-        <w:t>: This feature helps in enhancing productivity during application development. Auto application restarts/ auto re deployment.</w:t>
-      </w:r>
-    </w:p>
-    <w:p>
-      <w:r>
-        <w:t>Advantages:</w:t>
-      </w:r>
-    </w:p>
-    <w:p>
-      <w:pPr>
-        <w:numPr>
-          <w:ilvl w:val="0"/>
-          <w:numId w:val="39"/>
-        </w:numPr>
-      </w:pPr>
-      <w:r>
-        <w:t>Standalone and quick start</w:t>
-      </w:r>
-    </w:p>
-    <w:p>
-      <w:pPr>
-        <w:numPr>
-          <w:ilvl w:val="0"/>
-          <w:numId w:val="39"/>
-        </w:numPr>
-      </w:pPr>
-      <w:r>
-        <w:t>Starter code</w:t>
-      </w:r>
-    </w:p>
-    <w:p>
-      <w:pPr>
-        <w:numPr>
-          <w:ilvl w:val="0"/>
-          <w:numId w:val="39"/>
-        </w:numPr>
-      </w:pPr>
-      <w:r>
-        <w:t>Less configuration</w:t>
-      </w:r>
-    </w:p>
-    <w:p>
-      <w:pPr>
-        <w:numPr>
-          <w:ilvl w:val="0"/>
-          <w:numId w:val="39"/>
-        </w:numPr>
-      </w:pPr>
-      <w:r>
-        <w:t>Reduce cost and development time</w:t>
-      </w:r>
-    </w:p>
-    <w:p>
-      <w:proofErr w:type="spellStart"/>
-      <w:r>
-        <w:t>Springboot</w:t>
-      </w:r>
-      <w:proofErr w:type="spellEnd"/>
-      <w:r>
-        <w:t xml:space="preserve"> Architecture: SB has </w:t>
-      </w:r>
-      <w:proofErr w:type="gramStart"/>
-      <w:r>
-        <w:t>a layered</w:t>
-      </w:r>
-      <w:proofErr w:type="gramEnd"/>
-      <w:r>
-        <w:t xml:space="preserve"> architecture. Where layers communicate and share data.</w:t>
-      </w:r>
-    </w:p>
-    <w:p>
-      <w:r>
-        <w:t>Auto configuration, embedded server, starter dependencies wrapped around the outside to remove boilerplate.</w:t>
-      </w:r>
-    </w:p>
-    <w:p>
-      <w:pPr>
-        <w:numPr>
-          <w:ilvl w:val="0"/>
-          <w:numId w:val="40"/>
-        </w:numPr>
-      </w:pPr>
-      <w:r>
-        <w:t>Presentation layer (REST endpoints)</w:t>
-      </w:r>
-    </w:p>
-    <w:p>
-      <w:pPr>
-        <w:numPr>
-          <w:ilvl w:val="0"/>
-          <w:numId w:val="40"/>
-        </w:numPr>
-      </w:pPr>
-      <w:r>
-        <w:t>Service layer (Business logic)</w:t>
-      </w:r>
-    </w:p>
-    <w:p>
-      <w:pPr>
-        <w:numPr>
-          <w:ilvl w:val="0"/>
-          <w:numId w:val="40"/>
-        </w:numPr>
-      </w:pPr>
-      <w:r>
-        <w:t>Data layer (Data access)</w:t>
-      </w:r>
-    </w:p>
-    <w:p>
-      <w:r>
-        <w:t>Presentation layer: Presentation layer presents the data on the application features to the user this is the layer where in all the controller classes exist.</w:t>
-      </w:r>
-    </w:p>
-    <w:p>
-      <w:r>
-        <w:t>Service layer: Service layer is where business logic resides in the application. Tasks such as evaluations, decision making</w:t>
-      </w:r>
-      <w:proofErr w:type="gramStart"/>
-      <w:r>
-        <w:t>, processing</w:t>
-      </w:r>
-      <w:proofErr w:type="gramEnd"/>
-      <w:r>
-        <w:t xml:space="preserve"> of data </w:t>
-      </w:r>
-      <w:proofErr w:type="gramStart"/>
-      <w:r>
-        <w:t>is</w:t>
-      </w:r>
-      <w:proofErr w:type="gramEnd"/>
-      <w:r>
-        <w:t xml:space="preserve"> done in this layer.</w:t>
-      </w:r>
-    </w:p>
-    <w:p>
-      <w:r>
-        <w:t>Data Access layer: Data access layer is the layer where all the repository classes exist. Database related logic.</w:t>
-      </w:r>
-    </w:p>
-    <w:p>
-      <w:r>
-        <w:t>Client (Browser) -&gt; Controller -&gt; Service -&gt; Repository -&gt; Database</w:t>
-      </w:r>
-    </w:p>
-    <w:p>
-      <w:r>
-        <w:t>Pom.xml: Project Object model</w:t>
-      </w:r>
-    </w:p>
-    <w:p>
-      <w:r>
-        <w:t xml:space="preserve">The Project Object Model file serves as a configuration XML. It provides essential metadata and </w:t>
-      </w:r>
-      <w:proofErr w:type="gramStart"/>
-      <w:r>
-        <w:t>build</w:t>
-      </w:r>
-      <w:proofErr w:type="gramEnd"/>
-      <w:r>
-        <w:t xml:space="preserve"> instructions that Maven utilizes to manage the application development lifecycle.</w:t>
-      </w:r>
-    </w:p>
-    <w:p/>
-    <w:p>
-      <w:proofErr w:type="gramStart"/>
-      <w:r>
-        <w:rPr>
-          <w:b/>
-          <w:bCs/>
-        </w:rPr>
-        <w:t>@SpringBootApplication</w:t>
-      </w:r>
-      <w:proofErr w:type="gramEnd"/>
-      <w:r>
-        <w:rPr>
-          <w:b/>
-          <w:bCs/>
-        </w:rPr>
-        <w:t>:</w:t>
-      </w:r>
-      <w:r>
-        <w:t xml:space="preserve"> This annotation specifies this project as a </w:t>
-      </w:r>
-      <w:proofErr w:type="spellStart"/>
-      <w:r>
-        <w:t>springboot</w:t>
-      </w:r>
-      <w:proofErr w:type="spellEnd"/>
-      <w:r>
-        <w:t xml:space="preserve"> application.</w:t>
-      </w:r>
-    </w:p>
-    <w:p>
-      <w:r>
-        <w:t xml:space="preserve">This annotation provides </w:t>
-      </w:r>
-      <w:proofErr w:type="spellStart"/>
-      <w:r>
-        <w:t>Springboot</w:t>
-      </w:r>
-      <w:proofErr w:type="spellEnd"/>
-      <w:r>
-        <w:t xml:space="preserve"> configuration, Auto configuration and </w:t>
-      </w:r>
-      <w:proofErr w:type="spellStart"/>
-      <w:r>
-        <w:t>componentScan</w:t>
-      </w:r>
-      <w:proofErr w:type="spellEnd"/>
-      <w:r>
-        <w:t>.</w:t>
+        <w:t>@SpringBootApplication:</w:t>
+      </w:r>
+      <w:r>
+        <w:t xml:space="preserve"> This annotation specifies this project as a springboot application.</w:t>
+      </w:r>
+    </w:p>
+    <w:p>
+      <w:r>
+        <w:t>This annotation provides Springboot configuration, Auto configuration and componentScan.</w:t>
       </w:r>
     </w:p>
     <w:p>
@@ -3113,31 +2201,13 @@
       </w:r>
     </w:p>
     <w:p>
-      <w:proofErr w:type="gramStart"/>
-      <w:r>
-        <w:t>Dependencies are</w:t>
-      </w:r>
-      <w:proofErr w:type="gramEnd"/>
-      <w:r>
-        <w:t xml:space="preserve"> external libraries which are required to make our web application functional.</w:t>
-      </w:r>
-    </w:p>
-    <w:p>
-      <w:proofErr w:type="spellStart"/>
-      <w:r>
-        <w:t>Springboot</w:t>
-      </w:r>
-      <w:proofErr w:type="spellEnd"/>
-      <w:r>
-        <w:t xml:space="preserve"> uses maven, </w:t>
-      </w:r>
-      <w:proofErr w:type="spellStart"/>
-      <w:r>
-        <w:t>gradle</w:t>
-      </w:r>
-      <w:proofErr w:type="spellEnd"/>
-      <w:r>
-        <w:t xml:space="preserve"> build tools to manage these dependencies.</w:t>
+      <w:r>
+        <w:t>Dependencies are external libraries which are required to make our web application functional.</w:t>
+      </w:r>
+    </w:p>
+    <w:p>
+      <w:r>
+        <w:t>Springboot uses maven, gradle build tools to manage these dependencies.</w:t>
       </w:r>
     </w:p>
     <w:p>
@@ -3147,77 +2217,28 @@
     </w:p>
     <w:p/>
     <w:p>
-      <w:proofErr w:type="spellStart"/>
-      <w:proofErr w:type="gramStart"/>
-      <w:r>
-        <w:t>Lets</w:t>
-      </w:r>
-      <w:proofErr w:type="spellEnd"/>
-      <w:proofErr w:type="gramEnd"/>
-      <w:r>
-        <w:t xml:space="preserve"> build our first RESTful API, </w:t>
-      </w:r>
-      <w:proofErr w:type="gramStart"/>
-      <w:r>
-        <w:t>for that</w:t>
-      </w:r>
-      <w:proofErr w:type="gramEnd"/>
-      <w:r>
-        <w:t xml:space="preserve"> we need a presentation layer which means, controller class is needed to manage REST endpoints.</w:t>
-      </w:r>
-    </w:p>
-    <w:p>
-      <w:proofErr w:type="gramStart"/>
-      <w:r>
-        <w:t>@Controller</w:t>
-      </w:r>
-      <w:proofErr w:type="gramEnd"/>
-      <w:r>
-        <w:t>: this annotation specifies the class as a controller class which manages the web requests and responses.</w:t>
-      </w:r>
-    </w:p>
-    <w:p>
-      <w:proofErr w:type="spellStart"/>
-      <w:r>
-        <w:t>DispatcherServlet</w:t>
-      </w:r>
-      <w:proofErr w:type="spellEnd"/>
-      <w:r>
-        <w:t>:</w:t>
+      <w:r>
+        <w:t>Lets build our first RESTful API, for that we need a presentation layer which means, controller class is needed to manage REST endpoints.</w:t>
+      </w:r>
+    </w:p>
+    <w:p>
+      <w:r>
+        <w:t>@Controller: this annotation specifies the class as a controller class which manages the web requests and responses.</w:t>
+      </w:r>
+    </w:p>
+    <w:p>
+      <w:r>
+        <w:t>DispatcherServlet:</w:t>
       </w:r>
       <w:r>
         <w:br/>
-        <w:t xml:space="preserve">The </w:t>
-      </w:r>
-      <w:proofErr w:type="spellStart"/>
-      <w:r>
-        <w:t>DispatcherServlet</w:t>
-      </w:r>
-      <w:proofErr w:type="spellEnd"/>
-      <w:r>
-        <w:t xml:space="preserve"> is the front controller in Spring MVC. A </w:t>
-      </w:r>
-      <w:proofErr w:type="gramStart"/>
-      <w:r>
-        <w:t>single entry</w:t>
-      </w:r>
-      <w:proofErr w:type="gramEnd"/>
-      <w:r>
-        <w:t xml:space="preserve"> point that receives every incoming HTTP request and routes it to the right handler (controller). Instead of each URL mapping to a separate servlet, all requests go through this one servlet, which then delegates the actual work.</w:t>
+        <w:t>The DispatcherServlet is the front controller in Spring MVC. A single entry point that receives every incoming HTTP request and routes it to the right handler (controller). Instead of each URL mapping to a separate servlet, all requests go through this one servlet, which then delegates the actual work.</w:t>
       </w:r>
     </w:p>
     <w:p/>
     <w:p>
       <w:r>
-        <w:t xml:space="preserve">When a request comes in, </w:t>
-      </w:r>
-      <w:proofErr w:type="spellStart"/>
-      <w:r>
-        <w:t>DispatcherServlet</w:t>
-      </w:r>
-      <w:proofErr w:type="spellEnd"/>
-      <w:r>
-        <w:t xml:space="preserve"> coordinates several components in sequence:</w:t>
+        <w:t>When a request comes in, DispatcherServlet coordinates several components in sequence:</w:t>
       </w:r>
     </w:p>
     <w:p>
@@ -3227,21 +2248,8 @@
           <w:numId w:val="41"/>
         </w:numPr>
       </w:pPr>
-      <w:proofErr w:type="spellStart"/>
-      <w:r>
-        <w:t>HandlerMapping</w:t>
-      </w:r>
-      <w:proofErr w:type="spellEnd"/>
-      <w:r>
-        <w:t xml:space="preserve"> — figures out which controller method should handle this URL (based </w:t>
-      </w:r>
-      <w:proofErr w:type="gramStart"/>
-      <w:r>
-        <w:t>on @RequestMapping, @</w:t>
-      </w:r>
-      <w:proofErr w:type="gramEnd"/>
-      <w:r>
-        <w:t>GetMapping, etc.)</w:t>
+      <w:r>
+        <w:t>HandlerMapping — figures out which controller method should handle this URL (based on @RequestMapping, @GetMapping, etc.)</w:t>
       </w:r>
     </w:p>
     <w:p>
@@ -3251,21 +2259,8 @@
           <w:numId w:val="41"/>
         </w:numPr>
       </w:pPr>
-      <w:proofErr w:type="spellStart"/>
-      <w:r>
-        <w:t>HandlerAdapter</w:t>
-      </w:r>
-      <w:proofErr w:type="spellEnd"/>
-      <w:r>
-        <w:t xml:space="preserve"> — </w:t>
-      </w:r>
-      <w:proofErr w:type="gramStart"/>
-      <w:r>
-        <w:t>actually invokes</w:t>
-      </w:r>
-      <w:proofErr w:type="gramEnd"/>
-      <w:r>
-        <w:t xml:space="preserve"> that controller method</w:t>
+      <w:r>
+        <w:t>HandlerAdapter — actually invokes that controller method</w:t>
       </w:r>
     </w:p>
     <w:p>
@@ -3276,121 +2271,41 @@
         </w:numPr>
       </w:pPr>
       <w:r>
-        <w:t xml:space="preserve">Controller — executes business logic, returns a </w:t>
-      </w:r>
-      <w:proofErr w:type="spellStart"/>
-      <w:r>
-        <w:t>ModelAndView</w:t>
-      </w:r>
-      <w:proofErr w:type="spellEnd"/>
-      <w:r>
-        <w:t xml:space="preserve"> (or in REST APIs, the response body directly </w:t>
-      </w:r>
-      <w:proofErr w:type="gramStart"/>
-      <w:r>
-        <w:t>via @ResponseBody/@</w:t>
-      </w:r>
-      <w:proofErr w:type="gramEnd"/>
-      <w:r>
-        <w:t>RestController)</w:t>
+        <w:t>Controller — executes business logic, returns a ModelAndView (or in REST APIs, the response body directly via @ResponseBody/@RestController)</w:t>
       </w:r>
     </w:p>
     <w:p/>
     <w:p>
-      <w:proofErr w:type="spellStart"/>
-      <w:r>
-        <w:t>Application.properties</w:t>
-      </w:r>
-      <w:proofErr w:type="spellEnd"/>
-      <w:r>
-        <w:t>:</w:t>
-      </w:r>
-    </w:p>
-    <w:p>
-      <w:r>
-        <w:t xml:space="preserve">The </w:t>
-      </w:r>
-      <w:proofErr w:type="spellStart"/>
-      <w:proofErr w:type="gramStart"/>
-      <w:r>
-        <w:t>application.properties</w:t>
-      </w:r>
-      <w:proofErr w:type="spellEnd"/>
-      <w:proofErr w:type="gramEnd"/>
-      <w:r>
-        <w:t xml:space="preserve"> is a file we use to customize the pre-configurations of component logics in </w:t>
-      </w:r>
-      <w:proofErr w:type="spellStart"/>
-      <w:r>
-        <w:t>springboot</w:t>
-      </w:r>
-      <w:proofErr w:type="spellEnd"/>
-      <w:r>
-        <w:t>.</w:t>
+      <w:r>
+        <w:t>Application.properties:</w:t>
+      </w:r>
+    </w:p>
+    <w:p>
+      <w:r>
+        <w:t>The application.properties is a file we use to customize the pre-configurations of component logics in springboot.</w:t>
       </w:r>
     </w:p>
     <w:p/>
     <w:p>
-      <w:proofErr w:type="gramStart"/>
-      <w:r>
-        <w:t>@PathVariable</w:t>
-      </w:r>
-      <w:proofErr w:type="gramEnd"/>
-      <w:r>
-        <w:t>: </w:t>
-      </w:r>
-    </w:p>
-    <w:p>
-      <w:proofErr w:type="gramStart"/>
+      <w:r>
+        <w:t>@PathVariable: </w:t>
+      </w:r>
+    </w:p>
+    <w:p>
       <w:r>
         <w:lastRenderedPageBreak/>
-        <w:t>@PathVariable</w:t>
-      </w:r>
-      <w:proofErr w:type="gramEnd"/>
-      <w:r>
-        <w:t xml:space="preserve"> annotation is used to extract dynamic values from the URL path and bind them to method parameters in the Rest controllers.</w:t>
-      </w:r>
-    </w:p>
-    <w:p>
-      <w:proofErr w:type="gramStart"/>
-      <w:r>
-        <w:t>@GetMapping</w:t>
-      </w:r>
-      <w:proofErr w:type="gramEnd"/>
-      <w:r>
-        <w:t>("/</w:t>
-      </w:r>
-      <w:proofErr w:type="gramStart"/>
-      <w:r>
-        <w:t>users/{id}"</w:t>
-      </w:r>
-      <w:proofErr w:type="gramEnd"/>
-      <w:r>
-        <w:t>)</w:t>
-      </w:r>
-    </w:p>
-    <w:p>
-      <w:r>
-        <w:t xml:space="preserve">public String </w:t>
-      </w:r>
-      <w:proofErr w:type="spellStart"/>
-      <w:proofErr w:type="gramStart"/>
-      <w:r>
-        <w:t>getUserById</w:t>
-      </w:r>
-      <w:proofErr w:type="spellEnd"/>
-      <w:r>
-        <w:t>(</w:t>
-      </w:r>
-      <w:proofErr w:type="gramEnd"/>
-      <w:r>
-        <w:t xml:space="preserve">@PathVariable int </w:t>
-      </w:r>
-      <w:proofErr w:type="gramStart"/>
-      <w:r>
-        <w:t>id) {</w:t>
-      </w:r>
-      <w:proofErr w:type="gramEnd"/>
+        <w:t>@PathVariable annotation is used to extract dynamic values from the URL path and bind them to method parameters in the Rest controllers.</w:t>
+      </w:r>
+    </w:p>
+    <w:p>
+      <w:r>
+        <w:t>@GetMapping("/users/{id}")</w:t>
+      </w:r>
+    </w:p>
+    <w:p>
+      <w:r>
+        <w:t>public String getUserById(@PathVariable int id) {</w:t>
+      </w:r>
     </w:p>
     <w:p>
       <w:r>
@@ -3426,15 +2341,7 @@
         </w:numPr>
       </w:pPr>
       <w:r>
-        <w:t xml:space="preserve">We can explicitly </w:t>
-      </w:r>
-      <w:proofErr w:type="gramStart"/>
-      <w:r>
-        <w:t>mention in</w:t>
-      </w:r>
-      <w:proofErr w:type="gramEnd"/>
-      <w:r>
-        <w:t xml:space="preserve"> the variable name of annotation in the method parameter.</w:t>
+        <w:t>We can explicitly mention in the variable name of annotation in the method parameter.</w:t>
       </w:r>
     </w:p>
     <w:p>
@@ -3443,57 +2350,18 @@
       </w:r>
     </w:p>
     <w:p>
-      <w:proofErr w:type="gramStart"/>
-      <w:r>
-        <w:t>@GetMapping</w:t>
-      </w:r>
-      <w:proofErr w:type="gramEnd"/>
-      <w:r>
-        <w:t>("/</w:t>
-      </w:r>
-      <w:proofErr w:type="gramStart"/>
-      <w:r>
-        <w:t>books/{isbn}"</w:t>
-      </w:r>
-      <w:proofErr w:type="gramEnd"/>
-      <w:r>
-        <w:t>)</w:t>
-      </w:r>
-    </w:p>
-    <w:p>
-      <w:r>
-        <w:t xml:space="preserve">public String </w:t>
-      </w:r>
-      <w:proofErr w:type="spellStart"/>
-      <w:r>
-        <w:t>getBook</w:t>
-      </w:r>
-      <w:proofErr w:type="spellEnd"/>
-      <w:r>
-        <w:t xml:space="preserve">(@PathVariable("isbn") String </w:t>
-      </w:r>
-      <w:proofErr w:type="spellStart"/>
-      <w:proofErr w:type="gramStart"/>
-      <w:r>
-        <w:t>bookCode</w:t>
-      </w:r>
-      <w:proofErr w:type="spellEnd"/>
-      <w:r>
-        <w:t>) {</w:t>
-      </w:r>
-      <w:proofErr w:type="gramEnd"/>
-    </w:p>
-    <w:p>
-      <w:r>
-        <w:t xml:space="preserve">   return "Book ISBN: " + </w:t>
-      </w:r>
-      <w:proofErr w:type="spellStart"/>
-      <w:r>
-        <w:t>bookCode</w:t>
-      </w:r>
-      <w:proofErr w:type="spellEnd"/>
-      <w:r>
-        <w:t>;</w:t>
+      <w:r>
+        <w:t>@GetMapping("/books/{isbn}")</w:t>
+      </w:r>
+    </w:p>
+    <w:p>
+      <w:r>
+        <w:t>public String getBook(@PathVariable("isbn") String bookCode) {</w:t>
+      </w:r>
+    </w:p>
+    <w:p>
+      <w:r>
+        <w:t>   return "Book ISBN: " + bookCode;</w:t>
       </w:r>
     </w:p>
     <w:p>
@@ -3509,93 +2377,22 @@
         </w:numPr>
       </w:pPr>
       <w:r>
-        <w:t xml:space="preserve">We can extract and use multiple parameters from the </w:t>
-      </w:r>
-      <w:proofErr w:type="spellStart"/>
-      <w:r>
-        <w:t>pathVariable</w:t>
-      </w:r>
-      <w:proofErr w:type="spellEnd"/>
-      <w:r>
-        <w:t>.</w:t>
-      </w:r>
-    </w:p>
-    <w:p>
-      <w:proofErr w:type="gramStart"/>
-      <w:r>
-        <w:t>@GetMapping</w:t>
-      </w:r>
-      <w:proofErr w:type="gramEnd"/>
-      <w:r>
-        <w:t>("/</w:t>
-      </w:r>
-      <w:proofErr w:type="gramStart"/>
-      <w:r>
-        <w:t>orders/{userId}/order/{orderId}"</w:t>
-      </w:r>
-      <w:proofErr w:type="gramEnd"/>
-      <w:r>
-        <w:t>)</w:t>
-      </w:r>
-    </w:p>
-    <w:p>
-      <w:r>
-        <w:t xml:space="preserve">public String </w:t>
-      </w:r>
-      <w:proofErr w:type="spellStart"/>
-      <w:proofErr w:type="gramStart"/>
-      <w:r>
-        <w:t>getOrder</w:t>
-      </w:r>
-      <w:proofErr w:type="spellEnd"/>
-      <w:r>
-        <w:t>(</w:t>
-      </w:r>
-      <w:proofErr w:type="gramEnd"/>
-      <w:r>
-        <w:t xml:space="preserve">@PathVariable int </w:t>
-      </w:r>
-      <w:proofErr w:type="spellStart"/>
-      <w:proofErr w:type="gramStart"/>
-      <w:r>
-        <w:t>userId</w:t>
-      </w:r>
-      <w:proofErr w:type="spellEnd"/>
-      <w:r>
-        <w:t>, @</w:t>
-      </w:r>
-      <w:proofErr w:type="gramEnd"/>
-      <w:r>
-        <w:t xml:space="preserve">PathVariable int </w:t>
-      </w:r>
-      <w:proofErr w:type="spellStart"/>
-      <w:r>
-        <w:t>orderId</w:t>
-      </w:r>
-      <w:proofErr w:type="spellEnd"/>
-      <w:r>
-        <w:t>) {</w:t>
-      </w:r>
-    </w:p>
-    <w:p>
-      <w:r>
-        <w:t xml:space="preserve">   return "User ID: " + </w:t>
-      </w:r>
-      <w:proofErr w:type="spellStart"/>
-      <w:r>
-        <w:t>userId</w:t>
-      </w:r>
-      <w:proofErr w:type="spellEnd"/>
-      <w:r>
-        <w:t xml:space="preserve"> + ", Order ID: " + </w:t>
-      </w:r>
-      <w:proofErr w:type="spellStart"/>
-      <w:r>
-        <w:t>orderId</w:t>
-      </w:r>
-      <w:proofErr w:type="spellEnd"/>
-      <w:r>
-        <w:t>;</w:t>
+        <w:t>We can extract and use multiple parameters from the pathVariable.</w:t>
+      </w:r>
+    </w:p>
+    <w:p>
+      <w:r>
+        <w:t>@GetMapping("/orders/{userId}/order/{orderId}")</w:t>
+      </w:r>
+    </w:p>
+    <w:p>
+      <w:r>
+        <w:t>public String getOrder(@PathVariable int userId, @PathVariable int orderId) {</w:t>
+      </w:r>
+    </w:p>
+    <w:p>
+      <w:r>
+        <w:t>   return "User ID: " + userId + ", Order ID: " + orderId;</w:t>
       </w:r>
     </w:p>
     <w:p>
@@ -3605,40 +2402,20 @@
     </w:p>
     <w:p/>
     <w:p>
-      <w:proofErr w:type="spellStart"/>
-      <w:r>
-        <w:t>ResponseEntity</w:t>
-      </w:r>
-      <w:proofErr w:type="spellEnd"/>
-      <w:r>
-        <w:t>:</w:t>
+      <w:r>
+        <w:t>ResponseEntity:</w:t>
       </w:r>
       <w:r>
         <w:br/>
       </w:r>
       <w:r>
         <w:br/>
-      </w:r>
-      <w:proofErr w:type="spellStart"/>
-      <w:r>
-        <w:t>ResponseEntity</w:t>
-      </w:r>
-      <w:proofErr w:type="spellEnd"/>
-      <w:r>
-        <w:t xml:space="preserve"> is a wrapper class in Spring that represents the entire HTTP response. This includes status code, headers and body.</w:t>
-      </w:r>
-    </w:p>
-    <w:p>
-      <w:r>
-        <w:t xml:space="preserve">When the method returns the </w:t>
-      </w:r>
-      <w:proofErr w:type="spellStart"/>
-      <w:r>
-        <w:t>ResponseEntity</w:t>
-      </w:r>
-      <w:proofErr w:type="spellEnd"/>
-      <w:r>
-        <w:t>, Spring uses information provided in the method to construct the final HTTP response sent to the client.</w:t>
+        <w:t>ResponseEntity is a wrapper class in Spring that represents the entire HTTP response. This includes status code, headers and body.</w:t>
+      </w:r>
+    </w:p>
+    <w:p>
+      <w:r>
+        <w:t>When the method returns the ResponseEntity, Spring uses information provided in the method to construct the final HTTP response sent to the client.</w:t>
       </w:r>
     </w:p>
     <w:p/>
@@ -3684,34 +2461,13 @@
       </w:r>
     </w:p>
     <w:p>
-      <w:proofErr w:type="gramStart"/>
-      <w:r>
-        <w:t>@Entity</w:t>
-      </w:r>
-      <w:proofErr w:type="gramEnd"/>
-      <w:r>
-        <w:t>: Marks the class as a JPA entity. JPA will manage this object for persistence.</w:t>
-      </w:r>
-    </w:p>
-    <w:p>
-      <w:r>
-        <w:t>@</w:t>
-      </w:r>
-      <w:proofErr w:type="gramStart"/>
-      <w:r>
-        <w:t>Table(</w:t>
-      </w:r>
-      <w:proofErr w:type="gramEnd"/>
-      <w:r>
-        <w:t xml:space="preserve">name = "employees"): Maps the entity to the </w:t>
-      </w:r>
-      <w:proofErr w:type="gramStart"/>
-      <w:r>
-        <w:t>employees</w:t>
-      </w:r>
-      <w:proofErr w:type="gramEnd"/>
-      <w:r>
-        <w:t xml:space="preserve"> table. Optional if table name is the same as class name.</w:t>
+      <w:r>
+        <w:t>@Entity: Marks the class as a JPA entity. JPA will manage this object for persistence.</w:t>
+      </w:r>
+    </w:p>
+    <w:p>
+      <w:r>
+        <w:t>@Table(name = "employees"): Maps the entity to the employees table. Optional if table name is the same as class name.</w:t>
       </w:r>
     </w:p>
     <w:p>
@@ -3721,36 +2477,12 @@
     </w:p>
     <w:p>
       <w:r>
-        <w:t>@</w:t>
-      </w:r>
-      <w:proofErr w:type="gramStart"/>
-      <w:r>
-        <w:t>GeneratedValue(</w:t>
-      </w:r>
-      <w:proofErr w:type="gramEnd"/>
-      <w:r>
-        <w:t xml:space="preserve">strategy = </w:t>
-      </w:r>
-      <w:proofErr w:type="spellStart"/>
-      <w:r>
-        <w:t>GenerationType.IDENTITY</w:t>
-      </w:r>
-      <w:proofErr w:type="spellEnd"/>
-      <w:r>
-        <w:t>): Database auto-generates the ID.</w:t>
-      </w:r>
-    </w:p>
-    <w:p>
-      <w:r>
-        <w:t>@</w:t>
-      </w:r>
-      <w:proofErr w:type="gramStart"/>
-      <w:r>
-        <w:t>Column(</w:t>
-      </w:r>
-      <w:proofErr w:type="gramEnd"/>
-      <w:r>
-        <w:t>name = "name"): Maps a field to a specific column in the database. Optional if field name matches column name.</w:t>
+        <w:t>@GeneratedValue(strategy = GenerationType.IDENTITY): Database auto-generates the ID.</w:t>
+      </w:r>
+    </w:p>
+    <w:p>
+      <w:r>
+        <w:t>@Column(name = "name"): Maps a field to a specific column in the database. Optional if field name matches column name.</w:t>
       </w:r>
     </w:p>
     <w:p>
@@ -3760,37 +2492,13 @@
     </w:p>
     <w:p>
       <w:r>
-        <w:t xml:space="preserve">Optional&lt;T&gt; is a container object used to represent the presence or absence of </w:t>
-      </w:r>
-      <w:proofErr w:type="gramStart"/>
-      <w:r>
-        <w:t>a value</w:t>
-      </w:r>
-      <w:proofErr w:type="gramEnd"/>
-      <w:r>
-        <w:t xml:space="preserve">. It prevents </w:t>
-      </w:r>
-      <w:proofErr w:type="spellStart"/>
-      <w:r>
-        <w:t>NullPointerException</w:t>
-      </w:r>
-      <w:proofErr w:type="spellEnd"/>
-      <w:r>
-        <w:t xml:space="preserve"> (NPE) and makes your APIs cleaner by explicitly telling developers when a value might be missing.</w:t>
+        <w:t>Optional&lt;T&gt; is a container object used to represent the presence or absence of a value. It prevents NullPointerException (NPE) and makes your APIs cleaner by explicitly telling developers when a value might be missing.</w:t>
       </w:r>
     </w:p>
     <w:p/>
     <w:p>
       <w:r>
-        <w:t xml:space="preserve">Getters and </w:t>
-      </w:r>
-      <w:proofErr w:type="gramStart"/>
-      <w:r>
-        <w:t>setters</w:t>
-      </w:r>
-      <w:proofErr w:type="gramEnd"/>
-      <w:r>
-        <w:t xml:space="preserve"> are really needed in the MODEL classes, when we are developing web applications. Without them, we cannot store and fetch values from DB.</w:t>
+        <w:t>Getters and setters are really needed in the MODEL classes, when we are developing web applications. Without them, we cannot store and fetch values from DB.</w:t>
       </w:r>
     </w:p>
     <w:p/>
@@ -3802,15 +2510,7 @@
     </w:p>
     <w:p>
       <w:r>
-        <w:t xml:space="preserve">Validations in </w:t>
-      </w:r>
-      <w:proofErr w:type="spellStart"/>
-      <w:r>
-        <w:t>springboot</w:t>
-      </w:r>
-      <w:proofErr w:type="spellEnd"/>
-      <w:r>
-        <w:t>:</w:t>
+        <w:t>Validations in springboot:</w:t>
       </w:r>
       <w:r>
         <w:br/>
@@ -3836,15 +2536,7 @@
     </w:p>
     <w:p>
       <w:r>
-        <w:t xml:space="preserve">Hibernate Validator is the implementation of </w:t>
-      </w:r>
-      <w:proofErr w:type="spellStart"/>
-      <w:r>
-        <w:t>jakarta</w:t>
-      </w:r>
-      <w:proofErr w:type="spellEnd"/>
-      <w:r>
-        <w:t xml:space="preserve"> bean validation of spring framework.</w:t>
+        <w:t>Hibernate Validator is the implementation of jakarta bean validation of spring framework.</w:t>
       </w:r>
     </w:p>
     <w:p>
@@ -3869,25 +2561,12 @@
     </w:p>
     <w:p>
       <w:r>
-        <w:t>@</w:t>
-      </w:r>
-      <w:proofErr w:type="gramStart"/>
-      <w:r>
-        <w:t>Size(</w:t>
-      </w:r>
-      <w:proofErr w:type="gramEnd"/>
-      <w:r>
-        <w:t>min = x, max = y)</w:t>
-      </w:r>
-    </w:p>
-    <w:p>
-      <w:proofErr w:type="gramStart"/>
-      <w:r>
-        <w:t>@Email</w:t>
-      </w:r>
-      <w:proofErr w:type="gramEnd"/>
-      <w:r>
-        <w:t>  </w:t>
+        <w:t>@Size(min = x, max = y)</w:t>
+      </w:r>
+    </w:p>
+    <w:p>
+      <w:r>
+        <w:t>@Email  </w:t>
       </w:r>
     </w:p>
     <w:p>
@@ -3915,132 +2594,40 @@
     </w:p>
     <w:p>
       <w:r>
-        <w:t xml:space="preserve">I have category class with </w:t>
-      </w:r>
-      <w:proofErr w:type="spellStart"/>
-      <w:r>
-        <w:t>categoryId</w:t>
-      </w:r>
-      <w:proofErr w:type="spellEnd"/>
-      <w:r>
-        <w:t xml:space="preserve"> and </w:t>
-      </w:r>
-      <w:proofErr w:type="spellStart"/>
-      <w:r>
-        <w:t>categoryName</w:t>
-      </w:r>
-      <w:proofErr w:type="spellEnd"/>
-      <w:r>
-        <w:t>, I am sending post request via postman API.</w:t>
-      </w:r>
-    </w:p>
-    <w:p>
-      <w:r>
-        <w:t xml:space="preserve">I have placed annotation over </w:t>
-      </w:r>
-      <w:proofErr w:type="spellStart"/>
-      <w:r>
-        <w:t>categoryName</w:t>
-      </w:r>
-      <w:proofErr w:type="spellEnd"/>
-      <w:r>
-        <w:t xml:space="preserve"> as @</w:t>
-      </w:r>
-      <w:proofErr w:type="gramStart"/>
-      <w:r>
-        <w:t>NotEmpty(</w:t>
-      </w:r>
-      <w:proofErr w:type="gramEnd"/>
-      <w:r>
-        <w:t>message = “</w:t>
-      </w:r>
-      <w:proofErr w:type="spellStart"/>
-      <w:r>
-        <w:t>CategoryName</w:t>
-      </w:r>
-      <w:proofErr w:type="spellEnd"/>
-      <w:r>
-        <w:t xml:space="preserve"> </w:t>
-      </w:r>
-      <w:proofErr w:type="spellStart"/>
-      <w:proofErr w:type="gramStart"/>
-      <w:r>
-        <w:t>cant</w:t>
-      </w:r>
-      <w:proofErr w:type="spellEnd"/>
-      <w:proofErr w:type="gramEnd"/>
-      <w:r>
-        <w:t xml:space="preserve"> be blank”)</w:t>
-      </w:r>
-    </w:p>
-    <w:p>
-      <w:r>
-        <w:t xml:space="preserve">In JSON request, I set value for </w:t>
-      </w:r>
-      <w:proofErr w:type="spellStart"/>
-      <w:r>
-        <w:t>categoryName</w:t>
-      </w:r>
-      <w:proofErr w:type="spellEnd"/>
-      <w:r>
-        <w:t xml:space="preserve"> as empty, when I send the request to API,</w:t>
-      </w:r>
-    </w:p>
-    <w:p>
-      <w:r>
-        <w:t xml:space="preserve">I get response as 500 internal </w:t>
-      </w:r>
-      <w:proofErr w:type="gramStart"/>
-      <w:r>
-        <w:t>error</w:t>
-      </w:r>
-      <w:proofErr w:type="gramEnd"/>
-      <w:r>
-        <w:t>.</w:t>
-      </w:r>
-    </w:p>
-    <w:p>
-      <w:r>
-        <w:t xml:space="preserve">In console logs, we </w:t>
-      </w:r>
-      <w:proofErr w:type="gramStart"/>
-      <w:r>
-        <w:t>can</w:t>
-      </w:r>
-      <w:proofErr w:type="gramEnd"/>
-      <w:r>
-        <w:t xml:space="preserve"> able to see exception of </w:t>
-      </w:r>
-      <w:proofErr w:type="spellStart"/>
-      <w:r>
-        <w:t>constraintsViolation</w:t>
-      </w:r>
-      <w:proofErr w:type="spellEnd"/>
-      <w:r>
-        <w:t xml:space="preserve"> Exception along with message and variable name.</w:t>
+        <w:t>I have category class with categoryId and categoryName, I am sending post request via postman API.</w:t>
+      </w:r>
+    </w:p>
+    <w:p>
+      <w:r>
+        <w:t>I have placed annotation over categoryName as @NotEmpty(message = “CategoryName cant be blank”)</w:t>
+      </w:r>
+    </w:p>
+    <w:p>
+      <w:r>
+        <w:t>In JSON request, I set value for categoryName as empty, when I send the request to API,</w:t>
+      </w:r>
+    </w:p>
+    <w:p>
+      <w:r>
+        <w:t>I get response as 500 internal error.</w:t>
+      </w:r>
+    </w:p>
+    <w:p>
+      <w:r>
+        <w:t>In console logs, we can able to see exception of constraintsViolation Exception along with message and variable name.</w:t>
       </w:r>
     </w:p>
     <w:p/>
     <w:p>
       <w:r>
-        <w:t xml:space="preserve">In the process of making this more user friendly, we can </w:t>
-      </w:r>
-      <w:proofErr w:type="gramStart"/>
-      <w:r>
-        <w:t>use @</w:t>
-      </w:r>
-      <w:proofErr w:type="gramEnd"/>
-      <w:r>
-        <w:t>Valid annotation at controller class.</w:t>
+        <w:t>In the process of making this more user friendly, we can use @Valid annotation at controller class.</w:t>
       </w:r>
     </w:p>
     <w:p/>
     <w:p>
-      <w:proofErr w:type="gramStart"/>
       <w:r>
         <w:t>Using @</w:t>
       </w:r>
-      <w:proofErr w:type="gramEnd"/>
       <w:r>
         <w:t>Valid in controller at parameter level of the request</w:t>
       </w:r>
@@ -4050,25 +2637,8 @@
     </w:p>
     <w:p>
       <w:r>
-        <w:t xml:space="preserve">After </w:t>
-      </w:r>
-      <w:proofErr w:type="gramStart"/>
-      <w:r>
-        <w:t>using @</w:t>
-      </w:r>
-      <w:proofErr w:type="gramEnd"/>
-      <w:r>
-        <w:t xml:space="preserve">Valid annotation, the response will be 400 bad </w:t>
-      </w:r>
-      <w:proofErr w:type="gramStart"/>
-      <w:r>
-        <w:t>request</w:t>
-      </w:r>
-      <w:proofErr w:type="gramEnd"/>
-      <w:r>
-        <w:t xml:space="preserve">, and in console logs, we can find exception of </w:t>
-      </w:r>
-      <w:proofErr w:type="spellStart"/>
+        <w:t xml:space="preserve">After using @Valid annotation, the response will be 400 bad request, and in console logs, we can find exception of </w:t>
+      </w:r>
       <w:r>
         <w:rPr>
           <w:b/>
@@ -4076,7 +2646,6 @@
         </w:rPr>
         <w:t>MethodArugumentNotValidException</w:t>
       </w:r>
-      <w:proofErr w:type="spellEnd"/>
       <w:r>
         <w:t xml:space="preserve"> and its shows which fields did not pass the validation and specifies the message of validation we mentioned in the POJO class.</w:t>
       </w:r>
@@ -4086,7 +2655,6 @@
       <w:r>
         <w:t xml:space="preserve">To achieve more user-friendly response, we use </w:t>
       </w:r>
-      <w:proofErr w:type="spellStart"/>
       <w:r>
         <w:rPr>
           <w:b/>
@@ -4094,71 +2662,23 @@
         </w:rPr>
         <w:t>globalExceptionHandler</w:t>
       </w:r>
-      <w:proofErr w:type="spellEnd"/>
       <w:r>
         <w:t xml:space="preserve"> class, to manage default exception implementation.</w:t>
       </w:r>
     </w:p>
     <w:p>
-      <w:proofErr w:type="gramStart"/>
-      <w:r>
-        <w:t>@RestControllerAdvice</w:t>
-      </w:r>
-      <w:proofErr w:type="gramEnd"/>
-      <w:r>
-        <w:t>:</w:t>
-      </w:r>
-    </w:p>
-    <w:p>
-      <w:proofErr w:type="gramStart"/>
-      <w:r>
-        <w:t>@RestControllerAdvice</w:t>
-      </w:r>
-      <w:proofErr w:type="gramEnd"/>
-      <w:r>
-        <w:t xml:space="preserve"> is a specialized version </w:t>
-      </w:r>
-      <w:proofErr w:type="gramStart"/>
-      <w:r>
-        <w:t>of @</w:t>
-      </w:r>
-      <w:proofErr w:type="gramEnd"/>
-      <w:r>
-        <w:t xml:space="preserve">ControllerAdvice in Spring Boot, designed to handle exceptions in RESTful APIs. It combines the functionality </w:t>
-      </w:r>
-      <w:proofErr w:type="gramStart"/>
-      <w:r>
-        <w:t>of @</w:t>
-      </w:r>
-      <w:proofErr w:type="gramEnd"/>
-      <w:r>
-        <w:t xml:space="preserve">ControllerAdvice </w:t>
-      </w:r>
-      <w:proofErr w:type="gramStart"/>
-      <w:r>
-        <w:t>and @</w:t>
-      </w:r>
-      <w:proofErr w:type="gramEnd"/>
-      <w:r>
-        <w:t>ResponseBody, making it easier to manage exceptions globally and return JSON responses.</w:t>
-      </w:r>
-    </w:p>
-    <w:p>
-      <w:proofErr w:type="gramStart"/>
-      <w:r>
-        <w:t>Since @</w:t>
-      </w:r>
-      <w:proofErr w:type="gramEnd"/>
-      <w:r>
-        <w:t xml:space="preserve">RestControllerAdvice </w:t>
-      </w:r>
-      <w:proofErr w:type="gramStart"/>
-      <w:r>
-        <w:t>includes @</w:t>
-      </w:r>
-      <w:proofErr w:type="gramEnd"/>
-      <w:r>
-        <w:t>ResponseBody, any object returned from the exception handler methods is automatically serialized into JSON and sent back to the client.</w:t>
+      <w:r>
+        <w:t>@RestControllerAdvice:</w:t>
+      </w:r>
+    </w:p>
+    <w:p>
+      <w:r>
+        <w:t>@RestControllerAdvice is a specialized version of @ControllerAdvice in Spring Boot, designed to handle exceptions in RESTful APIs. It combines the functionality of @ControllerAdvice and @ResponseBody, making it easier to manage exceptions globally and return JSON responses.</w:t>
+      </w:r>
+    </w:p>
+    <w:p>
+      <w:r>
+        <w:t>Since @RestControllerAdvice includes @ResponseBody, any object returned from the exception handler methods is automatically serialized into JSON and sent back to the client.</w:t>
       </w:r>
     </w:p>
     <w:p/>
@@ -4183,15 +2703,7 @@
         </w:numPr>
       </w:pPr>
       <w:r>
-        <w:t xml:space="preserve">We create </w:t>
-      </w:r>
-      <w:proofErr w:type="spellStart"/>
-      <w:r>
-        <w:t>customException</w:t>
-      </w:r>
-      <w:proofErr w:type="spellEnd"/>
-      <w:r>
-        <w:t xml:space="preserve"> class </w:t>
+        <w:t xml:space="preserve">We create customException class </w:t>
       </w:r>
       <w:r>
         <w:t>with</w:t>
@@ -4203,15 +2715,7 @@
         <w:t>ing</w:t>
       </w:r>
       <w:r>
-        <w:t xml:space="preserve"> </w:t>
-      </w:r>
-      <w:proofErr w:type="spellStart"/>
-      <w:r>
-        <w:t>RuntimeException</w:t>
-      </w:r>
-      <w:proofErr w:type="spellEnd"/>
-      <w:r>
-        <w:t xml:space="preserve"> and implement logic.</w:t>
+        <w:t xml:space="preserve"> RuntimeException and implement logic.</w:t>
       </w:r>
     </w:p>
     <w:p>
@@ -4223,26 +2727,10 @@
         </w:numPr>
       </w:pPr>
       <w:r>
-        <w:t xml:space="preserve">We manage this custom exception class in the </w:t>
-      </w:r>
-      <w:proofErr w:type="spellStart"/>
-      <w:r>
-        <w:t>globalExceptionHandler</w:t>
-      </w:r>
-      <w:proofErr w:type="spellEnd"/>
-      <w:r>
-        <w:t xml:space="preserve"> class.</w:t>
-      </w:r>
-      <w:r>
-        <w:t xml:space="preserve"> We can return </w:t>
-      </w:r>
-      <w:proofErr w:type="spellStart"/>
-      <w:r>
-        <w:t>ResponseEntity</w:t>
-      </w:r>
-      <w:proofErr w:type="spellEnd"/>
-      <w:r>
-        <w:t xml:space="preserve"> along with exception message.</w:t>
+        <w:t>We manage this custom exception class in the globalExceptionHandler class.</w:t>
+      </w:r>
+      <w:r>
+        <w:t xml:space="preserve"> We can return ResponseEntity along with exception message.</w:t>
       </w:r>
     </w:p>
     <w:p>
@@ -4258,45 +2746,11 @@
         <w:ind w:left="1080"/>
       </w:pPr>
       <w:r>
-        <w:t>@</w:t>
-      </w:r>
-      <w:proofErr w:type="gramStart"/>
-      <w:r>
-        <w:t>ExceptionHandler(</w:t>
-      </w:r>
-      <w:proofErr w:type="gramEnd"/>
-      <w:r>
-        <w:t>APIException.class)</w:t>
+        <w:t>@ExceptionHandler(APIException.class)</w:t>
       </w:r>
       <w:r>
         <w:br/>
-        <w:t xml:space="preserve">public </w:t>
-      </w:r>
-      <w:proofErr w:type="spellStart"/>
-      <w:r>
-        <w:t>ResponseEntity</w:t>
-      </w:r>
-      <w:proofErr w:type="spellEnd"/>
-      <w:r>
-        <w:t xml:space="preserve">&lt;String&gt; </w:t>
-      </w:r>
-      <w:proofErr w:type="spellStart"/>
-      <w:proofErr w:type="gramStart"/>
-      <w:r>
-        <w:t>ApiException</w:t>
-      </w:r>
-      <w:proofErr w:type="spellEnd"/>
-      <w:r>
-        <w:t>(</w:t>
-      </w:r>
-      <w:proofErr w:type="spellStart"/>
-      <w:proofErr w:type="gramEnd"/>
-      <w:r>
-        <w:t>APIException</w:t>
-      </w:r>
-      <w:proofErr w:type="spellEnd"/>
-      <w:r>
-        <w:t xml:space="preserve"> exception)</w:t>
+        <w:t>public ResponseEntity&lt;String&gt; ApiException(APIException exception)</w:t>
       </w:r>
       <w:r>
         <w:br/>
@@ -4304,41 +2758,11 @@
       </w:r>
       <w:r>
         <w:br/>
-        <w:t xml:space="preserve">    String message = </w:t>
-      </w:r>
-      <w:proofErr w:type="spellStart"/>
-      <w:proofErr w:type="gramStart"/>
-      <w:r>
-        <w:t>exception.getMessage</w:t>
-      </w:r>
-      <w:proofErr w:type="spellEnd"/>
-      <w:proofErr w:type="gramEnd"/>
-      <w:r>
-        <w:t>();</w:t>
+        <w:t xml:space="preserve">    String message = exception.getMessage();</w:t>
       </w:r>
       <w:r>
         <w:br/>
-        <w:t xml:space="preserve">    return new </w:t>
-      </w:r>
-      <w:proofErr w:type="spellStart"/>
-      <w:r>
-        <w:t>ResponseEntity</w:t>
-      </w:r>
-      <w:proofErr w:type="spellEnd"/>
-      <w:r>
-        <w:t>&lt;</w:t>
-      </w:r>
-      <w:proofErr w:type="gramStart"/>
-      <w:r>
-        <w:t>&gt;(</w:t>
-      </w:r>
-      <w:proofErr w:type="gramEnd"/>
-      <w:r>
-        <w:t xml:space="preserve">message, </w:t>
-      </w:r>
-      <w:proofErr w:type="spellStart"/>
-      <w:r>
-        <w:t>HttpStatus.</w:t>
+        <w:t xml:space="preserve">    return new ResponseEntity&lt;&gt;(message, HttpStatus.</w:t>
       </w:r>
       <w:r>
         <w:rPr>
@@ -4347,7 +2771,6 @@
         </w:rPr>
         <w:t>BAD_REQUEST</w:t>
       </w:r>
-      <w:proofErr w:type="spellEnd"/>
       <w:r>
         <w:t>);</w:t>
       </w:r>
@@ -4367,15 +2790,7 @@
       </w:r>
       <w:r>
         <w:br/>
-        <w:t xml:space="preserve">Pagination is a technique of dividing a large body of </w:t>
-      </w:r>
-      <w:proofErr w:type="gramStart"/>
-      <w:r>
-        <w:t>con tent</w:t>
-      </w:r>
-      <w:proofErr w:type="gramEnd"/>
-      <w:r>
-        <w:t xml:space="preserve"> or data into smaller, discrete and numbered pages.</w:t>
+        <w:t>Pagination is a technique of dividing a large body of con tent or data into smaller, discrete and numbered pages.</w:t>
       </w:r>
     </w:p>
     <w:p>
@@ -4450,21 +2865,11 @@
     <w:p/>
     <w:p>
       <w:r>
-        <w:t xml:space="preserve">To implement pagination, our repositories must extend </w:t>
-      </w:r>
-      <w:proofErr w:type="spellStart"/>
-      <w:r>
-        <w:t>JpaRepository</w:t>
-      </w:r>
-      <w:proofErr w:type="spellEnd"/>
-      <w:r>
-        <w:t xml:space="preserve"> or </w:t>
-      </w:r>
-      <w:proofErr w:type="spellStart"/>
+        <w:t xml:space="preserve">To implement pagination, our repositories must extend JpaRepository or </w:t>
+      </w:r>
       <w:r>
         <w:t>PagingAndSortingRepository</w:t>
       </w:r>
-      <w:proofErr w:type="spellEnd"/>
       <w:r>
         <w:t>.</w:t>
       </w:r>
@@ -4477,135 +2882,23 @@
     </w:p>
     <w:p>
       <w:r>
-        <w:t xml:space="preserve">Pageable is the interface that describes what page of data you want. It's just a request object — it doesn't hold any actual data. It carries three things: the page number, the page size, and optionally a Sort. Spring Data's concrete implementation you'll </w:t>
-      </w:r>
-      <w:proofErr w:type="gramStart"/>
-      <w:r>
-        <w:t>actually construct</w:t>
-      </w:r>
-      <w:proofErr w:type="gramEnd"/>
-      <w:r>
-        <w:t xml:space="preserve"> is </w:t>
-      </w:r>
-      <w:proofErr w:type="spellStart"/>
-      <w:r>
-        <w:t>PageRequest</w:t>
-      </w:r>
-      <w:proofErr w:type="spellEnd"/>
-      <w:r>
-        <w:t>.</w:t>
+        <w:t>Pageable is the interface that describes what page of data you want. It's just a request object — it doesn't hold any actual data. It carries three things: the page number, the page size, and optionally a Sort. Spring Data's concrete implementation you'll actually construct is PageRequest.</w:t>
       </w:r>
     </w:p>
     <w:p/>
     <w:p>
       <w:r>
-        <w:t xml:space="preserve">Pageable </w:t>
-      </w:r>
-      <w:proofErr w:type="spellStart"/>
-      <w:r>
-        <w:t>pageable</w:t>
-      </w:r>
-      <w:proofErr w:type="spellEnd"/>
-      <w:r>
-        <w:t xml:space="preserve"> = </w:t>
-      </w:r>
-      <w:proofErr w:type="spellStart"/>
-      <w:r>
-        <w:t>PageRequest.of</w:t>
-      </w:r>
-      <w:proofErr w:type="spellEnd"/>
-      <w:r>
-        <w:t>(0, 20); // page 0, 20 items per page</w:t>
-      </w:r>
-    </w:p>
-    <w:p>
-      <w:r>
-        <w:t xml:space="preserve">Pageable </w:t>
-      </w:r>
-      <w:proofErr w:type="spellStart"/>
-      <w:r>
-        <w:t>pageable</w:t>
-      </w:r>
-      <w:proofErr w:type="spellEnd"/>
-      <w:r>
-        <w:t xml:space="preserve"> = </w:t>
-      </w:r>
-      <w:proofErr w:type="spellStart"/>
-      <w:r>
-        <w:t>PageRequest.of</w:t>
-      </w:r>
-      <w:proofErr w:type="spellEnd"/>
-      <w:r>
-        <w:t>(0, 20, Sort.by("</w:t>
-      </w:r>
-      <w:proofErr w:type="spellStart"/>
-      <w:r>
-        <w:t>lastName</w:t>
-      </w:r>
-      <w:proofErr w:type="spellEnd"/>
-      <w:r>
-        <w:t>"</w:t>
-      </w:r>
-      <w:proofErr w:type="gramStart"/>
-      <w:r>
-        <w:t>).ascending</w:t>
-      </w:r>
-      <w:proofErr w:type="gramEnd"/>
-      <w:r>
-        <w:t>());</w:t>
-      </w:r>
-    </w:p>
-    <w:p>
-      <w:r>
-        <w:t xml:space="preserve">Pageable </w:t>
-      </w:r>
-      <w:proofErr w:type="spellStart"/>
-      <w:r>
-        <w:t>pageable</w:t>
-      </w:r>
-      <w:proofErr w:type="spellEnd"/>
-      <w:r>
-        <w:t xml:space="preserve"> = </w:t>
-      </w:r>
-      <w:proofErr w:type="spellStart"/>
-      <w:r>
-        <w:t>PageRequest.of</w:t>
-      </w:r>
-      <w:proofErr w:type="spellEnd"/>
-      <w:r>
-        <w:t>(0, 20, Sort.by("</w:t>
-      </w:r>
-      <w:proofErr w:type="spellStart"/>
-      <w:r>
-        <w:t>lastName</w:t>
-      </w:r>
-      <w:proofErr w:type="spellEnd"/>
-      <w:r>
-        <w:t>"</w:t>
-      </w:r>
-      <w:proofErr w:type="gramStart"/>
-      <w:r>
-        <w:t>).ascending</w:t>
-      </w:r>
-      <w:proofErr w:type="gramEnd"/>
-      <w:r>
-        <w:t>().</w:t>
-      </w:r>
-      <w:proofErr w:type="gramStart"/>
-      <w:r>
-        <w:t>and(</w:t>
-      </w:r>
-      <w:proofErr w:type="gramEnd"/>
-      <w:r>
-        <w:t>Sort.by("</w:t>
-      </w:r>
-      <w:proofErr w:type="spellStart"/>
-      <w:r>
-        <w:t>firstName</w:t>
-      </w:r>
-      <w:proofErr w:type="spellEnd"/>
-      <w:r>
-        <w:t>")));</w:t>
+        <w:t>Pageable pageable = PageRequest.of(0, 20); // page 0, 20 items per page</w:t>
+      </w:r>
+    </w:p>
+    <w:p>
+      <w:r>
+        <w:t>Pageable pageable = PageRequest.of(0, 20, Sort.by("lastName").ascending());</w:t>
+      </w:r>
+    </w:p>
+    <w:p>
+      <w:r>
+        <w:t>Pageable pageable = PageRequest.of(0, 20, Sort.by("lastName").ascending().and(Sort.by("firstName")));</w:t>
       </w:r>
     </w:p>
     <w:p/>
@@ -4616,220 +2909,59 @@
     </w:p>
     <w:p>
       <w:r>
-        <w:t xml:space="preserve">Page&lt;T&gt; is what you get back when you pass a Pageable into a query. It extends Slice&lt;T&gt;, and on top of the slice behavior it adds a full count of all matching rows, obtained via a second, separate query. That's the important trade-off to </w:t>
-      </w:r>
-      <w:proofErr w:type="gramStart"/>
-      <w:r>
-        <w:t>know:</w:t>
-      </w:r>
-      <w:proofErr w:type="gramEnd"/>
-      <w:r>
-        <w:t xml:space="preserve"> under the hood, a Page&lt;T&gt; result triggers two SQL statements, one for the actual page of rows (with LIMIT/OFFSET) and one SELECT </w:t>
-      </w:r>
-      <w:proofErr w:type="gramStart"/>
-      <w:r>
-        <w:t>COUNT(</w:t>
-      </w:r>
-      <w:proofErr w:type="gramEnd"/>
-      <w:r>
-        <w:t xml:space="preserve">*) to compute </w:t>
-      </w:r>
-      <w:proofErr w:type="spellStart"/>
-      <w:proofErr w:type="gramStart"/>
-      <w:r>
-        <w:t>getTotalElements</w:t>
-      </w:r>
-      <w:proofErr w:type="spellEnd"/>
-      <w:r>
-        <w:t>(</w:t>
-      </w:r>
-      <w:proofErr w:type="gramEnd"/>
-      <w:r>
-        <w:t>).</w:t>
+        <w:t>Page&lt;T&gt; is what you get back when you pass a Pageable into a query. It extends Slice&lt;T&gt;, and on top of the slice behavior it adds a full count of all matching rows, obtained via a second, separate query. That's the important trade-off to know: under the hood, a Page&lt;T&gt; result triggers two SQL statements, one for the actual page of rows (with LIMIT/OFFSET) and one SELECT COUNT(*) to compute getTotalElements().</w:t>
       </w:r>
     </w:p>
     <w:p/>
     <w:p>
       <w:r>
-        <w:t xml:space="preserve">Page&lt;Employee&gt; page = </w:t>
-      </w:r>
-      <w:proofErr w:type="spellStart"/>
-      <w:r>
-        <w:t>employeeRepository.findAll</w:t>
-      </w:r>
-      <w:proofErr w:type="spellEnd"/>
-      <w:r>
-        <w:t>(pageable);</w:t>
-      </w:r>
-    </w:p>
-    <w:p>
-      <w:proofErr w:type="spellStart"/>
-      <w:proofErr w:type="gramStart"/>
-      <w:r>
-        <w:t>page.getContent</w:t>
-      </w:r>
-      <w:proofErr w:type="spellEnd"/>
-      <w:proofErr w:type="gramEnd"/>
-      <w:r>
-        <w:t>(</w:t>
-      </w:r>
-      <w:proofErr w:type="gramStart"/>
-      <w:r>
-        <w:t xml:space="preserve">);   </w:t>
-      </w:r>
-      <w:proofErr w:type="gramEnd"/>
-      <w:r>
-        <w:t xml:space="preserve">     // List&lt;Employee&gt; — the actual rows</w:t>
-      </w:r>
-    </w:p>
-    <w:p>
-      <w:proofErr w:type="spellStart"/>
-      <w:proofErr w:type="gramStart"/>
-      <w:r>
-        <w:t>page.getTotalElements</w:t>
-      </w:r>
-      <w:proofErr w:type="spellEnd"/>
-      <w:proofErr w:type="gramEnd"/>
-      <w:r>
-        <w:t>(</w:t>
-      </w:r>
-      <w:proofErr w:type="gramStart"/>
-      <w:r>
-        <w:t>);  /</w:t>
-      </w:r>
-      <w:proofErr w:type="gramEnd"/>
-      <w:r>
-        <w:t>/ total matching rows across all pages</w:t>
-      </w:r>
-    </w:p>
-    <w:p>
-      <w:proofErr w:type="spellStart"/>
-      <w:proofErr w:type="gramStart"/>
-      <w:r>
-        <w:t>page.getTotalPages</w:t>
-      </w:r>
-      <w:proofErr w:type="spellEnd"/>
-      <w:proofErr w:type="gramEnd"/>
-      <w:r>
-        <w:t>(</w:t>
-      </w:r>
-      <w:proofErr w:type="gramStart"/>
-      <w:r>
-        <w:t xml:space="preserve">);   </w:t>
-      </w:r>
-      <w:proofErr w:type="gramEnd"/>
-      <w:r>
-        <w:t xml:space="preserve">  // </w:t>
-      </w:r>
-      <w:proofErr w:type="gramStart"/>
-      <w:r>
-        <w:t>ceil(</w:t>
-      </w:r>
-      <w:proofErr w:type="spellStart"/>
-      <w:proofErr w:type="gramEnd"/>
-      <w:r>
-        <w:t>totalElements</w:t>
-      </w:r>
-      <w:proofErr w:type="spellEnd"/>
-      <w:r>
-        <w:t xml:space="preserve"> / </w:t>
-      </w:r>
-      <w:proofErr w:type="spellStart"/>
-      <w:r>
-        <w:t>pageSize</w:t>
-      </w:r>
-      <w:proofErr w:type="spellEnd"/>
-      <w:r>
-        <w:t>)</w:t>
-      </w:r>
-    </w:p>
-    <w:p>
-      <w:proofErr w:type="spellStart"/>
-      <w:proofErr w:type="gramStart"/>
+        <w:t>Page&lt;Employee&gt; page = employeeRepository.findAll(pageable);</w:t>
+      </w:r>
+    </w:p>
+    <w:p>
+      <w:r>
+        <w:t>page.getContent();        // List&lt;Employee&gt; — the actual rows</w:t>
+      </w:r>
+    </w:p>
+    <w:p>
+      <w:r>
+        <w:t>page.getTotalElements();  // total matching rows across all pages</w:t>
+      </w:r>
+    </w:p>
+    <w:p>
+      <w:r>
+        <w:t>page.getTotalPages();     // ceil(totalElements / pageSize)</w:t>
+      </w:r>
+    </w:p>
+    <w:p>
       <w:r>
         <w:lastRenderedPageBreak/>
-        <w:t>page.getNumber</w:t>
-      </w:r>
-      <w:proofErr w:type="spellEnd"/>
-      <w:proofErr w:type="gramEnd"/>
-      <w:r>
-        <w:t>(</w:t>
-      </w:r>
-      <w:proofErr w:type="gramStart"/>
-      <w:r>
-        <w:t xml:space="preserve">);   </w:t>
-      </w:r>
-      <w:proofErr w:type="gramEnd"/>
-      <w:r>
-        <w:t xml:space="preserve">      // current page number (0-indexed)</w:t>
-      </w:r>
-    </w:p>
-    <w:p>
-      <w:proofErr w:type="spellStart"/>
-      <w:proofErr w:type="gramStart"/>
-      <w:r>
-        <w:t>page.getSize</w:t>
-      </w:r>
-      <w:proofErr w:type="spellEnd"/>
-      <w:proofErr w:type="gramEnd"/>
-      <w:r>
-        <w:t>(</w:t>
-      </w:r>
-      <w:proofErr w:type="gramStart"/>
-      <w:r>
-        <w:t xml:space="preserve">);   </w:t>
-      </w:r>
-      <w:proofErr w:type="gramEnd"/>
-      <w:r>
-        <w:t xml:space="preserve">        // page size</w:t>
-      </w:r>
-    </w:p>
-    <w:p>
-      <w:proofErr w:type="spellStart"/>
-      <w:proofErr w:type="gramStart"/>
-      <w:r>
-        <w:t>page.hasNext</w:t>
-      </w:r>
-      <w:proofErr w:type="spellEnd"/>
-      <w:proofErr w:type="gramEnd"/>
-      <w:r>
-        <w:t>();</w:t>
-      </w:r>
-    </w:p>
-    <w:p>
-      <w:proofErr w:type="spellStart"/>
-      <w:proofErr w:type="gramStart"/>
-      <w:r>
-        <w:t>page.hasPrevious</w:t>
-      </w:r>
-      <w:proofErr w:type="spellEnd"/>
-      <w:proofErr w:type="gramEnd"/>
-      <w:r>
-        <w:t>();</w:t>
-      </w:r>
-    </w:p>
-    <w:p>
-      <w:proofErr w:type="spellStart"/>
-      <w:proofErr w:type="gramStart"/>
-      <w:r>
-        <w:t>page.isFirst</w:t>
-      </w:r>
-      <w:proofErr w:type="spellEnd"/>
-      <w:proofErr w:type="gramEnd"/>
-      <w:r>
-        <w:t>();</w:t>
-      </w:r>
-    </w:p>
-    <w:p>
-      <w:proofErr w:type="spellStart"/>
-      <w:proofErr w:type="gramStart"/>
-      <w:r>
-        <w:t>page.isLast</w:t>
-      </w:r>
-      <w:proofErr w:type="spellEnd"/>
-      <w:proofErr w:type="gramEnd"/>
-      <w:r>
-        <w:t>();</w:t>
+        <w:t>page.getNumber();         // current page number (0-indexed)</w:t>
+      </w:r>
+    </w:p>
+    <w:p>
+      <w:r>
+        <w:t>page.getSize();           // page size</w:t>
+      </w:r>
+    </w:p>
+    <w:p>
+      <w:r>
+        <w:t>page.hasNext();</w:t>
+      </w:r>
+    </w:p>
+    <w:p>
+      <w:r>
+        <w:t>page.hasPrevious();</w:t>
+      </w:r>
+    </w:p>
+    <w:p>
+      <w:r>
+        <w:t>page.isFirst();</w:t>
+      </w:r>
+    </w:p>
+    <w:p>
+      <w:r>
+        <w:t>page.isLast();</w:t>
       </w:r>
     </w:p>
     <w:p/>
@@ -4888,15 +3020,7 @@
         </w:numPr>
       </w:pPr>
       <w:r>
-        <w:t xml:space="preserve">Relationships in JPA defines how entities have </w:t>
-      </w:r>
-      <w:proofErr w:type="gramStart"/>
-      <w:r>
-        <w:t>related</w:t>
-      </w:r>
-      <w:proofErr w:type="gramEnd"/>
-      <w:r>
-        <w:t xml:space="preserve"> each other.</w:t>
+        <w:t>Relationships in JPA defines how entities have related each other.</w:t>
       </w:r>
     </w:p>
     <w:p>
@@ -4999,289 +3123,230 @@
         <w:t>inverse/referencing side</w:t>
       </w:r>
       <w:r>
-        <w:t xml:space="preserve"> (uses </w:t>
-      </w:r>
-      <w:proofErr w:type="spellStart"/>
-      <w:r>
-        <w:t>mappedBy</w:t>
-      </w:r>
-      <w:proofErr w:type="spellEnd"/>
-      <w:r>
-        <w:t>).</w:t>
+        <w:t xml:space="preserve"> (uses mappedBy).</w:t>
       </w:r>
     </w:p>
     <w:p/>
     <w:p>
+      <w:r>
+        <w:t>@JoinColumn: this annotation used to explicitly manage the foreign Key in owned side.</w:t>
+      </w:r>
+    </w:p>
+    <w:p/>
+    <w:p>
+      <w:r>
+        <w:t xml:space="preserve">@JoinTable: </w:t>
+      </w:r>
+    </w:p>
+    <w:p>
+      <w:r>
+        <w:t>@JoinTable is used to configure a join (junction/bridge) table for a many-to-many (or sometimes one-to-many/unidirectional) relationship.</w:t>
+      </w:r>
+    </w:p>
+    <w:p>
+      <w:r>
+        <w:t>Ex: @JoinTable(name = “name”, joinColumns = {@JoinColumn(name = “variable name”)</w:t>
+      </w:r>
+    </w:p>
+    <w:p/>
+    <w:p>
+      <w:r>
+        <w:rPr>
+          <w:b/>
+          <w:bCs/>
+        </w:rPr>
+        <w:t>JoinColumns:</w:t>
+      </w:r>
+      <w:r>
+        <w:t xml:space="preserve"> f</w:t>
+      </w:r>
+      <w:r>
+        <w:t xml:space="preserve">oreign key column(s) in the join table that reference </w:t>
+      </w:r>
+      <w:r>
+        <w:rPr>
+          <w:b/>
+          <w:bCs/>
+        </w:rPr>
+        <w:t>the entity that owns/declares the @JoinTable annotation</w:t>
+      </w:r>
+      <w:r>
+        <w:t xml:space="preserve"> (the "owning side").</w:t>
+      </w:r>
+    </w:p>
+    <w:p>
+      <w:r>
+        <w:rPr>
+          <w:b/>
+          <w:bCs/>
+        </w:rPr>
+        <w:t>InverseJoinColumns:</w:t>
+      </w:r>
+      <w:r>
+        <w:t xml:space="preserve"> </w:t>
+      </w:r>
+      <w:r>
+        <w:t xml:space="preserve">foreign key </w:t>
+      </w:r>
       <w:proofErr w:type="gramStart"/>
       <w:r>
-        <w:t>@JoinColumn</w:t>
+        <w:t>column(s)</w:t>
       </w:r>
       <w:proofErr w:type="gramEnd"/>
       <w:r>
-        <w:t>: this annotation used to explicitly manage the foreign Key in owned side.</w:t>
+        <w:t xml:space="preserve"> in the join table that </w:t>
+      </w:r>
+      <w:proofErr w:type="gramStart"/>
+      <w:r>
+        <w:t>reference</w:t>
+      </w:r>
+      <w:proofErr w:type="gramEnd"/>
+      <w:r>
+        <w:t xml:space="preserve"> </w:t>
+      </w:r>
+      <w:r>
+        <w:rPr>
+          <w:b/>
+          <w:bCs/>
+        </w:rPr>
+        <w:t>the other entity</w:t>
+      </w:r>
+      <w:r>
+        <w:t xml:space="preserve"> (the target/related entity).</w:t>
+      </w:r>
+    </w:p>
+    <w:p>
+      <w:r>
+        <w:t>While creating joinTable, if we include @Column(name = “name” ) for primary key in their classes, it would be good practice to explicitly mention referencedColumn = “exact name of @Column of primary key” in the @JoinColumn annotations of @JoinTable, so spring won’t face ambiguity.</w:t>
+      </w:r>
+    </w:p>
+    <w:p>
+      <w:r>
+        <w:t xml:space="preserve">Note: </w:t>
+      </w:r>
+      <w:r>
+        <w:t>If you skip referencedColumnName, Hibernate assumes it refers to the entity's primary key column by default</w:t>
+      </w:r>
+      <w:r>
+        <w:t xml:space="preserve"> </w:t>
+      </w:r>
+    </w:p>
+    <w:p>
+      <w:r>
+        <w:rPr>
+          <w:b/>
+          <w:bCs/>
+        </w:rPr>
+        <w:t>MappedBy</w:t>
+      </w:r>
+      <w:r>
+        <w:t xml:space="preserve">: we use this attribute </w:t>
+      </w:r>
+      <w:r>
+        <w:t xml:space="preserve">in the relationship annotation </w:t>
+      </w:r>
+      <w:r>
+        <w:t>to specify bi</w:t>
+      </w:r>
+      <w:r>
+        <w:t>-</w:t>
+      </w:r>
+      <w:r>
+        <w:t xml:space="preserve">directional </w:t>
+      </w:r>
+      <w:r>
+        <w:t>relationship;</w:t>
+      </w:r>
+      <w:r>
+        <w:t xml:space="preserve"> we include this attribute in referencing side.</w:t>
       </w:r>
     </w:p>
     <w:p/>
     <w:p>
-      <w:proofErr w:type="spellStart"/>
-      <w:r>
-        <w:t>MappedBy</w:t>
-      </w:r>
-      <w:proofErr w:type="spellEnd"/>
-      <w:r>
-        <w:t xml:space="preserve">: we use this attribute </w:t>
-      </w:r>
-      <w:r>
-        <w:t xml:space="preserve">in the relationship annotation </w:t>
-      </w:r>
-      <w:r>
-        <w:t>to specify bi</w:t>
-      </w:r>
-      <w:r>
-        <w:t>-</w:t>
-      </w:r>
-      <w:r>
-        <w:t xml:space="preserve">directional </w:t>
-      </w:r>
-      <w:proofErr w:type="gramStart"/>
-      <w:r>
-        <w:t>relationship</w:t>
-      </w:r>
-      <w:r>
-        <w:t>,</w:t>
-      </w:r>
-      <w:proofErr w:type="gramEnd"/>
-      <w:r>
-        <w:t xml:space="preserve"> we include this attribute in referencing side.</w:t>
+      <w:r>
+        <w:t>Circular reference: this is an issue occurs when we establish bi directional mapping, response would look like user -&gt; userProfile -&gt; user -&gt; userProfile……. Like an infinite JSON file.</w:t>
       </w:r>
     </w:p>
     <w:p/>
     <w:p>
       <w:r>
-        <w:t xml:space="preserve">Circular reference: this is an issue occurs when we establish </w:t>
-      </w:r>
-      <w:proofErr w:type="gramStart"/>
-      <w:r>
-        <w:t>bi directional</w:t>
-      </w:r>
-      <w:proofErr w:type="gramEnd"/>
-      <w:r>
-        <w:t xml:space="preserve"> mapping, response would look like user -&gt; </w:t>
-      </w:r>
-      <w:proofErr w:type="spellStart"/>
-      <w:r>
-        <w:t>userProfile</w:t>
-      </w:r>
-      <w:proofErr w:type="spellEnd"/>
-      <w:r>
-        <w:t xml:space="preserve"> -&gt; user -&gt; </w:t>
-      </w:r>
-      <w:proofErr w:type="spellStart"/>
-      <w:r>
-        <w:t>userProfile</w:t>
-      </w:r>
-      <w:proofErr w:type="spellEnd"/>
-      <w:r>
-        <w:t>……. Like an infinite JSON file.</w:t>
+        <w:t xml:space="preserve">Issue: </w:t>
+      </w:r>
+      <w:r>
+        <w:t>Could not write JSON: Infinite recursion (StackOverflowError)]</w:t>
+      </w:r>
+    </w:p>
+    <w:p>
+      <w:r>
+        <w:lastRenderedPageBreak/>
+        <w:t xml:space="preserve">To stop this, we have to use @JsonIgnore annotation, we </w:t>
+      </w:r>
+      <w:r>
+        <w:t>must</w:t>
+      </w:r>
+      <w:r>
+        <w:t xml:space="preserve"> place this at relation owning side class at the variable which has relation with reference class.</w:t>
+      </w:r>
+    </w:p>
+    <w:p>
+      <w:r>
+        <w:t xml:space="preserve">Note: if we </w:t>
+      </w:r>
+      <w:r>
+        <w:t>are using</w:t>
+      </w:r>
+      <w:r>
+        <w:t xml:space="preserve"> Lombok, we have explicitly </w:t>
+      </w:r>
+      <w:r>
+        <w:t xml:space="preserve">specify </w:t>
+      </w:r>
+      <w:r>
+        <w:t>the hashCode</w:t>
+      </w:r>
+      <w:r>
+        <w:t>()</w:t>
+      </w:r>
+      <w:r>
+        <w:t>, toString</w:t>
+      </w:r>
+      <w:r>
+        <w:t>()</w:t>
+      </w:r>
+      <w:r>
+        <w:t>, Equals</w:t>
+      </w:r>
+      <w:r>
+        <w:t>()</w:t>
+      </w:r>
+      <w:r>
+        <w:t xml:space="preserve"> </w:t>
+      </w:r>
+      <w:r>
+        <w:t>methods with only instance variables and exclude relationship related variables.</w:t>
+      </w:r>
+    </w:p>
+    <w:p>
+      <w:r>
+        <w:t xml:space="preserve">When we use @Data of Lombok, </w:t>
+      </w:r>
+      <w:r>
+        <w:t>It generates toString(), equals(), and hashCode() using all fields by default</w:t>
+      </w:r>
+      <w:r>
+        <w:t xml:space="preserve">. </w:t>
+      </w:r>
+      <w:r>
+        <w:t>including relationship fields. So even if JSON ignores socialUsers, Lombok could still recurse through</w:t>
       </w:r>
     </w:p>
     <w:p/>
     <w:p>
       <w:r>
-        <w:t xml:space="preserve">Issue: </w:t>
-      </w:r>
-      <w:r>
-        <w:t>Could not write JSON: Infinite recursion (</w:t>
-      </w:r>
-      <w:proofErr w:type="spellStart"/>
-      <w:r>
-        <w:t>StackOverflowError</w:t>
-      </w:r>
-      <w:proofErr w:type="spellEnd"/>
-      <w:r>
-        <w:t>)]</w:t>
-      </w:r>
-    </w:p>
-    <w:p>
-      <w:r>
-        <w:t xml:space="preserve">To stop this, we have to </w:t>
-      </w:r>
-      <w:proofErr w:type="gramStart"/>
-      <w:r>
-        <w:t>use @</w:t>
-      </w:r>
-      <w:proofErr w:type="gramEnd"/>
-      <w:r>
-        <w:t xml:space="preserve">JsonIgnore annotation, we </w:t>
-      </w:r>
-      <w:r>
-        <w:t>must</w:t>
-      </w:r>
-      <w:r>
-        <w:t xml:space="preserve"> place this at relation owning side class at the variable which has relation with reference class.</w:t>
-      </w:r>
-    </w:p>
-    <w:p>
-      <w:r>
-        <w:t xml:space="preserve">Note: if we </w:t>
-      </w:r>
-      <w:r>
-        <w:t>are using</w:t>
-      </w:r>
-      <w:r>
-        <w:t xml:space="preserve"> Lombok, we have explicitly </w:t>
-      </w:r>
-      <w:proofErr w:type="gramStart"/>
-      <w:r>
-        <w:t>specify</w:t>
-      </w:r>
-      <w:proofErr w:type="gramEnd"/>
-      <w:r>
-        <w:t xml:space="preserve"> </w:t>
-      </w:r>
-      <w:r>
-        <w:t xml:space="preserve">the </w:t>
-      </w:r>
-      <w:proofErr w:type="spellStart"/>
-      <w:proofErr w:type="gramStart"/>
-      <w:r>
-        <w:t>hashCode</w:t>
-      </w:r>
-      <w:proofErr w:type="spellEnd"/>
-      <w:r>
-        <w:t>(</w:t>
-      </w:r>
-      <w:proofErr w:type="gramEnd"/>
-      <w:r>
-        <w:t>)</w:t>
-      </w:r>
-      <w:r>
-        <w:t xml:space="preserve">, </w:t>
-      </w:r>
-      <w:proofErr w:type="spellStart"/>
-      <w:proofErr w:type="gramStart"/>
-      <w:r>
-        <w:t>toString</w:t>
-      </w:r>
-      <w:proofErr w:type="spellEnd"/>
-      <w:r>
-        <w:t>(</w:t>
-      </w:r>
-      <w:proofErr w:type="gramEnd"/>
-      <w:r>
-        <w:t>)</w:t>
-      </w:r>
-      <w:r>
-        <w:t xml:space="preserve">, </w:t>
-      </w:r>
-      <w:proofErr w:type="gramStart"/>
-      <w:r>
-        <w:t>Equals</w:t>
-      </w:r>
-      <w:r>
-        <w:t>(</w:t>
-      </w:r>
-      <w:proofErr w:type="gramEnd"/>
-      <w:r>
-        <w:t>)</w:t>
-      </w:r>
-      <w:r>
-        <w:t xml:space="preserve"> </w:t>
-      </w:r>
-      <w:r>
-        <w:t>methods with only instance variables and exclude relationship related variables.</w:t>
-      </w:r>
-    </w:p>
-    <w:p>
-      <w:r>
-        <w:t xml:space="preserve">When we </w:t>
-      </w:r>
-      <w:proofErr w:type="gramStart"/>
-      <w:r>
-        <w:t>use @</w:t>
-      </w:r>
-      <w:proofErr w:type="gramEnd"/>
-      <w:r>
-        <w:t xml:space="preserve">Data of Lombok, </w:t>
-      </w:r>
-      <w:proofErr w:type="gramStart"/>
-      <w:r>
-        <w:t>It</w:t>
-      </w:r>
-      <w:proofErr w:type="gramEnd"/>
-      <w:r>
-        <w:t xml:space="preserve"> generates </w:t>
-      </w:r>
-      <w:proofErr w:type="spellStart"/>
-      <w:proofErr w:type="gramStart"/>
-      <w:r>
-        <w:t>toString</w:t>
-      </w:r>
-      <w:proofErr w:type="spellEnd"/>
-      <w:r>
-        <w:t>(</w:t>
-      </w:r>
-      <w:proofErr w:type="gramEnd"/>
-      <w:r>
-        <w:t xml:space="preserve">), </w:t>
-      </w:r>
-      <w:proofErr w:type="gramStart"/>
-      <w:r>
-        <w:t>equals(</w:t>
-      </w:r>
-      <w:proofErr w:type="gramEnd"/>
-      <w:r>
-        <w:t xml:space="preserve">), and </w:t>
-      </w:r>
-      <w:proofErr w:type="spellStart"/>
-      <w:proofErr w:type="gramStart"/>
-      <w:r>
-        <w:t>hashCode</w:t>
-      </w:r>
-      <w:proofErr w:type="spellEnd"/>
-      <w:r>
-        <w:t>(</w:t>
-      </w:r>
-      <w:proofErr w:type="gramEnd"/>
-      <w:r>
-        <w:t>) using all fields by default</w:t>
-      </w:r>
-      <w:r>
-        <w:t xml:space="preserve">. </w:t>
-      </w:r>
-      <w:r>
-        <w:t xml:space="preserve">including relationship fields. So even if JSON ignores </w:t>
-      </w:r>
-      <w:proofErr w:type="spellStart"/>
-      <w:r>
-        <w:t>socialUsers</w:t>
-      </w:r>
-      <w:proofErr w:type="spellEnd"/>
-      <w:r>
-        <w:t>, Lombok could still recurse through</w:t>
-      </w:r>
-    </w:p>
-    <w:p/>
-    <w:p/>
-    <w:p/>
-    <w:p/>
-    <w:p/>
-    <w:p/>
-    <w:p>
-      <w:r>
-        <w:lastRenderedPageBreak/>
         <w:t>While adding data, in referenced class, we include owned class data also. But data is not being added.</w:t>
       </w:r>
       <w:r>
-        <w:t xml:space="preserve"> Because we </w:t>
-      </w:r>
-      <w:proofErr w:type="gramStart"/>
-      <w:r>
-        <w:t>missed to use</w:t>
-      </w:r>
-      <w:proofErr w:type="gramEnd"/>
-      <w:r>
-        <w:t xml:space="preserve"> cascading.</w:t>
+        <w:t xml:space="preserve"> Because we missed to use cascading.</w:t>
       </w:r>
     </w:p>
     <w:p>
@@ -5414,23 +3479,7 @@
         <w:t>must</w:t>
       </w:r>
       <w:r>
-        <w:t xml:space="preserve"> specify cascading attribute </w:t>
-      </w:r>
-      <w:proofErr w:type="gramStart"/>
-      <w:r>
-        <w:t>like @OneToMany(</w:t>
-      </w:r>
-      <w:proofErr w:type="gramEnd"/>
-      <w:r>
-        <w:t xml:space="preserve">cascade = </w:t>
-      </w:r>
-      <w:proofErr w:type="spellStart"/>
-      <w:r>
-        <w:t>Cascade.ALL</w:t>
-      </w:r>
-      <w:proofErr w:type="spellEnd"/>
-      <w:r>
-        <w:t>).</w:t>
+        <w:t xml:space="preserve"> specify cascading attribute like @OneToMany(cascade = Cascade.ALL).</w:t>
       </w:r>
     </w:p>
     <w:p>
@@ -5459,6 +3508,7 @@
     </w:p>
     <w:p>
       <w:r>
+        <w:lastRenderedPageBreak/>
         <w:t>After adding cascading, still we can face that issue.</w:t>
       </w:r>
     </w:p>
@@ -5476,46 +3526,21 @@
         <w:t xml:space="preserve">setters for relationship fields in both referenced class and owning side class, because Lombok provides default implementation of setters. </w:t>
       </w:r>
     </w:p>
+    <w:p>
+      <w:r>
+        <w:t>FetchTypes:</w:t>
+      </w:r>
+    </w:p>
+    <w:p>
+      <w:r>
+        <w:t>FetchType controls when related entities are loaded from the database relative to their parent entity. It's set on relationship annotations (@OneToMany, @ManyToOne, @OneToOne, @ManyToMany) via the fetch attribute.</w:t>
+      </w:r>
+    </w:p>
     <w:p/>
-    <w:p/>
-    <w:p/>
-    <w:p/>
-    <w:p>
-      <w:proofErr w:type="spellStart"/>
-      <w:r>
-        <w:lastRenderedPageBreak/>
-        <w:t>FetchTypes</w:t>
-      </w:r>
-      <w:proofErr w:type="spellEnd"/>
-      <w:r>
-        <w:t>:</w:t>
-      </w:r>
-    </w:p>
-    <w:p>
-      <w:proofErr w:type="spellStart"/>
-      <w:r>
-        <w:t>FetchType</w:t>
-      </w:r>
-      <w:proofErr w:type="spellEnd"/>
-      <w:r>
-        <w:t xml:space="preserve"> controls when related entities are loaded from the database relative to their parent entity. It's set on relationship </w:t>
-      </w:r>
-      <w:proofErr w:type="gramStart"/>
-      <w:r>
-        <w:t>annotations (@OneToMany, @ManyToOne, @OneToOne, @</w:t>
-      </w:r>
-      <w:proofErr w:type="gramEnd"/>
-      <w:r>
-        <w:t>ManyToMany) via the fetch attribute.</w:t>
-      </w:r>
-    </w:p>
-    <w:p/>
-    <w:p>
-      <w:proofErr w:type="spellStart"/>
+    <w:p>
       <w:r>
         <w:t>FetchType.Eager</w:t>
       </w:r>
-      <w:proofErr w:type="spellEnd"/>
     </w:p>
     <w:p>
       <w:r>
@@ -5533,11 +3558,9 @@
       </w:r>
     </w:p>
     <w:p>
-      <w:proofErr w:type="spellStart"/>
       <w:r>
         <w:t>FetchType.Lazy</w:t>
       </w:r>
-      <w:proofErr w:type="spellEnd"/>
     </w:p>
     <w:p>
       <w:r>

</xml_diff>

<commit_message>
Implemented product, along with valdations, relationships
</commit_message>
<xml_diff>
--- a/Ecommerce/src/main/resources/material.docx
+++ b/Ecommerce/src/main/resources/material.docx
@@ -104,7 +104,7 @@
         <w:tab/>
         <w:t xml:space="preserve">    </w:t>
       </w:r>
-      <w:hyperlink r:id="rId5" w:history="1">
+      <w:hyperlink r:id="rId6" w:history="1">
         <w:r>
           <w:rPr>
             <w:rStyle w:val="Hyperlink"/>
@@ -121,7 +121,7 @@
         <w:tab/>
         <w:t xml:space="preserve">    </w:t>
       </w:r>
-      <w:hyperlink r:id="rId6" w:history="1">
+      <w:hyperlink r:id="rId7" w:history="1">
         <w:r>
           <w:rPr>
             <w:rStyle w:val="Hyperlink"/>
@@ -439,7 +439,7 @@
                     </pic:cNvPicPr>
                   </pic:nvPicPr>
                   <pic:blipFill>
-                    <a:blip r:embed="rId7">
+                    <a:blip r:embed="rId8">
                       <a:extLst>
                         <a:ext uri="{28A0092B-C50C-407E-A947-70E740481C1C}">
                           <a14:useLocalDpi xmlns:a14="http://schemas.microsoft.com/office/drawing/2010/main" val="0"/>
@@ -3186,23 +3186,7 @@
         <w:t xml:space="preserve"> </w:t>
       </w:r>
       <w:r>
-        <w:t xml:space="preserve">foreign key </w:t>
-      </w:r>
-      <w:proofErr w:type="gramStart"/>
-      <w:r>
-        <w:t>column(s)</w:t>
-      </w:r>
-      <w:proofErr w:type="gramEnd"/>
-      <w:r>
-        <w:t xml:space="preserve"> in the join table that </w:t>
-      </w:r>
-      <w:proofErr w:type="gramStart"/>
-      <w:r>
-        <w:t>reference</w:t>
-      </w:r>
-      <w:proofErr w:type="gramEnd"/>
-      <w:r>
-        <w:t xml:space="preserve"> </w:t>
+        <w:t xml:space="preserve">foreign key column(s) in the join table that reference </w:t>
       </w:r>
       <w:r>
         <w:rPr>
@@ -3578,6 +3562,1051 @@
       </w:r>
     </w:p>
     <w:p/>
+    <w:p/>
+    <w:p/>
+    <w:p/>
+    <w:p/>
+    <w:p/>
+    <w:p/>
+    <w:p/>
+    <w:p/>
+    <w:p/>
+    <w:p/>
+    <w:p/>
+    <w:p/>
+    <w:p/>
+    <w:p>
+      <w:r>
+        <w:lastRenderedPageBreak/>
+        <w:t>Spring Security:</w:t>
+      </w:r>
+    </w:p>
+    <w:p>
+      <w:r>
+        <w:t>Authentication: Authentication proves who you are.</w:t>
+      </w:r>
+    </w:p>
+    <w:p>
+      <w:r>
+        <w:t>Authorization: Authorization is about what you are allowed to do after your authentication.</w:t>
+      </w:r>
+    </w:p>
+    <w:p/>
+    <w:p>
+      <w:r>
+        <w:t>Key security principles:</w:t>
+      </w:r>
+    </w:p>
+    <w:p>
+      <w:pPr>
+        <w:pStyle w:val="ListParagraph"/>
+        <w:numPr>
+          <w:ilvl w:val="1"/>
+          <w:numId w:val="35"/>
+        </w:numPr>
+      </w:pPr>
+      <w:r>
+        <w:t>Least Privilege</w:t>
+      </w:r>
+    </w:p>
+    <w:p>
+      <w:pPr>
+        <w:pStyle w:val="ListParagraph"/>
+        <w:numPr>
+          <w:ilvl w:val="1"/>
+          <w:numId w:val="35"/>
+        </w:numPr>
+      </w:pPr>
+      <w:r>
+        <w:t>Secure by design</w:t>
+      </w:r>
+    </w:p>
+    <w:p>
+      <w:pPr>
+        <w:pStyle w:val="ListParagraph"/>
+        <w:numPr>
+          <w:ilvl w:val="1"/>
+          <w:numId w:val="35"/>
+        </w:numPr>
+      </w:pPr>
+      <w:r>
+        <w:t>Fail-safe defaults</w:t>
+      </w:r>
+    </w:p>
+    <w:p>
+      <w:pPr>
+        <w:pStyle w:val="ListParagraph"/>
+        <w:numPr>
+          <w:ilvl w:val="1"/>
+          <w:numId w:val="35"/>
+        </w:numPr>
+      </w:pPr>
+      <w:r>
+        <w:t>Input Validation</w:t>
+      </w:r>
+    </w:p>
+    <w:p>
+      <w:pPr>
+        <w:pStyle w:val="ListParagraph"/>
+        <w:numPr>
+          <w:ilvl w:val="1"/>
+          <w:numId w:val="35"/>
+        </w:numPr>
+      </w:pPr>
+      <w:r>
+        <w:t>Auditing and logging</w:t>
+      </w:r>
+    </w:p>
+    <w:p>
+      <w:pPr>
+        <w:pStyle w:val="ListParagraph"/>
+        <w:numPr>
+          <w:ilvl w:val="1"/>
+          <w:numId w:val="35"/>
+        </w:numPr>
+      </w:pPr>
+      <w:r>
+        <w:t>Regular updates &amp; patch management</w:t>
+      </w:r>
+    </w:p>
+    <w:p/>
+    <w:p>
+      <w:r>
+        <w:t>Spring Security Architecture:</w:t>
+      </w:r>
+    </w:p>
+    <w:p>
+      <w:r>
+        <w:rPr>
+          <w:noProof/>
+        </w:rPr>
+        <w:drawing>
+          <wp:inline distT="0" distB="0" distL="0" distR="0" wp14:anchorId="0863299A" wp14:editId="0644A9B7">
+            <wp:extent cx="5196840" cy="3839887"/>
+            <wp:effectExtent l="0" t="0" r="3810" b="8255"/>
+            <wp:docPr id="1173833298" name="Picture 1"/>
+            <wp:cNvGraphicFramePr>
+              <a:graphicFrameLocks xmlns:a="http://schemas.openxmlformats.org/drawingml/2006/main" noChangeAspect="1"/>
+            </wp:cNvGraphicFramePr>
+            <a:graphic xmlns:a="http://schemas.openxmlformats.org/drawingml/2006/main">
+              <a:graphicData uri="http://schemas.openxmlformats.org/drawingml/2006/picture">
+                <pic:pic xmlns:pic="http://schemas.openxmlformats.org/drawingml/2006/picture">
+                  <pic:nvPicPr>
+                    <pic:cNvPr id="1173833298" name=""/>
+                    <pic:cNvPicPr/>
+                  </pic:nvPicPr>
+                  <pic:blipFill>
+                    <a:blip r:embed="rId9"/>
+                    <a:stretch>
+                      <a:fillRect/>
+                    </a:stretch>
+                  </pic:blipFill>
+                  <pic:spPr>
+                    <a:xfrm>
+                      <a:off x="0" y="0"/>
+                      <a:ext cx="5203493" cy="3844803"/>
+                    </a:xfrm>
+                    <a:prstGeom prst="rect">
+                      <a:avLst/>
+                    </a:prstGeom>
+                  </pic:spPr>
+                </pic:pic>
+              </a:graphicData>
+            </a:graphic>
+          </wp:inline>
+        </w:drawing>
+      </w:r>
+    </w:p>
+    <w:p>
+      <w:r>
+        <w:t xml:space="preserve">Request → Security Filter Chain → Authentication Filter → </w:t>
+      </w:r>
+      <w:proofErr w:type="spellStart"/>
+      <w:r>
+        <w:t>AuthenticationManager</w:t>
+      </w:r>
+      <w:proofErr w:type="spellEnd"/>
+      <w:r>
+        <w:t xml:space="preserve"> → </w:t>
+      </w:r>
+      <w:proofErr w:type="spellStart"/>
+      <w:r>
+        <w:t>AuthenticationProvider</w:t>
+      </w:r>
+      <w:proofErr w:type="spellEnd"/>
+      <w:r>
+        <w:t xml:space="preserve"> → </w:t>
+      </w:r>
+      <w:proofErr w:type="spellStart"/>
+      <w:r>
+        <w:t>UserDetailsService</w:t>
+      </w:r>
+      <w:proofErr w:type="spellEnd"/>
+      <w:r>
+        <w:t xml:space="preserve"> + </w:t>
+      </w:r>
+      <w:proofErr w:type="spellStart"/>
+      <w:r>
+        <w:t>PasswordEncoder</w:t>
+      </w:r>
+      <w:proofErr w:type="spellEnd"/>
+      <w:r>
+        <w:t xml:space="preserve"> → </w:t>
+      </w:r>
+      <w:proofErr w:type="spellStart"/>
+      <w:r>
+        <w:t>SecurityContext</w:t>
+      </w:r>
+      <w:proofErr w:type="spellEnd"/>
+      <w:r>
+        <w:t xml:space="preserve"> → Controller</w:t>
+      </w:r>
+      <w:r>
+        <w:t>.</w:t>
+      </w:r>
+    </w:p>
+    <w:p>
+      <w:r>
+        <w:lastRenderedPageBreak/>
+        <w:t xml:space="preserve">Initially </w:t>
+      </w:r>
+      <w:r>
+        <w:t xml:space="preserve">client sends a </w:t>
+      </w:r>
+      <w:r>
+        <w:t xml:space="preserve">HTTP request (ex: Frontend, UI, Postman API </w:t>
+      </w:r>
+      <w:r>
+        <w:t>etc...</w:t>
+      </w:r>
+      <w:r>
+        <w:t>)</w:t>
+      </w:r>
+      <w:r>
+        <w:t>. along with username and password.</w:t>
+      </w:r>
+    </w:p>
+    <w:p/>
+    <w:p>
+      <w:pPr>
+        <w:rPr>
+          <w:b/>
+          <w:bCs/>
+          <w:highlight w:val="green"/>
+        </w:rPr>
+      </w:pPr>
+      <w:r>
+        <w:rPr>
+          <w:b/>
+          <w:bCs/>
+          <w:highlight w:val="green"/>
+        </w:rPr>
+        <w:t>Filter chain:</w:t>
+      </w:r>
+    </w:p>
+    <w:p>
+      <w:r>
+        <w:t xml:space="preserve">A </w:t>
+      </w:r>
+      <w:r>
+        <w:rPr>
+          <w:b/>
+          <w:bCs/>
+        </w:rPr>
+        <w:t>Filter Chain</w:t>
+      </w:r>
+      <w:r>
+        <w:t xml:space="preserve"> is a sequence of security filters that process an HTTP request before it reaches your Spring MVC controller.</w:t>
+      </w:r>
+    </w:p>
+    <w:p>
+      <w:pPr>
+        <w:rPr>
+          <w:b/>
+          <w:bCs/>
+          <w:highlight w:val="green"/>
+        </w:rPr>
+      </w:pPr>
+      <w:r>
+        <w:rPr>
+          <w:b/>
+          <w:bCs/>
+          <w:highlight w:val="green"/>
+        </w:rPr>
+        <w:t xml:space="preserve">Authentication filter: </w:t>
+      </w:r>
+    </w:p>
+    <w:p>
+      <w:r>
+        <w:t xml:space="preserve">An </w:t>
+      </w:r>
+      <w:r>
+        <w:rPr>
+          <w:b/>
+          <w:bCs/>
+        </w:rPr>
+        <w:t>Authentication Filter</w:t>
+      </w:r>
+      <w:r>
+        <w:t xml:space="preserve"> extracts authentication information from the incoming request.</w:t>
+      </w:r>
+    </w:p>
+    <w:p>
+      <w:r>
+        <w:t xml:space="preserve">And it does not verify the password itself. This filter creates Authentication Object and delegates to </w:t>
+      </w:r>
+      <w:proofErr w:type="spellStart"/>
+      <w:r>
+        <w:t>AuthenticationManager</w:t>
+      </w:r>
+      <w:proofErr w:type="spellEnd"/>
+      <w:r>
+        <w:t>.</w:t>
+      </w:r>
+    </w:p>
+    <w:p>
+      <w:r>
+        <w:t xml:space="preserve">Request -&gt; </w:t>
+      </w:r>
+      <w:proofErr w:type="spellStart"/>
+      <w:r>
+        <w:t>AuthenticationObject</w:t>
+      </w:r>
+      <w:proofErr w:type="spellEnd"/>
+      <w:r>
+        <w:t xml:space="preserve"> -&gt; </w:t>
+      </w:r>
+      <w:proofErr w:type="spellStart"/>
+      <w:r>
+        <w:t>AuthenticationManager</w:t>
+      </w:r>
+      <w:proofErr w:type="spellEnd"/>
+    </w:p>
+    <w:p>
+      <w:proofErr w:type="spellStart"/>
+      <w:r>
+        <w:rPr>
+          <w:b/>
+          <w:bCs/>
+          <w:highlight w:val="green"/>
+        </w:rPr>
+        <w:t>AuthenticationManager</w:t>
+      </w:r>
+      <w:proofErr w:type="spellEnd"/>
+      <w:r>
+        <w:rPr>
+          <w:b/>
+          <w:bCs/>
+          <w:highlight w:val="green"/>
+        </w:rPr>
+        <w:t>:</w:t>
+      </w:r>
+      <w:r>
+        <w:rPr>
+          <w:b/>
+          <w:bCs/>
+        </w:rPr>
+        <w:t xml:space="preserve"> (</w:t>
+      </w:r>
+      <w:r>
+        <w:t>an interface)</w:t>
+      </w:r>
+    </w:p>
+    <w:p>
+      <w:proofErr w:type="spellStart"/>
+      <w:r>
+        <w:t>AuthenticationManager</w:t>
+      </w:r>
+      <w:proofErr w:type="spellEnd"/>
+      <w:r>
+        <w:t xml:space="preserve"> is responsible for coordinating the authentication process.</w:t>
+      </w:r>
+    </w:p>
+    <w:p>
+      <w:proofErr w:type="spellStart"/>
+      <w:r>
+        <w:t>ProviderManager.class</w:t>
+      </w:r>
+      <w:proofErr w:type="spellEnd"/>
+      <w:r>
+        <w:t xml:space="preserve"> implements the </w:t>
+      </w:r>
+      <w:proofErr w:type="spellStart"/>
+      <w:r>
+        <w:t>AuthenticationManager</w:t>
+      </w:r>
+      <w:proofErr w:type="spellEnd"/>
+      <w:r>
+        <w:t xml:space="preserve"> interface.</w:t>
+      </w:r>
+    </w:p>
+    <w:p>
+      <w:r>
+        <w:t xml:space="preserve">It uses the lone method authenticate() to authenticate the request. The authenticate() method performs the authentication and returns an Authentication Object on successful authentication or throw an </w:t>
+      </w:r>
+      <w:proofErr w:type="spellStart"/>
+      <w:r>
+        <w:t>AuthenticationException</w:t>
+      </w:r>
+      <w:proofErr w:type="spellEnd"/>
+      <w:r>
+        <w:t xml:space="preserve"> in case of authentication failure.</w:t>
+      </w:r>
+    </w:p>
+    <w:p>
+      <w:r>
+        <w:t xml:space="preserve">The process of authentication in this process is delegated to the </w:t>
+      </w:r>
+      <w:proofErr w:type="spellStart"/>
+      <w:r>
+        <w:t>AuthenticationProvider</w:t>
+      </w:r>
+      <w:proofErr w:type="spellEnd"/>
+      <w:r>
+        <w:t>.</w:t>
+      </w:r>
+    </w:p>
+    <w:p/>
+    <w:p>
+      <w:proofErr w:type="spellStart"/>
+      <w:r>
+        <w:rPr>
+          <w:highlight w:val="green"/>
+        </w:rPr>
+        <w:t>AuthenticationProvider</w:t>
+      </w:r>
+      <w:proofErr w:type="spellEnd"/>
+      <w:r>
+        <w:rPr>
+          <w:highlight w:val="green"/>
+        </w:rPr>
+        <w:t>:</w:t>
+      </w:r>
+    </w:p>
+    <w:p/>
+    <w:p>
+      <w:proofErr w:type="spellStart"/>
+      <w:r>
+        <w:t>Authentication</w:t>
+      </w:r>
+      <w:r>
+        <w:t>Provider</w:t>
+      </w:r>
+      <w:proofErr w:type="spellEnd"/>
+      <w:r>
+        <w:t xml:space="preserve"> (interface) -&gt; </w:t>
+      </w:r>
+      <w:proofErr w:type="spellStart"/>
+      <w:r>
+        <w:t>AbstractUserDetailsAuthenticationProvider</w:t>
+      </w:r>
+      <w:proofErr w:type="spellEnd"/>
+      <w:r>
+        <w:t xml:space="preserve"> (class) -&gt; </w:t>
+      </w:r>
+      <w:proofErr w:type="spellStart"/>
+      <w:r>
+        <w:t>DaoAuthenticationProvider</w:t>
+      </w:r>
+      <w:proofErr w:type="spellEnd"/>
+      <w:r>
+        <w:t>.</w:t>
+      </w:r>
+    </w:p>
+    <w:p/>
+    <w:p>
+      <w:r>
+        <w:t xml:space="preserve">The </w:t>
+      </w:r>
+      <w:proofErr w:type="spellStart"/>
+      <w:r>
+        <w:t>AuthenticationManager</w:t>
+      </w:r>
+      <w:proofErr w:type="spellEnd"/>
+      <w:r>
+        <w:t xml:space="preserve"> is implemented by the </w:t>
+      </w:r>
+      <w:proofErr w:type="spellStart"/>
+      <w:r>
+        <w:t>ProviderManager</w:t>
+      </w:r>
+      <w:proofErr w:type="spellEnd"/>
+      <w:r>
+        <w:t xml:space="preserve"> which delegates the process to one or more </w:t>
+      </w:r>
+      <w:proofErr w:type="spellStart"/>
+      <w:r>
+        <w:t>AuthenticationProvider</w:t>
+      </w:r>
+      <w:proofErr w:type="spellEnd"/>
+      <w:r>
+        <w:t xml:space="preserve"> instances. Any class implementing the </w:t>
+      </w:r>
+      <w:proofErr w:type="spellStart"/>
+      <w:r>
+        <w:t>AuthenticationProvider</w:t>
+      </w:r>
+      <w:proofErr w:type="spellEnd"/>
+      <w:r>
+        <w:t xml:space="preserve"> interface must implement the two methods authenticate() and supports().</w:t>
+      </w:r>
+    </w:p>
+    <w:p/>
+    <w:p>
+      <w:r>
+        <w:lastRenderedPageBreak/>
+        <w:t>support():</w:t>
+      </w:r>
+    </w:p>
+    <w:p>
+      <w:r>
+        <w:t xml:space="preserve">It is used to check if the particular authentication type is supported by our </w:t>
+      </w:r>
+      <w:proofErr w:type="spellStart"/>
+      <w:r>
+        <w:t>AuthenticationProvider</w:t>
+      </w:r>
+      <w:proofErr w:type="spellEnd"/>
+      <w:r>
+        <w:t xml:space="preserve"> implementation class. If it is supported it returns true or else false.</w:t>
+      </w:r>
+    </w:p>
+    <w:p/>
+    <w:p>
+      <w:r>
+        <w:t>authenticate():</w:t>
+      </w:r>
+    </w:p>
+    <w:p>
+      <w:r>
+        <w:t xml:space="preserve">If the authentication type is supported, the process of authentication is started. Here is this class can use the </w:t>
+      </w:r>
+      <w:proofErr w:type="spellStart"/>
+      <w:r>
+        <w:t>loadUserByUsername</w:t>
+      </w:r>
+      <w:proofErr w:type="spellEnd"/>
+      <w:r>
+        <w:t xml:space="preserve">() method of the </w:t>
+      </w:r>
+      <w:proofErr w:type="spellStart"/>
+      <w:r>
+        <w:rPr>
+          <w:b/>
+          <w:bCs/>
+        </w:rPr>
+        <w:t>UserDetailsService</w:t>
+      </w:r>
+      <w:proofErr w:type="spellEnd"/>
+      <w:r>
+        <w:t xml:space="preserve"> implementation. If the user is not found, it can throw a </w:t>
+      </w:r>
+      <w:proofErr w:type="spellStart"/>
+      <w:r>
+        <w:t>UsernameNotFoundException</w:t>
+      </w:r>
+      <w:proofErr w:type="spellEnd"/>
+      <w:r>
+        <w:t>.</w:t>
+      </w:r>
+    </w:p>
+    <w:p/>
+    <w:p>
+      <w:proofErr w:type="spellStart"/>
+      <w:r>
+        <w:t>onSucess</w:t>
+      </w:r>
+      <w:proofErr w:type="spellEnd"/>
+      <w:r>
+        <w:t xml:space="preserve">, it confirms creds with DB or </w:t>
+      </w:r>
+      <w:proofErr w:type="spellStart"/>
+      <w:r>
+        <w:t>inMemoryDB</w:t>
+      </w:r>
+      <w:proofErr w:type="spellEnd"/>
+      <w:r>
+        <w:t xml:space="preserve"> and returns the Authentication Object which will saves in </w:t>
+      </w:r>
+      <w:proofErr w:type="spellStart"/>
+      <w:r>
+        <w:t>SecurityContext</w:t>
+      </w:r>
+      <w:proofErr w:type="spellEnd"/>
+      <w:r>
+        <w:t>.</w:t>
+      </w:r>
+    </w:p>
+    <w:p/>
+    <w:p>
+      <w:pPr>
+        <w:rPr>
+          <w:b/>
+          <w:bCs/>
+        </w:rPr>
+      </w:pPr>
+      <w:proofErr w:type="spellStart"/>
+      <w:r>
+        <w:rPr>
+          <w:b/>
+          <w:bCs/>
+          <w:highlight w:val="green"/>
+        </w:rPr>
+        <w:t>UserDetailsService</w:t>
+      </w:r>
+      <w:proofErr w:type="spellEnd"/>
+      <w:r>
+        <w:rPr>
+          <w:b/>
+          <w:bCs/>
+          <w:highlight w:val="green"/>
+        </w:rPr>
+        <w:t>: (interface)</w:t>
+      </w:r>
+    </w:p>
+    <w:p>
+      <w:proofErr w:type="spellStart"/>
+      <w:r>
+        <w:t>UserDetailsService</w:t>
+      </w:r>
+      <w:proofErr w:type="spellEnd"/>
+      <w:r>
+        <w:t xml:space="preserve"> is a Spring Security interface responsible for loading user information.</w:t>
+      </w:r>
+    </w:p>
+    <w:p>
+      <w:r>
+        <w:t xml:space="preserve">Here we inject </w:t>
+      </w:r>
+      <w:proofErr w:type="spellStart"/>
+      <w:r>
+        <w:t>UserRepository</w:t>
+      </w:r>
+      <w:proofErr w:type="spellEnd"/>
+      <w:r>
+        <w:t xml:space="preserve"> and finds credentials in DB.</w:t>
+      </w:r>
+    </w:p>
+    <w:p>
+      <w:r>
+        <w:t xml:space="preserve">It uses </w:t>
+      </w:r>
+      <w:proofErr w:type="spellStart"/>
+      <w:r>
+        <w:rPr>
+          <w:highlight w:val="green"/>
+        </w:rPr>
+        <w:t>loadUserByUsername</w:t>
+      </w:r>
+      <w:proofErr w:type="spellEnd"/>
+      <w:r>
+        <w:rPr>
+          <w:highlight w:val="green"/>
+        </w:rPr>
+        <w:t>()</w:t>
+      </w:r>
+      <w:r>
+        <w:t xml:space="preserve"> method where we can provide our logic to fetch the user details for a user. The method will throw a </w:t>
+      </w:r>
+      <w:proofErr w:type="spellStart"/>
+      <w:r>
+        <w:t>UsernameNotFoundException</w:t>
+      </w:r>
+      <w:proofErr w:type="spellEnd"/>
+      <w:r>
+        <w:t xml:space="preserve"> if the user is not found.</w:t>
+      </w:r>
+    </w:p>
+    <w:p>
+      <w:pPr>
+        <w:rPr>
+          <w:highlight w:val="green"/>
+        </w:rPr>
+      </w:pPr>
+      <w:proofErr w:type="spellStart"/>
+      <w:r>
+        <w:rPr>
+          <w:highlight w:val="green"/>
+        </w:rPr>
+        <w:t>PasswordEncoder</w:t>
+      </w:r>
+      <w:proofErr w:type="spellEnd"/>
+      <w:r>
+        <w:rPr>
+          <w:highlight w:val="green"/>
+        </w:rPr>
+        <w:t xml:space="preserve">: </w:t>
+      </w:r>
+    </w:p>
+    <w:p>
+      <w:r>
+        <w:t xml:space="preserve">Until Spring Security 4, the use of </w:t>
+      </w:r>
+      <w:proofErr w:type="spellStart"/>
+      <w:r>
+        <w:t>PasswordEncoder</w:t>
+      </w:r>
+      <w:proofErr w:type="spellEnd"/>
+      <w:r>
+        <w:t xml:space="preserve"> was optional. The user could store plain text passwords using in-memory authentication. But Spring Security 5 has mandated the use of </w:t>
+      </w:r>
+      <w:proofErr w:type="spellStart"/>
+      <w:r>
+        <w:t>PasswordEncoder</w:t>
+      </w:r>
+      <w:proofErr w:type="spellEnd"/>
+      <w:r>
+        <w:t xml:space="preserve"> to store passwords.</w:t>
+      </w:r>
+    </w:p>
+    <w:p>
+      <w:pPr>
+        <w:rPr>
+          <w:highlight w:val="green"/>
+        </w:rPr>
+      </w:pPr>
+      <w:r>
+        <w:rPr>
+          <w:highlight w:val="green"/>
+        </w:rPr>
+        <w:t>Spring Security Context</w:t>
+      </w:r>
+    </w:p>
+    <w:p>
+      <w:r>
+        <w:t xml:space="preserve">This is where the details of the currently authenticated user are stored on successful authentication. The authentication object is then available throughout the application for the session. So, if we need the username or any other user details, we need to get the </w:t>
+      </w:r>
+      <w:proofErr w:type="spellStart"/>
+      <w:r>
+        <w:t>SecurityContext</w:t>
+      </w:r>
+      <w:proofErr w:type="spellEnd"/>
+      <w:r>
+        <w:t xml:space="preserve"> first. This is done with the </w:t>
+      </w:r>
+      <w:proofErr w:type="spellStart"/>
+      <w:r>
+        <w:t>SecurityContextHolder</w:t>
+      </w:r>
+      <w:proofErr w:type="spellEnd"/>
+      <w:r>
+        <w:t xml:space="preserve">, a helper class, which provides access to the security context. We can use the </w:t>
+      </w:r>
+      <w:proofErr w:type="spellStart"/>
+      <w:r>
+        <w:t>setAuthentication</w:t>
+      </w:r>
+      <w:proofErr w:type="spellEnd"/>
+      <w:r>
+        <w:t xml:space="preserve">() and </w:t>
+      </w:r>
+      <w:proofErr w:type="spellStart"/>
+      <w:r>
+        <w:t>getAuthentication</w:t>
+      </w:r>
+      <w:proofErr w:type="spellEnd"/>
+      <w:r>
+        <w:t>() methods for storing and retrieving the user details respectively.</w:t>
+      </w:r>
+    </w:p>
+    <w:p/>
+    <w:p>
+      <w:proofErr w:type="spellStart"/>
+      <w:r>
+        <w:rPr>
+          <w:highlight w:val="green"/>
+        </w:rPr>
+        <w:lastRenderedPageBreak/>
+        <w:t>InMemoryUserDetailsManager</w:t>
+      </w:r>
+      <w:proofErr w:type="spellEnd"/>
+      <w:r>
+        <w:rPr>
+          <w:highlight w:val="green"/>
+        </w:rPr>
+        <w:t>:</w:t>
+      </w:r>
+    </w:p>
+    <w:p>
+      <w:r>
+        <w:t xml:space="preserve">This is a class which implements </w:t>
+      </w:r>
+      <w:proofErr w:type="spellStart"/>
+      <w:r>
+        <w:t>userDetailsService</w:t>
+      </w:r>
+      <w:proofErr w:type="spellEnd"/>
+      <w:r>
+        <w:t xml:space="preserve"> interface, and this class is used to manage in memory credentials of users. Main purpose is for development and testing.</w:t>
+      </w:r>
+    </w:p>
+    <w:p/>
+    <w:p>
+      <w:proofErr w:type="spellStart"/>
+      <w:r>
+        <w:t>InMemoryUserDetailsManager</w:t>
+      </w:r>
+      <w:proofErr w:type="spellEnd"/>
+      <w:r>
+        <w:t>(user1, user2);</w:t>
+      </w:r>
+    </w:p>
+    <w:p/>
+    <w:p>
+      <w:r>
+        <w:t>We create customized security configurations to customize default security configurations.</w:t>
+      </w:r>
+    </w:p>
+    <w:p>
+      <w:r>
+        <w:t xml:space="preserve">In that class, I have created a </w:t>
+      </w:r>
+      <w:proofErr w:type="spellStart"/>
+      <w:r>
+        <w:t>UserDetailsService</w:t>
+      </w:r>
+      <w:proofErr w:type="spellEnd"/>
+      <w:r>
+        <w:t xml:space="preserve">() bean. In that bean I have created users with class User from spring security dependencies, this bean returns the </w:t>
+      </w:r>
+      <w:proofErr w:type="spellStart"/>
+      <w:r>
+        <w:t>InMemoryUserDetailsManager</w:t>
+      </w:r>
+      <w:proofErr w:type="spellEnd"/>
+      <w:r>
+        <w:t xml:space="preserve"> (class).</w:t>
+      </w:r>
+    </w:p>
+    <w:p/>
+    <w:p>
+      <w:r>
+        <w:t>There are multiple pre-built classes which implement the UserDetailService interface.</w:t>
+      </w:r>
+    </w:p>
+    <w:p/>
+    <w:p>
+      <w:r>
+        <w:t xml:space="preserve">I tried creating user credentials by creating </w:t>
+      </w:r>
+      <w:proofErr w:type="spellStart"/>
+      <w:r>
+        <w:t>UserDetailsService</w:t>
+      </w:r>
+      <w:proofErr w:type="spellEnd"/>
+      <w:r>
+        <w:t xml:space="preserve"> bean and returning </w:t>
+      </w:r>
+      <w:proofErr w:type="spellStart"/>
+      <w:r>
+        <w:t>InMemoryUserDetailsManager</w:t>
+      </w:r>
+      <w:proofErr w:type="spellEnd"/>
+      <w:r>
+        <w:t xml:space="preserve"> with User objects are parameter.</w:t>
+      </w:r>
+    </w:p>
+    <w:p>
+      <w:r>
+        <w:t>Application started successfully, but When I tries to send request, I have faced 401 unauthorized response, because since spring security 5, spring expecting password to be saved as encoded.</w:t>
+      </w:r>
+      <w:r>
+        <w:t xml:space="preserve"> We definitely include encoded tag along with password. This is where {encoded tag} comes in.</w:t>
+      </w:r>
+    </w:p>
+    <w:p>
+      <w:r>
+        <w:t>{</w:t>
+      </w:r>
+      <w:proofErr w:type="spellStart"/>
+      <w:r>
+        <w:t>noop</w:t>
+      </w:r>
+      <w:proofErr w:type="spellEnd"/>
+      <w:r>
+        <w:t xml:space="preserve">}: </w:t>
+      </w:r>
+    </w:p>
+    <w:p>
+      <w:r>
+        <w:t>{</w:t>
+      </w:r>
+      <w:proofErr w:type="spellStart"/>
+      <w:r>
+        <w:t>noop</w:t>
+      </w:r>
+      <w:proofErr w:type="spellEnd"/>
+      <w:r>
+        <w:t xml:space="preserve">} means the password is stored </w:t>
+      </w:r>
+      <w:r>
+        <w:rPr>
+          <w:b/>
+          <w:bCs/>
+        </w:rPr>
+        <w:t>and compared as plain text</w:t>
+      </w:r>
+      <w:r>
+        <w:t>.</w:t>
+      </w:r>
+    </w:p>
+    <w:p>
+      <w:pPr>
+        <w:pStyle w:val="ListParagraph"/>
+        <w:numPr>
+          <w:ilvl w:val="1"/>
+          <w:numId w:val="35"/>
+        </w:numPr>
+      </w:pPr>
+      <w:r>
+        <w:t>Since Spring Security 5, passwords are expected to be stored in the format</w:t>
+      </w:r>
+      <w:r>
+        <w:t>.</w:t>
+      </w:r>
+    </w:p>
+    <w:p>
+      <w:pPr>
+        <w:pStyle w:val="ListParagraph"/>
+        <w:numPr>
+          <w:ilvl w:val="1"/>
+          <w:numId w:val="35"/>
+        </w:numPr>
+      </w:pPr>
+      <w:r>
+        <w:t xml:space="preserve">The prefix in curly braces tells Spring Security </w:t>
+      </w:r>
+      <w:r>
+        <w:rPr>
+          <w:b/>
+          <w:bCs/>
+        </w:rPr>
+        <w:t xml:space="preserve">which </w:t>
+      </w:r>
+      <w:proofErr w:type="spellStart"/>
+      <w:r>
+        <w:rPr>
+          <w:b/>
+          <w:bCs/>
+        </w:rPr>
+        <w:t>PasswordEncoder</w:t>
+      </w:r>
+      <w:proofErr w:type="spellEnd"/>
+      <w:r>
+        <w:rPr>
+          <w:b/>
+          <w:bCs/>
+        </w:rPr>
+        <w:t xml:space="preserve"> to use</w:t>
+      </w:r>
+      <w:r>
+        <w:t xml:space="preserve"> to validate that password.</w:t>
+      </w:r>
+    </w:p>
+    <w:p>
+      <w:r>
+        <w:t xml:space="preserve">Ex: </w:t>
+      </w:r>
+      <w:r>
+        <w:t>password("{</w:t>
+      </w:r>
+      <w:proofErr w:type="spellStart"/>
+      <w:r>
+        <w:t>noop</w:t>
+      </w:r>
+      <w:proofErr w:type="spellEnd"/>
+      <w:r>
+        <w:t>}admin")</w:t>
+      </w:r>
+    </w:p>
+    <w:p>
+      <w:r>
+        <w:t xml:space="preserve">Note: using </w:t>
+      </w:r>
+      <w:proofErr w:type="spellStart"/>
+      <w:r>
+        <w:t>noop</w:t>
+      </w:r>
+      <w:proofErr w:type="spellEnd"/>
+      <w:r>
+        <w:t xml:space="preserve"> is not good production practice.</w:t>
+      </w:r>
+    </w:p>
+    <w:p/>
+    <w:p/>
+    <w:p/>
+    <w:p>
+      <w:r>
+        <w:lastRenderedPageBreak/>
+        <w:t>Role-based Authorization:</w:t>
+      </w:r>
+    </w:p>
+    <w:p/>
+    <w:p>
+      <w:r>
+        <w:t>@EnableMethodSecurity:</w:t>
+      </w:r>
+      <w:r>
+        <w:br/>
+      </w:r>
+      <w:r>
+        <w:t>This annotation</w:t>
+      </w:r>
+      <w:r>
+        <w:t xml:space="preserve"> activates method-level security in Spring Boot, allowing fine-grained access control on individual methods using annotations like @PreAuthorize, @PostAuthorize, @Secured, and @RolesAllowed.</w:t>
+      </w:r>
+    </w:p>
+    <w:p/>
+    <w:p>
+      <w:r>
+        <w:t>@PreAuthorize:</w:t>
+      </w:r>
+      <w:r>
+        <w:br/>
+        <w:t xml:space="preserve">This Annotation </w:t>
+      </w:r>
+      <w:r>
+        <w:t>is used</w:t>
+      </w:r>
+      <w:r>
+        <w:t xml:space="preserve"> to enforce method-level security. It evaluates a Spring Expression Language (</w:t>
+      </w:r>
+      <w:proofErr w:type="spellStart"/>
+      <w:r>
+        <w:t>SpEL</w:t>
+      </w:r>
+      <w:proofErr w:type="spellEnd"/>
+      <w:r>
+        <w:t xml:space="preserve">) expression before a method </w:t>
+      </w:r>
+      <w:r>
+        <w:t>is executed</w:t>
+      </w:r>
+      <w:r>
+        <w:t xml:space="preserve">. If the logged-in user does not meet the criteria, Spring Security throws an </w:t>
+      </w:r>
+      <w:r>
+        <w:rPr>
+          <w:highlight w:val="yellow"/>
+        </w:rPr>
+        <w:t>AccessDeniedException</w:t>
+      </w:r>
+      <w:r>
+        <w:t xml:space="preserve"> and blocks execution</w:t>
+      </w:r>
+    </w:p>
+    <w:p/>
+    <w:p>
+      <w:r>
+        <w:t>This annotation did not work if you don’t mention @EnableMethodSecurity at Configuration class.</w:t>
+      </w:r>
+    </w:p>
+    <w:p/>
+    <w:p>
+      <w:r>
+        <w:t>Configuring H2 Database in Spring security.</w:t>
+      </w:r>
+    </w:p>
     <w:p/>
     <w:p/>
     <w:p/>
@@ -4866,6 +5895,119 @@
     </w:lvl>
   </w:abstractNum>
   <w:abstractNum w:abstractNumId="9" w15:restartNumberingAfterBreak="0">
+    <w:nsid w:val="19D11E78"/>
+    <w:multiLevelType w:val="hybridMultilevel"/>
+    <w:tmpl w:val="22BCE456"/>
+    <w:lvl w:ilvl="0" w:tplc="04090001">
+      <w:start w:val="1"/>
+      <w:numFmt w:val="bullet"/>
+      <w:lvlText w:val=""/>
+      <w:lvlJc w:val="left"/>
+      <w:pPr>
+        <w:ind w:left="720" w:hanging="360"/>
+      </w:pPr>
+      <w:rPr>
+        <w:rFonts w:ascii="Symbol" w:hAnsi="Symbol" w:hint="default"/>
+      </w:rPr>
+    </w:lvl>
+    <w:lvl w:ilvl="1" w:tplc="04090003" w:tentative="1">
+      <w:start w:val="1"/>
+      <w:numFmt w:val="bullet"/>
+      <w:lvlText w:val="o"/>
+      <w:lvlJc w:val="left"/>
+      <w:pPr>
+        <w:ind w:left="1440" w:hanging="360"/>
+      </w:pPr>
+      <w:rPr>
+        <w:rFonts w:ascii="Courier New" w:hAnsi="Courier New" w:cs="Courier New" w:hint="default"/>
+      </w:rPr>
+    </w:lvl>
+    <w:lvl w:ilvl="2" w:tplc="04090005" w:tentative="1">
+      <w:start w:val="1"/>
+      <w:numFmt w:val="bullet"/>
+      <w:lvlText w:val=""/>
+      <w:lvlJc w:val="left"/>
+      <w:pPr>
+        <w:ind w:left="2160" w:hanging="360"/>
+      </w:pPr>
+      <w:rPr>
+        <w:rFonts w:ascii="Wingdings" w:hAnsi="Wingdings" w:hint="default"/>
+      </w:rPr>
+    </w:lvl>
+    <w:lvl w:ilvl="3" w:tplc="04090001" w:tentative="1">
+      <w:start w:val="1"/>
+      <w:numFmt w:val="bullet"/>
+      <w:lvlText w:val=""/>
+      <w:lvlJc w:val="left"/>
+      <w:pPr>
+        <w:ind w:left="2880" w:hanging="360"/>
+      </w:pPr>
+      <w:rPr>
+        <w:rFonts w:ascii="Symbol" w:hAnsi="Symbol" w:hint="default"/>
+      </w:rPr>
+    </w:lvl>
+    <w:lvl w:ilvl="4" w:tplc="04090003" w:tentative="1">
+      <w:start w:val="1"/>
+      <w:numFmt w:val="bullet"/>
+      <w:lvlText w:val="o"/>
+      <w:lvlJc w:val="left"/>
+      <w:pPr>
+        <w:ind w:left="3600" w:hanging="360"/>
+      </w:pPr>
+      <w:rPr>
+        <w:rFonts w:ascii="Courier New" w:hAnsi="Courier New" w:cs="Courier New" w:hint="default"/>
+      </w:rPr>
+    </w:lvl>
+    <w:lvl w:ilvl="5" w:tplc="04090005" w:tentative="1">
+      <w:start w:val="1"/>
+      <w:numFmt w:val="bullet"/>
+      <w:lvlText w:val=""/>
+      <w:lvlJc w:val="left"/>
+      <w:pPr>
+        <w:ind w:left="4320" w:hanging="360"/>
+      </w:pPr>
+      <w:rPr>
+        <w:rFonts w:ascii="Wingdings" w:hAnsi="Wingdings" w:hint="default"/>
+      </w:rPr>
+    </w:lvl>
+    <w:lvl w:ilvl="6" w:tplc="04090001" w:tentative="1">
+      <w:start w:val="1"/>
+      <w:numFmt w:val="bullet"/>
+      <w:lvlText w:val=""/>
+      <w:lvlJc w:val="left"/>
+      <w:pPr>
+        <w:ind w:left="5040" w:hanging="360"/>
+      </w:pPr>
+      <w:rPr>
+        <w:rFonts w:ascii="Symbol" w:hAnsi="Symbol" w:hint="default"/>
+      </w:rPr>
+    </w:lvl>
+    <w:lvl w:ilvl="7" w:tplc="04090003" w:tentative="1">
+      <w:start w:val="1"/>
+      <w:numFmt w:val="bullet"/>
+      <w:lvlText w:val="o"/>
+      <w:lvlJc w:val="left"/>
+      <w:pPr>
+        <w:ind w:left="5760" w:hanging="360"/>
+      </w:pPr>
+      <w:rPr>
+        <w:rFonts w:ascii="Courier New" w:hAnsi="Courier New" w:cs="Courier New" w:hint="default"/>
+      </w:rPr>
+    </w:lvl>
+    <w:lvl w:ilvl="8" w:tplc="04090005" w:tentative="1">
+      <w:start w:val="1"/>
+      <w:numFmt w:val="bullet"/>
+      <w:lvlText w:val=""/>
+      <w:lvlJc w:val="left"/>
+      <w:pPr>
+        <w:ind w:left="6480" w:hanging="360"/>
+      </w:pPr>
+      <w:rPr>
+        <w:rFonts w:ascii="Wingdings" w:hAnsi="Wingdings" w:hint="default"/>
+      </w:rPr>
+    </w:lvl>
+  </w:abstractNum>
+  <w:abstractNum w:abstractNumId="10" w15:restartNumberingAfterBreak="0">
     <w:nsid w:val="1A154F06"/>
     <w:multiLevelType w:val="multilevel"/>
     <w:tmpl w:val="AF2E1374"/>
@@ -4978,7 +6120,7 @@
       </w:pPr>
     </w:lvl>
   </w:abstractNum>
-  <w:abstractNum w:abstractNumId="10" w15:restartNumberingAfterBreak="0">
+  <w:abstractNum w:abstractNumId="11" w15:restartNumberingAfterBreak="0">
     <w:nsid w:val="1C7A22D7"/>
     <w:multiLevelType w:val="multilevel"/>
     <w:tmpl w:val="B7E450B2"/>
@@ -5127,7 +6269,7 @@
       </w:rPr>
     </w:lvl>
   </w:abstractNum>
-  <w:abstractNum w:abstractNumId="11" w15:restartNumberingAfterBreak="0">
+  <w:abstractNum w:abstractNumId="12" w15:restartNumberingAfterBreak="0">
     <w:nsid w:val="1CB45F58"/>
     <w:multiLevelType w:val="multilevel"/>
     <w:tmpl w:val="F410D256"/>
@@ -5240,7 +6382,7 @@
       </w:pPr>
     </w:lvl>
   </w:abstractNum>
-  <w:abstractNum w:abstractNumId="12" w15:restartNumberingAfterBreak="0">
+  <w:abstractNum w:abstractNumId="13" w15:restartNumberingAfterBreak="0">
     <w:nsid w:val="22636940"/>
     <w:multiLevelType w:val="multilevel"/>
     <w:tmpl w:val="190A1894"/>
@@ -5389,7 +6531,7 @@
       </w:rPr>
     </w:lvl>
   </w:abstractNum>
-  <w:abstractNum w:abstractNumId="13" w15:restartNumberingAfterBreak="0">
+  <w:abstractNum w:abstractNumId="14" w15:restartNumberingAfterBreak="0">
     <w:nsid w:val="23674F82"/>
     <w:multiLevelType w:val="multilevel"/>
     <w:tmpl w:val="FA846380"/>
@@ -5538,7 +6680,7 @@
       </w:rPr>
     </w:lvl>
   </w:abstractNum>
-  <w:abstractNum w:abstractNumId="14" w15:restartNumberingAfterBreak="0">
+  <w:abstractNum w:abstractNumId="15" w15:restartNumberingAfterBreak="0">
     <w:nsid w:val="25067F56"/>
     <w:multiLevelType w:val="hybridMultilevel"/>
     <w:tmpl w:val="B5D64DE0"/>
@@ -5627,7 +6769,7 @@
       </w:pPr>
     </w:lvl>
   </w:abstractNum>
-  <w:abstractNum w:abstractNumId="15" w15:restartNumberingAfterBreak="0">
+  <w:abstractNum w:abstractNumId="16" w15:restartNumberingAfterBreak="0">
     <w:nsid w:val="258932B7"/>
     <w:multiLevelType w:val="multilevel"/>
     <w:tmpl w:val="8A7887A2"/>
@@ -5776,7 +6918,120 @@
       </w:rPr>
     </w:lvl>
   </w:abstractNum>
-  <w:abstractNum w:abstractNumId="16" w15:restartNumberingAfterBreak="0">
+  <w:abstractNum w:abstractNumId="17" w15:restartNumberingAfterBreak="0">
+    <w:nsid w:val="26FE1982"/>
+    <w:multiLevelType w:val="hybridMultilevel"/>
+    <w:tmpl w:val="B01CD4C4"/>
+    <w:lvl w:ilvl="0" w:tplc="04090001">
+      <w:start w:val="1"/>
+      <w:numFmt w:val="bullet"/>
+      <w:lvlText w:val=""/>
+      <w:lvlJc w:val="left"/>
+      <w:pPr>
+        <w:ind w:left="360" w:hanging="360"/>
+      </w:pPr>
+      <w:rPr>
+        <w:rFonts w:ascii="Symbol" w:hAnsi="Symbol" w:hint="default"/>
+      </w:rPr>
+    </w:lvl>
+    <w:lvl w:ilvl="1" w:tplc="04090003" w:tentative="1">
+      <w:start w:val="1"/>
+      <w:numFmt w:val="bullet"/>
+      <w:lvlText w:val="o"/>
+      <w:lvlJc w:val="left"/>
+      <w:pPr>
+        <w:ind w:left="1080" w:hanging="360"/>
+      </w:pPr>
+      <w:rPr>
+        <w:rFonts w:ascii="Courier New" w:hAnsi="Courier New" w:cs="Courier New" w:hint="default"/>
+      </w:rPr>
+    </w:lvl>
+    <w:lvl w:ilvl="2" w:tplc="04090005" w:tentative="1">
+      <w:start w:val="1"/>
+      <w:numFmt w:val="bullet"/>
+      <w:lvlText w:val=""/>
+      <w:lvlJc w:val="left"/>
+      <w:pPr>
+        <w:ind w:left="1800" w:hanging="360"/>
+      </w:pPr>
+      <w:rPr>
+        <w:rFonts w:ascii="Wingdings" w:hAnsi="Wingdings" w:hint="default"/>
+      </w:rPr>
+    </w:lvl>
+    <w:lvl w:ilvl="3" w:tplc="04090001" w:tentative="1">
+      <w:start w:val="1"/>
+      <w:numFmt w:val="bullet"/>
+      <w:lvlText w:val=""/>
+      <w:lvlJc w:val="left"/>
+      <w:pPr>
+        <w:ind w:left="2520" w:hanging="360"/>
+      </w:pPr>
+      <w:rPr>
+        <w:rFonts w:ascii="Symbol" w:hAnsi="Symbol" w:hint="default"/>
+      </w:rPr>
+    </w:lvl>
+    <w:lvl w:ilvl="4" w:tplc="04090003" w:tentative="1">
+      <w:start w:val="1"/>
+      <w:numFmt w:val="bullet"/>
+      <w:lvlText w:val="o"/>
+      <w:lvlJc w:val="left"/>
+      <w:pPr>
+        <w:ind w:left="3240" w:hanging="360"/>
+      </w:pPr>
+      <w:rPr>
+        <w:rFonts w:ascii="Courier New" w:hAnsi="Courier New" w:cs="Courier New" w:hint="default"/>
+      </w:rPr>
+    </w:lvl>
+    <w:lvl w:ilvl="5" w:tplc="04090005" w:tentative="1">
+      <w:start w:val="1"/>
+      <w:numFmt w:val="bullet"/>
+      <w:lvlText w:val=""/>
+      <w:lvlJc w:val="left"/>
+      <w:pPr>
+        <w:ind w:left="3960" w:hanging="360"/>
+      </w:pPr>
+      <w:rPr>
+        <w:rFonts w:ascii="Wingdings" w:hAnsi="Wingdings" w:hint="default"/>
+      </w:rPr>
+    </w:lvl>
+    <w:lvl w:ilvl="6" w:tplc="04090001" w:tentative="1">
+      <w:start w:val="1"/>
+      <w:numFmt w:val="bullet"/>
+      <w:lvlText w:val=""/>
+      <w:lvlJc w:val="left"/>
+      <w:pPr>
+        <w:ind w:left="4680" w:hanging="360"/>
+      </w:pPr>
+      <w:rPr>
+        <w:rFonts w:ascii="Symbol" w:hAnsi="Symbol" w:hint="default"/>
+      </w:rPr>
+    </w:lvl>
+    <w:lvl w:ilvl="7" w:tplc="04090003" w:tentative="1">
+      <w:start w:val="1"/>
+      <w:numFmt w:val="bullet"/>
+      <w:lvlText w:val="o"/>
+      <w:lvlJc w:val="left"/>
+      <w:pPr>
+        <w:ind w:left="5400" w:hanging="360"/>
+      </w:pPr>
+      <w:rPr>
+        <w:rFonts w:ascii="Courier New" w:hAnsi="Courier New" w:cs="Courier New" w:hint="default"/>
+      </w:rPr>
+    </w:lvl>
+    <w:lvl w:ilvl="8" w:tplc="04090005" w:tentative="1">
+      <w:start w:val="1"/>
+      <w:numFmt w:val="bullet"/>
+      <w:lvlText w:val=""/>
+      <w:lvlJc w:val="left"/>
+      <w:pPr>
+        <w:ind w:left="6120" w:hanging="360"/>
+      </w:pPr>
+      <w:rPr>
+        <w:rFonts w:ascii="Wingdings" w:hAnsi="Wingdings" w:hint="default"/>
+      </w:rPr>
+    </w:lvl>
+  </w:abstractNum>
+  <w:abstractNum w:abstractNumId="18" w15:restartNumberingAfterBreak="0">
     <w:nsid w:val="295E33E6"/>
     <w:multiLevelType w:val="multilevel"/>
     <w:tmpl w:val="8F9E3000"/>
@@ -5925,7 +7180,7 @@
       </w:rPr>
     </w:lvl>
   </w:abstractNum>
-  <w:abstractNum w:abstractNumId="17" w15:restartNumberingAfterBreak="0">
+  <w:abstractNum w:abstractNumId="19" w15:restartNumberingAfterBreak="0">
     <w:nsid w:val="2B620CA2"/>
     <w:multiLevelType w:val="multilevel"/>
     <w:tmpl w:val="CF1AA116"/>
@@ -6074,7 +7329,7 @@
       </w:rPr>
     </w:lvl>
   </w:abstractNum>
-  <w:abstractNum w:abstractNumId="18" w15:restartNumberingAfterBreak="0">
+  <w:abstractNum w:abstractNumId="20" w15:restartNumberingAfterBreak="0">
     <w:nsid w:val="2C475D0D"/>
     <w:multiLevelType w:val="multilevel"/>
     <w:tmpl w:val="04E8B9B0"/>
@@ -6223,7 +7478,7 @@
       </w:rPr>
     </w:lvl>
   </w:abstractNum>
-  <w:abstractNum w:abstractNumId="19" w15:restartNumberingAfterBreak="0">
+  <w:abstractNum w:abstractNumId="21" w15:restartNumberingAfterBreak="0">
     <w:nsid w:val="2D5D7EB3"/>
     <w:multiLevelType w:val="multilevel"/>
     <w:tmpl w:val="F8464E06"/>
@@ -6336,7 +7591,7 @@
       </w:pPr>
     </w:lvl>
   </w:abstractNum>
-  <w:abstractNum w:abstractNumId="20" w15:restartNumberingAfterBreak="0">
+  <w:abstractNum w:abstractNumId="22" w15:restartNumberingAfterBreak="0">
     <w:nsid w:val="2E8B44A7"/>
     <w:multiLevelType w:val="hybridMultilevel"/>
     <w:tmpl w:val="003C4F1A"/>
@@ -6449,7 +7704,7 @@
       </w:rPr>
     </w:lvl>
   </w:abstractNum>
-  <w:abstractNum w:abstractNumId="21" w15:restartNumberingAfterBreak="0">
+  <w:abstractNum w:abstractNumId="23" w15:restartNumberingAfterBreak="0">
     <w:nsid w:val="33CB2316"/>
     <w:multiLevelType w:val="multilevel"/>
     <w:tmpl w:val="6AC23518"/>
@@ -6598,7 +7853,7 @@
       </w:rPr>
     </w:lvl>
   </w:abstractNum>
-  <w:abstractNum w:abstractNumId="22" w15:restartNumberingAfterBreak="0">
+  <w:abstractNum w:abstractNumId="24" w15:restartNumberingAfterBreak="0">
     <w:nsid w:val="3C9E2897"/>
     <w:multiLevelType w:val="multilevel"/>
     <w:tmpl w:val="A740C8CE"/>
@@ -6747,7 +8002,7 @@
       </w:rPr>
     </w:lvl>
   </w:abstractNum>
-  <w:abstractNum w:abstractNumId="23" w15:restartNumberingAfterBreak="0">
+  <w:abstractNum w:abstractNumId="25" w15:restartNumberingAfterBreak="0">
     <w:nsid w:val="3F804D67"/>
     <w:multiLevelType w:val="multilevel"/>
     <w:tmpl w:val="706E918E"/>
@@ -6896,7 +8151,7 @@
       </w:rPr>
     </w:lvl>
   </w:abstractNum>
-  <w:abstractNum w:abstractNumId="24" w15:restartNumberingAfterBreak="0">
+  <w:abstractNum w:abstractNumId="26" w15:restartNumberingAfterBreak="0">
     <w:nsid w:val="3FAE43D4"/>
     <w:multiLevelType w:val="multilevel"/>
     <w:tmpl w:val="C074C1D8"/>
@@ -7045,7 +8300,7 @@
       </w:rPr>
     </w:lvl>
   </w:abstractNum>
-  <w:abstractNum w:abstractNumId="25" w15:restartNumberingAfterBreak="0">
+  <w:abstractNum w:abstractNumId="27" w15:restartNumberingAfterBreak="0">
     <w:nsid w:val="40251C9F"/>
     <w:multiLevelType w:val="multilevel"/>
     <w:tmpl w:val="901C151E"/>
@@ -7194,7 +8449,7 @@
       </w:rPr>
     </w:lvl>
   </w:abstractNum>
-  <w:abstractNum w:abstractNumId="26" w15:restartNumberingAfterBreak="0">
+  <w:abstractNum w:abstractNumId="28" w15:restartNumberingAfterBreak="0">
     <w:nsid w:val="44441E7D"/>
     <w:multiLevelType w:val="multilevel"/>
     <w:tmpl w:val="B9E88734"/>
@@ -7307,7 +8562,7 @@
       </w:pPr>
     </w:lvl>
   </w:abstractNum>
-  <w:abstractNum w:abstractNumId="27" w15:restartNumberingAfterBreak="0">
+  <w:abstractNum w:abstractNumId="29" w15:restartNumberingAfterBreak="0">
     <w:nsid w:val="45620F3C"/>
     <w:multiLevelType w:val="multilevel"/>
     <w:tmpl w:val="470E42CA"/>
@@ -7456,7 +8711,7 @@
       </w:rPr>
     </w:lvl>
   </w:abstractNum>
-  <w:abstractNum w:abstractNumId="28" w15:restartNumberingAfterBreak="0">
+  <w:abstractNum w:abstractNumId="30" w15:restartNumberingAfterBreak="0">
     <w:nsid w:val="4B623F45"/>
     <w:multiLevelType w:val="multilevel"/>
     <w:tmpl w:val="F40C0B64"/>
@@ -7569,7 +8824,7 @@
       </w:pPr>
     </w:lvl>
   </w:abstractNum>
-  <w:abstractNum w:abstractNumId="29" w15:restartNumberingAfterBreak="0">
+  <w:abstractNum w:abstractNumId="31" w15:restartNumberingAfterBreak="0">
     <w:nsid w:val="4C8D7A50"/>
     <w:multiLevelType w:val="multilevel"/>
     <w:tmpl w:val="3ED4C582"/>
@@ -7718,7 +8973,7 @@
       </w:rPr>
     </w:lvl>
   </w:abstractNum>
-  <w:abstractNum w:abstractNumId="30" w15:restartNumberingAfterBreak="0">
+  <w:abstractNum w:abstractNumId="32" w15:restartNumberingAfterBreak="0">
     <w:nsid w:val="4CA402C1"/>
     <w:multiLevelType w:val="multilevel"/>
     <w:tmpl w:val="A8BEFC02"/>
@@ -7867,7 +9122,7 @@
       </w:rPr>
     </w:lvl>
   </w:abstractNum>
-  <w:abstractNum w:abstractNumId="31" w15:restartNumberingAfterBreak="0">
+  <w:abstractNum w:abstractNumId="33" w15:restartNumberingAfterBreak="0">
     <w:nsid w:val="512A79B8"/>
     <w:multiLevelType w:val="multilevel"/>
     <w:tmpl w:val="D332D6CC"/>
@@ -8016,7 +9271,7 @@
       </w:rPr>
     </w:lvl>
   </w:abstractNum>
-  <w:abstractNum w:abstractNumId="32" w15:restartNumberingAfterBreak="0">
+  <w:abstractNum w:abstractNumId="34" w15:restartNumberingAfterBreak="0">
     <w:nsid w:val="5B965A77"/>
     <w:multiLevelType w:val="multilevel"/>
     <w:tmpl w:val="BD9C82EE"/>
@@ -8165,7 +9420,7 @@
       </w:rPr>
     </w:lvl>
   </w:abstractNum>
-  <w:abstractNum w:abstractNumId="33" w15:restartNumberingAfterBreak="0">
+  <w:abstractNum w:abstractNumId="35" w15:restartNumberingAfterBreak="0">
     <w:nsid w:val="5D247814"/>
     <w:multiLevelType w:val="multilevel"/>
     <w:tmpl w:val="D1DA57DC"/>
@@ -8314,7 +9569,7 @@
       </w:rPr>
     </w:lvl>
   </w:abstractNum>
-  <w:abstractNum w:abstractNumId="34" w15:restartNumberingAfterBreak="0">
+  <w:abstractNum w:abstractNumId="36" w15:restartNumberingAfterBreak="0">
     <w:nsid w:val="639064B2"/>
     <w:multiLevelType w:val="multilevel"/>
     <w:tmpl w:val="9D622B0A"/>
@@ -8427,7 +9682,7 @@
       </w:pPr>
     </w:lvl>
   </w:abstractNum>
-  <w:abstractNum w:abstractNumId="35" w15:restartNumberingAfterBreak="0">
+  <w:abstractNum w:abstractNumId="37" w15:restartNumberingAfterBreak="0">
     <w:nsid w:val="6745206A"/>
     <w:multiLevelType w:val="multilevel"/>
     <w:tmpl w:val="8C342222"/>
@@ -8539,7 +9794,7 @@
       </w:pPr>
     </w:lvl>
   </w:abstractNum>
-  <w:abstractNum w:abstractNumId="36" w15:restartNumberingAfterBreak="0">
+  <w:abstractNum w:abstractNumId="38" w15:restartNumberingAfterBreak="0">
     <w:nsid w:val="6B6C53DF"/>
     <w:multiLevelType w:val="multilevel"/>
     <w:tmpl w:val="B0DC7CD2"/>
@@ -8688,7 +9943,7 @@
       </w:rPr>
     </w:lvl>
   </w:abstractNum>
-  <w:abstractNum w:abstractNumId="37" w15:restartNumberingAfterBreak="0">
+  <w:abstractNum w:abstractNumId="39" w15:restartNumberingAfterBreak="0">
     <w:nsid w:val="6C7C0D7D"/>
     <w:multiLevelType w:val="multilevel"/>
     <w:tmpl w:val="5FEC7DDC"/>
@@ -8801,7 +10056,7 @@
       </w:pPr>
     </w:lvl>
   </w:abstractNum>
-  <w:abstractNum w:abstractNumId="38" w15:restartNumberingAfterBreak="0">
+  <w:abstractNum w:abstractNumId="40" w15:restartNumberingAfterBreak="0">
     <w:nsid w:val="6F1C5C3D"/>
     <w:multiLevelType w:val="multilevel"/>
     <w:tmpl w:val="C3D8C85C"/>
@@ -8950,7 +10205,7 @@
       </w:rPr>
     </w:lvl>
   </w:abstractNum>
-  <w:abstractNum w:abstractNumId="39" w15:restartNumberingAfterBreak="0">
+  <w:abstractNum w:abstractNumId="41" w15:restartNumberingAfterBreak="0">
     <w:nsid w:val="70EB4336"/>
     <w:multiLevelType w:val="multilevel"/>
     <w:tmpl w:val="5A98E152"/>
@@ -9063,7 +10318,7 @@
       </w:pPr>
     </w:lvl>
   </w:abstractNum>
-  <w:abstractNum w:abstractNumId="40" w15:restartNumberingAfterBreak="0">
+  <w:abstractNum w:abstractNumId="42" w15:restartNumberingAfterBreak="0">
     <w:nsid w:val="75034FCF"/>
     <w:multiLevelType w:val="multilevel"/>
     <w:tmpl w:val="078E21CE"/>
@@ -9212,7 +10467,7 @@
       </w:rPr>
     </w:lvl>
   </w:abstractNum>
-  <w:abstractNum w:abstractNumId="41" w15:restartNumberingAfterBreak="0">
+  <w:abstractNum w:abstractNumId="43" w15:restartNumberingAfterBreak="0">
     <w:nsid w:val="75994B14"/>
     <w:multiLevelType w:val="multilevel"/>
     <w:tmpl w:val="E4F6367E"/>
@@ -9361,7 +10616,7 @@
       </w:rPr>
     </w:lvl>
   </w:abstractNum>
-  <w:abstractNum w:abstractNumId="42" w15:restartNumberingAfterBreak="0">
+  <w:abstractNum w:abstractNumId="44" w15:restartNumberingAfterBreak="0">
     <w:nsid w:val="769046A9"/>
     <w:multiLevelType w:val="multilevel"/>
     <w:tmpl w:val="E4D8E34A"/>
@@ -9510,7 +10765,7 @@
       </w:rPr>
     </w:lvl>
   </w:abstractNum>
-  <w:abstractNum w:abstractNumId="43" w15:restartNumberingAfterBreak="0">
+  <w:abstractNum w:abstractNumId="45" w15:restartNumberingAfterBreak="0">
     <w:nsid w:val="794D618C"/>
     <w:multiLevelType w:val="multilevel"/>
     <w:tmpl w:val="0D6A193E"/>
@@ -9659,7 +10914,7 @@
       </w:rPr>
     </w:lvl>
   </w:abstractNum>
-  <w:abstractNum w:abstractNumId="44" w15:restartNumberingAfterBreak="0">
+  <w:abstractNum w:abstractNumId="46" w15:restartNumberingAfterBreak="0">
     <w:nsid w:val="7AC10A49"/>
     <w:multiLevelType w:val="multilevel"/>
     <w:tmpl w:val="6B806EC0"/>
@@ -9773,19 +11028,19 @@
     </w:lvl>
   </w:abstractNum>
   <w:num w:numId="1" w16cid:durableId="2039161732">
-    <w:abstractNumId w:val="38"/>
+    <w:abstractNumId w:val="40"/>
   </w:num>
   <w:num w:numId="2" w16cid:durableId="599878884">
-    <w:abstractNumId w:val="17"/>
+    <w:abstractNumId w:val="19"/>
   </w:num>
   <w:num w:numId="3" w16cid:durableId="1687515766">
-    <w:abstractNumId w:val="27"/>
+    <w:abstractNumId w:val="29"/>
   </w:num>
   <w:num w:numId="4" w16cid:durableId="1597786103">
-    <w:abstractNumId w:val="37"/>
+    <w:abstractNumId w:val="39"/>
   </w:num>
   <w:num w:numId="5" w16cid:durableId="2037730805">
-    <w:abstractNumId w:val="11"/>
+    <w:abstractNumId w:val="12"/>
     <w:lvlOverride w:ilvl="0">
       <w:lvl w:ilvl="0">
         <w:numFmt w:val="decimal"/>
@@ -9811,16 +11066,16 @@
     <w:abstractNumId w:val="1"/>
   </w:num>
   <w:num w:numId="9" w16cid:durableId="2054183601">
-    <w:abstractNumId w:val="16"/>
+    <w:abstractNumId w:val="18"/>
   </w:num>
   <w:num w:numId="10" w16cid:durableId="1772167618">
-    <w:abstractNumId w:val="43"/>
+    <w:abstractNumId w:val="45"/>
   </w:num>
   <w:num w:numId="11" w16cid:durableId="97992273">
-    <w:abstractNumId w:val="24"/>
+    <w:abstractNumId w:val="26"/>
   </w:num>
   <w:num w:numId="12" w16cid:durableId="399138131">
-    <w:abstractNumId w:val="42"/>
+    <w:abstractNumId w:val="44"/>
   </w:num>
   <w:num w:numId="13" w16cid:durableId="1586260525">
     <w:abstractNumId w:val="0"/>
@@ -9829,70 +11084,70 @@
     <w:abstractNumId w:val="2"/>
   </w:num>
   <w:num w:numId="15" w16cid:durableId="1625185821">
-    <w:abstractNumId w:val="9"/>
+    <w:abstractNumId w:val="10"/>
   </w:num>
   <w:num w:numId="16" w16cid:durableId="825627380">
-    <w:abstractNumId w:val="28"/>
+    <w:abstractNumId w:val="30"/>
   </w:num>
   <w:num w:numId="17" w16cid:durableId="2075004164">
-    <w:abstractNumId w:val="33"/>
+    <w:abstractNumId w:val="35"/>
   </w:num>
   <w:num w:numId="18" w16cid:durableId="4594926">
-    <w:abstractNumId w:val="41"/>
+    <w:abstractNumId w:val="43"/>
   </w:num>
   <w:num w:numId="19" w16cid:durableId="1771468233">
     <w:abstractNumId w:val="4"/>
   </w:num>
   <w:num w:numId="20" w16cid:durableId="316500084">
-    <w:abstractNumId w:val="40"/>
+    <w:abstractNumId w:val="42"/>
   </w:num>
   <w:num w:numId="21" w16cid:durableId="46925458">
-    <w:abstractNumId w:val="36"/>
+    <w:abstractNumId w:val="38"/>
   </w:num>
   <w:num w:numId="22" w16cid:durableId="68312687">
-    <w:abstractNumId w:val="31"/>
+    <w:abstractNumId w:val="33"/>
   </w:num>
   <w:num w:numId="23" w16cid:durableId="1069303592">
     <w:abstractNumId w:val="8"/>
   </w:num>
   <w:num w:numId="24" w16cid:durableId="219941630">
-    <w:abstractNumId w:val="10"/>
+    <w:abstractNumId w:val="11"/>
   </w:num>
   <w:num w:numId="25" w16cid:durableId="1046952834">
-    <w:abstractNumId w:val="32"/>
+    <w:abstractNumId w:val="34"/>
   </w:num>
   <w:num w:numId="26" w16cid:durableId="1074931892">
-    <w:abstractNumId w:val="13"/>
+    <w:abstractNumId w:val="14"/>
   </w:num>
   <w:num w:numId="27" w16cid:durableId="95760160">
-    <w:abstractNumId w:val="18"/>
+    <w:abstractNumId w:val="20"/>
   </w:num>
   <w:num w:numId="28" w16cid:durableId="2115401707">
     <w:abstractNumId w:val="5"/>
   </w:num>
   <w:num w:numId="29" w16cid:durableId="1036780762">
+    <w:abstractNumId w:val="25"/>
+  </w:num>
+  <w:num w:numId="30" w16cid:durableId="909072183">
+    <w:abstractNumId w:val="32"/>
+  </w:num>
+  <w:num w:numId="31" w16cid:durableId="290861997">
     <w:abstractNumId w:val="23"/>
   </w:num>
-  <w:num w:numId="30" w16cid:durableId="909072183">
-    <w:abstractNumId w:val="30"/>
-  </w:num>
-  <w:num w:numId="31" w16cid:durableId="290861997">
-    <w:abstractNumId w:val="21"/>
-  </w:num>
   <w:num w:numId="32" w16cid:durableId="992679136">
-    <w:abstractNumId w:val="25"/>
+    <w:abstractNumId w:val="27"/>
   </w:num>
   <w:num w:numId="33" w16cid:durableId="1903565666">
     <w:abstractNumId w:val="3"/>
   </w:num>
   <w:num w:numId="34" w16cid:durableId="781609022">
-    <w:abstractNumId w:val="26"/>
+    <w:abstractNumId w:val="28"/>
   </w:num>
   <w:num w:numId="35" w16cid:durableId="2055502745">
-    <w:abstractNumId w:val="35"/>
+    <w:abstractNumId w:val="37"/>
   </w:num>
   <w:num w:numId="36" w16cid:durableId="1158157485">
-    <w:abstractNumId w:val="44"/>
+    <w:abstractNumId w:val="46"/>
     <w:lvlOverride w:ilvl="0">
       <w:lvl w:ilvl="0">
         <w:numFmt w:val="decimal"/>
@@ -9902,7 +11157,7 @@
     </w:lvlOverride>
   </w:num>
   <w:num w:numId="37" w16cid:durableId="1089040727">
-    <w:abstractNumId w:val="34"/>
+    <w:abstractNumId w:val="36"/>
     <w:lvlOverride w:ilvl="0">
       <w:lvl w:ilvl="0">
         <w:numFmt w:val="decimal"/>
@@ -9912,7 +11167,7 @@
     </w:lvlOverride>
   </w:num>
   <w:num w:numId="38" w16cid:durableId="1102337783">
-    <w:abstractNumId w:val="39"/>
+    <w:abstractNumId w:val="41"/>
     <w:lvlOverride w:ilvl="0">
       <w:lvl w:ilvl="0">
         <w:numFmt w:val="decimal"/>
@@ -9922,25 +11177,31 @@
     </w:lvlOverride>
   </w:num>
   <w:num w:numId="39" w16cid:durableId="572620663">
-    <w:abstractNumId w:val="12"/>
+    <w:abstractNumId w:val="13"/>
   </w:num>
   <w:num w:numId="40" w16cid:durableId="1517693151">
-    <w:abstractNumId w:val="29"/>
+    <w:abstractNumId w:val="31"/>
   </w:num>
   <w:num w:numId="41" w16cid:durableId="1516770646">
-    <w:abstractNumId w:val="19"/>
+    <w:abstractNumId w:val="21"/>
   </w:num>
   <w:num w:numId="42" w16cid:durableId="15204715">
+    <w:abstractNumId w:val="24"/>
+  </w:num>
+  <w:num w:numId="43" w16cid:durableId="1598364838">
+    <w:abstractNumId w:val="16"/>
+  </w:num>
+  <w:num w:numId="44" w16cid:durableId="491138507">
+    <w:abstractNumId w:val="15"/>
+  </w:num>
+  <w:num w:numId="45" w16cid:durableId="318193185">
     <w:abstractNumId w:val="22"/>
   </w:num>
-  <w:num w:numId="43" w16cid:durableId="1598364838">
-    <w:abstractNumId w:val="15"/>
+  <w:num w:numId="46" w16cid:durableId="121925833">
+    <w:abstractNumId w:val="17"/>
   </w:num>
-  <w:num w:numId="44" w16cid:durableId="491138507">
-    <w:abstractNumId w:val="14"/>
-  </w:num>
-  <w:num w:numId="45" w16cid:durableId="318193185">
-    <w:abstractNumId w:val="20"/>
+  <w:num w:numId="47" w16cid:durableId="1700664514">
+    <w:abstractNumId w:val="9"/>
   </w:num>
 </w:numbering>
 </file>
@@ -11200,4 +12461,16 @@
     </a:ext>
   </a:extLst>
 </a:theme>
+</file>
+
+<file path=customXml/item1.xml><?xml version="1.0" encoding="utf-8"?>
+<b:Sources xmlns:b="http://schemas.openxmlformats.org/officeDocument/2006/bibliography" xmlns="http://schemas.openxmlformats.org/officeDocument/2006/bibliography" SelectedStyle="\APASixthEditionOfficeOnline.xsl" StyleName="APA" Version="6"/>
+</file>
+
+<file path=customXml/itemProps1.xml><?xml version="1.0" encoding="utf-8"?>
+<ds:datastoreItem xmlns:ds="http://schemas.openxmlformats.org/officeDocument/2006/customXml" ds:itemID="{85035075-33FE-4107-9C53-0C815D0B7512}">
+  <ds:schemaRefs>
+    <ds:schemaRef ds:uri="http://schemas.openxmlformats.org/officeDocument/2006/bibliography"/>
+  </ds:schemaRefs>
+</ds:datastoreItem>
 </file>
</xml_diff>